<commit_message>
atualizando a aula do dia 21/09
</commit_message>
<xml_diff>
--- a/Apostila/Apostila Space For Men.docx
+++ b/Apostila/Apostila Space For Men.docx
@@ -5900,6 +5900,7 @@
       </w:pPr>
       <w:r>
         <w:rPr>
+          <w:noProof/>
           <w:color w:val="000000" w:themeColor="text1"/>
           <w:sz w:val="24"/>
           <w:szCs w:val="24"/>
@@ -6921,6 +6922,7 @@
       <w:proofErr w:type="spellStart"/>
       <w:r>
         <w:rPr>
+          <w:b/>
           <w:color w:val="000000" w:themeColor="text1"/>
           <w:sz w:val="24"/>
           <w:szCs w:val="24"/>
@@ -6930,11 +6932,37 @@
       <w:proofErr w:type="spellEnd"/>
       <w:r>
         <w:rPr>
-          <w:color w:val="000000" w:themeColor="text1"/>
-          <w:sz w:val="24"/>
-          <w:szCs w:val="24"/>
-        </w:rPr>
-        <w:t xml:space="preserve"> aumentando o subtítulo h2 passando uma impressão que a imagem está se mexendo.</w:t>
+          <w:b/>
+          <w:color w:val="000000" w:themeColor="text1"/>
+          <w:sz w:val="24"/>
+          <w:szCs w:val="24"/>
+        </w:rPr>
+        <w:t xml:space="preserve"> </w:t>
+      </w:r>
+      <w:r>
+        <w:rPr>
+          <w:color w:val="000000" w:themeColor="text1"/>
+          <w:sz w:val="24"/>
+          <w:szCs w:val="24"/>
+        </w:rPr>
+        <w:t xml:space="preserve">aumentando o subtítulo </w:t>
+      </w:r>
+      <w:r>
+        <w:rPr>
+          <w:b/>
+          <w:color w:val="000000" w:themeColor="text1"/>
+          <w:sz w:val="24"/>
+          <w:szCs w:val="24"/>
+        </w:rPr>
+        <w:t>h2</w:t>
+      </w:r>
+      <w:r>
+        <w:rPr>
+          <w:color w:val="000000" w:themeColor="text1"/>
+          <w:sz w:val="24"/>
+          <w:szCs w:val="24"/>
+        </w:rPr>
+        <w:t xml:space="preserve"> passando uma impressão que a imagem está se mexendo.</w:t>
       </w:r>
     </w:p>
     <w:p>
@@ -7015,8 +7043,795 @@
         </w:rPr>
         <w:t>39-</w:t>
       </w:r>
+      <w:r>
+        <w:rPr>
+          <w:color w:val="000000" w:themeColor="text1"/>
+          <w:sz w:val="24"/>
+          <w:szCs w:val="24"/>
+        </w:rPr>
+        <w:t xml:space="preserve"> No </w:t>
+      </w:r>
+      <w:proofErr w:type="spellStart"/>
+      <w:r>
+        <w:rPr>
+          <w:b/>
+          <w:color w:val="000000" w:themeColor="text1"/>
+          <w:sz w:val="24"/>
+          <w:szCs w:val="24"/>
+        </w:rPr>
+        <w:t>footer</w:t>
+      </w:r>
+      <w:proofErr w:type="spellEnd"/>
+      <w:r>
+        <w:rPr>
+          <w:color w:val="000000" w:themeColor="text1"/>
+          <w:sz w:val="24"/>
+          <w:szCs w:val="24"/>
+        </w:rPr>
+        <w:t xml:space="preserve"> adicionamos uma imagem de fundo que é feita direto no </w:t>
+      </w:r>
+      <w:proofErr w:type="spellStart"/>
+      <w:r>
+        <w:rPr>
+          <w:b/>
+          <w:color w:val="000000" w:themeColor="text1"/>
+          <w:sz w:val="24"/>
+          <w:szCs w:val="24"/>
+        </w:rPr>
+        <w:t>css</w:t>
+      </w:r>
+      <w:proofErr w:type="spellEnd"/>
+      <w:r>
+        <w:rPr>
+          <w:color w:val="000000" w:themeColor="text1"/>
+          <w:sz w:val="24"/>
+          <w:szCs w:val="24"/>
+        </w:rPr>
+        <w:t xml:space="preserve"> e quando aplicamos uma imagem de fundo tem a tendência de replicar o conteúdo da imagem até completar o tamanho da área que aplicamos, ou seja, no caso o </w:t>
+      </w:r>
+      <w:proofErr w:type="spellStart"/>
+      <w:r>
+        <w:rPr>
+          <w:b/>
+          <w:color w:val="000000" w:themeColor="text1"/>
+          <w:sz w:val="24"/>
+          <w:szCs w:val="24"/>
+        </w:rPr>
+        <w:t>footer</w:t>
+      </w:r>
+      <w:proofErr w:type="spellEnd"/>
+      <w:r>
+        <w:rPr>
+          <w:color w:val="000000" w:themeColor="text1"/>
+          <w:sz w:val="24"/>
+          <w:szCs w:val="24"/>
+        </w:rPr>
+        <w:t>.</w:t>
+      </w:r>
+    </w:p>
+    <w:p>
+      <w:pPr>
+        <w:rPr>
+          <w:color w:val="000000" w:themeColor="text1"/>
+          <w:sz w:val="24"/>
+          <w:szCs w:val="24"/>
+        </w:rPr>
+      </w:pPr>
+      <w:r>
+        <w:rPr>
+          <w:color w:val="000000" w:themeColor="text1"/>
+          <w:sz w:val="24"/>
+          <w:szCs w:val="24"/>
+        </w:rPr>
+        <w:drawing>
+          <wp:inline distT="0" distB="0" distL="0" distR="0" wp14:anchorId="251B97CF" wp14:editId="26488E4D">
+            <wp:extent cx="3086531" cy="952633"/>
+            <wp:effectExtent l="0" t="0" r="0" b="0"/>
+            <wp:docPr id="60" name="Imagem 60"/>
+            <wp:cNvGraphicFramePr>
+              <a:graphicFrameLocks xmlns:a="http://schemas.openxmlformats.org/drawingml/2006/main" noChangeAspect="1"/>
+            </wp:cNvGraphicFramePr>
+            <a:graphic xmlns:a="http://schemas.openxmlformats.org/drawingml/2006/main">
+              <a:graphicData uri="http://schemas.openxmlformats.org/drawingml/2006/picture">
+                <pic:pic xmlns:pic="http://schemas.openxmlformats.org/drawingml/2006/picture">
+                  <pic:nvPicPr>
+                    <pic:cNvPr id="1" name=""/>
+                    <pic:cNvPicPr/>
+                  </pic:nvPicPr>
+                  <pic:blipFill>
+                    <a:blip r:embed="rId65"/>
+                    <a:stretch>
+                      <a:fillRect/>
+                    </a:stretch>
+                  </pic:blipFill>
+                  <pic:spPr>
+                    <a:xfrm>
+                      <a:off x="0" y="0"/>
+                      <a:ext cx="3086531" cy="952633"/>
+                    </a:xfrm>
+                    <a:prstGeom prst="rect">
+                      <a:avLst/>
+                    </a:prstGeom>
+                  </pic:spPr>
+                </pic:pic>
+              </a:graphicData>
+            </a:graphic>
+          </wp:inline>
+        </w:drawing>
+      </w:r>
+    </w:p>
+    <w:p>
+      <w:pPr>
+        <w:rPr>
+          <w:b/>
+          <w:color w:val="000000" w:themeColor="text1"/>
+          <w:sz w:val="24"/>
+          <w:szCs w:val="24"/>
+        </w:rPr>
+      </w:pPr>
+      <w:r>
+        <w:rPr>
+          <w:color w:val="000000" w:themeColor="text1"/>
+          <w:sz w:val="24"/>
+          <w:szCs w:val="24"/>
+        </w:rPr>
+        <w:t xml:space="preserve">OBS: Para que uma imagem de fundo não possa se repetir utilizamos o </w:t>
+      </w:r>
+      <w:proofErr w:type="spellStart"/>
+      <w:r>
+        <w:rPr>
+          <w:b/>
+          <w:color w:val="000000" w:themeColor="text1"/>
+          <w:sz w:val="24"/>
+          <w:szCs w:val="24"/>
+        </w:rPr>
+        <w:t>background-repeat:no-repeat</w:t>
+      </w:r>
+      <w:proofErr w:type="spellEnd"/>
+      <w:r>
+        <w:rPr>
+          <w:b/>
+          <w:color w:val="000000" w:themeColor="text1"/>
+          <w:sz w:val="24"/>
+          <w:szCs w:val="24"/>
+        </w:rPr>
+        <w:t>;</w:t>
+      </w:r>
+    </w:p>
+    <w:p>
+      <w:pPr>
+        <w:rPr>
+          <w:color w:val="000000" w:themeColor="text1"/>
+          <w:sz w:val="24"/>
+          <w:szCs w:val="24"/>
+        </w:rPr>
+      </w:pPr>
+      <w:r>
+        <w:rPr>
+          <w:noProof/>
+          <w:color w:val="000000" w:themeColor="text1"/>
+          <w:sz w:val="24"/>
+          <w:szCs w:val="24"/>
+        </w:rPr>
+        <mc:AlternateContent>
+          <mc:Choice Requires="wps">
+            <w:drawing>
+              <wp:anchor distT="0" distB="0" distL="114300" distR="114300" simplePos="0" relativeHeight="251679744" behindDoc="0" locked="0" layoutInCell="1" allowOverlap="1">
+                <wp:simplePos x="0" y="0"/>
+                <wp:positionH relativeFrom="column">
+                  <wp:posOffset>1047750</wp:posOffset>
+                </wp:positionH>
+                <wp:positionV relativeFrom="paragraph">
+                  <wp:posOffset>154940</wp:posOffset>
+                </wp:positionV>
+                <wp:extent cx="2305050" cy="1428750"/>
+                <wp:effectExtent l="38100" t="0" r="19050" b="57150"/>
+                <wp:wrapNone/>
+                <wp:docPr id="70" name="Conector de Seta Reta 70"/>
+                <wp:cNvGraphicFramePr/>
+                <a:graphic xmlns:a="http://schemas.openxmlformats.org/drawingml/2006/main">
+                  <a:graphicData uri="http://schemas.microsoft.com/office/word/2010/wordprocessingShape">
+                    <wps:wsp>
+                      <wps:cNvCnPr/>
+                      <wps:spPr>
+                        <a:xfrm flipH="1">
+                          <a:off x="0" y="0"/>
+                          <a:ext cx="2305050" cy="1428750"/>
+                        </a:xfrm>
+                        <a:prstGeom prst="straightConnector1">
+                          <a:avLst/>
+                        </a:prstGeom>
+                        <a:ln>
+                          <a:tailEnd type="triangle"/>
+                        </a:ln>
+                      </wps:spPr>
+                      <wps:style>
+                        <a:lnRef idx="1">
+                          <a:schemeClr val="accent1"/>
+                        </a:lnRef>
+                        <a:fillRef idx="0">
+                          <a:schemeClr val="accent1"/>
+                        </a:fillRef>
+                        <a:effectRef idx="0">
+                          <a:schemeClr val="accent1"/>
+                        </a:effectRef>
+                        <a:fontRef idx="minor">
+                          <a:schemeClr val="tx1"/>
+                        </a:fontRef>
+                      </wps:style>
+                      <wps:bodyPr/>
+                    </wps:wsp>
+                  </a:graphicData>
+                </a:graphic>
+              </wp:anchor>
+            </w:drawing>
+          </mc:Choice>
+          <mc:Fallback>
+            <w:pict>
+              <v:shapetype w14:anchorId="43B46099" id="_x0000_t32" coordsize="21600,21600" o:spt="32" o:oned="t" path="m,l21600,21600e" filled="f">
+                <v:path arrowok="t" fillok="f" o:connecttype="none"/>
+                <o:lock v:ext="edit" shapetype="t"/>
+              </v:shapetype>
+              <v:shape id="Conector de Seta Reta 70" o:spid="_x0000_s1026" type="#_x0000_t32" style="position:absolute;margin-left:82.5pt;margin-top:12.2pt;width:181.5pt;height:112.5pt;flip:x;z-index:251679744;visibility:visible;mso-wrap-style:square;mso-wrap-distance-left:9pt;mso-wrap-distance-top:0;mso-wrap-distance-right:9pt;mso-wrap-distance-bottom:0;mso-position-horizontal:absolute;mso-position-horizontal-relative:text;mso-position-vertical:absolute;mso-position-vertical-relative:text" o:gfxdata="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" strokecolor="#4472c4 [3204]" strokeweight=".5pt">
+                <v:stroke endarrow="block" joinstyle="miter"/>
+              </v:shape>
+            </w:pict>
+          </mc:Fallback>
+        </mc:AlternateContent>
+      </w:r>
+      <w:r>
+        <w:rPr>
+          <w:noProof/>
+          <w:color w:val="000000" w:themeColor="text1"/>
+          <w:sz w:val="24"/>
+          <w:szCs w:val="24"/>
+        </w:rPr>
+        <mc:AlternateContent>
+          <mc:Choice Requires="wps">
+            <w:drawing>
+              <wp:anchor distT="0" distB="0" distL="114300" distR="114300" simplePos="0" relativeHeight="251678720" behindDoc="0" locked="0" layoutInCell="1" allowOverlap="1">
+                <wp:simplePos x="0" y="0"/>
+                <wp:positionH relativeFrom="column">
+                  <wp:posOffset>1104900</wp:posOffset>
+                </wp:positionH>
+                <wp:positionV relativeFrom="paragraph">
+                  <wp:posOffset>173990</wp:posOffset>
+                </wp:positionV>
+                <wp:extent cx="1228725" cy="1638300"/>
+                <wp:effectExtent l="38100" t="0" r="28575" b="57150"/>
+                <wp:wrapNone/>
+                <wp:docPr id="69" name="Conector de Seta Reta 69"/>
+                <wp:cNvGraphicFramePr/>
+                <a:graphic xmlns:a="http://schemas.openxmlformats.org/drawingml/2006/main">
+                  <a:graphicData uri="http://schemas.microsoft.com/office/word/2010/wordprocessingShape">
+                    <wps:wsp>
+                      <wps:cNvCnPr/>
+                      <wps:spPr>
+                        <a:xfrm flipH="1">
+                          <a:off x="0" y="0"/>
+                          <a:ext cx="1228725" cy="1638300"/>
+                        </a:xfrm>
+                        <a:prstGeom prst="straightConnector1">
+                          <a:avLst/>
+                        </a:prstGeom>
+                        <a:ln>
+                          <a:tailEnd type="triangle"/>
+                        </a:ln>
+                      </wps:spPr>
+                      <wps:style>
+                        <a:lnRef idx="1">
+                          <a:schemeClr val="accent1"/>
+                        </a:lnRef>
+                        <a:fillRef idx="0">
+                          <a:schemeClr val="accent1"/>
+                        </a:fillRef>
+                        <a:effectRef idx="0">
+                          <a:schemeClr val="accent1"/>
+                        </a:effectRef>
+                        <a:fontRef idx="minor">
+                          <a:schemeClr val="tx1"/>
+                        </a:fontRef>
+                      </wps:style>
+                      <wps:bodyPr/>
+                    </wps:wsp>
+                  </a:graphicData>
+                </a:graphic>
+              </wp:anchor>
+            </w:drawing>
+          </mc:Choice>
+          <mc:Fallback>
+            <w:pict>
+              <v:shape w14:anchorId="666B580E" id="Conector de Seta Reta 69" o:spid="_x0000_s1026" type="#_x0000_t32" style="position:absolute;margin-left:87pt;margin-top:13.7pt;width:96.75pt;height:129pt;flip:x;z-index:251678720;visibility:visible;mso-wrap-style:square;mso-wrap-distance-left:9pt;mso-wrap-distance-top:0;mso-wrap-distance-right:9pt;mso-wrap-distance-bottom:0;mso-position-horizontal:absolute;mso-position-horizontal-relative:text;mso-position-vertical:absolute;mso-position-vertical-relative:text" o:gfxdata="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" strokecolor="#4472c4 [3204]" strokeweight=".5pt">
+                <v:stroke endarrow="block" joinstyle="miter"/>
+              </v:shape>
+            </w:pict>
+          </mc:Fallback>
+        </mc:AlternateContent>
+      </w:r>
+      <w:r>
+        <w:rPr>
+          <w:color w:val="000000" w:themeColor="text1"/>
+          <w:sz w:val="24"/>
+          <w:szCs w:val="24"/>
+        </w:rPr>
+        <w:t xml:space="preserve">40- </w:t>
+      </w:r>
+      <w:r>
+        <w:rPr>
+          <w:color w:val="000000" w:themeColor="text1"/>
+          <w:sz w:val="24"/>
+          <w:szCs w:val="24"/>
+        </w:rPr>
+        <w:t>Criam</w:t>
+      </w:r>
+      <w:r>
+        <w:rPr>
+          <w:color w:val="000000" w:themeColor="text1"/>
+          <w:sz w:val="24"/>
+          <w:szCs w:val="24"/>
+        </w:rPr>
+        <w:t xml:space="preserve">os dois arquivos, o contatos.html e o contatos.css no contatos.html copiamos o header do produtos.html e colamos, e no </w:t>
+      </w:r>
+      <w:proofErr w:type="spellStart"/>
+      <w:r>
+        <w:rPr>
+          <w:color w:val="000000" w:themeColor="text1"/>
+          <w:sz w:val="24"/>
+          <w:szCs w:val="24"/>
+        </w:rPr>
+        <w:t>css</w:t>
+      </w:r>
+      <w:proofErr w:type="spellEnd"/>
+      <w:r>
+        <w:rPr>
+          <w:color w:val="000000" w:themeColor="text1"/>
+          <w:sz w:val="24"/>
+          <w:szCs w:val="24"/>
+        </w:rPr>
+        <w:t xml:space="preserve"> repetimos o mesmo processo copiando toda a parte de configuração do menu, com isso não precisamos fazer novamente o menu e o </w:t>
+      </w:r>
+      <w:proofErr w:type="spellStart"/>
+      <w:r>
+        <w:rPr>
+          <w:color w:val="000000" w:themeColor="text1"/>
+          <w:sz w:val="24"/>
+          <w:szCs w:val="24"/>
+        </w:rPr>
+        <w:t>footer</w:t>
+      </w:r>
+      <w:proofErr w:type="spellEnd"/>
+      <w:r>
+        <w:rPr>
+          <w:color w:val="000000" w:themeColor="text1"/>
+          <w:sz w:val="24"/>
+          <w:szCs w:val="24"/>
+        </w:rPr>
+        <w:t xml:space="preserve"> porque já se encontram prontos.</w:t>
+      </w:r>
+    </w:p>
+    <w:p>
+      <w:pPr>
+        <w:rPr>
+          <w:color w:val="000000" w:themeColor="text1"/>
+          <w:sz w:val="24"/>
+          <w:szCs w:val="24"/>
+        </w:rPr>
+      </w:pPr>
+      <w:r>
+        <w:rPr>
+          <w:color w:val="000000" w:themeColor="text1"/>
+          <w:sz w:val="24"/>
+          <w:szCs w:val="24"/>
+        </w:rPr>
+        <w:drawing>
+          <wp:inline distT="0" distB="0" distL="0" distR="0" wp14:anchorId="3E9142B0" wp14:editId="0CC20C80">
+            <wp:extent cx="1676634" cy="2429214"/>
+            <wp:effectExtent l="0" t="0" r="0" b="9525"/>
+            <wp:docPr id="61" name="Imagem 61"/>
+            <wp:cNvGraphicFramePr>
+              <a:graphicFrameLocks xmlns:a="http://schemas.openxmlformats.org/drawingml/2006/main" noChangeAspect="1"/>
+            </wp:cNvGraphicFramePr>
+            <a:graphic xmlns:a="http://schemas.openxmlformats.org/drawingml/2006/main">
+              <a:graphicData uri="http://schemas.openxmlformats.org/drawingml/2006/picture">
+                <pic:pic xmlns:pic="http://schemas.openxmlformats.org/drawingml/2006/picture">
+                  <pic:nvPicPr>
+                    <pic:cNvPr id="1" name=""/>
+                    <pic:cNvPicPr/>
+                  </pic:nvPicPr>
+                  <pic:blipFill>
+                    <a:blip r:embed="rId66"/>
+                    <a:stretch>
+                      <a:fillRect/>
+                    </a:stretch>
+                  </pic:blipFill>
+                  <pic:spPr>
+                    <a:xfrm>
+                      <a:off x="0" y="0"/>
+                      <a:ext cx="1676634" cy="2429214"/>
+                    </a:xfrm>
+                    <a:prstGeom prst="rect">
+                      <a:avLst/>
+                    </a:prstGeom>
+                  </pic:spPr>
+                </pic:pic>
+              </a:graphicData>
+            </a:graphic>
+          </wp:inline>
+        </w:drawing>
+      </w:r>
+      <w:r>
+        <w:rPr>
+          <w:noProof/>
+          <w:color w:val="000000" w:themeColor="text1"/>
+          <w:sz w:val="24"/>
+          <w:szCs w:val="24"/>
+        </w:rPr>
+        <w:drawing>
+          <wp:inline distT="0" distB="0" distL="0" distR="0" wp14:anchorId="5365F395">
+            <wp:extent cx="4619625" cy="2429337"/>
+            <wp:effectExtent l="0" t="0" r="0" b="9525"/>
+            <wp:docPr id="71" name="Imagem 71"/>
+            <wp:cNvGraphicFramePr>
+              <a:graphicFrameLocks xmlns:a="http://schemas.openxmlformats.org/drawingml/2006/main" noChangeAspect="1"/>
+            </wp:cNvGraphicFramePr>
+            <a:graphic xmlns:a="http://schemas.openxmlformats.org/drawingml/2006/main">
+              <a:graphicData uri="http://schemas.openxmlformats.org/drawingml/2006/picture">
+                <pic:pic xmlns:pic="http://schemas.openxmlformats.org/drawingml/2006/picture">
+                  <pic:nvPicPr>
+                    <pic:cNvPr id="0" name="Picture 2"/>
+                    <pic:cNvPicPr>
+                      <a:picLocks noChangeAspect="1" noChangeArrowheads="1"/>
+                    </pic:cNvPicPr>
+                  </pic:nvPicPr>
+                  <pic:blipFill>
+                    <a:blip r:embed="rId67">
+                      <a:extLst>
+                        <a:ext uri="{28A0092B-C50C-407E-A947-70E740481C1C}">
+                          <a14:useLocalDpi xmlns:a14="http://schemas.microsoft.com/office/drawing/2010/main" val="0"/>
+                        </a:ext>
+                      </a:extLst>
+                    </a:blip>
+                    <a:srcRect/>
+                    <a:stretch>
+                      <a:fillRect/>
+                    </a:stretch>
+                  </pic:blipFill>
+                  <pic:spPr bwMode="auto">
+                    <a:xfrm>
+                      <a:off x="0" y="0"/>
+                      <a:ext cx="4658684" cy="2449877"/>
+                    </a:xfrm>
+                    <a:prstGeom prst="rect">
+                      <a:avLst/>
+                    </a:prstGeom>
+                    <a:noFill/>
+                  </pic:spPr>
+                </pic:pic>
+              </a:graphicData>
+            </a:graphic>
+          </wp:inline>
+        </w:drawing>
+      </w:r>
+      <w:r>
+        <w:rPr>
+          <w:noProof/>
+          <w:color w:val="000000" w:themeColor="text1"/>
+          <w:sz w:val="24"/>
+          <w:szCs w:val="24"/>
+        </w:rPr>
+        <w:drawing>
+          <wp:inline distT="0" distB="0" distL="0" distR="0" wp14:anchorId="7AAC7C85">
+            <wp:extent cx="4744085" cy="1133475"/>
+            <wp:effectExtent l="0" t="0" r="0" b="9525"/>
+            <wp:docPr id="72" name="Imagem 72"/>
+            <wp:cNvGraphicFramePr>
+              <a:graphicFrameLocks xmlns:a="http://schemas.openxmlformats.org/drawingml/2006/main" noChangeAspect="1"/>
+            </wp:cNvGraphicFramePr>
+            <a:graphic xmlns:a="http://schemas.openxmlformats.org/drawingml/2006/main">
+              <a:graphicData uri="http://schemas.openxmlformats.org/drawingml/2006/picture">
+                <pic:pic xmlns:pic="http://schemas.openxmlformats.org/drawingml/2006/picture">
+                  <pic:nvPicPr>
+                    <pic:cNvPr id="0" name="Picture 3"/>
+                    <pic:cNvPicPr>
+                      <a:picLocks noChangeAspect="1" noChangeArrowheads="1"/>
+                    </pic:cNvPicPr>
+                  </pic:nvPicPr>
+                  <pic:blipFill>
+                    <a:blip r:embed="rId68">
+                      <a:extLst>
+                        <a:ext uri="{28A0092B-C50C-407E-A947-70E740481C1C}">
+                          <a14:useLocalDpi xmlns:a14="http://schemas.microsoft.com/office/drawing/2010/main" val="0"/>
+                        </a:ext>
+                      </a:extLst>
+                    </a:blip>
+                    <a:srcRect/>
+                    <a:stretch>
+                      <a:fillRect/>
+                    </a:stretch>
+                  </pic:blipFill>
+                  <pic:spPr bwMode="auto">
+                    <a:xfrm>
+                      <a:off x="0" y="0"/>
+                      <a:ext cx="4744085" cy="1133475"/>
+                    </a:xfrm>
+                    <a:prstGeom prst="rect">
+                      <a:avLst/>
+                    </a:prstGeom>
+                    <a:noFill/>
+                  </pic:spPr>
+                </pic:pic>
+              </a:graphicData>
+            </a:graphic>
+          </wp:inline>
+        </w:drawing>
+      </w:r>
+    </w:p>
+    <w:p>
+      <w:pPr>
+        <w:rPr>
+          <w:color w:val="000000" w:themeColor="text1"/>
+          <w:sz w:val="24"/>
+          <w:szCs w:val="24"/>
+        </w:rPr>
+      </w:pPr>
+      <w:r>
+        <w:rPr>
+          <w:noProof/>
+          <w:color w:val="000000" w:themeColor="text1"/>
+          <w:sz w:val="24"/>
+          <w:szCs w:val="24"/>
+        </w:rPr>
+        <w:drawing>
+          <wp:inline distT="0" distB="0" distL="0" distR="0" wp14:anchorId="70528ABB">
+            <wp:extent cx="2085975" cy="3819829"/>
+            <wp:effectExtent l="0" t="0" r="0" b="9525"/>
+            <wp:docPr id="73" name="Imagem 73"/>
+            <wp:cNvGraphicFramePr>
+              <a:graphicFrameLocks xmlns:a="http://schemas.openxmlformats.org/drawingml/2006/main" noChangeAspect="1"/>
+            </wp:cNvGraphicFramePr>
+            <a:graphic xmlns:a="http://schemas.openxmlformats.org/drawingml/2006/main">
+              <a:graphicData uri="http://schemas.openxmlformats.org/drawingml/2006/picture">
+                <pic:pic xmlns:pic="http://schemas.openxmlformats.org/drawingml/2006/picture">
+                  <pic:nvPicPr>
+                    <pic:cNvPr id="0" name="Picture 4"/>
+                    <pic:cNvPicPr>
+                      <a:picLocks noChangeAspect="1" noChangeArrowheads="1"/>
+                    </pic:cNvPicPr>
+                  </pic:nvPicPr>
+                  <pic:blipFill>
+                    <a:blip r:embed="rId69">
+                      <a:extLst>
+                        <a:ext uri="{28A0092B-C50C-407E-A947-70E740481C1C}">
+                          <a14:useLocalDpi xmlns:a14="http://schemas.microsoft.com/office/drawing/2010/main" val="0"/>
+                        </a:ext>
+                      </a:extLst>
+                    </a:blip>
+                    <a:srcRect/>
+                    <a:stretch>
+                      <a:fillRect/>
+                    </a:stretch>
+                  </pic:blipFill>
+                  <pic:spPr bwMode="auto">
+                    <a:xfrm>
+                      <a:off x="0" y="0"/>
+                      <a:ext cx="2092039" cy="3830934"/>
+                    </a:xfrm>
+                    <a:prstGeom prst="rect">
+                      <a:avLst/>
+                    </a:prstGeom>
+                    <a:noFill/>
+                  </pic:spPr>
+                </pic:pic>
+              </a:graphicData>
+            </a:graphic>
+          </wp:inline>
+        </w:drawing>
+      </w:r>
+    </w:p>
+    <w:p>
+      <w:pPr>
+        <w:rPr>
+          <w:color w:val="000000" w:themeColor="text1"/>
+          <w:sz w:val="24"/>
+          <w:szCs w:val="24"/>
+        </w:rPr>
+      </w:pPr>
+      <w:r>
+        <w:rPr>
+          <w:color w:val="000000" w:themeColor="text1"/>
+          <w:sz w:val="24"/>
+          <w:szCs w:val="24"/>
+        </w:rPr>
+        <w:t xml:space="preserve">41- </w:t>
+      </w:r>
+      <w:r>
+        <w:rPr>
+          <w:color w:val="000000" w:themeColor="text1"/>
+          <w:sz w:val="24"/>
+          <w:szCs w:val="24"/>
+        </w:rPr>
+        <w:t xml:space="preserve">Dentro do </w:t>
+      </w:r>
+      <w:proofErr w:type="spellStart"/>
+      <w:r>
+        <w:rPr>
+          <w:color w:val="000000" w:themeColor="text1"/>
+          <w:sz w:val="24"/>
+          <w:szCs w:val="24"/>
+        </w:rPr>
+        <w:t>main</w:t>
+      </w:r>
+      <w:proofErr w:type="spellEnd"/>
+      <w:r>
+        <w:rPr>
+          <w:color w:val="000000" w:themeColor="text1"/>
+          <w:sz w:val="24"/>
+          <w:szCs w:val="24"/>
+        </w:rPr>
+        <w:t xml:space="preserve"> adicionamos até </w:t>
+      </w:r>
+      <w:proofErr w:type="spellStart"/>
+      <w:r>
+        <w:rPr>
+          <w:color w:val="000000" w:themeColor="text1"/>
+          <w:sz w:val="24"/>
+          <w:szCs w:val="24"/>
+        </w:rPr>
+        <w:t>form</w:t>
+      </w:r>
+      <w:proofErr w:type="spellEnd"/>
+      <w:r>
+        <w:rPr>
+          <w:color w:val="000000" w:themeColor="text1"/>
+          <w:sz w:val="24"/>
+          <w:szCs w:val="24"/>
+        </w:rPr>
+        <w:t xml:space="preserve"> e inserimos os inputs tipo de texto e as </w:t>
+      </w:r>
+      <w:proofErr w:type="spellStart"/>
+      <w:r>
+        <w:rPr>
+          <w:color w:val="000000" w:themeColor="text1"/>
+          <w:sz w:val="24"/>
+          <w:szCs w:val="24"/>
+        </w:rPr>
+        <w:t>label</w:t>
+      </w:r>
+      <w:proofErr w:type="spellEnd"/>
+      <w:r>
+        <w:rPr>
+          <w:color w:val="000000" w:themeColor="text1"/>
+          <w:sz w:val="24"/>
+          <w:szCs w:val="24"/>
+        </w:rPr>
+        <w:t xml:space="preserve"> e juntamos a </w:t>
+      </w:r>
+      <w:proofErr w:type="spellStart"/>
+      <w:r>
+        <w:rPr>
+          <w:color w:val="000000" w:themeColor="text1"/>
+          <w:sz w:val="24"/>
+          <w:szCs w:val="24"/>
+        </w:rPr>
+        <w:t>label</w:t>
+      </w:r>
+      <w:proofErr w:type="spellEnd"/>
+      <w:r>
+        <w:rPr>
+          <w:color w:val="000000" w:themeColor="text1"/>
+          <w:sz w:val="24"/>
+          <w:szCs w:val="24"/>
+        </w:rPr>
+        <w:t xml:space="preserve"> com os inputs utilizando o for da </w:t>
+      </w:r>
+      <w:proofErr w:type="spellStart"/>
+      <w:r>
+        <w:rPr>
+          <w:color w:val="000000" w:themeColor="text1"/>
+          <w:sz w:val="24"/>
+          <w:szCs w:val="24"/>
+        </w:rPr>
+        <w:t>label</w:t>
+      </w:r>
+      <w:proofErr w:type="spellEnd"/>
+      <w:r>
+        <w:rPr>
+          <w:color w:val="000000" w:themeColor="text1"/>
+          <w:sz w:val="24"/>
+          <w:szCs w:val="24"/>
+        </w:rPr>
+        <w:t xml:space="preserve"> com mesmo nome do id dos inputs.</w:t>
+      </w:r>
+    </w:p>
+    <w:p>
+      <w:pPr>
+        <w:rPr>
+          <w:color w:val="000000" w:themeColor="text1"/>
+          <w:sz w:val="24"/>
+          <w:szCs w:val="24"/>
+        </w:rPr>
+      </w:pPr>
+      <w:r>
+        <w:rPr>
+          <w:noProof/>
+          <w:color w:val="000000" w:themeColor="text1"/>
+          <w:sz w:val="24"/>
+          <w:szCs w:val="24"/>
+        </w:rPr>
+        <w:drawing>
+          <wp:inline distT="0" distB="0" distL="0" distR="0" wp14:anchorId="449CE601">
+            <wp:extent cx="2952750" cy="2131445"/>
+            <wp:effectExtent l="0" t="0" r="0" b="2540"/>
+            <wp:docPr id="74" name="Imagem 74"/>
+            <wp:cNvGraphicFramePr>
+              <a:graphicFrameLocks xmlns:a="http://schemas.openxmlformats.org/drawingml/2006/main" noChangeAspect="1"/>
+            </wp:cNvGraphicFramePr>
+            <a:graphic xmlns:a="http://schemas.openxmlformats.org/drawingml/2006/main">
+              <a:graphicData uri="http://schemas.openxmlformats.org/drawingml/2006/picture">
+                <pic:pic xmlns:pic="http://schemas.openxmlformats.org/drawingml/2006/picture">
+                  <pic:nvPicPr>
+                    <pic:cNvPr id="0" name="Picture 5"/>
+                    <pic:cNvPicPr>
+                      <a:picLocks noChangeAspect="1" noChangeArrowheads="1"/>
+                    </pic:cNvPicPr>
+                  </pic:nvPicPr>
+                  <pic:blipFill>
+                    <a:blip r:embed="rId70">
+                      <a:extLst>
+                        <a:ext uri="{28A0092B-C50C-407E-A947-70E740481C1C}">
+                          <a14:useLocalDpi xmlns:a14="http://schemas.microsoft.com/office/drawing/2010/main" val="0"/>
+                        </a:ext>
+                      </a:extLst>
+                    </a:blip>
+                    <a:srcRect/>
+                    <a:stretch>
+                      <a:fillRect/>
+                    </a:stretch>
+                  </pic:blipFill>
+                  <pic:spPr bwMode="auto">
+                    <a:xfrm>
+                      <a:off x="0" y="0"/>
+                      <a:ext cx="2958759" cy="2135783"/>
+                    </a:xfrm>
+                    <a:prstGeom prst="rect">
+                      <a:avLst/>
+                    </a:prstGeom>
+                    <a:noFill/>
+                  </pic:spPr>
+                </pic:pic>
+              </a:graphicData>
+            </a:graphic>
+          </wp:inline>
+        </w:drawing>
+      </w:r>
+    </w:p>
+    <w:p>
+      <w:pPr>
+        <w:rPr>
+          <w:color w:val="000000" w:themeColor="text1"/>
+          <w:sz w:val="24"/>
+          <w:szCs w:val="24"/>
+        </w:rPr>
+      </w:pPr>
+      <w:r>
+        <w:rPr>
+          <w:color w:val="000000" w:themeColor="text1"/>
+          <w:sz w:val="24"/>
+          <w:szCs w:val="24"/>
+        </w:rPr>
+        <w:t xml:space="preserve">42- </w:t>
+      </w:r>
       <w:bookmarkStart w:id="0" w:name="_GoBack"/>
       <w:bookmarkEnd w:id="0"/>
+    </w:p>
+    <w:p>
+      <w:pPr>
+        <w:rPr>
+          <w:color w:val="000000" w:themeColor="text1"/>
+          <w:sz w:val="24"/>
+          <w:szCs w:val="24"/>
+        </w:rPr>
+      </w:pPr>
     </w:p>
     <w:sectPr>
       <w:pgSz w:w="11906" w:h="16838"/>
@@ -8607,7 +9422,7 @@
 </file>
 
 <file path=customXml/itemProps1.xml><?xml version="1.0" encoding="utf-8"?>
-<ds:datastoreItem xmlns:ds="http://schemas.openxmlformats.org/officeDocument/2006/customXml" ds:itemID="{43FAF462-CDF6-4E46-8ED5-7C253B20EEDD}">
+<ds:datastoreItem xmlns:ds="http://schemas.openxmlformats.org/officeDocument/2006/customXml" ds:itemID="{39A0C819-460B-4E60-A4A7-BCFBC445B0D1}">
   <ds:schemaRefs>
     <ds:schemaRef ds:uri="http://schemas.openxmlformats.org/officeDocument/2006/bibliography"/>
   </ds:schemaRefs>

</xml_diff>

<commit_message>
atualização da aula dia 22/09
</commit_message>
<xml_diff>
--- a/Apostila/Apostila Space For Men.docx
+++ b/Apostila/Apostila Space For Men.docx
@@ -7119,6 +7119,7 @@
       </w:pPr>
       <w:r>
         <w:rPr>
+          <w:noProof/>
           <w:color w:val="000000" w:themeColor="text1"/>
           <w:sz w:val="24"/>
           <w:szCs w:val="24"/>
@@ -7370,11 +7371,89 @@
           <w:sz w:val="24"/>
           <w:szCs w:val="24"/>
         </w:rPr>
-        <w:t xml:space="preserve">os dois arquivos, o contatos.html e o contatos.css no contatos.html copiamos o header do produtos.html e colamos, e no </w:t>
+        <w:t xml:space="preserve">os dois arquivos, o </w:t>
+      </w:r>
+      <w:r>
+        <w:rPr>
+          <w:b/>
+          <w:color w:val="000000" w:themeColor="text1"/>
+          <w:sz w:val="24"/>
+          <w:szCs w:val="24"/>
+        </w:rPr>
+        <w:t>contatos.html</w:t>
+      </w:r>
+      <w:r>
+        <w:rPr>
+          <w:color w:val="000000" w:themeColor="text1"/>
+          <w:sz w:val="24"/>
+          <w:szCs w:val="24"/>
+        </w:rPr>
+        <w:t xml:space="preserve"> e o </w:t>
+      </w:r>
+      <w:r>
+        <w:rPr>
+          <w:b/>
+          <w:color w:val="000000" w:themeColor="text1"/>
+          <w:sz w:val="24"/>
+          <w:szCs w:val="24"/>
+        </w:rPr>
+        <w:t>contatos.css</w:t>
+      </w:r>
+      <w:r>
+        <w:rPr>
+          <w:b/>
+          <w:color w:val="000000" w:themeColor="text1"/>
+          <w:sz w:val="24"/>
+          <w:szCs w:val="24"/>
+        </w:rPr>
+        <w:t>,</w:t>
+      </w:r>
+      <w:r>
+        <w:rPr>
+          <w:color w:val="000000" w:themeColor="text1"/>
+          <w:sz w:val="24"/>
+          <w:szCs w:val="24"/>
+        </w:rPr>
+        <w:t xml:space="preserve"> no </w:t>
+      </w:r>
+      <w:r>
+        <w:rPr>
+          <w:b/>
+          <w:color w:val="000000" w:themeColor="text1"/>
+          <w:sz w:val="24"/>
+          <w:szCs w:val="24"/>
+        </w:rPr>
+        <w:t>contatos.html</w:t>
+      </w:r>
+      <w:r>
+        <w:rPr>
+          <w:color w:val="000000" w:themeColor="text1"/>
+          <w:sz w:val="24"/>
+          <w:szCs w:val="24"/>
+        </w:rPr>
+        <w:t xml:space="preserve"> copiamos o header do </w:t>
+      </w:r>
+      <w:r>
+        <w:rPr>
+          <w:b/>
+          <w:color w:val="000000" w:themeColor="text1"/>
+          <w:sz w:val="24"/>
+          <w:szCs w:val="24"/>
+        </w:rPr>
+        <w:t>produtos.html</w:t>
+      </w:r>
+      <w:r>
+        <w:rPr>
+          <w:color w:val="000000" w:themeColor="text1"/>
+          <w:sz w:val="24"/>
+          <w:szCs w:val="24"/>
+        </w:rPr>
+        <w:t xml:space="preserve"> e colamos, e no </w:t>
       </w:r>
       <w:proofErr w:type="spellStart"/>
       <w:r>
         <w:rPr>
+          <w:b/>
           <w:color w:val="000000" w:themeColor="text1"/>
           <w:sz w:val="24"/>
           <w:szCs w:val="24"/>
@@ -7393,6 +7472,7 @@
       <w:proofErr w:type="spellStart"/>
       <w:r>
         <w:rPr>
+          <w:b/>
           <w:color w:val="000000" w:themeColor="text1"/>
           <w:sz w:val="24"/>
           <w:szCs w:val="24"/>
@@ -7419,6 +7499,7 @@
       </w:pPr>
       <w:r>
         <w:rPr>
+          <w:noProof/>
           <w:color w:val="000000" w:themeColor="text1"/>
           <w:sz w:val="24"/>
           <w:szCs w:val="24"/>
@@ -7655,6 +7736,7 @@
       <w:proofErr w:type="spellStart"/>
       <w:r>
         <w:rPr>
+          <w:b/>
           <w:color w:val="000000" w:themeColor="text1"/>
           <w:sz w:val="24"/>
           <w:szCs w:val="24"/>
@@ -7673,6 +7755,7 @@
       <w:proofErr w:type="spellStart"/>
       <w:r>
         <w:rPr>
+          <w:b/>
           <w:color w:val="000000" w:themeColor="text1"/>
           <w:sz w:val="24"/>
           <w:szCs w:val="24"/>
@@ -7686,11 +7769,29 @@
           <w:sz w:val="24"/>
           <w:szCs w:val="24"/>
         </w:rPr>
-        <w:t xml:space="preserve"> e inserimos os inputs tipo de texto e as </w:t>
+        <w:t xml:space="preserve"> e inserimos os </w:t>
+      </w:r>
+      <w:r>
+        <w:rPr>
+          <w:b/>
+          <w:color w:val="000000" w:themeColor="text1"/>
+          <w:sz w:val="24"/>
+          <w:szCs w:val="24"/>
+        </w:rPr>
+        <w:t>inputs</w:t>
+      </w:r>
+      <w:r>
+        <w:rPr>
+          <w:color w:val="000000" w:themeColor="text1"/>
+          <w:sz w:val="24"/>
+          <w:szCs w:val="24"/>
+        </w:rPr>
+        <w:t xml:space="preserve"> tipo de texto e as </w:t>
       </w:r>
       <w:proofErr w:type="spellStart"/>
       <w:r>
         <w:rPr>
+          <w:b/>
           <w:color w:val="000000" w:themeColor="text1"/>
           <w:sz w:val="24"/>
           <w:szCs w:val="24"/>
@@ -7709,6 +7810,7 @@
       <w:proofErr w:type="spellStart"/>
       <w:r>
         <w:rPr>
+          <w:b/>
           <w:color w:val="000000" w:themeColor="text1"/>
           <w:sz w:val="24"/>
           <w:szCs w:val="24"/>
@@ -7722,11 +7824,29 @@
           <w:sz w:val="24"/>
           <w:szCs w:val="24"/>
         </w:rPr>
-        <w:t xml:space="preserve"> com os inputs utilizando o for da </w:t>
+        <w:t xml:space="preserve"> com os </w:t>
+      </w:r>
+      <w:r>
+        <w:rPr>
+          <w:b/>
+          <w:color w:val="000000" w:themeColor="text1"/>
+          <w:sz w:val="24"/>
+          <w:szCs w:val="24"/>
+        </w:rPr>
+        <w:t>inputs</w:t>
+      </w:r>
+      <w:r>
+        <w:rPr>
+          <w:color w:val="000000" w:themeColor="text1"/>
+          <w:sz w:val="24"/>
+          <w:szCs w:val="24"/>
+        </w:rPr>
+        <w:t xml:space="preserve"> utilizando o for da </w:t>
       </w:r>
       <w:proofErr w:type="spellStart"/>
       <w:r>
         <w:rPr>
+          <w:b/>
           <w:color w:val="000000" w:themeColor="text1"/>
           <w:sz w:val="24"/>
           <w:szCs w:val="24"/>
@@ -7740,7 +7860,41 @@
           <w:sz w:val="24"/>
           <w:szCs w:val="24"/>
         </w:rPr>
-        <w:t xml:space="preserve"> com mesmo nome do id dos inputs.</w:t>
+        <w:t xml:space="preserve"> com mesmo nome do </w:t>
+      </w:r>
+      <w:r>
+        <w:rPr>
+          <w:b/>
+          <w:color w:val="000000" w:themeColor="text1"/>
+          <w:sz w:val="24"/>
+          <w:szCs w:val="24"/>
+        </w:rPr>
+        <w:t>id</w:t>
+      </w:r>
+      <w:r>
+        <w:rPr>
+          <w:color w:val="000000" w:themeColor="text1"/>
+          <w:sz w:val="24"/>
+          <w:szCs w:val="24"/>
+        </w:rPr>
+        <w:t xml:space="preserve"> dos </w:t>
+      </w:r>
+      <w:r>
+        <w:rPr>
+          <w:b/>
+          <w:color w:val="000000" w:themeColor="text1"/>
+          <w:sz w:val="24"/>
+          <w:szCs w:val="24"/>
+        </w:rPr>
+        <w:t>inputs</w:t>
+      </w:r>
+      <w:r>
+        <w:rPr>
+          <w:color w:val="000000" w:themeColor="text1"/>
+          <w:sz w:val="24"/>
+          <w:szCs w:val="24"/>
+        </w:rPr>
+        <w:t>.</w:t>
       </w:r>
     </w:p>
     <w:p>
@@ -7821,8 +7975,1024 @@
         </w:rPr>
         <w:t xml:space="preserve">42- </w:t>
       </w:r>
+      <w:r>
+        <w:rPr>
+          <w:color w:val="000000" w:themeColor="text1"/>
+          <w:sz w:val="24"/>
+          <w:szCs w:val="24"/>
+        </w:rPr>
+        <w:t xml:space="preserve">Demos uma largura pra o </w:t>
+      </w:r>
+      <w:proofErr w:type="spellStart"/>
+      <w:r>
+        <w:rPr>
+          <w:b/>
+          <w:color w:val="000000" w:themeColor="text1"/>
+          <w:sz w:val="24"/>
+          <w:szCs w:val="24"/>
+        </w:rPr>
+        <w:t>main</w:t>
+      </w:r>
+      <w:r>
+        <w:rPr>
+          <w:color w:val="000000" w:themeColor="text1"/>
+          <w:sz w:val="24"/>
+          <w:szCs w:val="24"/>
+        </w:rPr>
+        <w:t>,</w:t>
+      </w:r>
+      <w:proofErr w:type="spellEnd"/>
+      <w:r>
+        <w:rPr>
+          <w:color w:val="000000" w:themeColor="text1"/>
+          <w:sz w:val="24"/>
+          <w:szCs w:val="24"/>
+        </w:rPr>
+        <w:t xml:space="preserve"> com isso para poder centralizar o formulário utilizando </w:t>
+      </w:r>
+      <w:r>
+        <w:rPr>
+          <w:b/>
+          <w:color w:val="000000" w:themeColor="text1"/>
+          <w:sz w:val="24"/>
+          <w:szCs w:val="24"/>
+        </w:rPr>
+        <w:t>margin</w:t>
+      </w:r>
+      <w:r>
+        <w:rPr>
+          <w:color w:val="000000" w:themeColor="text1"/>
+          <w:sz w:val="24"/>
+          <w:szCs w:val="24"/>
+        </w:rPr>
+        <w:t>:</w:t>
+      </w:r>
+      <w:r>
+        <w:rPr>
+          <w:b/>
+          <w:color w:val="000000" w:themeColor="text1"/>
+          <w:sz w:val="24"/>
+          <w:szCs w:val="24"/>
+        </w:rPr>
+        <w:t>0</w:t>
+      </w:r>
+      <w:r>
+        <w:rPr>
+          <w:color w:val="000000" w:themeColor="text1"/>
+          <w:sz w:val="24"/>
+          <w:szCs w:val="24"/>
+        </w:rPr>
+        <w:t xml:space="preserve"> </w:t>
+      </w:r>
+      <w:r>
+        <w:rPr>
+          <w:b/>
+          <w:color w:val="000000" w:themeColor="text1"/>
+          <w:sz w:val="24"/>
+          <w:szCs w:val="24"/>
+        </w:rPr>
+        <w:t>auto</w:t>
+      </w:r>
+      <w:r>
+        <w:rPr>
+          <w:color w:val="000000" w:themeColor="text1"/>
+          <w:sz w:val="24"/>
+          <w:szCs w:val="24"/>
+        </w:rPr>
+        <w:t xml:space="preserve"> e no </w:t>
+      </w:r>
+      <w:proofErr w:type="spellStart"/>
+      <w:r>
+        <w:rPr>
+          <w:b/>
+          <w:color w:val="000000" w:themeColor="text1"/>
+          <w:sz w:val="24"/>
+          <w:szCs w:val="24"/>
+        </w:rPr>
+        <w:t>form</w:t>
+      </w:r>
+      <w:proofErr w:type="spellEnd"/>
+      <w:r>
+        <w:rPr>
+          <w:color w:val="000000" w:themeColor="text1"/>
+          <w:sz w:val="24"/>
+          <w:szCs w:val="24"/>
+        </w:rPr>
+        <w:t xml:space="preserve"> aumentamos o tamanho tanto para cima como para baixo usando </w:t>
+      </w:r>
+      <w:proofErr w:type="spellStart"/>
+      <w:r>
+        <w:rPr>
+          <w:b/>
+          <w:color w:val="000000" w:themeColor="text1"/>
+          <w:sz w:val="24"/>
+          <w:szCs w:val="24"/>
+        </w:rPr>
+        <w:t>margin</w:t>
+      </w:r>
+      <w:proofErr w:type="spellEnd"/>
+      <w:r>
+        <w:rPr>
+          <w:color w:val="000000" w:themeColor="text1"/>
+          <w:sz w:val="24"/>
+          <w:szCs w:val="24"/>
+        </w:rPr>
+        <w:t xml:space="preserve"> </w:t>
+      </w:r>
+      <w:r>
+        <w:rPr>
+          <w:b/>
+          <w:color w:val="000000" w:themeColor="text1"/>
+          <w:sz w:val="24"/>
+          <w:szCs w:val="24"/>
+        </w:rPr>
+        <w:t>40px</w:t>
+      </w:r>
+      <w:r>
+        <w:rPr>
+          <w:color w:val="000000" w:themeColor="text1"/>
+          <w:sz w:val="24"/>
+          <w:szCs w:val="24"/>
+        </w:rPr>
+        <w:t xml:space="preserve"> </w:t>
+      </w:r>
+      <w:r>
+        <w:rPr>
+          <w:b/>
+          <w:color w:val="000000" w:themeColor="text1"/>
+          <w:sz w:val="24"/>
+          <w:szCs w:val="24"/>
+        </w:rPr>
+        <w:t>0</w:t>
+      </w:r>
+      <w:r>
+        <w:rPr>
+          <w:color w:val="000000" w:themeColor="text1"/>
+          <w:sz w:val="24"/>
+          <w:szCs w:val="24"/>
+        </w:rPr>
+        <w:t>;</w:t>
+      </w:r>
+    </w:p>
+    <w:p>
+      <w:pPr>
+        <w:rPr>
+          <w:color w:val="000000" w:themeColor="text1"/>
+          <w:sz w:val="24"/>
+          <w:szCs w:val="24"/>
+        </w:rPr>
+      </w:pPr>
+      <w:r>
+        <w:rPr>
+          <w:color w:val="000000" w:themeColor="text1"/>
+          <w:sz w:val="24"/>
+          <w:szCs w:val="24"/>
+        </w:rPr>
+        <w:drawing>
+          <wp:inline distT="0" distB="0" distL="0" distR="0" wp14:anchorId="5F8F5DB0" wp14:editId="0E558FBE">
+            <wp:extent cx="1581371" cy="1467055"/>
+            <wp:effectExtent l="0" t="0" r="0" b="0"/>
+            <wp:docPr id="67" name="Imagem 67"/>
+            <wp:cNvGraphicFramePr>
+              <a:graphicFrameLocks xmlns:a="http://schemas.openxmlformats.org/drawingml/2006/main" noChangeAspect="1"/>
+            </wp:cNvGraphicFramePr>
+            <a:graphic xmlns:a="http://schemas.openxmlformats.org/drawingml/2006/main">
+              <a:graphicData uri="http://schemas.openxmlformats.org/drawingml/2006/picture">
+                <pic:pic xmlns:pic="http://schemas.openxmlformats.org/drawingml/2006/picture">
+                  <pic:nvPicPr>
+                    <pic:cNvPr id="1" name=""/>
+                    <pic:cNvPicPr/>
+                  </pic:nvPicPr>
+                  <pic:blipFill>
+                    <a:blip r:embed="rId71"/>
+                    <a:stretch>
+                      <a:fillRect/>
+                    </a:stretch>
+                  </pic:blipFill>
+                  <pic:spPr>
+                    <a:xfrm>
+                      <a:off x="0" y="0"/>
+                      <a:ext cx="1581371" cy="1467055"/>
+                    </a:xfrm>
+                    <a:prstGeom prst="rect">
+                      <a:avLst/>
+                    </a:prstGeom>
+                  </pic:spPr>
+                </pic:pic>
+              </a:graphicData>
+            </a:graphic>
+          </wp:inline>
+        </w:drawing>
+      </w:r>
+    </w:p>
+    <w:p>
+      <w:pPr>
+        <w:rPr>
+          <w:color w:val="000000" w:themeColor="text1"/>
+          <w:sz w:val="24"/>
+          <w:szCs w:val="24"/>
+        </w:rPr>
+      </w:pPr>
+      <w:r>
+        <w:rPr>
+          <w:color w:val="000000" w:themeColor="text1"/>
+          <w:sz w:val="24"/>
+          <w:szCs w:val="24"/>
+        </w:rPr>
+        <w:t xml:space="preserve">43- </w:t>
+      </w:r>
+      <w:r>
+        <w:rPr>
+          <w:color w:val="000000" w:themeColor="text1"/>
+          <w:sz w:val="24"/>
+          <w:szCs w:val="24"/>
+        </w:rPr>
+        <w:t xml:space="preserve">Trabalhamos com a natureza da </w:t>
+      </w:r>
+      <w:proofErr w:type="spellStart"/>
+      <w:r>
+        <w:rPr>
+          <w:color w:val="000000" w:themeColor="text1"/>
+          <w:sz w:val="24"/>
+          <w:szCs w:val="24"/>
+        </w:rPr>
+        <w:t>label</w:t>
+      </w:r>
+      <w:proofErr w:type="spellEnd"/>
+      <w:r>
+        <w:rPr>
+          <w:color w:val="000000" w:themeColor="text1"/>
+          <w:sz w:val="24"/>
+          <w:szCs w:val="24"/>
+        </w:rPr>
+        <w:t xml:space="preserve"> e do input, mudamos para </w:t>
+      </w:r>
+      <w:proofErr w:type="spellStart"/>
+      <w:r>
+        <w:rPr>
+          <w:color w:val="000000" w:themeColor="text1"/>
+          <w:sz w:val="24"/>
+          <w:szCs w:val="24"/>
+        </w:rPr>
+        <w:t>block</w:t>
+      </w:r>
+      <w:proofErr w:type="spellEnd"/>
+      <w:r>
+        <w:rPr>
+          <w:color w:val="000000" w:themeColor="text1"/>
+          <w:sz w:val="24"/>
+          <w:szCs w:val="24"/>
+        </w:rPr>
+        <w:t xml:space="preserve"> assim tanto a </w:t>
+      </w:r>
+      <w:proofErr w:type="spellStart"/>
+      <w:r>
+        <w:rPr>
+          <w:color w:val="000000" w:themeColor="text1"/>
+          <w:sz w:val="24"/>
+          <w:szCs w:val="24"/>
+        </w:rPr>
+        <w:t>label</w:t>
+      </w:r>
+      <w:proofErr w:type="spellEnd"/>
+      <w:r>
+        <w:rPr>
+          <w:color w:val="000000" w:themeColor="text1"/>
+          <w:sz w:val="24"/>
+          <w:szCs w:val="24"/>
+        </w:rPr>
+        <w:t xml:space="preserve"> como o input fica um acima do outro e demos um espaço entre eles utilizando o </w:t>
+      </w:r>
+      <w:proofErr w:type="spellStart"/>
+      <w:r>
+        <w:rPr>
+          <w:color w:val="000000" w:themeColor="text1"/>
+          <w:sz w:val="24"/>
+          <w:szCs w:val="24"/>
+        </w:rPr>
+        <w:t>margin</w:t>
+      </w:r>
+      <w:proofErr w:type="spellEnd"/>
+      <w:r>
+        <w:rPr>
+          <w:color w:val="000000" w:themeColor="text1"/>
+          <w:sz w:val="24"/>
+          <w:szCs w:val="24"/>
+        </w:rPr>
+        <w:t xml:space="preserve"> (espaço externo).</w:t>
+      </w:r>
+    </w:p>
+    <w:p>
+      <w:pPr>
+        <w:rPr>
+          <w:color w:val="000000" w:themeColor="text1"/>
+          <w:sz w:val="24"/>
+          <w:szCs w:val="24"/>
+        </w:rPr>
+      </w:pPr>
+      <w:r>
+        <w:rPr>
+          <w:noProof/>
+          <w:color w:val="000000" w:themeColor="text1"/>
+          <w:sz w:val="24"/>
+          <w:szCs w:val="24"/>
+        </w:rPr>
+        <w:drawing>
+          <wp:inline distT="0" distB="0" distL="0" distR="0" wp14:anchorId="31B88D90">
+            <wp:extent cx="1933575" cy="1847850"/>
+            <wp:effectExtent l="0" t="0" r="9525" b="0"/>
+            <wp:docPr id="75" name="Imagem 75"/>
+            <wp:cNvGraphicFramePr>
+              <a:graphicFrameLocks xmlns:a="http://schemas.openxmlformats.org/drawingml/2006/main" noChangeAspect="1"/>
+            </wp:cNvGraphicFramePr>
+            <a:graphic xmlns:a="http://schemas.openxmlformats.org/drawingml/2006/main">
+              <a:graphicData uri="http://schemas.openxmlformats.org/drawingml/2006/picture">
+                <pic:pic xmlns:pic="http://schemas.openxmlformats.org/drawingml/2006/picture">
+                  <pic:nvPicPr>
+                    <pic:cNvPr id="0" name="Picture 2"/>
+                    <pic:cNvPicPr>
+                      <a:picLocks noChangeAspect="1" noChangeArrowheads="1"/>
+                    </pic:cNvPicPr>
+                  </pic:nvPicPr>
+                  <pic:blipFill>
+                    <a:blip r:embed="rId72">
+                      <a:extLst>
+                        <a:ext uri="{28A0092B-C50C-407E-A947-70E740481C1C}">
+                          <a14:useLocalDpi xmlns:a14="http://schemas.microsoft.com/office/drawing/2010/main" val="0"/>
+                        </a:ext>
+                      </a:extLst>
+                    </a:blip>
+                    <a:srcRect/>
+                    <a:stretch>
+                      <a:fillRect/>
+                    </a:stretch>
+                  </pic:blipFill>
+                  <pic:spPr bwMode="auto">
+                    <a:xfrm>
+                      <a:off x="0" y="0"/>
+                      <a:ext cx="1933575" cy="1847850"/>
+                    </a:xfrm>
+                    <a:prstGeom prst="rect">
+                      <a:avLst/>
+                    </a:prstGeom>
+                    <a:noFill/>
+                  </pic:spPr>
+                </pic:pic>
+              </a:graphicData>
+            </a:graphic>
+          </wp:inline>
+        </w:drawing>
+      </w:r>
+      <w:r>
+        <w:rPr>
+          <w:color w:val="000000" w:themeColor="text1"/>
+          <w:sz w:val="24"/>
+          <w:szCs w:val="24"/>
+        </w:rPr>
+        <w:drawing>
+          <wp:inline distT="0" distB="0" distL="0" distR="0" wp14:anchorId="5724EECF" wp14:editId="42BB450A">
+            <wp:extent cx="1706793" cy="1847849"/>
+            <wp:effectExtent l="0" t="0" r="8255" b="635"/>
+            <wp:docPr id="68" name="Imagem 68"/>
+            <wp:cNvGraphicFramePr>
+              <a:graphicFrameLocks xmlns:a="http://schemas.openxmlformats.org/drawingml/2006/main" noChangeAspect="1"/>
+            </wp:cNvGraphicFramePr>
+            <a:graphic xmlns:a="http://schemas.openxmlformats.org/drawingml/2006/main">
+              <a:graphicData uri="http://schemas.openxmlformats.org/drawingml/2006/picture">
+                <pic:pic xmlns:pic="http://schemas.openxmlformats.org/drawingml/2006/picture">
+                  <pic:nvPicPr>
+                    <pic:cNvPr id="1" name=""/>
+                    <pic:cNvPicPr/>
+                  </pic:nvPicPr>
+                  <pic:blipFill>
+                    <a:blip r:embed="rId73"/>
+                    <a:stretch>
+                      <a:fillRect/>
+                    </a:stretch>
+                  </pic:blipFill>
+                  <pic:spPr>
+                    <a:xfrm>
+                      <a:off x="0" y="0"/>
+                      <a:ext cx="1719572" cy="1861684"/>
+                    </a:xfrm>
+                    <a:prstGeom prst="rect">
+                      <a:avLst/>
+                    </a:prstGeom>
+                  </pic:spPr>
+                </pic:pic>
+              </a:graphicData>
+            </a:graphic>
+          </wp:inline>
+        </w:drawing>
+      </w:r>
+    </w:p>
+    <w:p>
+      <w:pPr>
+        <w:rPr>
+          <w:color w:val="000000" w:themeColor="text1"/>
+          <w:sz w:val="24"/>
+          <w:szCs w:val="24"/>
+        </w:rPr>
+      </w:pPr>
+      <w:r>
+        <w:rPr>
+          <w:color w:val="000000" w:themeColor="text1"/>
+          <w:sz w:val="24"/>
+          <w:szCs w:val="24"/>
+        </w:rPr>
+        <w:t xml:space="preserve">44- Aumentamos o tamanho da </w:t>
+      </w:r>
+      <w:proofErr w:type="spellStart"/>
+      <w:r>
+        <w:rPr>
+          <w:color w:val="000000" w:themeColor="text1"/>
+          <w:sz w:val="24"/>
+          <w:szCs w:val="24"/>
+        </w:rPr>
+        <w:t>label</w:t>
+      </w:r>
+      <w:proofErr w:type="spellEnd"/>
+      <w:r>
+        <w:rPr>
+          <w:color w:val="000000" w:themeColor="text1"/>
+          <w:sz w:val="24"/>
+          <w:szCs w:val="24"/>
+        </w:rPr>
+        <w:t xml:space="preserve"> e também o espaço interno dos inputs e demos uma largura para o</w:t>
+      </w:r>
+      <w:r>
+        <w:rPr>
+          <w:color w:val="000000" w:themeColor="text1"/>
+          <w:sz w:val="24"/>
+          <w:szCs w:val="24"/>
+        </w:rPr>
+        <w:t>cupar de 50%</w:t>
+      </w:r>
+    </w:p>
+    <w:p>
+      <w:pPr>
+        <w:rPr>
+          <w:color w:val="000000" w:themeColor="text1"/>
+          <w:sz w:val="24"/>
+          <w:szCs w:val="24"/>
+        </w:rPr>
+      </w:pPr>
+      <w:r>
+        <w:rPr>
+          <w:noProof/>
+          <w:color w:val="000000" w:themeColor="text1"/>
+          <w:sz w:val="24"/>
+          <w:szCs w:val="24"/>
+        </w:rPr>
+        <w:drawing>
+          <wp:inline distT="0" distB="0" distL="0" distR="0" wp14:anchorId="2D4734D2">
+            <wp:extent cx="1819275" cy="2228850"/>
+            <wp:effectExtent l="0" t="0" r="9525" b="0"/>
+            <wp:docPr id="76" name="Imagem 76"/>
+            <wp:cNvGraphicFramePr>
+              <a:graphicFrameLocks xmlns:a="http://schemas.openxmlformats.org/drawingml/2006/main" noChangeAspect="1"/>
+            </wp:cNvGraphicFramePr>
+            <a:graphic xmlns:a="http://schemas.openxmlformats.org/drawingml/2006/main">
+              <a:graphicData uri="http://schemas.openxmlformats.org/drawingml/2006/picture">
+                <pic:pic xmlns:pic="http://schemas.openxmlformats.org/drawingml/2006/picture">
+                  <pic:nvPicPr>
+                    <pic:cNvPr id="0" name="Picture 3"/>
+                    <pic:cNvPicPr>
+                      <a:picLocks noChangeAspect="1" noChangeArrowheads="1"/>
+                    </pic:cNvPicPr>
+                  </pic:nvPicPr>
+                  <pic:blipFill>
+                    <a:blip r:embed="rId74">
+                      <a:extLst>
+                        <a:ext uri="{28A0092B-C50C-407E-A947-70E740481C1C}">
+                          <a14:useLocalDpi xmlns:a14="http://schemas.microsoft.com/office/drawing/2010/main" val="0"/>
+                        </a:ext>
+                      </a:extLst>
+                    </a:blip>
+                    <a:srcRect/>
+                    <a:stretch>
+                      <a:fillRect/>
+                    </a:stretch>
+                  </pic:blipFill>
+                  <pic:spPr bwMode="auto">
+                    <a:xfrm>
+                      <a:off x="0" y="0"/>
+                      <a:ext cx="1819275" cy="2228850"/>
+                    </a:xfrm>
+                    <a:prstGeom prst="rect">
+                      <a:avLst/>
+                    </a:prstGeom>
+                    <a:noFill/>
+                  </pic:spPr>
+                </pic:pic>
+              </a:graphicData>
+            </a:graphic>
+          </wp:inline>
+        </w:drawing>
+      </w:r>
+    </w:p>
+    <w:p>
+      <w:pPr>
+        <w:rPr>
+          <w:color w:val="000000" w:themeColor="text1"/>
+          <w:sz w:val="24"/>
+          <w:szCs w:val="24"/>
+        </w:rPr>
+      </w:pPr>
+      <w:r>
+        <w:rPr>
+          <w:color w:val="000000" w:themeColor="text1"/>
+          <w:sz w:val="24"/>
+          <w:szCs w:val="24"/>
+        </w:rPr>
+        <w:t xml:space="preserve">45- </w:t>
+      </w:r>
+      <w:r>
+        <w:rPr>
+          <w:color w:val="000000" w:themeColor="text1"/>
+          <w:sz w:val="24"/>
+          <w:szCs w:val="24"/>
+        </w:rPr>
+        <w:t xml:space="preserve">Adicionamos o </w:t>
+      </w:r>
+      <w:proofErr w:type="spellStart"/>
+      <w:r>
+        <w:rPr>
+          <w:color w:val="000000" w:themeColor="text1"/>
+          <w:sz w:val="24"/>
+          <w:szCs w:val="24"/>
+        </w:rPr>
+        <w:t>text</w:t>
+      </w:r>
+      <w:r>
+        <w:rPr>
+          <w:color w:val="000000" w:themeColor="text1"/>
+          <w:sz w:val="24"/>
+          <w:szCs w:val="24"/>
+        </w:rPr>
+        <w:t>area</w:t>
+      </w:r>
+      <w:proofErr w:type="spellEnd"/>
+      <w:r>
+        <w:rPr>
+          <w:color w:val="000000" w:themeColor="text1"/>
+          <w:sz w:val="24"/>
+          <w:szCs w:val="24"/>
+        </w:rPr>
+        <w:t>, o input que utilizamos para enviar mensagem mais longa de texto</w:t>
+      </w:r>
+    </w:p>
+    <w:p>
+      <w:pPr>
+        <w:rPr>
+          <w:color w:val="000000" w:themeColor="text1"/>
+          <w:sz w:val="24"/>
+          <w:szCs w:val="24"/>
+        </w:rPr>
+      </w:pPr>
+      <w:r>
+        <w:rPr>
+          <w:noProof/>
+          <w:color w:val="000000" w:themeColor="text1"/>
+          <w:sz w:val="24"/>
+          <w:szCs w:val="24"/>
+        </w:rPr>
+        <w:drawing>
+          <wp:inline distT="0" distB="0" distL="0" distR="0" wp14:anchorId="55D187CF" wp14:editId="6253FF2B">
+            <wp:extent cx="3057525" cy="2813839"/>
+            <wp:effectExtent l="0" t="0" r="0" b="5715"/>
+            <wp:docPr id="78" name="Imagem 78"/>
+            <wp:cNvGraphicFramePr>
+              <a:graphicFrameLocks xmlns:a="http://schemas.openxmlformats.org/drawingml/2006/main" noChangeAspect="1"/>
+            </wp:cNvGraphicFramePr>
+            <a:graphic xmlns:a="http://schemas.openxmlformats.org/drawingml/2006/main">
+              <a:graphicData uri="http://schemas.openxmlformats.org/drawingml/2006/picture">
+                <pic:pic xmlns:pic="http://schemas.openxmlformats.org/drawingml/2006/picture">
+                  <pic:nvPicPr>
+                    <pic:cNvPr id="0" name="Picture 5"/>
+                    <pic:cNvPicPr>
+                      <a:picLocks noChangeAspect="1" noChangeArrowheads="1"/>
+                    </pic:cNvPicPr>
+                  </pic:nvPicPr>
+                  <pic:blipFill>
+                    <a:blip r:embed="rId75">
+                      <a:extLst>
+                        <a:ext uri="{28A0092B-C50C-407E-A947-70E740481C1C}">
+                          <a14:useLocalDpi xmlns:a14="http://schemas.microsoft.com/office/drawing/2010/main" val="0"/>
+                        </a:ext>
+                      </a:extLst>
+                    </a:blip>
+                    <a:srcRect/>
+                    <a:stretch>
+                      <a:fillRect/>
+                    </a:stretch>
+                  </pic:blipFill>
+                  <pic:spPr bwMode="auto">
+                    <a:xfrm>
+                      <a:off x="0" y="0"/>
+                      <a:ext cx="3075484" cy="2830367"/>
+                    </a:xfrm>
+                    <a:prstGeom prst="rect">
+                      <a:avLst/>
+                    </a:prstGeom>
+                    <a:noFill/>
+                  </pic:spPr>
+                </pic:pic>
+              </a:graphicData>
+            </a:graphic>
+          </wp:inline>
+        </w:drawing>
+      </w:r>
+      <w:r>
+        <w:rPr>
+          <w:noProof/>
+          <w:color w:val="000000" w:themeColor="text1"/>
+          <w:sz w:val="24"/>
+          <w:szCs w:val="24"/>
+        </w:rPr>
+        <w:drawing>
+          <wp:inline distT="0" distB="0" distL="0" distR="0" wp14:anchorId="7B8F4032">
+            <wp:extent cx="4124960" cy="485775"/>
+            <wp:effectExtent l="0" t="0" r="8890" b="9525"/>
+            <wp:docPr id="77" name="Imagem 77"/>
+            <wp:cNvGraphicFramePr>
+              <a:graphicFrameLocks xmlns:a="http://schemas.openxmlformats.org/drawingml/2006/main" noChangeAspect="1"/>
+            </wp:cNvGraphicFramePr>
+            <a:graphic xmlns:a="http://schemas.openxmlformats.org/drawingml/2006/main">
+              <a:graphicData uri="http://schemas.openxmlformats.org/drawingml/2006/picture">
+                <pic:pic xmlns:pic="http://schemas.openxmlformats.org/drawingml/2006/picture">
+                  <pic:nvPicPr>
+                    <pic:cNvPr id="0" name="Picture 4"/>
+                    <pic:cNvPicPr>
+                      <a:picLocks noChangeAspect="1" noChangeArrowheads="1"/>
+                    </pic:cNvPicPr>
+                  </pic:nvPicPr>
+                  <pic:blipFill>
+                    <a:blip r:embed="rId76">
+                      <a:extLst>
+                        <a:ext uri="{28A0092B-C50C-407E-A947-70E740481C1C}">
+                          <a14:useLocalDpi xmlns:a14="http://schemas.microsoft.com/office/drawing/2010/main" val="0"/>
+                        </a:ext>
+                      </a:extLst>
+                    </a:blip>
+                    <a:srcRect/>
+                    <a:stretch>
+                      <a:fillRect/>
+                    </a:stretch>
+                  </pic:blipFill>
+                  <pic:spPr bwMode="auto">
+                    <a:xfrm>
+                      <a:off x="0" y="0"/>
+                      <a:ext cx="4124960" cy="485775"/>
+                    </a:xfrm>
+                    <a:prstGeom prst="rect">
+                      <a:avLst/>
+                    </a:prstGeom>
+                    <a:noFill/>
+                  </pic:spPr>
+                </pic:pic>
+              </a:graphicData>
+            </a:graphic>
+          </wp:inline>
+        </w:drawing>
+      </w:r>
+    </w:p>
+    <w:p>
+      <w:pPr>
+        <w:rPr>
+          <w:color w:val="000000" w:themeColor="text1"/>
+          <w:sz w:val="24"/>
+          <w:szCs w:val="24"/>
+        </w:rPr>
+      </w:pPr>
+      <w:r>
+        <w:rPr>
+          <w:color w:val="000000" w:themeColor="text1"/>
+          <w:sz w:val="24"/>
+          <w:szCs w:val="24"/>
+        </w:rPr>
+        <w:t>46</w:t>
+      </w:r>
+      <w:r>
+        <w:rPr>
+          <w:color w:val="000000" w:themeColor="text1"/>
+          <w:sz w:val="24"/>
+          <w:szCs w:val="24"/>
+        </w:rPr>
+        <w:t xml:space="preserve">- Adicionamos as </w:t>
+      </w:r>
+      <w:proofErr w:type="spellStart"/>
+      <w:r>
+        <w:rPr>
+          <w:color w:val="000000" w:themeColor="text1"/>
+          <w:sz w:val="24"/>
+          <w:szCs w:val="24"/>
+        </w:rPr>
+        <w:t>labels</w:t>
+      </w:r>
+      <w:proofErr w:type="spellEnd"/>
+      <w:r>
+        <w:rPr>
+          <w:color w:val="000000" w:themeColor="text1"/>
+          <w:sz w:val="24"/>
+          <w:szCs w:val="24"/>
+        </w:rPr>
+        <w:t xml:space="preserve"> e os inputs radio</w:t>
+      </w:r>
+    </w:p>
+    <w:p>
+      <w:pPr>
+        <w:rPr>
+          <w:color w:val="000000" w:themeColor="text1"/>
+          <w:sz w:val="24"/>
+          <w:szCs w:val="24"/>
+        </w:rPr>
+      </w:pPr>
+      <w:r>
+        <w:rPr>
+          <w:noProof/>
+          <w:color w:val="000000" w:themeColor="text1"/>
+          <w:sz w:val="24"/>
+          <w:szCs w:val="24"/>
+        </w:rPr>
+        <w:drawing>
+          <wp:inline distT="0" distB="0" distL="0" distR="0" wp14:anchorId="2D6DA4EC">
+            <wp:extent cx="3457575" cy="3555330"/>
+            <wp:effectExtent l="0" t="0" r="0" b="7620"/>
+            <wp:docPr id="79" name="Imagem 79"/>
+            <wp:cNvGraphicFramePr>
+              <a:graphicFrameLocks xmlns:a="http://schemas.openxmlformats.org/drawingml/2006/main" noChangeAspect="1"/>
+            </wp:cNvGraphicFramePr>
+            <a:graphic xmlns:a="http://schemas.openxmlformats.org/drawingml/2006/main">
+              <a:graphicData uri="http://schemas.openxmlformats.org/drawingml/2006/picture">
+                <pic:pic xmlns:pic="http://schemas.openxmlformats.org/drawingml/2006/picture">
+                  <pic:nvPicPr>
+                    <pic:cNvPr id="0" name="Picture 6"/>
+                    <pic:cNvPicPr>
+                      <a:picLocks noChangeAspect="1" noChangeArrowheads="1"/>
+                    </pic:cNvPicPr>
+                  </pic:nvPicPr>
+                  <pic:blipFill>
+                    <a:blip r:embed="rId77">
+                      <a:extLst>
+                        <a:ext uri="{28A0092B-C50C-407E-A947-70E740481C1C}">
+                          <a14:useLocalDpi xmlns:a14="http://schemas.microsoft.com/office/drawing/2010/main" val="0"/>
+                        </a:ext>
+                      </a:extLst>
+                    </a:blip>
+                    <a:srcRect/>
+                    <a:stretch>
+                      <a:fillRect/>
+                    </a:stretch>
+                  </pic:blipFill>
+                  <pic:spPr bwMode="auto">
+                    <a:xfrm>
+                      <a:off x="0" y="0"/>
+                      <a:ext cx="3469476" cy="3567567"/>
+                    </a:xfrm>
+                    <a:prstGeom prst="rect">
+                      <a:avLst/>
+                    </a:prstGeom>
+                    <a:noFill/>
+                  </pic:spPr>
+                </pic:pic>
+              </a:graphicData>
+            </a:graphic>
+          </wp:inline>
+        </w:drawing>
+      </w:r>
+      <w:r>
+        <w:rPr>
+          <w:noProof/>
+          <w:color w:val="000000" w:themeColor="text1"/>
+          <w:sz w:val="24"/>
+          <w:szCs w:val="24"/>
+        </w:rPr>
+        <w:drawing>
+          <wp:inline distT="0" distB="0" distL="0" distR="0" wp14:anchorId="74C532FB">
+            <wp:extent cx="4715510" cy="2515235"/>
+            <wp:effectExtent l="0" t="0" r="8890" b="0"/>
+            <wp:docPr id="81" name="Imagem 81"/>
+            <wp:cNvGraphicFramePr>
+              <a:graphicFrameLocks xmlns:a="http://schemas.openxmlformats.org/drawingml/2006/main" noChangeAspect="1"/>
+            </wp:cNvGraphicFramePr>
+            <a:graphic xmlns:a="http://schemas.openxmlformats.org/drawingml/2006/main">
+              <a:graphicData uri="http://schemas.openxmlformats.org/drawingml/2006/picture">
+                <pic:pic xmlns:pic="http://schemas.openxmlformats.org/drawingml/2006/picture">
+                  <pic:nvPicPr>
+                    <pic:cNvPr id="0" name="Picture 8"/>
+                    <pic:cNvPicPr>
+                      <a:picLocks noChangeAspect="1" noChangeArrowheads="1"/>
+                    </pic:cNvPicPr>
+                  </pic:nvPicPr>
+                  <pic:blipFill>
+                    <a:blip r:embed="rId78">
+                      <a:extLst>
+                        <a:ext uri="{28A0092B-C50C-407E-A947-70E740481C1C}">
+                          <a14:useLocalDpi xmlns:a14="http://schemas.microsoft.com/office/drawing/2010/main" val="0"/>
+                        </a:ext>
+                      </a:extLst>
+                    </a:blip>
+                    <a:srcRect/>
+                    <a:stretch>
+                      <a:fillRect/>
+                    </a:stretch>
+                  </pic:blipFill>
+                  <pic:spPr bwMode="auto">
+                    <a:xfrm>
+                      <a:off x="0" y="0"/>
+                      <a:ext cx="4715510" cy="2515235"/>
+                    </a:xfrm>
+                    <a:prstGeom prst="rect">
+                      <a:avLst/>
+                    </a:prstGeom>
+                    <a:noFill/>
+                  </pic:spPr>
+                </pic:pic>
+              </a:graphicData>
+            </a:graphic>
+          </wp:inline>
+        </w:drawing>
+      </w:r>
+    </w:p>
+    <w:p>
+      <w:pPr>
+        <w:rPr>
+          <w:color w:val="000000" w:themeColor="text1"/>
+          <w:sz w:val="24"/>
+          <w:szCs w:val="24"/>
+        </w:rPr>
+      </w:pPr>
+      <w:r>
+        <w:rPr>
+          <w:color w:val="000000" w:themeColor="text1"/>
+          <w:sz w:val="24"/>
+          <w:szCs w:val="24"/>
+        </w:rPr>
+        <w:t xml:space="preserve">47- Inserimos a </w:t>
+      </w:r>
+      <w:proofErr w:type="spellStart"/>
+      <w:r>
+        <w:rPr>
+          <w:color w:val="000000" w:themeColor="text1"/>
+          <w:sz w:val="24"/>
+          <w:szCs w:val="24"/>
+        </w:rPr>
+        <w:t>label</w:t>
+      </w:r>
+      <w:proofErr w:type="spellEnd"/>
+      <w:r>
+        <w:rPr>
+          <w:color w:val="000000" w:themeColor="text1"/>
+          <w:sz w:val="24"/>
+          <w:szCs w:val="24"/>
+        </w:rPr>
+        <w:t xml:space="preserve"> e o input tipo </w:t>
+      </w:r>
+      <w:proofErr w:type="spellStart"/>
+      <w:r>
+        <w:rPr>
+          <w:color w:val="000000" w:themeColor="text1"/>
+          <w:sz w:val="24"/>
+          <w:szCs w:val="24"/>
+        </w:rPr>
+        <w:t>checkbox</w:t>
+      </w:r>
+      <w:proofErr w:type="spellEnd"/>
+    </w:p>
+    <w:p>
+      <w:pPr>
+        <w:rPr>
+          <w:color w:val="000000" w:themeColor="text1"/>
+          <w:sz w:val="24"/>
+          <w:szCs w:val="24"/>
+        </w:rPr>
+      </w:pPr>
+      <w:r>
+        <w:rPr>
+          <w:noProof/>
+          <w:color w:val="000000" w:themeColor="text1"/>
+          <w:sz w:val="24"/>
+          <w:szCs w:val="24"/>
+        </w:rPr>
+        <w:drawing>
+          <wp:inline distT="0" distB="0" distL="0" distR="0" wp14:anchorId="2262666A">
+            <wp:extent cx="5782310" cy="457200"/>
+            <wp:effectExtent l="0" t="0" r="8890" b="0"/>
+            <wp:docPr id="80" name="Imagem 80"/>
+            <wp:cNvGraphicFramePr>
+              <a:graphicFrameLocks xmlns:a="http://schemas.openxmlformats.org/drawingml/2006/main" noChangeAspect="1"/>
+            </wp:cNvGraphicFramePr>
+            <a:graphic xmlns:a="http://schemas.openxmlformats.org/drawingml/2006/main">
+              <a:graphicData uri="http://schemas.openxmlformats.org/drawingml/2006/picture">
+                <pic:pic xmlns:pic="http://schemas.openxmlformats.org/drawingml/2006/picture">
+                  <pic:nvPicPr>
+                    <pic:cNvPr id="0" name="Picture 7"/>
+                    <pic:cNvPicPr>
+                      <a:picLocks noChangeAspect="1" noChangeArrowheads="1"/>
+                    </pic:cNvPicPr>
+                  </pic:nvPicPr>
+                  <pic:blipFill>
+                    <a:blip r:embed="rId79">
+                      <a:extLst>
+                        <a:ext uri="{28A0092B-C50C-407E-A947-70E740481C1C}">
+                          <a14:useLocalDpi xmlns:a14="http://schemas.microsoft.com/office/drawing/2010/main" val="0"/>
+                        </a:ext>
+                      </a:extLst>
+                    </a:blip>
+                    <a:srcRect/>
+                    <a:stretch>
+                      <a:fillRect/>
+                    </a:stretch>
+                  </pic:blipFill>
+                  <pic:spPr bwMode="auto">
+                    <a:xfrm>
+                      <a:off x="0" y="0"/>
+                      <a:ext cx="5782310" cy="457200"/>
+                    </a:xfrm>
+                    <a:prstGeom prst="rect">
+                      <a:avLst/>
+                    </a:prstGeom>
+                    <a:noFill/>
+                  </pic:spPr>
+                </pic:pic>
+              </a:graphicData>
+            </a:graphic>
+          </wp:inline>
+        </w:drawing>
+      </w:r>
       <w:bookmarkStart w:id="0" w:name="_GoBack"/>
+      <w:r>
+        <w:rPr>
+          <w:noProof/>
+          <w:color w:val="000000" w:themeColor="text1"/>
+          <w:sz w:val="24"/>
+          <w:szCs w:val="24"/>
+        </w:rPr>
+        <w:drawing>
+          <wp:inline distT="0" distB="0" distL="0" distR="0" wp14:anchorId="38C5304C">
+            <wp:extent cx="3801110" cy="619125"/>
+            <wp:effectExtent l="0" t="0" r="8890" b="9525"/>
+            <wp:docPr id="82" name="Imagem 82"/>
+            <wp:cNvGraphicFramePr>
+              <a:graphicFrameLocks xmlns:a="http://schemas.openxmlformats.org/drawingml/2006/main" noChangeAspect="1"/>
+            </wp:cNvGraphicFramePr>
+            <a:graphic xmlns:a="http://schemas.openxmlformats.org/drawingml/2006/main">
+              <a:graphicData uri="http://schemas.openxmlformats.org/drawingml/2006/picture">
+                <pic:pic xmlns:pic="http://schemas.openxmlformats.org/drawingml/2006/picture">
+                  <pic:nvPicPr>
+                    <pic:cNvPr id="0" name="Picture 9"/>
+                    <pic:cNvPicPr>
+                      <a:picLocks noChangeAspect="1" noChangeArrowheads="1"/>
+                    </pic:cNvPicPr>
+                  </pic:nvPicPr>
+                  <pic:blipFill>
+                    <a:blip r:embed="rId80">
+                      <a:extLst>
+                        <a:ext uri="{28A0092B-C50C-407E-A947-70E740481C1C}">
+                          <a14:useLocalDpi xmlns:a14="http://schemas.microsoft.com/office/drawing/2010/main" val="0"/>
+                        </a:ext>
+                      </a:extLst>
+                    </a:blip>
+                    <a:srcRect/>
+                    <a:stretch>
+                      <a:fillRect/>
+                    </a:stretch>
+                  </pic:blipFill>
+                  <pic:spPr bwMode="auto">
+                    <a:xfrm>
+                      <a:off x="0" y="0"/>
+                      <a:ext cx="3801110" cy="619125"/>
+                    </a:xfrm>
+                    <a:prstGeom prst="rect">
+                      <a:avLst/>
+                    </a:prstGeom>
+                    <a:noFill/>
+                  </pic:spPr>
+                </pic:pic>
+              </a:graphicData>
+            </a:graphic>
+          </wp:inline>
+        </w:drawing>
+      </w:r>
       <w:bookmarkEnd w:id="0"/>
+    </w:p>
+    <w:p>
+      <w:pPr>
+        <w:rPr>
+          <w:color w:val="000000" w:themeColor="text1"/>
+          <w:sz w:val="24"/>
+          <w:szCs w:val="24"/>
+        </w:rPr>
+      </w:pPr>
+      <w:r>
+        <w:rPr>
+          <w:color w:val="000000" w:themeColor="text1"/>
+          <w:sz w:val="24"/>
+          <w:szCs w:val="24"/>
+        </w:rPr>
+        <w:t xml:space="preserve">48- </w:t>
+      </w:r>
     </w:p>
     <w:p>
       <w:pPr>
@@ -9422,7 +10592,7 @@
 </file>
 
 <file path=customXml/itemProps1.xml><?xml version="1.0" encoding="utf-8"?>
-<ds:datastoreItem xmlns:ds="http://schemas.openxmlformats.org/officeDocument/2006/customXml" ds:itemID="{39A0C819-460B-4E60-A4A7-BCFBC445B0D1}">
+<ds:datastoreItem xmlns:ds="http://schemas.openxmlformats.org/officeDocument/2006/customXml" ds:itemID="{08B7810A-1E52-4497-B5AF-A7CA24864551}">
   <ds:schemaRefs>
     <ds:schemaRef ds:uri="http://schemas.openxmlformats.org/officeDocument/2006/bibliography"/>
   </ds:schemaRefs>

</xml_diff>

<commit_message>
atualizando o aula do dia 28/09
</commit_message>
<xml_diff>
--- a/Apostila/Apostila Space For Men.docx
+++ b/Apostila/Apostila Space For Men.docx
@@ -7993,14 +7993,6 @@
         </w:rPr>
         <w:t>main</w:t>
       </w:r>
-      <w:r>
-        <w:rPr>
-          <w:color w:val="000000" w:themeColor="text1"/>
-          <w:sz w:val="24"/>
-          <w:szCs w:val="24"/>
-        </w:rPr>
-        <w:t>,</w:t>
-      </w:r>
       <w:proofErr w:type="spellEnd"/>
       <w:r>
         <w:rPr>
@@ -8008,7 +8000,7 @@
           <w:sz w:val="24"/>
           <w:szCs w:val="24"/>
         </w:rPr>
-        <w:t xml:space="preserve"> com isso para poder centralizar o formulário utilizando </w:t>
+        <w:t xml:space="preserve">, com isso para poder centralizar o formulário utilizando </w:t>
       </w:r>
       <w:r>
         <w:rPr>
@@ -8144,6 +8136,7 @@
       </w:pPr>
       <w:r>
         <w:rPr>
+          <w:noProof/>
           <w:color w:val="000000" w:themeColor="text1"/>
           <w:sz w:val="24"/>
           <w:szCs w:val="24"/>
@@ -8345,6 +8338,7 @@
       </w:r>
       <w:r>
         <w:rPr>
+          <w:noProof/>
           <w:color w:val="000000" w:themeColor="text1"/>
           <w:sz w:val="24"/>
           <w:szCs w:val="24"/>
@@ -8921,7 +8915,6 @@
           </wp:inline>
         </w:drawing>
       </w:r>
-      <w:bookmarkStart w:id="0" w:name="_GoBack"/>
       <w:r>
         <w:rPr>
           <w:noProof/>
@@ -8975,6 +8968,1935 @@
           </wp:inline>
         </w:drawing>
       </w:r>
+    </w:p>
+    <w:p>
+      <w:pPr>
+        <w:rPr>
+          <w:color w:val="000000" w:themeColor="text1"/>
+          <w:sz w:val="24"/>
+          <w:szCs w:val="24"/>
+        </w:rPr>
+      </w:pPr>
+      <w:r>
+        <w:rPr>
+          <w:color w:val="000000" w:themeColor="text1"/>
+          <w:sz w:val="24"/>
+          <w:szCs w:val="24"/>
+        </w:rPr>
+        <w:t xml:space="preserve">48- </w:t>
+      </w:r>
+      <w:r>
+        <w:rPr>
+          <w:color w:val="000000" w:themeColor="text1"/>
+          <w:sz w:val="24"/>
+          <w:szCs w:val="24"/>
+        </w:rPr>
+        <w:t xml:space="preserve">Para colocar os inputs </w:t>
+      </w:r>
+      <w:r>
+        <w:rPr>
+          <w:color w:val="000000" w:themeColor="text1"/>
+          <w:sz w:val="24"/>
+          <w:szCs w:val="24"/>
+        </w:rPr>
+        <w:t>radio-box e o input-</w:t>
+      </w:r>
+      <w:proofErr w:type="spellStart"/>
+      <w:r>
+        <w:rPr>
+          <w:color w:val="000000" w:themeColor="text1"/>
+          <w:sz w:val="24"/>
+          <w:szCs w:val="24"/>
+        </w:rPr>
+        <w:t>checkbox</w:t>
+      </w:r>
+      <w:proofErr w:type="spellEnd"/>
+      <w:r>
+        <w:rPr>
+          <w:color w:val="000000" w:themeColor="text1"/>
+          <w:sz w:val="24"/>
+          <w:szCs w:val="24"/>
+        </w:rPr>
+        <w:t xml:space="preserve"> na frente da </w:t>
+      </w:r>
+      <w:proofErr w:type="spellStart"/>
+      <w:r>
+        <w:rPr>
+          <w:color w:val="000000" w:themeColor="text1"/>
+          <w:sz w:val="24"/>
+          <w:szCs w:val="24"/>
+        </w:rPr>
+        <w:t>label</w:t>
+      </w:r>
+      <w:proofErr w:type="spellEnd"/>
+      <w:r>
+        <w:rPr>
+          <w:color w:val="000000" w:themeColor="text1"/>
+          <w:sz w:val="24"/>
+          <w:szCs w:val="24"/>
+        </w:rPr>
+        <w:t xml:space="preserve"> inserimos </w:t>
+      </w:r>
+      <w:proofErr w:type="gramStart"/>
+      <w:r>
+        <w:rPr>
+          <w:color w:val="000000" w:themeColor="text1"/>
+          <w:sz w:val="24"/>
+          <w:szCs w:val="24"/>
+        </w:rPr>
+        <w:t>o inputs</w:t>
+      </w:r>
+      <w:proofErr w:type="gramEnd"/>
+      <w:r>
+        <w:rPr>
+          <w:color w:val="000000" w:themeColor="text1"/>
+          <w:sz w:val="24"/>
+          <w:szCs w:val="24"/>
+        </w:rPr>
+        <w:t xml:space="preserve"> dentro da </w:t>
+      </w:r>
+      <w:proofErr w:type="spellStart"/>
+      <w:r>
+        <w:rPr>
+          <w:color w:val="000000" w:themeColor="text1"/>
+          <w:sz w:val="24"/>
+          <w:szCs w:val="24"/>
+        </w:rPr>
+        <w:t>label</w:t>
+      </w:r>
+      <w:proofErr w:type="spellEnd"/>
+      <w:r>
+        <w:rPr>
+          <w:color w:val="000000" w:themeColor="text1"/>
+          <w:sz w:val="24"/>
+          <w:szCs w:val="24"/>
+        </w:rPr>
+        <w:t xml:space="preserve"> conforme o código abaixo:</w:t>
+      </w:r>
+    </w:p>
+    <w:p>
+      <w:pPr>
+        <w:rPr>
+          <w:color w:val="000000" w:themeColor="text1"/>
+          <w:sz w:val="24"/>
+          <w:szCs w:val="24"/>
+        </w:rPr>
+      </w:pPr>
+      <w:r>
+        <w:rPr>
+          <w:noProof/>
+          <w:color w:val="000000" w:themeColor="text1"/>
+          <w:sz w:val="24"/>
+          <w:szCs w:val="24"/>
+        </w:rPr>
+        <w:drawing>
+          <wp:inline distT="0" distB="0" distL="0" distR="0" wp14:anchorId="16EBFDED" wp14:editId="3782FD63">
+            <wp:extent cx="6019800" cy="2947576"/>
+            <wp:effectExtent l="0" t="0" r="0" b="5715"/>
+            <wp:docPr id="83" name="Imagem 83"/>
+            <wp:cNvGraphicFramePr>
+              <a:graphicFrameLocks xmlns:a="http://schemas.openxmlformats.org/drawingml/2006/main" noChangeAspect="1"/>
+            </wp:cNvGraphicFramePr>
+            <a:graphic xmlns:a="http://schemas.openxmlformats.org/drawingml/2006/main">
+              <a:graphicData uri="http://schemas.openxmlformats.org/drawingml/2006/picture">
+                <pic:pic xmlns:pic="http://schemas.openxmlformats.org/drawingml/2006/picture">
+                  <pic:nvPicPr>
+                    <pic:cNvPr id="1" name=""/>
+                    <pic:cNvPicPr/>
+                  </pic:nvPicPr>
+                  <pic:blipFill>
+                    <a:blip r:embed="rId81"/>
+                    <a:stretch>
+                      <a:fillRect/>
+                    </a:stretch>
+                  </pic:blipFill>
+                  <pic:spPr>
+                    <a:xfrm>
+                      <a:off x="0" y="0"/>
+                      <a:ext cx="6089265" cy="2981589"/>
+                    </a:xfrm>
+                    <a:prstGeom prst="rect">
+                      <a:avLst/>
+                    </a:prstGeom>
+                  </pic:spPr>
+                </pic:pic>
+              </a:graphicData>
+            </a:graphic>
+          </wp:inline>
+        </w:drawing>
+      </w:r>
+    </w:p>
+    <w:p>
+      <w:pPr>
+        <w:rPr>
+          <w:color w:val="000000" w:themeColor="text1"/>
+          <w:sz w:val="24"/>
+          <w:szCs w:val="24"/>
+        </w:rPr>
+      </w:pPr>
+      <w:r>
+        <w:rPr>
+          <w:color w:val="000000" w:themeColor="text1"/>
+          <w:sz w:val="24"/>
+          <w:szCs w:val="24"/>
+        </w:rPr>
+        <w:t xml:space="preserve">49- Ao colocar os inputs dentro da </w:t>
+      </w:r>
+      <w:proofErr w:type="spellStart"/>
+      <w:r>
+        <w:rPr>
+          <w:color w:val="000000" w:themeColor="text1"/>
+          <w:sz w:val="24"/>
+          <w:szCs w:val="24"/>
+        </w:rPr>
+        <w:t>label</w:t>
+      </w:r>
+      <w:proofErr w:type="spellEnd"/>
+      <w:r>
+        <w:rPr>
+          <w:color w:val="000000" w:themeColor="text1"/>
+          <w:sz w:val="24"/>
+          <w:szCs w:val="24"/>
+        </w:rPr>
+        <w:t xml:space="preserve"> no código conforme o código acima se fez necessário criar uma </w:t>
+      </w:r>
+      <w:proofErr w:type="spellStart"/>
+      <w:r>
+        <w:rPr>
+          <w:color w:val="000000" w:themeColor="text1"/>
+          <w:sz w:val="24"/>
+          <w:szCs w:val="24"/>
+        </w:rPr>
+        <w:t>class</w:t>
+      </w:r>
+      <w:proofErr w:type="spellEnd"/>
+      <w:r>
+        <w:rPr>
+          <w:color w:val="000000" w:themeColor="text1"/>
+          <w:sz w:val="24"/>
+          <w:szCs w:val="24"/>
+        </w:rPr>
+        <w:t xml:space="preserve"> para formatar os outros inputs para coloca-los em </w:t>
+      </w:r>
+      <w:proofErr w:type="spellStart"/>
+      <w:r>
+        <w:rPr>
+          <w:color w:val="000000" w:themeColor="text1"/>
+          <w:sz w:val="24"/>
+          <w:szCs w:val="24"/>
+        </w:rPr>
+        <w:t>block</w:t>
+      </w:r>
+      <w:proofErr w:type="spellEnd"/>
+      <w:r>
+        <w:rPr>
+          <w:color w:val="000000" w:themeColor="text1"/>
+          <w:sz w:val="24"/>
+          <w:szCs w:val="24"/>
+        </w:rPr>
+        <w:t>.</w:t>
+      </w:r>
+    </w:p>
+    <w:p>
+      <w:pPr>
+        <w:rPr>
+          <w:color w:val="000000" w:themeColor="text1"/>
+          <w:sz w:val="24"/>
+          <w:szCs w:val="24"/>
+        </w:rPr>
+      </w:pPr>
+      <w:r>
+        <w:rPr>
+          <w:noProof/>
+          <w:color w:val="000000" w:themeColor="text1"/>
+          <w:sz w:val="24"/>
+          <w:szCs w:val="24"/>
+        </w:rPr>
+        <w:drawing>
+          <wp:inline distT="0" distB="0" distL="0" distR="0" wp14:anchorId="420A9F6E" wp14:editId="2C93204B">
+            <wp:extent cx="2124075" cy="2265940"/>
+            <wp:effectExtent l="0" t="0" r="0" b="1270"/>
+            <wp:docPr id="86" name="Imagem 86"/>
+            <wp:cNvGraphicFramePr>
+              <a:graphicFrameLocks xmlns:a="http://schemas.openxmlformats.org/drawingml/2006/main" noChangeAspect="1"/>
+            </wp:cNvGraphicFramePr>
+            <a:graphic xmlns:a="http://schemas.openxmlformats.org/drawingml/2006/main">
+              <a:graphicData uri="http://schemas.openxmlformats.org/drawingml/2006/picture">
+                <pic:pic xmlns:pic="http://schemas.openxmlformats.org/drawingml/2006/picture">
+                  <pic:nvPicPr>
+                    <pic:cNvPr id="0" name="Picture 4"/>
+                    <pic:cNvPicPr>
+                      <a:picLocks noChangeAspect="1" noChangeArrowheads="1"/>
+                    </pic:cNvPicPr>
+                  </pic:nvPicPr>
+                  <pic:blipFill>
+                    <a:blip r:embed="rId82">
+                      <a:extLst>
+                        <a:ext uri="{28A0092B-C50C-407E-A947-70E740481C1C}">
+                          <a14:useLocalDpi xmlns:a14="http://schemas.microsoft.com/office/drawing/2010/main" val="0"/>
+                        </a:ext>
+                      </a:extLst>
+                    </a:blip>
+                    <a:srcRect/>
+                    <a:stretch>
+                      <a:fillRect/>
+                    </a:stretch>
+                  </pic:blipFill>
+                  <pic:spPr bwMode="auto">
+                    <a:xfrm>
+                      <a:off x="0" y="0"/>
+                      <a:ext cx="2133129" cy="2275599"/>
+                    </a:xfrm>
+                    <a:prstGeom prst="rect">
+                      <a:avLst/>
+                    </a:prstGeom>
+                    <a:noFill/>
+                  </pic:spPr>
+                </pic:pic>
+              </a:graphicData>
+            </a:graphic>
+          </wp:inline>
+        </w:drawing>
+      </w:r>
+      <w:r>
+        <w:rPr>
+          <w:noProof/>
+          <w:color w:val="000000" w:themeColor="text1"/>
+          <w:sz w:val="24"/>
+          <w:szCs w:val="24"/>
+        </w:rPr>
+        <w:drawing>
+          <wp:inline distT="0" distB="0" distL="0" distR="0" wp14:anchorId="6AFCB0D5" wp14:editId="7B18BB5C">
+            <wp:extent cx="3657600" cy="1502445"/>
+            <wp:effectExtent l="0" t="0" r="0" b="2540"/>
+            <wp:docPr id="85" name="Imagem 85"/>
+            <wp:cNvGraphicFramePr>
+              <a:graphicFrameLocks xmlns:a="http://schemas.openxmlformats.org/drawingml/2006/main" noChangeAspect="1"/>
+            </wp:cNvGraphicFramePr>
+            <a:graphic xmlns:a="http://schemas.openxmlformats.org/drawingml/2006/main">
+              <a:graphicData uri="http://schemas.openxmlformats.org/drawingml/2006/picture">
+                <pic:pic xmlns:pic="http://schemas.openxmlformats.org/drawingml/2006/picture">
+                  <pic:nvPicPr>
+                    <pic:cNvPr id="0" name="Picture 3"/>
+                    <pic:cNvPicPr>
+                      <a:picLocks noChangeAspect="1" noChangeArrowheads="1"/>
+                    </pic:cNvPicPr>
+                  </pic:nvPicPr>
+                  <pic:blipFill>
+                    <a:blip r:embed="rId83">
+                      <a:extLst>
+                        <a:ext uri="{28A0092B-C50C-407E-A947-70E740481C1C}">
+                          <a14:useLocalDpi xmlns:a14="http://schemas.microsoft.com/office/drawing/2010/main" val="0"/>
+                        </a:ext>
+                      </a:extLst>
+                    </a:blip>
+                    <a:srcRect/>
+                    <a:stretch>
+                      <a:fillRect/>
+                    </a:stretch>
+                  </pic:blipFill>
+                  <pic:spPr bwMode="auto">
+                    <a:xfrm>
+                      <a:off x="0" y="0"/>
+                      <a:ext cx="3687313" cy="1514650"/>
+                    </a:xfrm>
+                    <a:prstGeom prst="rect">
+                      <a:avLst/>
+                    </a:prstGeom>
+                    <a:noFill/>
+                  </pic:spPr>
+                </pic:pic>
+              </a:graphicData>
+            </a:graphic>
+          </wp:inline>
+        </w:drawing>
+      </w:r>
+      <w:r>
+        <w:rPr>
+          <w:noProof/>
+          <w:color w:val="000000" w:themeColor="text1"/>
+          <w:sz w:val="24"/>
+          <w:szCs w:val="24"/>
+        </w:rPr>
+        <w:drawing>
+          <wp:inline distT="0" distB="0" distL="0" distR="0" wp14:anchorId="6A3E421F">
+            <wp:extent cx="1828800" cy="1171575"/>
+            <wp:effectExtent l="0" t="0" r="0" b="9525"/>
+            <wp:docPr id="84" name="Imagem 84"/>
+            <wp:cNvGraphicFramePr>
+              <a:graphicFrameLocks xmlns:a="http://schemas.openxmlformats.org/drawingml/2006/main" noChangeAspect="1"/>
+            </wp:cNvGraphicFramePr>
+            <a:graphic xmlns:a="http://schemas.openxmlformats.org/drawingml/2006/main">
+              <a:graphicData uri="http://schemas.openxmlformats.org/drawingml/2006/picture">
+                <pic:pic xmlns:pic="http://schemas.openxmlformats.org/drawingml/2006/picture">
+                  <pic:nvPicPr>
+                    <pic:cNvPr id="0" name="Picture 2"/>
+                    <pic:cNvPicPr>
+                      <a:picLocks noChangeAspect="1" noChangeArrowheads="1"/>
+                    </pic:cNvPicPr>
+                  </pic:nvPicPr>
+                  <pic:blipFill>
+                    <a:blip r:embed="rId84">
+                      <a:extLst>
+                        <a:ext uri="{28A0092B-C50C-407E-A947-70E740481C1C}">
+                          <a14:useLocalDpi xmlns:a14="http://schemas.microsoft.com/office/drawing/2010/main" val="0"/>
+                        </a:ext>
+                      </a:extLst>
+                    </a:blip>
+                    <a:srcRect/>
+                    <a:stretch>
+                      <a:fillRect/>
+                    </a:stretch>
+                  </pic:blipFill>
+                  <pic:spPr bwMode="auto">
+                    <a:xfrm>
+                      <a:off x="0" y="0"/>
+                      <a:ext cx="1828800" cy="1171575"/>
+                    </a:xfrm>
+                    <a:prstGeom prst="rect">
+                      <a:avLst/>
+                    </a:prstGeom>
+                    <a:noFill/>
+                  </pic:spPr>
+                </pic:pic>
+              </a:graphicData>
+            </a:graphic>
+          </wp:inline>
+        </w:drawing>
+      </w:r>
+    </w:p>
+    <w:p>
+      <w:pPr>
+        <w:rPr>
+          <w:color w:val="000000" w:themeColor="text1"/>
+          <w:sz w:val="24"/>
+          <w:szCs w:val="24"/>
+        </w:rPr>
+      </w:pPr>
+      <w:r>
+        <w:rPr>
+          <w:color w:val="000000" w:themeColor="text1"/>
+          <w:sz w:val="24"/>
+          <w:szCs w:val="24"/>
+        </w:rPr>
+        <w:t xml:space="preserve">50- </w:t>
+      </w:r>
+      <w:r>
+        <w:rPr>
+          <w:color w:val="000000" w:themeColor="text1"/>
+          <w:sz w:val="24"/>
+          <w:szCs w:val="24"/>
+        </w:rPr>
+        <w:t xml:space="preserve">Adicionamos o </w:t>
+      </w:r>
+      <w:proofErr w:type="spellStart"/>
+      <w:r>
+        <w:rPr>
+          <w:color w:val="000000" w:themeColor="text1"/>
+          <w:sz w:val="24"/>
+          <w:szCs w:val="24"/>
+        </w:rPr>
+        <w:t>select</w:t>
+      </w:r>
+      <w:proofErr w:type="spellEnd"/>
+      <w:r>
+        <w:rPr>
+          <w:color w:val="000000" w:themeColor="text1"/>
+          <w:sz w:val="24"/>
+          <w:szCs w:val="24"/>
+        </w:rPr>
+        <w:t xml:space="preserve"> e a legenda na nossa página conforme código abaixo:</w:t>
+      </w:r>
+    </w:p>
+    <w:p>
+      <w:pPr>
+        <w:rPr>
+          <w:color w:val="000000" w:themeColor="text1"/>
+          <w:sz w:val="24"/>
+          <w:szCs w:val="24"/>
+        </w:rPr>
+      </w:pPr>
+      <w:r>
+        <w:rPr>
+          <w:noProof/>
+          <w:color w:val="000000" w:themeColor="text1"/>
+          <w:sz w:val="24"/>
+          <w:szCs w:val="24"/>
+        </w:rPr>
+        <w:drawing>
+          <wp:inline distT="0" distB="0" distL="0" distR="0" wp14:anchorId="24845FA4">
+            <wp:extent cx="3048000" cy="924862"/>
+            <wp:effectExtent l="0" t="0" r="0" b="8890"/>
+            <wp:docPr id="87" name="Imagem 87"/>
+            <wp:cNvGraphicFramePr>
+              <a:graphicFrameLocks xmlns:a="http://schemas.openxmlformats.org/drawingml/2006/main" noChangeAspect="1"/>
+            </wp:cNvGraphicFramePr>
+            <a:graphic xmlns:a="http://schemas.openxmlformats.org/drawingml/2006/main">
+              <a:graphicData uri="http://schemas.openxmlformats.org/drawingml/2006/picture">
+                <pic:pic xmlns:pic="http://schemas.openxmlformats.org/drawingml/2006/picture">
+                  <pic:nvPicPr>
+                    <pic:cNvPr id="0" name="Picture 5"/>
+                    <pic:cNvPicPr>
+                      <a:picLocks noChangeAspect="1" noChangeArrowheads="1"/>
+                    </pic:cNvPicPr>
+                  </pic:nvPicPr>
+                  <pic:blipFill>
+                    <a:blip r:embed="rId85">
+                      <a:extLst>
+                        <a:ext uri="{28A0092B-C50C-407E-A947-70E740481C1C}">
+                          <a14:useLocalDpi xmlns:a14="http://schemas.microsoft.com/office/drawing/2010/main" val="0"/>
+                        </a:ext>
+                      </a:extLst>
+                    </a:blip>
+                    <a:srcRect/>
+                    <a:stretch>
+                      <a:fillRect/>
+                    </a:stretch>
+                  </pic:blipFill>
+                  <pic:spPr bwMode="auto">
+                    <a:xfrm>
+                      <a:off x="0" y="0"/>
+                      <a:ext cx="3072145" cy="932188"/>
+                    </a:xfrm>
+                    <a:prstGeom prst="rect">
+                      <a:avLst/>
+                    </a:prstGeom>
+                    <a:noFill/>
+                  </pic:spPr>
+                </pic:pic>
+              </a:graphicData>
+            </a:graphic>
+          </wp:inline>
+        </w:drawing>
+      </w:r>
+      <w:r>
+        <w:rPr>
+          <w:noProof/>
+          <w:color w:val="000000" w:themeColor="text1"/>
+          <w:sz w:val="24"/>
+          <w:szCs w:val="24"/>
+        </w:rPr>
+        <w:drawing>
+          <wp:inline distT="0" distB="0" distL="0" distR="0" wp14:anchorId="04C4A882">
+            <wp:extent cx="3601085" cy="304800"/>
+            <wp:effectExtent l="0" t="0" r="0" b="0"/>
+            <wp:docPr id="88" name="Imagem 88"/>
+            <wp:cNvGraphicFramePr>
+              <a:graphicFrameLocks xmlns:a="http://schemas.openxmlformats.org/drawingml/2006/main" noChangeAspect="1"/>
+            </wp:cNvGraphicFramePr>
+            <a:graphic xmlns:a="http://schemas.openxmlformats.org/drawingml/2006/main">
+              <a:graphicData uri="http://schemas.openxmlformats.org/drawingml/2006/picture">
+                <pic:pic xmlns:pic="http://schemas.openxmlformats.org/drawingml/2006/picture">
+                  <pic:nvPicPr>
+                    <pic:cNvPr id="0" name="Picture 6"/>
+                    <pic:cNvPicPr>
+                      <a:picLocks noChangeAspect="1" noChangeArrowheads="1"/>
+                    </pic:cNvPicPr>
+                  </pic:nvPicPr>
+                  <pic:blipFill>
+                    <a:blip r:embed="rId86">
+                      <a:extLst>
+                        <a:ext uri="{28A0092B-C50C-407E-A947-70E740481C1C}">
+                          <a14:useLocalDpi xmlns:a14="http://schemas.microsoft.com/office/drawing/2010/main" val="0"/>
+                        </a:ext>
+                      </a:extLst>
+                    </a:blip>
+                    <a:srcRect/>
+                    <a:stretch>
+                      <a:fillRect/>
+                    </a:stretch>
+                  </pic:blipFill>
+                  <pic:spPr bwMode="auto">
+                    <a:xfrm>
+                      <a:off x="0" y="0"/>
+                      <a:ext cx="3601085" cy="304800"/>
+                    </a:xfrm>
+                    <a:prstGeom prst="rect">
+                      <a:avLst/>
+                    </a:prstGeom>
+                    <a:noFill/>
+                  </pic:spPr>
+                </pic:pic>
+              </a:graphicData>
+            </a:graphic>
+          </wp:inline>
+        </w:drawing>
+      </w:r>
+    </w:p>
+    <w:p>
+      <w:pPr>
+        <w:rPr>
+          <w:color w:val="000000" w:themeColor="text1"/>
+          <w:sz w:val="24"/>
+          <w:szCs w:val="24"/>
+        </w:rPr>
+      </w:pPr>
+      <w:r>
+        <w:rPr>
+          <w:color w:val="000000" w:themeColor="text1"/>
+          <w:sz w:val="24"/>
+          <w:szCs w:val="24"/>
+        </w:rPr>
+        <w:t xml:space="preserve">51- </w:t>
+      </w:r>
+      <w:r>
+        <w:rPr>
+          <w:color w:val="000000" w:themeColor="text1"/>
+          <w:sz w:val="24"/>
+          <w:szCs w:val="24"/>
+        </w:rPr>
+        <w:t xml:space="preserve">Colocamos </w:t>
+      </w:r>
+      <w:r>
+        <w:rPr>
+          <w:color w:val="000000" w:themeColor="text1"/>
+          <w:sz w:val="24"/>
+          <w:szCs w:val="24"/>
+        </w:rPr>
+        <w:t>um</w:t>
+      </w:r>
+      <w:r>
+        <w:rPr>
+          <w:color w:val="000000" w:themeColor="text1"/>
+          <w:sz w:val="24"/>
+          <w:szCs w:val="24"/>
+        </w:rPr>
+        <w:t xml:space="preserve"> espaço </w:t>
+      </w:r>
+      <w:r>
+        <w:rPr>
+          <w:color w:val="000000" w:themeColor="text1"/>
+          <w:sz w:val="24"/>
+          <w:szCs w:val="24"/>
+        </w:rPr>
+        <w:t xml:space="preserve">externo para cima e para baixo no </w:t>
+      </w:r>
+      <w:proofErr w:type="spellStart"/>
+      <w:r>
+        <w:rPr>
+          <w:color w:val="000000" w:themeColor="text1"/>
+          <w:sz w:val="24"/>
+          <w:szCs w:val="24"/>
+        </w:rPr>
+        <w:t>checkbox</w:t>
+      </w:r>
+      <w:proofErr w:type="spellEnd"/>
+      <w:r>
+        <w:rPr>
+          <w:color w:val="000000" w:themeColor="text1"/>
+          <w:sz w:val="24"/>
+          <w:szCs w:val="24"/>
+        </w:rPr>
+        <w:t xml:space="preserve"> conforme o código.</w:t>
+      </w:r>
+    </w:p>
+    <w:p>
+      <w:pPr>
+        <w:rPr>
+          <w:color w:val="000000" w:themeColor="text1"/>
+          <w:sz w:val="24"/>
+          <w:szCs w:val="24"/>
+        </w:rPr>
+      </w:pPr>
+      <w:r>
+        <w:rPr>
+          <w:noProof/>
+          <w:color w:val="000000" w:themeColor="text1"/>
+          <w:sz w:val="24"/>
+          <w:szCs w:val="24"/>
+        </w:rPr>
+        <w:drawing>
+          <wp:inline distT="0" distB="0" distL="0" distR="0" wp14:anchorId="5D8AECCB" wp14:editId="35AB1DC2">
+            <wp:extent cx="2838450" cy="851386"/>
+            <wp:effectExtent l="0" t="0" r="0" b="6350"/>
+            <wp:docPr id="90" name="Imagem 90"/>
+            <wp:cNvGraphicFramePr>
+              <a:graphicFrameLocks xmlns:a="http://schemas.openxmlformats.org/drawingml/2006/main" noChangeAspect="1"/>
+            </wp:cNvGraphicFramePr>
+            <a:graphic xmlns:a="http://schemas.openxmlformats.org/drawingml/2006/main">
+              <a:graphicData uri="http://schemas.openxmlformats.org/drawingml/2006/picture">
+                <pic:pic xmlns:pic="http://schemas.openxmlformats.org/drawingml/2006/picture">
+                  <pic:nvPicPr>
+                    <pic:cNvPr id="0" name="Picture 8"/>
+                    <pic:cNvPicPr>
+                      <a:picLocks noChangeAspect="1" noChangeArrowheads="1"/>
+                    </pic:cNvPicPr>
+                  </pic:nvPicPr>
+                  <pic:blipFill>
+                    <a:blip r:embed="rId87">
+                      <a:extLst>
+                        <a:ext uri="{28A0092B-C50C-407E-A947-70E740481C1C}">
+                          <a14:useLocalDpi xmlns:a14="http://schemas.microsoft.com/office/drawing/2010/main" val="0"/>
+                        </a:ext>
+                      </a:extLst>
+                    </a:blip>
+                    <a:srcRect/>
+                    <a:stretch>
+                      <a:fillRect/>
+                    </a:stretch>
+                  </pic:blipFill>
+                  <pic:spPr bwMode="auto">
+                    <a:xfrm>
+                      <a:off x="0" y="0"/>
+                      <a:ext cx="2906364" cy="871757"/>
+                    </a:xfrm>
+                    <a:prstGeom prst="rect">
+                      <a:avLst/>
+                    </a:prstGeom>
+                    <a:noFill/>
+                  </pic:spPr>
+                </pic:pic>
+              </a:graphicData>
+            </a:graphic>
+          </wp:inline>
+        </w:drawing>
+      </w:r>
+      <w:r>
+        <w:rPr>
+          <w:noProof/>
+          <w:color w:val="000000" w:themeColor="text1"/>
+          <w:sz w:val="24"/>
+          <w:szCs w:val="24"/>
+        </w:rPr>
+        <w:drawing>
+          <wp:inline distT="0" distB="0" distL="0" distR="0" wp14:anchorId="52D9A469">
+            <wp:extent cx="1543050" cy="657225"/>
+            <wp:effectExtent l="0" t="0" r="0" b="9525"/>
+            <wp:docPr id="89" name="Imagem 89"/>
+            <wp:cNvGraphicFramePr>
+              <a:graphicFrameLocks xmlns:a="http://schemas.openxmlformats.org/drawingml/2006/main" noChangeAspect="1"/>
+            </wp:cNvGraphicFramePr>
+            <a:graphic xmlns:a="http://schemas.openxmlformats.org/drawingml/2006/main">
+              <a:graphicData uri="http://schemas.openxmlformats.org/drawingml/2006/picture">
+                <pic:pic xmlns:pic="http://schemas.openxmlformats.org/drawingml/2006/picture">
+                  <pic:nvPicPr>
+                    <pic:cNvPr id="0" name="Picture 7"/>
+                    <pic:cNvPicPr>
+                      <a:picLocks noChangeAspect="1" noChangeArrowheads="1"/>
+                    </pic:cNvPicPr>
+                  </pic:nvPicPr>
+                  <pic:blipFill>
+                    <a:blip r:embed="rId88">
+                      <a:extLst>
+                        <a:ext uri="{28A0092B-C50C-407E-A947-70E740481C1C}">
+                          <a14:useLocalDpi xmlns:a14="http://schemas.microsoft.com/office/drawing/2010/main" val="0"/>
+                        </a:ext>
+                      </a:extLst>
+                    </a:blip>
+                    <a:srcRect/>
+                    <a:stretch>
+                      <a:fillRect/>
+                    </a:stretch>
+                  </pic:blipFill>
+                  <pic:spPr bwMode="auto">
+                    <a:xfrm>
+                      <a:off x="0" y="0"/>
+                      <a:ext cx="1543050" cy="657225"/>
+                    </a:xfrm>
+                    <a:prstGeom prst="rect">
+                      <a:avLst/>
+                    </a:prstGeom>
+                    <a:noFill/>
+                  </pic:spPr>
+                </pic:pic>
+              </a:graphicData>
+            </a:graphic>
+          </wp:inline>
+        </w:drawing>
+      </w:r>
+      <w:r>
+        <w:rPr>
+          <w:noProof/>
+          <w:color w:val="000000" w:themeColor="text1"/>
+          <w:sz w:val="24"/>
+          <w:szCs w:val="24"/>
+        </w:rPr>
+        <w:drawing>
+          <wp:inline distT="0" distB="0" distL="0" distR="0" wp14:anchorId="0029E561">
+            <wp:extent cx="8353425" cy="285750"/>
+            <wp:effectExtent l="0" t="0" r="9525" b="0"/>
+            <wp:docPr id="91" name="Imagem 91"/>
+            <wp:cNvGraphicFramePr>
+              <a:graphicFrameLocks xmlns:a="http://schemas.openxmlformats.org/drawingml/2006/main" noChangeAspect="1"/>
+            </wp:cNvGraphicFramePr>
+            <a:graphic xmlns:a="http://schemas.openxmlformats.org/drawingml/2006/main">
+              <a:graphicData uri="http://schemas.openxmlformats.org/drawingml/2006/picture">
+                <pic:pic xmlns:pic="http://schemas.openxmlformats.org/drawingml/2006/picture">
+                  <pic:nvPicPr>
+                    <pic:cNvPr id="0" name="Picture 9"/>
+                    <pic:cNvPicPr>
+                      <a:picLocks noChangeAspect="1" noChangeArrowheads="1"/>
+                    </pic:cNvPicPr>
+                  </pic:nvPicPr>
+                  <pic:blipFill>
+                    <a:blip r:embed="rId89">
+                      <a:extLst>
+                        <a:ext uri="{28A0092B-C50C-407E-A947-70E740481C1C}">
+                          <a14:useLocalDpi xmlns:a14="http://schemas.microsoft.com/office/drawing/2010/main" val="0"/>
+                        </a:ext>
+                      </a:extLst>
+                    </a:blip>
+                    <a:srcRect/>
+                    <a:stretch>
+                      <a:fillRect/>
+                    </a:stretch>
+                  </pic:blipFill>
+                  <pic:spPr bwMode="auto">
+                    <a:xfrm>
+                      <a:off x="0" y="0"/>
+                      <a:ext cx="8353425" cy="285750"/>
+                    </a:xfrm>
+                    <a:prstGeom prst="rect">
+                      <a:avLst/>
+                    </a:prstGeom>
+                    <a:noFill/>
+                  </pic:spPr>
+                </pic:pic>
+              </a:graphicData>
+            </a:graphic>
+          </wp:inline>
+        </w:drawing>
+      </w:r>
+    </w:p>
+    <w:p>
+      <w:pPr>
+        <w:rPr>
+          <w:color w:val="000000" w:themeColor="text1"/>
+          <w:sz w:val="24"/>
+          <w:szCs w:val="24"/>
+        </w:rPr>
+      </w:pPr>
+      <w:r>
+        <w:rPr>
+          <w:noProof/>
+          <w:color w:val="000000" w:themeColor="text1"/>
+          <w:sz w:val="24"/>
+          <w:szCs w:val="24"/>
+        </w:rPr>
+        <mc:AlternateContent>
+          <mc:Choice Requires="wps">
+            <w:drawing>
+              <wp:anchor distT="0" distB="0" distL="114300" distR="114300" simplePos="0" relativeHeight="251681792" behindDoc="0" locked="0" layoutInCell="1" allowOverlap="1">
+                <wp:simplePos x="0" y="0"/>
+                <wp:positionH relativeFrom="column">
+                  <wp:posOffset>2132965</wp:posOffset>
+                </wp:positionH>
+                <wp:positionV relativeFrom="paragraph">
+                  <wp:posOffset>106680</wp:posOffset>
+                </wp:positionV>
+                <wp:extent cx="3733800" cy="1819275"/>
+                <wp:effectExtent l="38100" t="0" r="19050" b="66675"/>
+                <wp:wrapNone/>
+                <wp:docPr id="94" name="Conector de Seta Reta 94"/>
+                <wp:cNvGraphicFramePr/>
+                <a:graphic xmlns:a="http://schemas.openxmlformats.org/drawingml/2006/main">
+                  <a:graphicData uri="http://schemas.microsoft.com/office/word/2010/wordprocessingShape">
+                    <wps:wsp>
+                      <wps:cNvCnPr/>
+                      <wps:spPr>
+                        <a:xfrm flipH="1">
+                          <a:off x="0" y="0"/>
+                          <a:ext cx="3733800" cy="1819275"/>
+                        </a:xfrm>
+                        <a:prstGeom prst="straightConnector1">
+                          <a:avLst/>
+                        </a:prstGeom>
+                        <a:ln>
+                          <a:tailEnd type="triangle"/>
+                        </a:ln>
+                      </wps:spPr>
+                      <wps:style>
+                        <a:lnRef idx="1">
+                          <a:schemeClr val="accent1"/>
+                        </a:lnRef>
+                        <a:fillRef idx="0">
+                          <a:schemeClr val="accent1"/>
+                        </a:fillRef>
+                        <a:effectRef idx="0">
+                          <a:schemeClr val="accent1"/>
+                        </a:effectRef>
+                        <a:fontRef idx="minor">
+                          <a:schemeClr val="tx1"/>
+                        </a:fontRef>
+                      </wps:style>
+                      <wps:bodyPr/>
+                    </wps:wsp>
+                  </a:graphicData>
+                </a:graphic>
+                <wp14:sizeRelH relativeFrom="margin">
+                  <wp14:pctWidth>0</wp14:pctWidth>
+                </wp14:sizeRelH>
+                <wp14:sizeRelV relativeFrom="margin">
+                  <wp14:pctHeight>0</wp14:pctHeight>
+                </wp14:sizeRelV>
+              </wp:anchor>
+            </w:drawing>
+          </mc:Choice>
+          <mc:Fallback>
+            <w:pict>
+              <v:shapetype w14:anchorId="63AD2639" id="_x0000_t32" coordsize="21600,21600" o:spt="32" o:oned="t" path="m,l21600,21600e" filled="f">
+                <v:path arrowok="t" fillok="f" o:connecttype="none"/>
+                <o:lock v:ext="edit" shapetype="t"/>
+              </v:shapetype>
+              <v:shape id="Conector de Seta Reta 94" o:spid="_x0000_s1026" type="#_x0000_t32" style="position:absolute;margin-left:167.95pt;margin-top:8.4pt;width:294pt;height:143.25pt;flip:x;z-index:251681792;visibility:visible;mso-wrap-style:square;mso-width-percent:0;mso-height-percent:0;mso-wrap-distance-left:9pt;mso-wrap-distance-top:0;mso-wrap-distance-right:9pt;mso-wrap-distance-bottom:0;mso-position-horizontal:absolute;mso-position-horizontal-relative:text;mso-position-vertical:absolute;mso-position-vertical-relative:text;mso-width-percent:0;mso-height-percent:0;mso-width-relative:margin;mso-height-relative:margin" o:gfxdata="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" strokecolor="#4472c4 [3204]" strokeweight=".5pt">
+                <v:stroke endarrow="block" joinstyle="miter"/>
+              </v:shape>
+            </w:pict>
+          </mc:Fallback>
+        </mc:AlternateContent>
+      </w:r>
+      <w:r>
+        <w:rPr>
+          <w:noProof/>
+          <w:color w:val="000000" w:themeColor="text1"/>
+          <w:sz w:val="24"/>
+          <w:szCs w:val="24"/>
+        </w:rPr>
+        <mc:AlternateContent>
+          <mc:Choice Requires="wps">
+            <w:drawing>
+              <wp:anchor distT="0" distB="0" distL="114300" distR="114300" simplePos="0" relativeHeight="251680768" behindDoc="0" locked="0" layoutInCell="1" allowOverlap="1">
+                <wp:simplePos x="0" y="0"/>
+                <wp:positionH relativeFrom="column">
+                  <wp:posOffset>2276475</wp:posOffset>
+                </wp:positionH>
+                <wp:positionV relativeFrom="paragraph">
+                  <wp:posOffset>163830</wp:posOffset>
+                </wp:positionV>
+                <wp:extent cx="3295650" cy="1181100"/>
+                <wp:effectExtent l="38100" t="0" r="19050" b="76200"/>
+                <wp:wrapNone/>
+                <wp:docPr id="93" name="Conector de Seta Reta 93"/>
+                <wp:cNvGraphicFramePr/>
+                <a:graphic xmlns:a="http://schemas.openxmlformats.org/drawingml/2006/main">
+                  <a:graphicData uri="http://schemas.microsoft.com/office/word/2010/wordprocessingShape">
+                    <wps:wsp>
+                      <wps:cNvCnPr/>
+                      <wps:spPr>
+                        <a:xfrm flipH="1">
+                          <a:off x="0" y="0"/>
+                          <a:ext cx="3295650" cy="1181100"/>
+                        </a:xfrm>
+                        <a:prstGeom prst="straightConnector1">
+                          <a:avLst/>
+                        </a:prstGeom>
+                        <a:ln>
+                          <a:tailEnd type="triangle"/>
+                        </a:ln>
+                      </wps:spPr>
+                      <wps:style>
+                        <a:lnRef idx="1">
+                          <a:schemeClr val="accent1"/>
+                        </a:lnRef>
+                        <a:fillRef idx="0">
+                          <a:schemeClr val="accent1"/>
+                        </a:fillRef>
+                        <a:effectRef idx="0">
+                          <a:schemeClr val="accent1"/>
+                        </a:effectRef>
+                        <a:fontRef idx="minor">
+                          <a:schemeClr val="tx1"/>
+                        </a:fontRef>
+                      </wps:style>
+                      <wps:bodyPr/>
+                    </wps:wsp>
+                  </a:graphicData>
+                </a:graphic>
+              </wp:anchor>
+            </w:drawing>
+          </mc:Choice>
+          <mc:Fallback>
+            <w:pict>
+              <v:shape w14:anchorId="59C65F03" id="Conector de Seta Reta 93" o:spid="_x0000_s1026" type="#_x0000_t32" style="position:absolute;margin-left:179.25pt;margin-top:12.9pt;width:259.5pt;height:93pt;flip:x;z-index:251680768;visibility:visible;mso-wrap-style:square;mso-wrap-distance-left:9pt;mso-wrap-distance-top:0;mso-wrap-distance-right:9pt;mso-wrap-distance-bottom:0;mso-position-horizontal:absolute;mso-position-horizontal-relative:text;mso-position-vertical:absolute;mso-position-vertical-relative:text" o:gfxdata="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" strokecolor="#4472c4 [3204]" strokeweight=".5pt">
+                <v:stroke endarrow="block" joinstyle="miter"/>
+              </v:shape>
+            </w:pict>
+          </mc:Fallback>
+        </mc:AlternateContent>
+      </w:r>
+      <w:r>
+        <w:rPr>
+          <w:color w:val="000000" w:themeColor="text1"/>
+          <w:sz w:val="24"/>
+          <w:szCs w:val="24"/>
+        </w:rPr>
+        <w:t xml:space="preserve">52- </w:t>
+      </w:r>
+      <w:r>
+        <w:rPr>
+          <w:color w:val="000000" w:themeColor="text1"/>
+          <w:sz w:val="24"/>
+          <w:szCs w:val="24"/>
+        </w:rPr>
+        <w:t xml:space="preserve">Trocamos os tipos de inputs de texto para os seus respectivos, como por exemplo </w:t>
+      </w:r>
+      <w:proofErr w:type="spellStart"/>
+      <w:r>
+        <w:rPr>
+          <w:color w:val="000000" w:themeColor="text1"/>
+          <w:sz w:val="24"/>
+          <w:szCs w:val="24"/>
+        </w:rPr>
+        <w:t>email</w:t>
+      </w:r>
+      <w:proofErr w:type="spellEnd"/>
+      <w:r>
+        <w:rPr>
+          <w:color w:val="000000" w:themeColor="text1"/>
+          <w:sz w:val="24"/>
+          <w:szCs w:val="24"/>
+        </w:rPr>
+        <w:t xml:space="preserve">, </w:t>
+      </w:r>
+      <w:proofErr w:type="spellStart"/>
+      <w:r>
+        <w:rPr>
+          <w:color w:val="000000" w:themeColor="text1"/>
+          <w:sz w:val="24"/>
+          <w:szCs w:val="24"/>
+        </w:rPr>
+        <w:t>tel</w:t>
+      </w:r>
+      <w:proofErr w:type="spellEnd"/>
+      <w:r>
+        <w:rPr>
+          <w:color w:val="000000" w:themeColor="text1"/>
+          <w:sz w:val="24"/>
+          <w:szCs w:val="24"/>
+        </w:rPr>
+        <w:t>, para telefone.</w:t>
+      </w:r>
+    </w:p>
+    <w:p>
+      <w:pPr>
+        <w:rPr>
+          <w:color w:val="000000" w:themeColor="text1"/>
+          <w:sz w:val="24"/>
+          <w:szCs w:val="24"/>
+        </w:rPr>
+      </w:pPr>
+      <w:r>
+        <w:rPr>
+          <w:noProof/>
+          <w:color w:val="000000" w:themeColor="text1"/>
+          <w:sz w:val="24"/>
+          <w:szCs w:val="24"/>
+        </w:rPr>
+        <w:drawing>
+          <wp:inline distT="0" distB="0" distL="0" distR="0" wp14:anchorId="1BAE5833">
+            <wp:extent cx="4391660" cy="1828800"/>
+            <wp:effectExtent l="0" t="0" r="8890" b="0"/>
+            <wp:docPr id="92" name="Imagem 92"/>
+            <wp:cNvGraphicFramePr>
+              <a:graphicFrameLocks xmlns:a="http://schemas.openxmlformats.org/drawingml/2006/main" noChangeAspect="1"/>
+            </wp:cNvGraphicFramePr>
+            <a:graphic xmlns:a="http://schemas.openxmlformats.org/drawingml/2006/main">
+              <a:graphicData uri="http://schemas.openxmlformats.org/drawingml/2006/picture">
+                <pic:pic xmlns:pic="http://schemas.openxmlformats.org/drawingml/2006/picture">
+                  <pic:nvPicPr>
+                    <pic:cNvPr id="0" name="Picture 10"/>
+                    <pic:cNvPicPr>
+                      <a:picLocks noChangeAspect="1" noChangeArrowheads="1"/>
+                    </pic:cNvPicPr>
+                  </pic:nvPicPr>
+                  <pic:blipFill>
+                    <a:blip r:embed="rId90">
+                      <a:extLst>
+                        <a:ext uri="{28A0092B-C50C-407E-A947-70E740481C1C}">
+                          <a14:useLocalDpi xmlns:a14="http://schemas.microsoft.com/office/drawing/2010/main" val="0"/>
+                        </a:ext>
+                      </a:extLst>
+                    </a:blip>
+                    <a:srcRect/>
+                    <a:stretch>
+                      <a:fillRect/>
+                    </a:stretch>
+                  </pic:blipFill>
+                  <pic:spPr bwMode="auto">
+                    <a:xfrm>
+                      <a:off x="0" y="0"/>
+                      <a:ext cx="4391660" cy="1828800"/>
+                    </a:xfrm>
+                    <a:prstGeom prst="rect">
+                      <a:avLst/>
+                    </a:prstGeom>
+                    <a:noFill/>
+                  </pic:spPr>
+                </pic:pic>
+              </a:graphicData>
+            </a:graphic>
+          </wp:inline>
+        </w:drawing>
+      </w:r>
+    </w:p>
+    <w:p>
+      <w:pPr>
+        <w:rPr>
+          <w:color w:val="000000" w:themeColor="text1"/>
+          <w:sz w:val="24"/>
+          <w:szCs w:val="24"/>
+        </w:rPr>
+      </w:pPr>
+      <w:r>
+        <w:rPr>
+          <w:color w:val="000000" w:themeColor="text1"/>
+          <w:sz w:val="24"/>
+          <w:szCs w:val="24"/>
+        </w:rPr>
+        <w:t xml:space="preserve">53- </w:t>
+      </w:r>
+      <w:r>
+        <w:rPr>
+          <w:color w:val="000000" w:themeColor="text1"/>
+          <w:sz w:val="24"/>
+          <w:szCs w:val="24"/>
+        </w:rPr>
+        <w:t xml:space="preserve">Para deixar os campos de forma obrigatória inserimos o comando do </w:t>
+      </w:r>
+      <w:proofErr w:type="spellStart"/>
+      <w:r>
+        <w:rPr>
+          <w:color w:val="000000" w:themeColor="text1"/>
+          <w:sz w:val="24"/>
+          <w:szCs w:val="24"/>
+        </w:rPr>
+        <w:t>riquerid</w:t>
+      </w:r>
+      <w:proofErr w:type="spellEnd"/>
+      <w:r>
+        <w:rPr>
+          <w:color w:val="000000" w:themeColor="text1"/>
+          <w:sz w:val="24"/>
+          <w:szCs w:val="24"/>
+        </w:rPr>
+        <w:t xml:space="preserve"> conforme código:</w:t>
+      </w:r>
+    </w:p>
+    <w:p>
+      <w:pPr>
+        <w:rPr>
+          <w:color w:val="000000" w:themeColor="text1"/>
+          <w:sz w:val="24"/>
+          <w:szCs w:val="24"/>
+        </w:rPr>
+      </w:pPr>
+      <w:r>
+        <w:rPr>
+          <w:noProof/>
+          <w:color w:val="000000" w:themeColor="text1"/>
+          <w:sz w:val="24"/>
+          <w:szCs w:val="24"/>
+        </w:rPr>
+        <w:drawing>
+          <wp:inline distT="0" distB="0" distL="0" distR="0" wp14:anchorId="1790EEAC">
+            <wp:extent cx="4629150" cy="1627224"/>
+            <wp:effectExtent l="0" t="0" r="0" b="0"/>
+            <wp:docPr id="95" name="Imagem 95"/>
+            <wp:cNvGraphicFramePr>
+              <a:graphicFrameLocks xmlns:a="http://schemas.openxmlformats.org/drawingml/2006/main" noChangeAspect="1"/>
+            </wp:cNvGraphicFramePr>
+            <a:graphic xmlns:a="http://schemas.openxmlformats.org/drawingml/2006/main">
+              <a:graphicData uri="http://schemas.openxmlformats.org/drawingml/2006/picture">
+                <pic:pic xmlns:pic="http://schemas.openxmlformats.org/drawingml/2006/picture">
+                  <pic:nvPicPr>
+                    <pic:cNvPr id="0" name="Picture 11"/>
+                    <pic:cNvPicPr>
+                      <a:picLocks noChangeAspect="1" noChangeArrowheads="1"/>
+                    </pic:cNvPicPr>
+                  </pic:nvPicPr>
+                  <pic:blipFill>
+                    <a:blip r:embed="rId91">
+                      <a:extLst>
+                        <a:ext uri="{28A0092B-C50C-407E-A947-70E740481C1C}">
+                          <a14:useLocalDpi xmlns:a14="http://schemas.microsoft.com/office/drawing/2010/main" val="0"/>
+                        </a:ext>
+                      </a:extLst>
+                    </a:blip>
+                    <a:srcRect/>
+                    <a:stretch>
+                      <a:fillRect/>
+                    </a:stretch>
+                  </pic:blipFill>
+                  <pic:spPr bwMode="auto">
+                    <a:xfrm>
+                      <a:off x="0" y="0"/>
+                      <a:ext cx="4632818" cy="1628513"/>
+                    </a:xfrm>
+                    <a:prstGeom prst="rect">
+                      <a:avLst/>
+                    </a:prstGeom>
+                    <a:noFill/>
+                  </pic:spPr>
+                </pic:pic>
+              </a:graphicData>
+            </a:graphic>
+          </wp:inline>
+        </w:drawing>
+      </w:r>
+    </w:p>
+    <w:p>
+      <w:pPr>
+        <w:rPr>
+          <w:color w:val="000000" w:themeColor="text1"/>
+          <w:sz w:val="24"/>
+          <w:szCs w:val="24"/>
+        </w:rPr>
+      </w:pPr>
+      <w:r>
+        <w:rPr>
+          <w:color w:val="000000" w:themeColor="text1"/>
+          <w:sz w:val="24"/>
+          <w:szCs w:val="24"/>
+        </w:rPr>
+        <w:t xml:space="preserve">54- Adicionamos o </w:t>
+      </w:r>
+      <w:proofErr w:type="spellStart"/>
+      <w:r>
+        <w:rPr>
+          <w:color w:val="000000" w:themeColor="text1"/>
+          <w:sz w:val="24"/>
+          <w:szCs w:val="24"/>
+        </w:rPr>
+        <w:t>placeholder</w:t>
+      </w:r>
+      <w:proofErr w:type="spellEnd"/>
+      <w:r>
+        <w:rPr>
+          <w:color w:val="000000" w:themeColor="text1"/>
+          <w:sz w:val="24"/>
+          <w:szCs w:val="24"/>
+        </w:rPr>
+        <w:t xml:space="preserve"> para dar um exemplo de como deve ser preenchido o camp</w:t>
+      </w:r>
+      <w:r>
+        <w:rPr>
+          <w:color w:val="000000" w:themeColor="text1"/>
+          <w:sz w:val="24"/>
+          <w:szCs w:val="24"/>
+        </w:rPr>
+        <w:t>o.</w:t>
+      </w:r>
+    </w:p>
+    <w:p>
+      <w:pPr>
+        <w:rPr>
+          <w:color w:val="000000" w:themeColor="text1"/>
+          <w:sz w:val="24"/>
+          <w:szCs w:val="24"/>
+        </w:rPr>
+      </w:pPr>
+      <w:r>
+        <w:rPr>
+          <w:noProof/>
+          <w:color w:val="000000" w:themeColor="text1"/>
+          <w:sz w:val="24"/>
+          <w:szCs w:val="24"/>
+        </w:rPr>
+        <w:drawing>
+          <wp:inline distT="0" distB="0" distL="0" distR="0" wp14:anchorId="52B6E078" wp14:editId="4CCE2C24">
+            <wp:extent cx="3514725" cy="2841788"/>
+            <wp:effectExtent l="0" t="0" r="0" b="0"/>
+            <wp:docPr id="97" name="Imagem 97"/>
+            <wp:cNvGraphicFramePr>
+              <a:graphicFrameLocks xmlns:a="http://schemas.openxmlformats.org/drawingml/2006/main" noChangeAspect="1"/>
+            </wp:cNvGraphicFramePr>
+            <a:graphic xmlns:a="http://schemas.openxmlformats.org/drawingml/2006/main">
+              <a:graphicData uri="http://schemas.openxmlformats.org/drawingml/2006/picture">
+                <pic:pic xmlns:pic="http://schemas.openxmlformats.org/drawingml/2006/picture">
+                  <pic:nvPicPr>
+                    <pic:cNvPr id="0" name="Picture 13"/>
+                    <pic:cNvPicPr>
+                      <a:picLocks noChangeAspect="1" noChangeArrowheads="1"/>
+                    </pic:cNvPicPr>
+                  </pic:nvPicPr>
+                  <pic:blipFill>
+                    <a:blip r:embed="rId92">
+                      <a:extLst>
+                        <a:ext uri="{28A0092B-C50C-407E-A947-70E740481C1C}">
+                          <a14:useLocalDpi xmlns:a14="http://schemas.microsoft.com/office/drawing/2010/main" val="0"/>
+                        </a:ext>
+                      </a:extLst>
+                    </a:blip>
+                    <a:srcRect/>
+                    <a:stretch>
+                      <a:fillRect/>
+                    </a:stretch>
+                  </pic:blipFill>
+                  <pic:spPr bwMode="auto">
+                    <a:xfrm>
+                      <a:off x="0" y="0"/>
+                      <a:ext cx="3532099" cy="2855836"/>
+                    </a:xfrm>
+                    <a:prstGeom prst="rect">
+                      <a:avLst/>
+                    </a:prstGeom>
+                    <a:noFill/>
+                  </pic:spPr>
+                </pic:pic>
+              </a:graphicData>
+            </a:graphic>
+          </wp:inline>
+        </w:drawing>
+      </w:r>
+      <w:r>
+        <w:rPr>
+          <w:noProof/>
+          <w:color w:val="000000" w:themeColor="text1"/>
+          <w:sz w:val="24"/>
+          <w:szCs w:val="24"/>
+        </w:rPr>
+        <w:drawing>
+          <wp:inline distT="0" distB="0" distL="0" distR="0" wp14:anchorId="0C51344C">
+            <wp:extent cx="7545070" cy="1752600"/>
+            <wp:effectExtent l="0" t="0" r="0" b="0"/>
+            <wp:docPr id="96" name="Imagem 96"/>
+            <wp:cNvGraphicFramePr>
+              <a:graphicFrameLocks xmlns:a="http://schemas.openxmlformats.org/drawingml/2006/main" noChangeAspect="1"/>
+            </wp:cNvGraphicFramePr>
+            <a:graphic xmlns:a="http://schemas.openxmlformats.org/drawingml/2006/main">
+              <a:graphicData uri="http://schemas.openxmlformats.org/drawingml/2006/picture">
+                <pic:pic xmlns:pic="http://schemas.openxmlformats.org/drawingml/2006/picture">
+                  <pic:nvPicPr>
+                    <pic:cNvPr id="0" name="Picture 12"/>
+                    <pic:cNvPicPr>
+                      <a:picLocks noChangeAspect="1" noChangeArrowheads="1"/>
+                    </pic:cNvPicPr>
+                  </pic:nvPicPr>
+                  <pic:blipFill>
+                    <a:blip r:embed="rId93">
+                      <a:extLst>
+                        <a:ext uri="{28A0092B-C50C-407E-A947-70E740481C1C}">
+                          <a14:useLocalDpi xmlns:a14="http://schemas.microsoft.com/office/drawing/2010/main" val="0"/>
+                        </a:ext>
+                      </a:extLst>
+                    </a:blip>
+                    <a:srcRect/>
+                    <a:stretch>
+                      <a:fillRect/>
+                    </a:stretch>
+                  </pic:blipFill>
+                  <pic:spPr bwMode="auto">
+                    <a:xfrm>
+                      <a:off x="0" y="0"/>
+                      <a:ext cx="7545070" cy="1752600"/>
+                    </a:xfrm>
+                    <a:prstGeom prst="rect">
+                      <a:avLst/>
+                    </a:prstGeom>
+                    <a:noFill/>
+                  </pic:spPr>
+                </pic:pic>
+              </a:graphicData>
+            </a:graphic>
+          </wp:inline>
+        </w:drawing>
+      </w:r>
+    </w:p>
+    <w:p>
+      <w:pPr>
+        <w:rPr>
+          <w:color w:val="000000" w:themeColor="text1"/>
+          <w:sz w:val="24"/>
+          <w:szCs w:val="24"/>
+        </w:rPr>
+      </w:pPr>
+      <w:r>
+        <w:rPr>
+          <w:color w:val="000000" w:themeColor="text1"/>
+          <w:sz w:val="24"/>
+          <w:szCs w:val="24"/>
+        </w:rPr>
+        <w:t xml:space="preserve">55- </w:t>
+      </w:r>
+      <w:r>
+        <w:rPr>
+          <w:color w:val="000000" w:themeColor="text1"/>
+          <w:sz w:val="24"/>
+          <w:szCs w:val="24"/>
+        </w:rPr>
+        <w:t xml:space="preserve">A </w:t>
+      </w:r>
+      <w:r>
+        <w:rPr>
+          <w:color w:val="000000" w:themeColor="text1"/>
+          <w:sz w:val="24"/>
+          <w:szCs w:val="24"/>
+        </w:rPr>
+        <w:t xml:space="preserve">mesma configuração das </w:t>
+      </w:r>
+      <w:proofErr w:type="spellStart"/>
+      <w:r>
+        <w:rPr>
+          <w:color w:val="000000" w:themeColor="text1"/>
+          <w:sz w:val="24"/>
+          <w:szCs w:val="24"/>
+        </w:rPr>
+        <w:t>label</w:t>
+      </w:r>
+      <w:proofErr w:type="spellEnd"/>
+      <w:r>
+        <w:rPr>
+          <w:color w:val="000000" w:themeColor="text1"/>
+          <w:sz w:val="24"/>
+          <w:szCs w:val="24"/>
+        </w:rPr>
+        <w:t xml:space="preserve"> aplicamos nas </w:t>
+      </w:r>
+      <w:proofErr w:type="spellStart"/>
+      <w:r>
+        <w:rPr>
+          <w:color w:val="000000" w:themeColor="text1"/>
+          <w:sz w:val="24"/>
+          <w:szCs w:val="24"/>
+        </w:rPr>
+        <w:t>legends</w:t>
+      </w:r>
+      <w:proofErr w:type="spellEnd"/>
+      <w:r>
+        <w:rPr>
+          <w:color w:val="000000" w:themeColor="text1"/>
+          <w:sz w:val="24"/>
+          <w:szCs w:val="24"/>
+        </w:rPr>
+        <w:t>.</w:t>
+      </w:r>
+    </w:p>
+    <w:p>
+      <w:pPr>
+        <w:rPr>
+          <w:color w:val="000000" w:themeColor="text1"/>
+          <w:sz w:val="24"/>
+          <w:szCs w:val="24"/>
+        </w:rPr>
+      </w:pPr>
+      <w:r>
+        <w:rPr>
+          <w:color w:val="000000" w:themeColor="text1"/>
+          <w:sz w:val="24"/>
+          <w:szCs w:val="24"/>
+        </w:rPr>
+        <w:drawing>
+          <wp:inline distT="0" distB="0" distL="0" distR="0" wp14:anchorId="318723FC" wp14:editId="5344797B">
+            <wp:extent cx="1810003" cy="981212"/>
+            <wp:effectExtent l="0" t="0" r="0" b="9525"/>
+            <wp:docPr id="98" name="Imagem 98"/>
+            <wp:cNvGraphicFramePr>
+              <a:graphicFrameLocks xmlns:a="http://schemas.openxmlformats.org/drawingml/2006/main" noChangeAspect="1"/>
+            </wp:cNvGraphicFramePr>
+            <a:graphic xmlns:a="http://schemas.openxmlformats.org/drawingml/2006/main">
+              <a:graphicData uri="http://schemas.openxmlformats.org/drawingml/2006/picture">
+                <pic:pic xmlns:pic="http://schemas.openxmlformats.org/drawingml/2006/picture">
+                  <pic:nvPicPr>
+                    <pic:cNvPr id="1" name=""/>
+                    <pic:cNvPicPr/>
+                  </pic:nvPicPr>
+                  <pic:blipFill>
+                    <a:blip r:embed="rId94"/>
+                    <a:stretch>
+                      <a:fillRect/>
+                    </a:stretch>
+                  </pic:blipFill>
+                  <pic:spPr>
+                    <a:xfrm>
+                      <a:off x="0" y="0"/>
+                      <a:ext cx="1810003" cy="981212"/>
+                    </a:xfrm>
+                    <a:prstGeom prst="rect">
+                      <a:avLst/>
+                    </a:prstGeom>
+                  </pic:spPr>
+                </pic:pic>
+              </a:graphicData>
+            </a:graphic>
+          </wp:inline>
+        </w:drawing>
+      </w:r>
+    </w:p>
+    <w:p>
+      <w:pPr>
+        <w:rPr>
+          <w:color w:val="000000" w:themeColor="text1"/>
+          <w:sz w:val="24"/>
+          <w:szCs w:val="24"/>
+        </w:rPr>
+      </w:pPr>
+      <w:r>
+        <w:rPr>
+          <w:color w:val="000000" w:themeColor="text1"/>
+          <w:sz w:val="24"/>
+          <w:szCs w:val="24"/>
+        </w:rPr>
+        <w:t xml:space="preserve">56- </w:t>
+      </w:r>
+      <w:r>
+        <w:rPr>
+          <w:color w:val="000000" w:themeColor="text1"/>
+          <w:sz w:val="24"/>
+          <w:szCs w:val="24"/>
+        </w:rPr>
+        <w:t xml:space="preserve">Adicionamos uma </w:t>
+      </w:r>
+      <w:proofErr w:type="spellStart"/>
+      <w:r>
+        <w:rPr>
+          <w:color w:val="000000" w:themeColor="text1"/>
+          <w:sz w:val="24"/>
+          <w:szCs w:val="24"/>
+        </w:rPr>
+        <w:t>class</w:t>
+      </w:r>
+      <w:proofErr w:type="spellEnd"/>
+      <w:r>
+        <w:rPr>
+          <w:color w:val="000000" w:themeColor="text1"/>
+          <w:sz w:val="24"/>
+          <w:szCs w:val="24"/>
+        </w:rPr>
+        <w:t xml:space="preserve"> </w:t>
+      </w:r>
+      <w:r>
+        <w:rPr>
+          <w:color w:val="000000" w:themeColor="text1"/>
+          <w:sz w:val="24"/>
+          <w:szCs w:val="24"/>
+        </w:rPr>
+        <w:t xml:space="preserve">no botão de enviar com o nome enviar e no </w:t>
+      </w:r>
+      <w:proofErr w:type="spellStart"/>
+      <w:r>
+        <w:rPr>
+          <w:color w:val="000000" w:themeColor="text1"/>
+          <w:sz w:val="24"/>
+          <w:szCs w:val="24"/>
+        </w:rPr>
+        <w:t>css</w:t>
+      </w:r>
+      <w:proofErr w:type="spellEnd"/>
+      <w:r>
+        <w:rPr>
+          <w:color w:val="000000" w:themeColor="text1"/>
+          <w:sz w:val="24"/>
+          <w:szCs w:val="24"/>
+        </w:rPr>
+        <w:t xml:space="preserve"> definimos que o botão teria:</w:t>
+      </w:r>
+    </w:p>
+    <w:p>
+      <w:pPr>
+        <w:pStyle w:val="PargrafodaLista"/>
+        <w:numPr>
+          <w:ilvl w:val="0"/>
+          <w:numId w:val="8"/>
+        </w:numPr>
+        <w:rPr>
+          <w:color w:val="000000" w:themeColor="text1"/>
+          <w:sz w:val="24"/>
+          <w:szCs w:val="24"/>
+        </w:rPr>
+      </w:pPr>
+      <w:r>
+        <w:rPr>
+          <w:color w:val="000000" w:themeColor="text1"/>
+          <w:sz w:val="24"/>
+          <w:szCs w:val="24"/>
+        </w:rPr>
+        <w:t>Ocuparia 40% de largura</w:t>
+      </w:r>
+    </w:p>
+    <w:p>
+      <w:pPr>
+        <w:pStyle w:val="PargrafodaLista"/>
+        <w:numPr>
+          <w:ilvl w:val="0"/>
+          <w:numId w:val="8"/>
+        </w:numPr>
+        <w:rPr>
+          <w:color w:val="000000" w:themeColor="text1"/>
+          <w:sz w:val="24"/>
+          <w:szCs w:val="24"/>
+        </w:rPr>
+      </w:pPr>
+      <w:r>
+        <w:rPr>
+          <w:color w:val="000000" w:themeColor="text1"/>
+          <w:sz w:val="24"/>
+          <w:szCs w:val="24"/>
+        </w:rPr>
+        <w:t>Aumentamos o espaço interno tanto pra cima como pra baixo</w:t>
+      </w:r>
+    </w:p>
+    <w:p>
+      <w:pPr>
+        <w:pStyle w:val="PargrafodaLista"/>
+        <w:numPr>
+          <w:ilvl w:val="0"/>
+          <w:numId w:val="8"/>
+        </w:numPr>
+        <w:rPr>
+          <w:color w:val="000000" w:themeColor="text1"/>
+          <w:sz w:val="24"/>
+          <w:szCs w:val="24"/>
+        </w:rPr>
+      </w:pPr>
+      <w:r>
+        <w:rPr>
+          <w:color w:val="000000" w:themeColor="text1"/>
+          <w:sz w:val="24"/>
+          <w:szCs w:val="24"/>
+        </w:rPr>
+        <w:t>Colocamos uma cor de fundo (Orange)</w:t>
+      </w:r>
+    </w:p>
+    <w:p>
+      <w:pPr>
+        <w:pStyle w:val="PargrafodaLista"/>
+        <w:numPr>
+          <w:ilvl w:val="0"/>
+          <w:numId w:val="8"/>
+        </w:numPr>
+        <w:rPr>
+          <w:color w:val="000000" w:themeColor="text1"/>
+          <w:sz w:val="24"/>
+          <w:szCs w:val="24"/>
+        </w:rPr>
+      </w:pPr>
+      <w:r>
+        <w:rPr>
+          <w:color w:val="000000" w:themeColor="text1"/>
+          <w:sz w:val="24"/>
+          <w:szCs w:val="24"/>
+        </w:rPr>
+        <w:t>Alteramos a cor da letra para (White) branco</w:t>
+      </w:r>
+    </w:p>
+    <w:p>
+      <w:pPr>
+        <w:pStyle w:val="PargrafodaLista"/>
+        <w:numPr>
+          <w:ilvl w:val="0"/>
+          <w:numId w:val="8"/>
+        </w:numPr>
+        <w:rPr>
+          <w:color w:val="000000" w:themeColor="text1"/>
+          <w:sz w:val="24"/>
+          <w:szCs w:val="24"/>
+        </w:rPr>
+      </w:pPr>
+      <w:r>
+        <w:rPr>
+          <w:color w:val="000000" w:themeColor="text1"/>
+          <w:sz w:val="24"/>
+          <w:szCs w:val="24"/>
+        </w:rPr>
+        <w:t>Deixamos a letra mais encorpada (</w:t>
+      </w:r>
+      <w:proofErr w:type="spellStart"/>
+      <w:r>
+        <w:rPr>
+          <w:color w:val="000000" w:themeColor="text1"/>
+          <w:sz w:val="24"/>
+          <w:szCs w:val="24"/>
+        </w:rPr>
+        <w:t>font-weight</w:t>
+      </w:r>
+      <w:proofErr w:type="spellEnd"/>
+      <w:r>
+        <w:rPr>
+          <w:color w:val="000000" w:themeColor="text1"/>
+          <w:sz w:val="24"/>
+          <w:szCs w:val="24"/>
+        </w:rPr>
+        <w:t xml:space="preserve">: </w:t>
+      </w:r>
+      <w:proofErr w:type="spellStart"/>
+      <w:r>
+        <w:rPr>
+          <w:color w:val="000000" w:themeColor="text1"/>
+          <w:sz w:val="24"/>
+          <w:szCs w:val="24"/>
+        </w:rPr>
+        <w:t>bold</w:t>
+      </w:r>
+      <w:proofErr w:type="spellEnd"/>
+      <w:r>
+        <w:rPr>
+          <w:color w:val="000000" w:themeColor="text1"/>
+          <w:sz w:val="24"/>
+          <w:szCs w:val="24"/>
+        </w:rPr>
+        <w:t>)</w:t>
+      </w:r>
+    </w:p>
+    <w:p>
+      <w:pPr>
+        <w:pStyle w:val="PargrafodaLista"/>
+        <w:numPr>
+          <w:ilvl w:val="0"/>
+          <w:numId w:val="8"/>
+        </w:numPr>
+        <w:rPr>
+          <w:color w:val="000000" w:themeColor="text1"/>
+          <w:sz w:val="24"/>
+          <w:szCs w:val="24"/>
+        </w:rPr>
+      </w:pPr>
+      <w:r>
+        <w:rPr>
+          <w:color w:val="000000" w:themeColor="text1"/>
+          <w:sz w:val="24"/>
+          <w:szCs w:val="24"/>
+        </w:rPr>
+        <w:t>Tiramos a borda do botão enviar</w:t>
+      </w:r>
+    </w:p>
+    <w:p>
+      <w:pPr>
+        <w:pStyle w:val="PargrafodaLista"/>
+        <w:numPr>
+          <w:ilvl w:val="0"/>
+          <w:numId w:val="8"/>
+        </w:numPr>
+        <w:rPr>
+          <w:color w:val="000000" w:themeColor="text1"/>
+          <w:sz w:val="24"/>
+          <w:szCs w:val="24"/>
+        </w:rPr>
+      </w:pPr>
+      <w:r>
+        <w:rPr>
+          <w:color w:val="000000" w:themeColor="text1"/>
+          <w:sz w:val="24"/>
+          <w:szCs w:val="24"/>
+        </w:rPr>
+        <w:t>Arredondamos os cantos utilizando</w:t>
+      </w:r>
+      <w:r>
+        <w:rPr>
+          <w:color w:val="000000" w:themeColor="text1"/>
+          <w:sz w:val="24"/>
+          <w:szCs w:val="24"/>
+        </w:rPr>
+        <w:t xml:space="preserve"> </w:t>
+      </w:r>
+      <w:proofErr w:type="spellStart"/>
+      <w:r>
+        <w:rPr>
+          <w:color w:val="000000" w:themeColor="text1"/>
+          <w:sz w:val="24"/>
+          <w:szCs w:val="24"/>
+        </w:rPr>
+        <w:t>border-radius</w:t>
+      </w:r>
+      <w:proofErr w:type="spellEnd"/>
+      <w:r>
+        <w:rPr>
+          <w:color w:val="000000" w:themeColor="text1"/>
+          <w:sz w:val="24"/>
+          <w:szCs w:val="24"/>
+        </w:rPr>
+        <w:t>: 5px</w:t>
+      </w:r>
+    </w:p>
+    <w:p>
+      <w:pPr>
+        <w:pStyle w:val="PargrafodaLista"/>
+        <w:numPr>
+          <w:ilvl w:val="0"/>
+          <w:numId w:val="8"/>
+        </w:numPr>
+        <w:rPr>
+          <w:color w:val="000000" w:themeColor="text1"/>
+          <w:sz w:val="24"/>
+          <w:szCs w:val="24"/>
+        </w:rPr>
+      </w:pPr>
+      <w:r>
+        <w:rPr>
+          <w:color w:val="000000" w:themeColor="text1"/>
+          <w:sz w:val="24"/>
+          <w:szCs w:val="24"/>
+        </w:rPr>
+        <w:t>Ao passar o mouse sobre o botão ele vira mãozinha (cursor-pointer)</w:t>
+      </w:r>
+    </w:p>
+    <w:p>
+      <w:pPr>
+        <w:pStyle w:val="PargrafodaLista"/>
+        <w:numPr>
+          <w:ilvl w:val="0"/>
+          <w:numId w:val="8"/>
+        </w:numPr>
+        <w:rPr>
+          <w:color w:val="000000" w:themeColor="text1"/>
+          <w:sz w:val="24"/>
+          <w:szCs w:val="24"/>
+        </w:rPr>
+      </w:pPr>
+      <w:r>
+        <w:rPr>
+          <w:color w:val="000000" w:themeColor="text1"/>
+          <w:sz w:val="24"/>
+          <w:szCs w:val="24"/>
+        </w:rPr>
+        <w:t xml:space="preserve">Criamos o </w:t>
+      </w:r>
+      <w:r>
+        <w:rPr>
+          <w:color w:val="000000" w:themeColor="text1"/>
+          <w:sz w:val="24"/>
+          <w:szCs w:val="24"/>
+        </w:rPr>
+        <w:t xml:space="preserve">enviar </w:t>
+      </w:r>
+      <w:proofErr w:type="spellStart"/>
+      <w:r>
+        <w:rPr>
+          <w:color w:val="000000" w:themeColor="text1"/>
+          <w:sz w:val="24"/>
+          <w:szCs w:val="24"/>
+        </w:rPr>
+        <w:t>hover</w:t>
+      </w:r>
+      <w:proofErr w:type="spellEnd"/>
+      <w:r>
+        <w:rPr>
+          <w:color w:val="000000" w:themeColor="text1"/>
+          <w:sz w:val="24"/>
+          <w:szCs w:val="24"/>
+        </w:rPr>
+        <w:t xml:space="preserve"> para realizar efeitos em nosso site ao passar o mouse</w:t>
+      </w:r>
+    </w:p>
+    <w:p>
+      <w:pPr>
+        <w:pStyle w:val="PargrafodaLista"/>
+        <w:numPr>
+          <w:ilvl w:val="0"/>
+          <w:numId w:val="8"/>
+        </w:numPr>
+        <w:rPr>
+          <w:color w:val="000000" w:themeColor="text1"/>
+          <w:sz w:val="24"/>
+          <w:szCs w:val="24"/>
+        </w:rPr>
+      </w:pPr>
+      <w:r>
+        <w:rPr>
+          <w:color w:val="000000" w:themeColor="text1"/>
+          <w:sz w:val="24"/>
+          <w:szCs w:val="24"/>
+        </w:rPr>
+        <w:t>Trocar de cor para laranja escuro</w:t>
+      </w:r>
+    </w:p>
+    <w:p>
+      <w:pPr>
+        <w:pStyle w:val="PargrafodaLista"/>
+        <w:numPr>
+          <w:ilvl w:val="0"/>
+          <w:numId w:val="8"/>
+        </w:numPr>
+        <w:rPr>
+          <w:color w:val="000000" w:themeColor="text1"/>
+          <w:sz w:val="24"/>
+          <w:szCs w:val="24"/>
+        </w:rPr>
+      </w:pPr>
+      <w:proofErr w:type="gramStart"/>
+      <w:r>
+        <w:rPr>
+          <w:color w:val="000000" w:themeColor="text1"/>
+          <w:sz w:val="24"/>
+          <w:szCs w:val="24"/>
+        </w:rPr>
+        <w:t>No .enviar</w:t>
+      </w:r>
+      <w:proofErr w:type="gramEnd"/>
+      <w:r>
+        <w:rPr>
+          <w:color w:val="000000" w:themeColor="text1"/>
+          <w:sz w:val="24"/>
+          <w:szCs w:val="24"/>
+        </w:rPr>
+        <w:t xml:space="preserve"> adicionamos um </w:t>
+      </w:r>
+      <w:proofErr w:type="spellStart"/>
+      <w:r>
+        <w:rPr>
+          <w:color w:val="000000" w:themeColor="text1"/>
+          <w:sz w:val="24"/>
+          <w:szCs w:val="24"/>
+        </w:rPr>
+        <w:t>transition</w:t>
+      </w:r>
+      <w:proofErr w:type="spellEnd"/>
+      <w:r>
+        <w:rPr>
+          <w:color w:val="000000" w:themeColor="text1"/>
+          <w:sz w:val="24"/>
+          <w:szCs w:val="24"/>
+        </w:rPr>
+        <w:t xml:space="preserve"> : 1s para as mudanças possa ter um tempo de sua transição, tanto de cor, aumentar o tamanho e a rotação</w:t>
+      </w:r>
+    </w:p>
+    <w:p>
+      <w:pPr>
+        <w:pStyle w:val="PargrafodaLista"/>
+        <w:numPr>
+          <w:ilvl w:val="0"/>
+          <w:numId w:val="8"/>
+        </w:numPr>
+        <w:rPr>
+          <w:color w:val="000000" w:themeColor="text1"/>
+          <w:sz w:val="24"/>
+          <w:szCs w:val="24"/>
+        </w:rPr>
+      </w:pPr>
+      <w:r>
+        <w:rPr>
+          <w:color w:val="000000" w:themeColor="text1"/>
+          <w:sz w:val="24"/>
+          <w:szCs w:val="24"/>
+        </w:rPr>
+        <w:t xml:space="preserve">No enviar </w:t>
+      </w:r>
+      <w:proofErr w:type="spellStart"/>
+      <w:r>
+        <w:rPr>
+          <w:color w:val="000000" w:themeColor="text1"/>
+          <w:sz w:val="24"/>
+          <w:szCs w:val="24"/>
+        </w:rPr>
+        <w:t>hover</w:t>
+      </w:r>
+      <w:proofErr w:type="spellEnd"/>
+      <w:r>
+        <w:rPr>
+          <w:color w:val="000000" w:themeColor="text1"/>
+          <w:sz w:val="24"/>
+          <w:szCs w:val="24"/>
+        </w:rPr>
+        <w:t xml:space="preserve"> também utilizamos o </w:t>
+      </w:r>
+      <w:proofErr w:type="spellStart"/>
+      <w:r>
+        <w:rPr>
+          <w:color w:val="000000" w:themeColor="text1"/>
+          <w:sz w:val="24"/>
+          <w:szCs w:val="24"/>
+        </w:rPr>
+        <w:t>transform</w:t>
+      </w:r>
+      <w:proofErr w:type="spellEnd"/>
+      <w:r>
+        <w:rPr>
+          <w:color w:val="000000" w:themeColor="text1"/>
+          <w:sz w:val="24"/>
+          <w:szCs w:val="24"/>
+        </w:rPr>
+        <w:t xml:space="preserve"> para aumentar o tamanho do botão e ter a rotação</w:t>
+      </w:r>
+      <w:bookmarkStart w:id="0" w:name="_GoBack"/>
       <w:bookmarkEnd w:id="0"/>
     </w:p>
     <w:p>
@@ -8987,21 +10909,74 @@
       </w:pPr>
       <w:r>
         <w:rPr>
-          <w:color w:val="000000" w:themeColor="text1"/>
-          <w:sz w:val="24"/>
-          <w:szCs w:val="24"/>
-        </w:rPr>
-        <w:t xml:space="preserve">48- </w:t>
-      </w:r>
-    </w:p>
-    <w:p>
-      <w:pPr>
-        <w:rPr>
-          <w:color w:val="000000" w:themeColor="text1"/>
-          <w:sz w:val="24"/>
-          <w:szCs w:val="24"/>
-        </w:rPr>
-      </w:pPr>
+          <w:noProof/>
+          <w:color w:val="000000" w:themeColor="text1"/>
+          <w:sz w:val="24"/>
+          <w:szCs w:val="24"/>
+        </w:rPr>
+        <w:drawing>
+          <wp:inline distT="0" distB="0" distL="0" distR="0" wp14:anchorId="40C35CA6">
+            <wp:extent cx="3115310" cy="2962910"/>
+            <wp:effectExtent l="0" t="0" r="8890" b="8890"/>
+            <wp:docPr id="99" name="Imagem 99"/>
+            <wp:cNvGraphicFramePr>
+              <a:graphicFrameLocks xmlns:a="http://schemas.openxmlformats.org/drawingml/2006/main" noChangeAspect="1"/>
+            </wp:cNvGraphicFramePr>
+            <a:graphic xmlns:a="http://schemas.openxmlformats.org/drawingml/2006/main">
+              <a:graphicData uri="http://schemas.openxmlformats.org/drawingml/2006/picture">
+                <pic:pic xmlns:pic="http://schemas.openxmlformats.org/drawingml/2006/picture">
+                  <pic:nvPicPr>
+                    <pic:cNvPr id="0" name="Picture 2"/>
+                    <pic:cNvPicPr>
+                      <a:picLocks noChangeAspect="1" noChangeArrowheads="1"/>
+                    </pic:cNvPicPr>
+                  </pic:nvPicPr>
+                  <pic:blipFill>
+                    <a:blip r:embed="rId95">
+                      <a:extLst>
+                        <a:ext uri="{28A0092B-C50C-407E-A947-70E740481C1C}">
+                          <a14:useLocalDpi xmlns:a14="http://schemas.microsoft.com/office/drawing/2010/main" val="0"/>
+                        </a:ext>
+                      </a:extLst>
+                    </a:blip>
+                    <a:srcRect/>
+                    <a:stretch>
+                      <a:fillRect/>
+                    </a:stretch>
+                  </pic:blipFill>
+                  <pic:spPr bwMode="auto">
+                    <a:xfrm>
+                      <a:off x="0" y="0"/>
+                      <a:ext cx="3115310" cy="2962910"/>
+                    </a:xfrm>
+                    <a:prstGeom prst="rect">
+                      <a:avLst/>
+                    </a:prstGeom>
+                    <a:noFill/>
+                  </pic:spPr>
+                </pic:pic>
+              </a:graphicData>
+            </a:graphic>
+          </wp:inline>
+        </w:drawing>
+      </w:r>
+    </w:p>
+    <w:p>
+      <w:pPr>
+        <w:rPr>
+          <w:color w:val="000000" w:themeColor="text1"/>
+          <w:sz w:val="24"/>
+          <w:szCs w:val="24"/>
+        </w:rPr>
+      </w:pPr>
+      <w:r>
+        <w:rPr>
+          <w:color w:val="000000" w:themeColor="text1"/>
+          <w:sz w:val="24"/>
+          <w:szCs w:val="24"/>
+        </w:rPr>
+        <w:t xml:space="preserve">57- </w:t>
+      </w:r>
     </w:p>
     <w:sectPr>
       <w:pgSz w:w="11906" w:h="16838"/>
@@ -9694,6 +11669,119 @@
     </w:lvl>
   </w:abstractNum>
   <w:abstractNum w:abstractNumId="6" w15:restartNumberingAfterBreak="0">
+    <w:nsid w:val="4350088B"/>
+    <w:multiLevelType w:val="hybridMultilevel"/>
+    <w:tmpl w:val="BB0A0D6C"/>
+    <w:lvl w:ilvl="0" w:tplc="04160001">
+      <w:start w:val="1"/>
+      <w:numFmt w:val="bullet"/>
+      <w:lvlText w:val=""/>
+      <w:lvlJc w:val="left"/>
+      <w:pPr>
+        <w:ind w:left="720" w:hanging="360"/>
+      </w:pPr>
+      <w:rPr>
+        <w:rFonts w:ascii="Symbol" w:hAnsi="Symbol" w:hint="default"/>
+      </w:rPr>
+    </w:lvl>
+    <w:lvl w:ilvl="1" w:tplc="04160003" w:tentative="1">
+      <w:start w:val="1"/>
+      <w:numFmt w:val="bullet"/>
+      <w:lvlText w:val="o"/>
+      <w:lvlJc w:val="left"/>
+      <w:pPr>
+        <w:ind w:left="1440" w:hanging="360"/>
+      </w:pPr>
+      <w:rPr>
+        <w:rFonts w:ascii="Courier New" w:hAnsi="Courier New" w:cs="Courier New" w:hint="default"/>
+      </w:rPr>
+    </w:lvl>
+    <w:lvl w:ilvl="2" w:tplc="04160005" w:tentative="1">
+      <w:start w:val="1"/>
+      <w:numFmt w:val="bullet"/>
+      <w:lvlText w:val=""/>
+      <w:lvlJc w:val="left"/>
+      <w:pPr>
+        <w:ind w:left="2160" w:hanging="360"/>
+      </w:pPr>
+      <w:rPr>
+        <w:rFonts w:ascii="Wingdings" w:hAnsi="Wingdings" w:hint="default"/>
+      </w:rPr>
+    </w:lvl>
+    <w:lvl w:ilvl="3" w:tplc="04160001" w:tentative="1">
+      <w:start w:val="1"/>
+      <w:numFmt w:val="bullet"/>
+      <w:lvlText w:val=""/>
+      <w:lvlJc w:val="left"/>
+      <w:pPr>
+        <w:ind w:left="2880" w:hanging="360"/>
+      </w:pPr>
+      <w:rPr>
+        <w:rFonts w:ascii="Symbol" w:hAnsi="Symbol" w:hint="default"/>
+      </w:rPr>
+    </w:lvl>
+    <w:lvl w:ilvl="4" w:tplc="04160003" w:tentative="1">
+      <w:start w:val="1"/>
+      <w:numFmt w:val="bullet"/>
+      <w:lvlText w:val="o"/>
+      <w:lvlJc w:val="left"/>
+      <w:pPr>
+        <w:ind w:left="3600" w:hanging="360"/>
+      </w:pPr>
+      <w:rPr>
+        <w:rFonts w:ascii="Courier New" w:hAnsi="Courier New" w:cs="Courier New" w:hint="default"/>
+      </w:rPr>
+    </w:lvl>
+    <w:lvl w:ilvl="5" w:tplc="04160005" w:tentative="1">
+      <w:start w:val="1"/>
+      <w:numFmt w:val="bullet"/>
+      <w:lvlText w:val=""/>
+      <w:lvlJc w:val="left"/>
+      <w:pPr>
+        <w:ind w:left="4320" w:hanging="360"/>
+      </w:pPr>
+      <w:rPr>
+        <w:rFonts w:ascii="Wingdings" w:hAnsi="Wingdings" w:hint="default"/>
+      </w:rPr>
+    </w:lvl>
+    <w:lvl w:ilvl="6" w:tplc="04160001" w:tentative="1">
+      <w:start w:val="1"/>
+      <w:numFmt w:val="bullet"/>
+      <w:lvlText w:val=""/>
+      <w:lvlJc w:val="left"/>
+      <w:pPr>
+        <w:ind w:left="5040" w:hanging="360"/>
+      </w:pPr>
+      <w:rPr>
+        <w:rFonts w:ascii="Symbol" w:hAnsi="Symbol" w:hint="default"/>
+      </w:rPr>
+    </w:lvl>
+    <w:lvl w:ilvl="7" w:tplc="04160003" w:tentative="1">
+      <w:start w:val="1"/>
+      <w:numFmt w:val="bullet"/>
+      <w:lvlText w:val="o"/>
+      <w:lvlJc w:val="left"/>
+      <w:pPr>
+        <w:ind w:left="5760" w:hanging="360"/>
+      </w:pPr>
+      <w:rPr>
+        <w:rFonts w:ascii="Courier New" w:hAnsi="Courier New" w:cs="Courier New" w:hint="default"/>
+      </w:rPr>
+    </w:lvl>
+    <w:lvl w:ilvl="8" w:tplc="04160005" w:tentative="1">
+      <w:start w:val="1"/>
+      <w:numFmt w:val="bullet"/>
+      <w:lvlText w:val=""/>
+      <w:lvlJc w:val="left"/>
+      <w:pPr>
+        <w:ind w:left="6480" w:hanging="360"/>
+      </w:pPr>
+      <w:rPr>
+        <w:rFonts w:ascii="Wingdings" w:hAnsi="Wingdings" w:hint="default"/>
+      </w:rPr>
+    </w:lvl>
+  </w:abstractNum>
+  <w:abstractNum w:abstractNumId="7" w15:restartNumberingAfterBreak="0">
     <w:nsid w:val="67EB77F4"/>
     <w:multiLevelType w:val="hybridMultilevel"/>
     <w:tmpl w:val="1FAA0BA4"/>
@@ -9813,7 +11901,7 @@
     <w:abstractNumId w:val="0"/>
   </w:num>
   <w:num w:numId="3">
-    <w:abstractNumId w:val="6"/>
+    <w:abstractNumId w:val="7"/>
   </w:num>
   <w:num w:numId="4">
     <w:abstractNumId w:val="5"/>
@@ -9826,6 +11914,9 @@
   </w:num>
   <w:num w:numId="7">
     <w:abstractNumId w:val="4"/>
+  </w:num>
+  <w:num w:numId="8">
+    <w:abstractNumId w:val="6"/>
   </w:num>
 </w:numbering>
 </file>
@@ -10592,7 +12683,7 @@
 </file>
 
 <file path=customXml/itemProps1.xml><?xml version="1.0" encoding="utf-8"?>
-<ds:datastoreItem xmlns:ds="http://schemas.openxmlformats.org/officeDocument/2006/customXml" ds:itemID="{08B7810A-1E52-4497-B5AF-A7CA24864551}">
+<ds:datastoreItem xmlns:ds="http://schemas.openxmlformats.org/officeDocument/2006/customXml" ds:itemID="{C5358D9C-20B1-42AF-A992-8714F498654C}">
   <ds:schemaRefs>
     <ds:schemaRef ds:uri="http://schemas.openxmlformats.org/officeDocument/2006/bibliography"/>
   </ds:schemaRefs>

</xml_diff>

<commit_message>
atualização da aula de hoje 29/09
</commit_message>
<xml_diff>
--- a/Apostila/Apostila Space For Men.docx
+++ b/Apostila/Apostila Space For Men.docx
@@ -10371,6 +10371,7 @@
       </w:pPr>
       <w:r>
         <w:rPr>
+          <w:noProof/>
           <w:color w:val="000000" w:themeColor="text1"/>
           <w:sz w:val="24"/>
           <w:szCs w:val="24"/>
@@ -10896,8 +10897,6 @@
         </w:rPr>
         <w:t xml:space="preserve"> para aumentar o tamanho do botão e ter a rotação</w:t>
       </w:r>
-      <w:bookmarkStart w:id="0" w:name="_GoBack"/>
-      <w:bookmarkEnd w:id="0"/>
     </w:p>
     <w:p>
       <w:pPr>
@@ -10977,6 +10976,857 @@
         </w:rPr>
         <w:t xml:space="preserve">57- </w:t>
       </w:r>
+      <w:r>
+        <w:rPr>
+          <w:color w:val="000000" w:themeColor="text1"/>
+          <w:sz w:val="24"/>
+          <w:szCs w:val="24"/>
+        </w:rPr>
+        <w:t xml:space="preserve">Logo abaixo do </w:t>
+      </w:r>
+      <w:proofErr w:type="spellStart"/>
+      <w:r>
+        <w:rPr>
+          <w:color w:val="000000" w:themeColor="text1"/>
+          <w:sz w:val="24"/>
+          <w:szCs w:val="24"/>
+        </w:rPr>
+        <w:t>form</w:t>
+      </w:r>
+      <w:proofErr w:type="spellEnd"/>
+      <w:r>
+        <w:rPr>
+          <w:color w:val="000000" w:themeColor="text1"/>
+          <w:sz w:val="24"/>
+          <w:szCs w:val="24"/>
+        </w:rPr>
+        <w:t xml:space="preserve"> criamos a estrutura da tabela conforme código:</w:t>
+      </w:r>
+    </w:p>
+    <w:p>
+      <w:pPr>
+        <w:rPr>
+          <w:color w:val="000000" w:themeColor="text1"/>
+          <w:sz w:val="24"/>
+          <w:szCs w:val="24"/>
+        </w:rPr>
+      </w:pPr>
+      <w:r>
+        <w:rPr>
+          <w:color w:val="000000" w:themeColor="text1"/>
+          <w:sz w:val="24"/>
+          <w:szCs w:val="24"/>
+        </w:rPr>
+        <w:drawing>
+          <wp:inline distT="0" distB="0" distL="0" distR="0" wp14:anchorId="103BE826" wp14:editId="0F2D93E7">
+            <wp:extent cx="1657350" cy="2911065"/>
+            <wp:effectExtent l="0" t="0" r="0" b="3810"/>
+            <wp:docPr id="100" name="Imagem 100"/>
+            <wp:cNvGraphicFramePr>
+              <a:graphicFrameLocks xmlns:a="http://schemas.openxmlformats.org/drawingml/2006/main" noChangeAspect="1"/>
+            </wp:cNvGraphicFramePr>
+            <a:graphic xmlns:a="http://schemas.openxmlformats.org/drawingml/2006/main">
+              <a:graphicData uri="http://schemas.openxmlformats.org/drawingml/2006/picture">
+                <pic:pic xmlns:pic="http://schemas.openxmlformats.org/drawingml/2006/picture">
+                  <pic:nvPicPr>
+                    <pic:cNvPr id="1" name=""/>
+                    <pic:cNvPicPr/>
+                  </pic:nvPicPr>
+                  <pic:blipFill>
+                    <a:blip r:embed="rId96"/>
+                    <a:stretch>
+                      <a:fillRect/>
+                    </a:stretch>
+                  </pic:blipFill>
+                  <pic:spPr>
+                    <a:xfrm>
+                      <a:off x="0" y="0"/>
+                      <a:ext cx="1664902" cy="2924329"/>
+                    </a:xfrm>
+                    <a:prstGeom prst="rect">
+                      <a:avLst/>
+                    </a:prstGeom>
+                  </pic:spPr>
+                </pic:pic>
+              </a:graphicData>
+            </a:graphic>
+          </wp:inline>
+        </w:drawing>
+      </w:r>
+    </w:p>
+    <w:p>
+      <w:pPr>
+        <w:rPr>
+          <w:color w:val="000000" w:themeColor="text1"/>
+          <w:sz w:val="24"/>
+          <w:szCs w:val="24"/>
+        </w:rPr>
+      </w:pPr>
+      <w:r>
+        <w:rPr>
+          <w:color w:val="000000" w:themeColor="text1"/>
+          <w:sz w:val="24"/>
+          <w:szCs w:val="24"/>
+        </w:rPr>
+        <w:t xml:space="preserve">58- Trabalhando com a tabela estamos utilizando o </w:t>
+      </w:r>
+      <w:proofErr w:type="spellStart"/>
+      <w:r>
+        <w:rPr>
+          <w:color w:val="000000" w:themeColor="text1"/>
+          <w:sz w:val="24"/>
+          <w:szCs w:val="24"/>
+        </w:rPr>
+        <w:t>thead</w:t>
+      </w:r>
+      <w:proofErr w:type="spellEnd"/>
+      <w:r>
+        <w:rPr>
+          <w:color w:val="000000" w:themeColor="text1"/>
+          <w:sz w:val="24"/>
+          <w:szCs w:val="24"/>
+        </w:rPr>
+        <w:t xml:space="preserve"> (cabeçalho da tabela) e o </w:t>
+      </w:r>
+      <w:proofErr w:type="spellStart"/>
+      <w:r>
+        <w:rPr>
+          <w:color w:val="000000" w:themeColor="text1"/>
+          <w:sz w:val="24"/>
+          <w:szCs w:val="24"/>
+        </w:rPr>
+        <w:t>tbody</w:t>
+      </w:r>
+      <w:proofErr w:type="spellEnd"/>
+      <w:r>
+        <w:rPr>
+          <w:color w:val="000000" w:themeColor="text1"/>
+          <w:sz w:val="24"/>
+          <w:szCs w:val="24"/>
+        </w:rPr>
+        <w:t xml:space="preserve"> (corpo da tabela) e dentro do </w:t>
+      </w:r>
+      <w:proofErr w:type="spellStart"/>
+      <w:r>
+        <w:rPr>
+          <w:color w:val="000000" w:themeColor="text1"/>
+          <w:sz w:val="24"/>
+          <w:szCs w:val="24"/>
+        </w:rPr>
+        <w:t>thead</w:t>
+      </w:r>
+      <w:proofErr w:type="spellEnd"/>
+      <w:r>
+        <w:rPr>
+          <w:color w:val="000000" w:themeColor="text1"/>
+          <w:sz w:val="24"/>
+          <w:szCs w:val="24"/>
+        </w:rPr>
+        <w:t xml:space="preserve"> temos o </w:t>
+      </w:r>
+      <w:proofErr w:type="spellStart"/>
+      <w:r>
+        <w:rPr>
+          <w:color w:val="000000" w:themeColor="text1"/>
+          <w:sz w:val="24"/>
+          <w:szCs w:val="24"/>
+        </w:rPr>
+        <w:t>th</w:t>
+      </w:r>
+      <w:proofErr w:type="spellEnd"/>
+      <w:r>
+        <w:rPr>
+          <w:color w:val="000000" w:themeColor="text1"/>
+          <w:sz w:val="24"/>
+          <w:szCs w:val="24"/>
+        </w:rPr>
+        <w:t xml:space="preserve"> que são os dados do cabeçalho da tabela</w:t>
+      </w:r>
+    </w:p>
+    <w:p>
+      <w:pPr>
+        <w:rPr>
+          <w:color w:val="000000" w:themeColor="text1"/>
+          <w:sz w:val="24"/>
+          <w:szCs w:val="24"/>
+        </w:rPr>
+      </w:pPr>
+      <w:r>
+        <w:rPr>
+          <w:noProof/>
+          <w:color w:val="000000" w:themeColor="text1"/>
+          <w:sz w:val="24"/>
+          <w:szCs w:val="24"/>
+        </w:rPr>
+        <w:drawing>
+          <wp:inline distT="0" distB="0" distL="0" distR="0" wp14:anchorId="3A2C6527">
+            <wp:extent cx="1543050" cy="1047750"/>
+            <wp:effectExtent l="0" t="0" r="0" b="0"/>
+            <wp:docPr id="101" name="Imagem 101"/>
+            <wp:cNvGraphicFramePr>
+              <a:graphicFrameLocks xmlns:a="http://schemas.openxmlformats.org/drawingml/2006/main" noChangeAspect="1"/>
+            </wp:cNvGraphicFramePr>
+            <a:graphic xmlns:a="http://schemas.openxmlformats.org/drawingml/2006/main">
+              <a:graphicData uri="http://schemas.openxmlformats.org/drawingml/2006/picture">
+                <pic:pic xmlns:pic="http://schemas.openxmlformats.org/drawingml/2006/picture">
+                  <pic:nvPicPr>
+                    <pic:cNvPr id="0" name="Picture 2"/>
+                    <pic:cNvPicPr>
+                      <a:picLocks noChangeAspect="1" noChangeArrowheads="1"/>
+                    </pic:cNvPicPr>
+                  </pic:nvPicPr>
+                  <pic:blipFill>
+                    <a:blip r:embed="rId97">
+                      <a:extLst>
+                        <a:ext uri="{28A0092B-C50C-407E-A947-70E740481C1C}">
+                          <a14:useLocalDpi xmlns:a14="http://schemas.microsoft.com/office/drawing/2010/main" val="0"/>
+                        </a:ext>
+                      </a:extLst>
+                    </a:blip>
+                    <a:srcRect/>
+                    <a:stretch>
+                      <a:fillRect/>
+                    </a:stretch>
+                  </pic:blipFill>
+                  <pic:spPr bwMode="auto">
+                    <a:xfrm>
+                      <a:off x="0" y="0"/>
+                      <a:ext cx="1543050" cy="1047750"/>
+                    </a:xfrm>
+                    <a:prstGeom prst="rect">
+                      <a:avLst/>
+                    </a:prstGeom>
+                    <a:noFill/>
+                  </pic:spPr>
+                </pic:pic>
+              </a:graphicData>
+            </a:graphic>
+          </wp:inline>
+        </w:drawing>
+      </w:r>
+    </w:p>
+    <w:p>
+      <w:pPr>
+        <w:rPr>
+          <w:color w:val="000000" w:themeColor="text1"/>
+          <w:sz w:val="24"/>
+          <w:szCs w:val="24"/>
+        </w:rPr>
+      </w:pPr>
+      <w:r>
+        <w:rPr>
+          <w:color w:val="000000" w:themeColor="text1"/>
+          <w:sz w:val="24"/>
+          <w:szCs w:val="24"/>
+        </w:rPr>
+        <w:t xml:space="preserve">59- No </w:t>
+      </w:r>
+      <w:proofErr w:type="spellStart"/>
+      <w:r>
+        <w:rPr>
+          <w:color w:val="000000" w:themeColor="text1"/>
+          <w:sz w:val="24"/>
+          <w:szCs w:val="24"/>
+        </w:rPr>
+        <w:t>css</w:t>
+      </w:r>
+      <w:proofErr w:type="spellEnd"/>
+      <w:r>
+        <w:rPr>
+          <w:color w:val="000000" w:themeColor="text1"/>
+          <w:sz w:val="24"/>
+          <w:szCs w:val="24"/>
+        </w:rPr>
+        <w:t xml:space="preserve"> da tabela vamos dar um espaço </w:t>
+      </w:r>
+      <w:r>
+        <w:rPr>
+          <w:color w:val="000000" w:themeColor="text1"/>
+          <w:sz w:val="24"/>
+          <w:szCs w:val="24"/>
+        </w:rPr>
+        <w:t>externo para cima e para baixo</w:t>
+      </w:r>
+    </w:p>
+    <w:p>
+      <w:pPr>
+        <w:rPr>
+          <w:color w:val="000000" w:themeColor="text1"/>
+          <w:sz w:val="24"/>
+          <w:szCs w:val="24"/>
+        </w:rPr>
+      </w:pPr>
+      <w:r>
+        <w:rPr>
+          <w:noProof/>
+          <w:color w:val="000000" w:themeColor="text1"/>
+          <w:sz w:val="24"/>
+          <w:szCs w:val="24"/>
+        </w:rPr>
+        <w:drawing>
+          <wp:inline distT="0" distB="0" distL="0" distR="0" wp14:anchorId="04EF4BCA">
+            <wp:extent cx="2038350" cy="762000"/>
+            <wp:effectExtent l="0" t="0" r="0" b="0"/>
+            <wp:docPr id="102" name="Imagem 102"/>
+            <wp:cNvGraphicFramePr>
+              <a:graphicFrameLocks xmlns:a="http://schemas.openxmlformats.org/drawingml/2006/main" noChangeAspect="1"/>
+            </wp:cNvGraphicFramePr>
+            <a:graphic xmlns:a="http://schemas.openxmlformats.org/drawingml/2006/main">
+              <a:graphicData uri="http://schemas.openxmlformats.org/drawingml/2006/picture">
+                <pic:pic xmlns:pic="http://schemas.openxmlformats.org/drawingml/2006/picture">
+                  <pic:nvPicPr>
+                    <pic:cNvPr id="0" name="Picture 3"/>
+                    <pic:cNvPicPr>
+                      <a:picLocks noChangeAspect="1" noChangeArrowheads="1"/>
+                    </pic:cNvPicPr>
+                  </pic:nvPicPr>
+                  <pic:blipFill>
+                    <a:blip r:embed="rId98">
+                      <a:extLst>
+                        <a:ext uri="{28A0092B-C50C-407E-A947-70E740481C1C}">
+                          <a14:useLocalDpi xmlns:a14="http://schemas.microsoft.com/office/drawing/2010/main" val="0"/>
+                        </a:ext>
+                      </a:extLst>
+                    </a:blip>
+                    <a:srcRect/>
+                    <a:stretch>
+                      <a:fillRect/>
+                    </a:stretch>
+                  </pic:blipFill>
+                  <pic:spPr bwMode="auto">
+                    <a:xfrm>
+                      <a:off x="0" y="0"/>
+                      <a:ext cx="2038350" cy="762000"/>
+                    </a:xfrm>
+                    <a:prstGeom prst="rect">
+                      <a:avLst/>
+                    </a:prstGeom>
+                    <a:noFill/>
+                  </pic:spPr>
+                </pic:pic>
+              </a:graphicData>
+            </a:graphic>
+          </wp:inline>
+        </w:drawing>
+      </w:r>
+    </w:p>
+    <w:p>
+      <w:pPr>
+        <w:rPr>
+          <w:color w:val="000000" w:themeColor="text1"/>
+          <w:sz w:val="24"/>
+          <w:szCs w:val="24"/>
+        </w:rPr>
+      </w:pPr>
+      <w:r>
+        <w:rPr>
+          <w:color w:val="000000" w:themeColor="text1"/>
+          <w:sz w:val="24"/>
+          <w:szCs w:val="24"/>
+        </w:rPr>
+        <w:t>60- No cabeçalho da tabela adicionamos uma cor de fundo, mudamos a cor do texto e deixamos mais encorpada</w:t>
+      </w:r>
+    </w:p>
+    <w:p>
+      <w:pPr>
+        <w:rPr>
+          <w:color w:val="000000" w:themeColor="text1"/>
+          <w:sz w:val="24"/>
+          <w:szCs w:val="24"/>
+        </w:rPr>
+      </w:pPr>
+      <w:r>
+        <w:rPr>
+          <w:noProof/>
+          <w:color w:val="000000" w:themeColor="text1"/>
+          <w:sz w:val="24"/>
+          <w:szCs w:val="24"/>
+        </w:rPr>
+        <w:drawing>
+          <wp:inline distT="0" distB="0" distL="0" distR="0" wp14:anchorId="76C0C98E">
+            <wp:extent cx="2467610" cy="962025"/>
+            <wp:effectExtent l="0" t="0" r="8890" b="9525"/>
+            <wp:docPr id="103" name="Imagem 103"/>
+            <wp:cNvGraphicFramePr>
+              <a:graphicFrameLocks xmlns:a="http://schemas.openxmlformats.org/drawingml/2006/main" noChangeAspect="1"/>
+            </wp:cNvGraphicFramePr>
+            <a:graphic xmlns:a="http://schemas.openxmlformats.org/drawingml/2006/main">
+              <a:graphicData uri="http://schemas.openxmlformats.org/drawingml/2006/picture">
+                <pic:pic xmlns:pic="http://schemas.openxmlformats.org/drawingml/2006/picture">
+                  <pic:nvPicPr>
+                    <pic:cNvPr id="0" name="Picture 4"/>
+                    <pic:cNvPicPr>
+                      <a:picLocks noChangeAspect="1" noChangeArrowheads="1"/>
+                    </pic:cNvPicPr>
+                  </pic:nvPicPr>
+                  <pic:blipFill>
+                    <a:blip r:embed="rId99">
+                      <a:extLst>
+                        <a:ext uri="{28A0092B-C50C-407E-A947-70E740481C1C}">
+                          <a14:useLocalDpi xmlns:a14="http://schemas.microsoft.com/office/drawing/2010/main" val="0"/>
+                        </a:ext>
+                      </a:extLst>
+                    </a:blip>
+                    <a:srcRect/>
+                    <a:stretch>
+                      <a:fillRect/>
+                    </a:stretch>
+                  </pic:blipFill>
+                  <pic:spPr bwMode="auto">
+                    <a:xfrm>
+                      <a:off x="0" y="0"/>
+                      <a:ext cx="2467610" cy="962025"/>
+                    </a:xfrm>
+                    <a:prstGeom prst="rect">
+                      <a:avLst/>
+                    </a:prstGeom>
+                    <a:noFill/>
+                  </pic:spPr>
+                </pic:pic>
+              </a:graphicData>
+            </a:graphic>
+          </wp:inline>
+        </w:drawing>
+      </w:r>
+    </w:p>
+    <w:p>
+      <w:pPr>
+        <w:rPr>
+          <w:color w:val="000000" w:themeColor="text1"/>
+          <w:sz w:val="24"/>
+          <w:szCs w:val="24"/>
+        </w:rPr>
+      </w:pPr>
+      <w:r>
+        <w:rPr>
+          <w:color w:val="000000" w:themeColor="text1"/>
+          <w:sz w:val="24"/>
+          <w:szCs w:val="24"/>
+        </w:rPr>
+        <w:t>61- Colocamos uma borda nos dados da tabela e no cabeçalho conforme código</w:t>
+      </w:r>
+    </w:p>
+    <w:p>
+      <w:pPr>
+        <w:rPr>
+          <w:color w:val="000000" w:themeColor="text1"/>
+          <w:sz w:val="24"/>
+          <w:szCs w:val="24"/>
+        </w:rPr>
+      </w:pPr>
+      <w:r>
+        <w:rPr>
+          <w:noProof/>
+          <w:color w:val="000000" w:themeColor="text1"/>
+          <w:sz w:val="24"/>
+          <w:szCs w:val="24"/>
+        </w:rPr>
+        <w:drawing>
+          <wp:inline distT="0" distB="0" distL="0" distR="0" wp14:anchorId="4150AB21" wp14:editId="4EC1F372">
+            <wp:extent cx="2277110" cy="628650"/>
+            <wp:effectExtent l="0" t="0" r="8890" b="0"/>
+            <wp:docPr id="105" name="Imagem 105"/>
+            <wp:cNvGraphicFramePr>
+              <a:graphicFrameLocks xmlns:a="http://schemas.openxmlformats.org/drawingml/2006/main" noChangeAspect="1"/>
+            </wp:cNvGraphicFramePr>
+            <a:graphic xmlns:a="http://schemas.openxmlformats.org/drawingml/2006/main">
+              <a:graphicData uri="http://schemas.openxmlformats.org/drawingml/2006/picture">
+                <pic:pic xmlns:pic="http://schemas.openxmlformats.org/drawingml/2006/picture">
+                  <pic:nvPicPr>
+                    <pic:cNvPr id="0" name="Picture 6"/>
+                    <pic:cNvPicPr>
+                      <a:picLocks noChangeAspect="1" noChangeArrowheads="1"/>
+                    </pic:cNvPicPr>
+                  </pic:nvPicPr>
+                  <pic:blipFill>
+                    <a:blip r:embed="rId100">
+                      <a:extLst>
+                        <a:ext uri="{28A0092B-C50C-407E-A947-70E740481C1C}">
+                          <a14:useLocalDpi xmlns:a14="http://schemas.microsoft.com/office/drawing/2010/main" val="0"/>
+                        </a:ext>
+                      </a:extLst>
+                    </a:blip>
+                    <a:srcRect/>
+                    <a:stretch>
+                      <a:fillRect/>
+                    </a:stretch>
+                  </pic:blipFill>
+                  <pic:spPr bwMode="auto">
+                    <a:xfrm>
+                      <a:off x="0" y="0"/>
+                      <a:ext cx="2277110" cy="628650"/>
+                    </a:xfrm>
+                    <a:prstGeom prst="rect">
+                      <a:avLst/>
+                    </a:prstGeom>
+                    <a:noFill/>
+                  </pic:spPr>
+                </pic:pic>
+              </a:graphicData>
+            </a:graphic>
+          </wp:inline>
+        </w:drawing>
+      </w:r>
+    </w:p>
+    <w:p>
+      <w:pPr>
+        <w:rPr>
+          <w:color w:val="000000" w:themeColor="text1"/>
+          <w:sz w:val="24"/>
+          <w:szCs w:val="24"/>
+        </w:rPr>
+      </w:pPr>
+      <w:r>
+        <w:rPr>
+          <w:color w:val="000000" w:themeColor="text1"/>
+          <w:sz w:val="24"/>
+          <w:szCs w:val="24"/>
+        </w:rPr>
+        <w:t xml:space="preserve">62- </w:t>
+      </w:r>
+      <w:r>
+        <w:rPr>
+          <w:color w:val="000000" w:themeColor="text1"/>
+          <w:sz w:val="24"/>
+          <w:szCs w:val="24"/>
+        </w:rPr>
+        <w:t>Agora vamos dar um espaço interno para cima e para baixo e para os lados esquerdo e direito</w:t>
+      </w:r>
+    </w:p>
+    <w:p>
+      <w:pPr>
+        <w:rPr>
+          <w:color w:val="000000" w:themeColor="text1"/>
+          <w:sz w:val="24"/>
+          <w:szCs w:val="24"/>
+        </w:rPr>
+      </w:pPr>
+      <w:r>
+        <w:rPr>
+          <w:noProof/>
+          <w:color w:val="000000" w:themeColor="text1"/>
+          <w:sz w:val="24"/>
+          <w:szCs w:val="24"/>
+        </w:rPr>
+        <w:drawing>
+          <wp:inline distT="0" distB="0" distL="0" distR="0" wp14:anchorId="10E11CAD">
+            <wp:extent cx="2247900" cy="847725"/>
+            <wp:effectExtent l="0" t="0" r="0" b="9525"/>
+            <wp:docPr id="106" name="Imagem 106"/>
+            <wp:cNvGraphicFramePr>
+              <a:graphicFrameLocks xmlns:a="http://schemas.openxmlformats.org/drawingml/2006/main" noChangeAspect="1"/>
+            </wp:cNvGraphicFramePr>
+            <a:graphic xmlns:a="http://schemas.openxmlformats.org/drawingml/2006/main">
+              <a:graphicData uri="http://schemas.openxmlformats.org/drawingml/2006/picture">
+                <pic:pic xmlns:pic="http://schemas.openxmlformats.org/drawingml/2006/picture">
+                  <pic:nvPicPr>
+                    <pic:cNvPr id="0" name="Picture 7"/>
+                    <pic:cNvPicPr>
+                      <a:picLocks noChangeAspect="1" noChangeArrowheads="1"/>
+                    </pic:cNvPicPr>
+                  </pic:nvPicPr>
+                  <pic:blipFill>
+                    <a:blip r:embed="rId101">
+                      <a:extLst>
+                        <a:ext uri="{28A0092B-C50C-407E-A947-70E740481C1C}">
+                          <a14:useLocalDpi xmlns:a14="http://schemas.microsoft.com/office/drawing/2010/main" val="0"/>
+                        </a:ext>
+                      </a:extLst>
+                    </a:blip>
+                    <a:srcRect/>
+                    <a:stretch>
+                      <a:fillRect/>
+                    </a:stretch>
+                  </pic:blipFill>
+                  <pic:spPr bwMode="auto">
+                    <a:xfrm>
+                      <a:off x="0" y="0"/>
+                      <a:ext cx="2247900" cy="847725"/>
+                    </a:xfrm>
+                    <a:prstGeom prst="rect">
+                      <a:avLst/>
+                    </a:prstGeom>
+                    <a:noFill/>
+                  </pic:spPr>
+                </pic:pic>
+              </a:graphicData>
+            </a:graphic>
+          </wp:inline>
+        </w:drawing>
+      </w:r>
+    </w:p>
+    <w:p>
+      <w:pPr>
+        <w:rPr>
+          <w:color w:val="000000" w:themeColor="text1"/>
+          <w:sz w:val="24"/>
+          <w:szCs w:val="24"/>
+        </w:rPr>
+      </w:pPr>
+      <w:r>
+        <w:rPr>
+          <w:color w:val="000000" w:themeColor="text1"/>
+          <w:sz w:val="24"/>
+          <w:szCs w:val="24"/>
+        </w:rPr>
+        <w:t xml:space="preserve">63- </w:t>
+      </w:r>
+      <w:r>
+        <w:rPr>
+          <w:color w:val="000000" w:themeColor="text1"/>
+          <w:sz w:val="24"/>
+          <w:szCs w:val="24"/>
+        </w:rPr>
+        <w:t xml:space="preserve">Da mesma forma na página de contato </w:t>
+      </w:r>
+      <w:proofErr w:type="spellStart"/>
+      <w:r>
+        <w:rPr>
+          <w:color w:val="000000" w:themeColor="text1"/>
+          <w:sz w:val="24"/>
+          <w:szCs w:val="24"/>
+        </w:rPr>
+        <w:t>html</w:t>
+      </w:r>
+      <w:proofErr w:type="spellEnd"/>
+      <w:r>
+        <w:rPr>
+          <w:color w:val="000000" w:themeColor="text1"/>
+          <w:sz w:val="24"/>
+          <w:szCs w:val="24"/>
+        </w:rPr>
+        <w:t xml:space="preserve"> que copiamos o header e </w:t>
+      </w:r>
+      <w:proofErr w:type="spellStart"/>
+      <w:r>
+        <w:rPr>
+          <w:color w:val="000000" w:themeColor="text1"/>
+          <w:sz w:val="24"/>
+          <w:szCs w:val="24"/>
+        </w:rPr>
+        <w:t>footer</w:t>
+      </w:r>
+      <w:proofErr w:type="spellEnd"/>
+      <w:r>
+        <w:rPr>
+          <w:color w:val="000000" w:themeColor="text1"/>
+          <w:sz w:val="24"/>
+          <w:szCs w:val="24"/>
+        </w:rPr>
+        <w:t xml:space="preserve"> da página produtos, colocamos na página index.html e aplicamos o </w:t>
+      </w:r>
+      <w:proofErr w:type="spellStart"/>
+      <w:r>
+        <w:rPr>
+          <w:color w:val="000000" w:themeColor="text1"/>
+          <w:sz w:val="24"/>
+          <w:szCs w:val="24"/>
+        </w:rPr>
+        <w:t>css</w:t>
+      </w:r>
+      <w:proofErr w:type="spellEnd"/>
+      <w:r>
+        <w:rPr>
+          <w:color w:val="000000" w:themeColor="text1"/>
+          <w:sz w:val="24"/>
+          <w:szCs w:val="24"/>
+        </w:rPr>
+        <w:t xml:space="preserve"> fazendo isso para não ter a necessidade de fazer novamente o menu e o </w:t>
+      </w:r>
+      <w:proofErr w:type="spellStart"/>
+      <w:r>
+        <w:rPr>
+          <w:color w:val="000000" w:themeColor="text1"/>
+          <w:sz w:val="24"/>
+          <w:szCs w:val="24"/>
+        </w:rPr>
+        <w:t>footer</w:t>
+      </w:r>
+      <w:proofErr w:type="spellEnd"/>
+    </w:p>
+    <w:p>
+      <w:pPr>
+        <w:rPr>
+          <w:color w:val="000000" w:themeColor="text1"/>
+          <w:sz w:val="24"/>
+          <w:szCs w:val="24"/>
+        </w:rPr>
+      </w:pPr>
+      <w:r>
+        <w:rPr>
+          <w:color w:val="000000" w:themeColor="text1"/>
+          <w:sz w:val="24"/>
+          <w:szCs w:val="24"/>
+        </w:rPr>
+        <w:t>64- Vamos deixar a imagem do banner ocupando 100% de espaço</w:t>
+      </w:r>
+    </w:p>
+    <w:p>
+      <w:pPr>
+        <w:rPr>
+          <w:color w:val="000000" w:themeColor="text1"/>
+          <w:sz w:val="24"/>
+          <w:szCs w:val="24"/>
+        </w:rPr>
+      </w:pPr>
+      <w:r>
+        <w:rPr>
+          <w:color w:val="000000" w:themeColor="text1"/>
+          <w:sz w:val="24"/>
+          <w:szCs w:val="24"/>
+        </w:rPr>
+        <w:drawing>
+          <wp:inline distT="0" distB="0" distL="0" distR="0" wp14:anchorId="6FAEB1DE" wp14:editId="4D0C0379">
+            <wp:extent cx="1267002" cy="609685"/>
+            <wp:effectExtent l="0" t="0" r="9525" b="0"/>
+            <wp:docPr id="107" name="Imagem 107"/>
+            <wp:cNvGraphicFramePr>
+              <a:graphicFrameLocks xmlns:a="http://schemas.openxmlformats.org/drawingml/2006/main" noChangeAspect="1"/>
+            </wp:cNvGraphicFramePr>
+            <a:graphic xmlns:a="http://schemas.openxmlformats.org/drawingml/2006/main">
+              <a:graphicData uri="http://schemas.openxmlformats.org/drawingml/2006/picture">
+                <pic:pic xmlns:pic="http://schemas.openxmlformats.org/drawingml/2006/picture">
+                  <pic:nvPicPr>
+                    <pic:cNvPr id="1" name=""/>
+                    <pic:cNvPicPr/>
+                  </pic:nvPicPr>
+                  <pic:blipFill>
+                    <a:blip r:embed="rId102"/>
+                    <a:stretch>
+                      <a:fillRect/>
+                    </a:stretch>
+                  </pic:blipFill>
+                  <pic:spPr>
+                    <a:xfrm>
+                      <a:off x="0" y="0"/>
+                      <a:ext cx="1267002" cy="609685"/>
+                    </a:xfrm>
+                    <a:prstGeom prst="rect">
+                      <a:avLst/>
+                    </a:prstGeom>
+                  </pic:spPr>
+                </pic:pic>
+              </a:graphicData>
+            </a:graphic>
+          </wp:inline>
+        </w:drawing>
+      </w:r>
+    </w:p>
+    <w:p>
+      <w:pPr>
+        <w:rPr>
+          <w:color w:val="000000" w:themeColor="text1"/>
+          <w:sz w:val="24"/>
+          <w:szCs w:val="24"/>
+        </w:rPr>
+      </w:pPr>
+      <w:r>
+        <w:rPr>
+          <w:color w:val="000000" w:themeColor="text1"/>
+          <w:sz w:val="24"/>
+          <w:szCs w:val="24"/>
+        </w:rPr>
+        <w:t xml:space="preserve">65- </w:t>
+      </w:r>
+      <w:r>
+        <w:rPr>
+          <w:color w:val="000000" w:themeColor="text1"/>
+          <w:sz w:val="24"/>
+          <w:szCs w:val="24"/>
+        </w:rPr>
+        <w:t xml:space="preserve">Centralizamos e demos uma largura de 940px para o conteúdo do </w:t>
+      </w:r>
+      <w:proofErr w:type="spellStart"/>
+      <w:r>
+        <w:rPr>
+          <w:color w:val="000000" w:themeColor="text1"/>
+          <w:sz w:val="24"/>
+          <w:szCs w:val="24"/>
+        </w:rPr>
+        <w:t>main</w:t>
+      </w:r>
+      <w:proofErr w:type="spellEnd"/>
+      <w:r>
+        <w:rPr>
+          <w:color w:val="000000" w:themeColor="text1"/>
+          <w:sz w:val="24"/>
+          <w:szCs w:val="24"/>
+        </w:rPr>
+        <w:t xml:space="preserve"> conforme o código:</w:t>
+      </w:r>
+    </w:p>
+    <w:p>
+      <w:pPr>
+        <w:rPr>
+          <w:color w:val="000000" w:themeColor="text1"/>
+          <w:sz w:val="24"/>
+          <w:szCs w:val="24"/>
+        </w:rPr>
+      </w:pPr>
+      <w:r>
+        <w:rPr>
+          <w:noProof/>
+          <w:color w:val="000000" w:themeColor="text1"/>
+          <w:sz w:val="24"/>
+          <w:szCs w:val="24"/>
+        </w:rPr>
+        <w:drawing>
+          <wp:inline distT="0" distB="0" distL="0" distR="0" wp14:anchorId="2B64C380">
+            <wp:extent cx="1476375" cy="742950"/>
+            <wp:effectExtent l="0" t="0" r="9525" b="0"/>
+            <wp:docPr id="108" name="Imagem 108"/>
+            <wp:cNvGraphicFramePr>
+              <a:graphicFrameLocks xmlns:a="http://schemas.openxmlformats.org/drawingml/2006/main" noChangeAspect="1"/>
+            </wp:cNvGraphicFramePr>
+            <a:graphic xmlns:a="http://schemas.openxmlformats.org/drawingml/2006/main">
+              <a:graphicData uri="http://schemas.openxmlformats.org/drawingml/2006/picture">
+                <pic:pic xmlns:pic="http://schemas.openxmlformats.org/drawingml/2006/picture">
+                  <pic:nvPicPr>
+                    <pic:cNvPr id="0" name="Picture 8"/>
+                    <pic:cNvPicPr>
+                      <a:picLocks noChangeAspect="1" noChangeArrowheads="1"/>
+                    </pic:cNvPicPr>
+                  </pic:nvPicPr>
+                  <pic:blipFill>
+                    <a:blip r:embed="rId103">
+                      <a:extLst>
+                        <a:ext uri="{28A0092B-C50C-407E-A947-70E740481C1C}">
+                          <a14:useLocalDpi xmlns:a14="http://schemas.microsoft.com/office/drawing/2010/main" val="0"/>
+                        </a:ext>
+                      </a:extLst>
+                    </a:blip>
+                    <a:srcRect/>
+                    <a:stretch>
+                      <a:fillRect/>
+                    </a:stretch>
+                  </pic:blipFill>
+                  <pic:spPr bwMode="auto">
+                    <a:xfrm>
+                      <a:off x="0" y="0"/>
+                      <a:ext cx="1476375" cy="742950"/>
+                    </a:xfrm>
+                    <a:prstGeom prst="rect">
+                      <a:avLst/>
+                    </a:prstGeom>
+                    <a:noFill/>
+                  </pic:spPr>
+                </pic:pic>
+              </a:graphicData>
+            </a:graphic>
+          </wp:inline>
+        </w:drawing>
+      </w:r>
+      <w:bookmarkStart w:id="0" w:name="_GoBack"/>
+      <w:bookmarkEnd w:id="0"/>
+    </w:p>
+    <w:p>
+      <w:pPr>
+        <w:rPr>
+          <w:color w:val="000000" w:themeColor="text1"/>
+          <w:sz w:val="24"/>
+          <w:szCs w:val="24"/>
+        </w:rPr>
+      </w:pPr>
     </w:p>
     <w:sectPr>
       <w:pgSz w:w="11906" w:h="16838"/>
@@ -12683,7 +13533,7 @@
 </file>
 
 <file path=customXml/itemProps1.xml><?xml version="1.0" encoding="utf-8"?>
-<ds:datastoreItem xmlns:ds="http://schemas.openxmlformats.org/officeDocument/2006/customXml" ds:itemID="{C5358D9C-20B1-42AF-A992-8714F498654C}">
+<ds:datastoreItem xmlns:ds="http://schemas.openxmlformats.org/officeDocument/2006/customXml" ds:itemID="{29E4A043-8509-432E-9089-47061E68DD62}">
   <ds:schemaRefs>
     <ds:schemaRef ds:uri="http://schemas.openxmlformats.org/officeDocument/2006/bibliography"/>
   </ds:schemaRefs>

</xml_diff>

<commit_message>
atualização da aula do dia 01/10
</commit_message>
<xml_diff>
--- a/Apostila/Apostila Space For Men.docx
+++ b/Apostila/Apostila Space For Men.docx
@@ -3483,6 +3483,14 @@
         </w:rPr>
         <w:t>Trabalhando com posicionamento</w:t>
       </w:r>
+      <w:r>
+        <w:rPr>
+          <w:color w:val="000000" w:themeColor="text1"/>
+          <w:sz w:val="24"/>
+          <w:szCs w:val="24"/>
+        </w:rPr>
+        <w:t>:</w:t>
+      </w:r>
     </w:p>
     <w:p>
       <w:pPr>
@@ -4250,6 +4258,14 @@
           <w:szCs w:val="24"/>
         </w:rPr>
         <w:t>(da página)</w:t>
+      </w:r>
+      <w:r>
+        <w:rPr>
+          <w:color w:val="000000" w:themeColor="text1"/>
+          <w:sz w:val="24"/>
+          <w:szCs w:val="24"/>
+        </w:rPr>
+        <w:t>.</w:t>
       </w:r>
     </w:p>
     <w:p>
@@ -5889,6 +5905,14 @@
         </w:rPr>
         <w:t>)</w:t>
       </w:r>
+      <w:r>
+        <w:rPr>
+          <w:color w:val="000000" w:themeColor="text1"/>
+          <w:sz w:val="24"/>
+          <w:szCs w:val="24"/>
+        </w:rPr>
+        <w:t>.</w:t>
+      </w:r>
     </w:p>
     <w:p>
       <w:pPr>
@@ -8205,6 +8229,7 @@
       <w:proofErr w:type="spellStart"/>
       <w:r>
         <w:rPr>
+          <w:b/>
           <w:color w:val="000000" w:themeColor="text1"/>
           <w:sz w:val="24"/>
           <w:szCs w:val="24"/>
@@ -8218,11 +8243,29 @@
           <w:sz w:val="24"/>
           <w:szCs w:val="24"/>
         </w:rPr>
-        <w:t xml:space="preserve"> e do input, mudamos para </w:t>
+        <w:t xml:space="preserve"> e do </w:t>
+      </w:r>
+      <w:r>
+        <w:rPr>
+          <w:b/>
+          <w:color w:val="000000" w:themeColor="text1"/>
+          <w:sz w:val="24"/>
+          <w:szCs w:val="24"/>
+        </w:rPr>
+        <w:t>input</w:t>
+      </w:r>
+      <w:r>
+        <w:rPr>
+          <w:color w:val="000000" w:themeColor="text1"/>
+          <w:sz w:val="24"/>
+          <w:szCs w:val="24"/>
+        </w:rPr>
+        <w:t xml:space="preserve">, mudamos para </w:t>
       </w:r>
       <w:proofErr w:type="spellStart"/>
       <w:r>
         <w:rPr>
+          <w:b/>
           <w:color w:val="000000" w:themeColor="text1"/>
           <w:sz w:val="24"/>
           <w:szCs w:val="24"/>
@@ -8241,6 +8284,7 @@
       <w:proofErr w:type="spellStart"/>
       <w:r>
         <w:rPr>
+          <w:b/>
           <w:color w:val="000000" w:themeColor="text1"/>
           <w:sz w:val="24"/>
           <w:szCs w:val="24"/>
@@ -8254,11 +8298,29 @@
           <w:sz w:val="24"/>
           <w:szCs w:val="24"/>
         </w:rPr>
-        <w:t xml:space="preserve"> como o input fica um acima do outro e demos um espaço entre eles utilizando o </w:t>
+        <w:t xml:space="preserve"> como o </w:t>
+      </w:r>
+      <w:r>
+        <w:rPr>
+          <w:b/>
+          <w:color w:val="000000" w:themeColor="text1"/>
+          <w:sz w:val="24"/>
+          <w:szCs w:val="24"/>
+        </w:rPr>
+        <w:t>input</w:t>
+      </w:r>
+      <w:r>
+        <w:rPr>
+          <w:color w:val="000000" w:themeColor="text1"/>
+          <w:sz w:val="24"/>
+          <w:szCs w:val="24"/>
+        </w:rPr>
+        <w:t xml:space="preserve"> fica um acima do outro e demos um espaço entre eles utilizando o </w:t>
       </w:r>
       <w:proofErr w:type="spellStart"/>
       <w:r>
         <w:rPr>
+          <w:b/>
           <w:color w:val="000000" w:themeColor="text1"/>
           <w:sz w:val="24"/>
           <w:szCs w:val="24"/>
@@ -8399,6 +8461,7 @@
       <w:proofErr w:type="spellStart"/>
       <w:r>
         <w:rPr>
+          <w:b/>
           <w:color w:val="000000" w:themeColor="text1"/>
           <w:sz w:val="24"/>
           <w:szCs w:val="24"/>
@@ -8412,7 +8475,24 @@
           <w:sz w:val="24"/>
           <w:szCs w:val="24"/>
         </w:rPr>
-        <w:t xml:space="preserve"> e também o espaço interno dos inputs e demos uma largura para o</w:t>
+        <w:t xml:space="preserve"> e também o espaço interno dos </w:t>
+      </w:r>
+      <w:r>
+        <w:rPr>
+          <w:b/>
+          <w:color w:val="000000" w:themeColor="text1"/>
+          <w:sz w:val="24"/>
+          <w:szCs w:val="24"/>
+        </w:rPr>
+        <w:t>inputs</w:t>
+      </w:r>
+      <w:r>
+        <w:rPr>
+          <w:color w:val="000000" w:themeColor="text1"/>
+          <w:sz w:val="24"/>
+          <w:szCs w:val="24"/>
+        </w:rPr>
+        <w:t xml:space="preserve"> e demos uma largura para o</w:t>
       </w:r>
       <w:r>
         <w:rPr>
@@ -8421,6 +8501,14 @@
           <w:szCs w:val="24"/>
         </w:rPr>
         <w:t>cupar de 50%</w:t>
+      </w:r>
+      <w:r>
+        <w:rPr>
+          <w:color w:val="000000" w:themeColor="text1"/>
+          <w:sz w:val="24"/>
+          <w:szCs w:val="24"/>
+        </w:rPr>
+        <w:t>.</w:t>
       </w:r>
     </w:p>
     <w:p>
@@ -8512,6 +8600,7 @@
       <w:proofErr w:type="spellStart"/>
       <w:r>
         <w:rPr>
+          <w:b/>
           <w:color w:val="000000" w:themeColor="text1"/>
           <w:sz w:val="24"/>
           <w:szCs w:val="24"/>
@@ -8520,6 +8609,7 @@
       </w:r>
       <w:r>
         <w:rPr>
+          <w:b/>
           <w:color w:val="000000" w:themeColor="text1"/>
           <w:sz w:val="24"/>
           <w:szCs w:val="24"/>
@@ -8533,7 +8623,32 @@
           <w:sz w:val="24"/>
           <w:szCs w:val="24"/>
         </w:rPr>
-        <w:t>, o input que utilizamos para enviar mensagem mais longa de texto</w:t>
+        <w:t xml:space="preserve">, o </w:t>
+      </w:r>
+      <w:r>
+        <w:rPr>
+          <w:b/>
+          <w:color w:val="000000" w:themeColor="text1"/>
+          <w:sz w:val="24"/>
+          <w:szCs w:val="24"/>
+        </w:rPr>
+        <w:t xml:space="preserve">input </w:t>
+      </w:r>
+      <w:r>
+        <w:rPr>
+          <w:color w:val="000000" w:themeColor="text1"/>
+          <w:sz w:val="24"/>
+          <w:szCs w:val="24"/>
+        </w:rPr>
+        <w:t>que utilizamos para enviar mensagem mais longa de texto</w:t>
+      </w:r>
+      <w:r>
+        <w:rPr>
+          <w:color w:val="000000" w:themeColor="text1"/>
+          <w:sz w:val="24"/>
+          <w:szCs w:val="24"/>
+        </w:rPr>
+        <w:t>.</w:t>
       </w:r>
     </w:p>
     <w:p>
@@ -8678,6 +8793,7 @@
       <w:proofErr w:type="spellStart"/>
       <w:r>
         <w:rPr>
+          <w:b/>
           <w:color w:val="000000" w:themeColor="text1"/>
           <w:sz w:val="24"/>
           <w:szCs w:val="24"/>
@@ -8691,7 +8807,36 @@
           <w:sz w:val="24"/>
           <w:szCs w:val="24"/>
         </w:rPr>
-        <w:t xml:space="preserve"> e os inputs radio</w:t>
+        <w:t xml:space="preserve"> e os </w:t>
+      </w:r>
+      <w:r>
+        <w:rPr>
+          <w:b/>
+          <w:color w:val="000000" w:themeColor="text1"/>
+          <w:sz w:val="24"/>
+          <w:szCs w:val="24"/>
+        </w:rPr>
+        <w:t xml:space="preserve">inputs </w:t>
+      </w:r>
+      <w:proofErr w:type="spellStart"/>
+      <w:r>
+        <w:rPr>
+          <w:b/>
+          <w:color w:val="000000" w:themeColor="text1"/>
+          <w:sz w:val="24"/>
+          <w:szCs w:val="24"/>
+        </w:rPr>
+        <w:t>radio</w:t>
+      </w:r>
+      <w:proofErr w:type="spellEnd"/>
+      <w:r>
+        <w:rPr>
+          <w:b/>
+          <w:color w:val="000000" w:themeColor="text1"/>
+          <w:sz w:val="24"/>
+          <w:szCs w:val="24"/>
+        </w:rPr>
+        <w:t>.</w:t>
       </w:r>
     </w:p>
     <w:p>
@@ -8828,6 +8973,7 @@
       <w:proofErr w:type="spellStart"/>
       <w:r>
         <w:rPr>
+          <w:b/>
           <w:color w:val="000000" w:themeColor="text1"/>
           <w:sz w:val="24"/>
           <w:szCs w:val="24"/>
@@ -8841,11 +8987,29 @@
           <w:sz w:val="24"/>
           <w:szCs w:val="24"/>
         </w:rPr>
-        <w:t xml:space="preserve"> e o input tipo </w:t>
+        <w:t xml:space="preserve"> e o </w:t>
+      </w:r>
+      <w:r>
+        <w:rPr>
+          <w:b/>
+          <w:color w:val="000000" w:themeColor="text1"/>
+          <w:sz w:val="24"/>
+          <w:szCs w:val="24"/>
+        </w:rPr>
+        <w:t>input</w:t>
+      </w:r>
+      <w:r>
+        <w:rPr>
+          <w:color w:val="000000" w:themeColor="text1"/>
+          <w:sz w:val="24"/>
+          <w:szCs w:val="24"/>
+        </w:rPr>
+        <w:t xml:space="preserve"> tipo </w:t>
       </w:r>
       <w:proofErr w:type="spellStart"/>
       <w:r>
         <w:rPr>
+          <w:b/>
           <w:color w:val="000000" w:themeColor="text1"/>
           <w:sz w:val="24"/>
           <w:szCs w:val="24"/>
@@ -8853,6 +9017,15 @@
         <w:t>checkbox</w:t>
       </w:r>
       <w:proofErr w:type="spellEnd"/>
+      <w:r>
+        <w:rPr>
+          <w:b/>
+          <w:color w:val="000000" w:themeColor="text1"/>
+          <w:sz w:val="24"/>
+          <w:szCs w:val="24"/>
+        </w:rPr>
+        <w:t>.</w:t>
+      </w:r>
     </w:p>
     <w:p>
       <w:pPr>
@@ -8991,19 +9164,47 @@
           <w:sz w:val="24"/>
           <w:szCs w:val="24"/>
         </w:rPr>
-        <w:t xml:space="preserve">Para colocar os inputs </w:t>
-      </w:r>
-      <w:r>
-        <w:rPr>
-          <w:color w:val="000000" w:themeColor="text1"/>
-          <w:sz w:val="24"/>
-          <w:szCs w:val="24"/>
-        </w:rPr>
-        <w:t>radio-box e o input-</w:t>
+        <w:t xml:space="preserve">Para colocar os </w:t>
+      </w:r>
+      <w:r>
+        <w:rPr>
+          <w:b/>
+          <w:color w:val="000000" w:themeColor="text1"/>
+          <w:sz w:val="24"/>
+          <w:szCs w:val="24"/>
+        </w:rPr>
+        <w:t xml:space="preserve">inputs </w:t>
+      </w:r>
+      <w:r>
+        <w:rPr>
+          <w:b/>
+          <w:color w:val="000000" w:themeColor="text1"/>
+          <w:sz w:val="24"/>
+          <w:szCs w:val="24"/>
+        </w:rPr>
+        <w:t>radio-box</w:t>
+      </w:r>
+      <w:r>
+        <w:rPr>
+          <w:color w:val="000000" w:themeColor="text1"/>
+          <w:sz w:val="24"/>
+          <w:szCs w:val="24"/>
+        </w:rPr>
+        <w:t xml:space="preserve"> e o </w:t>
+      </w:r>
+      <w:r>
+        <w:rPr>
+          <w:b/>
+          <w:color w:val="000000" w:themeColor="text1"/>
+          <w:sz w:val="24"/>
+          <w:szCs w:val="24"/>
+        </w:rPr>
+        <w:t>input-</w:t>
       </w:r>
       <w:proofErr w:type="spellStart"/>
       <w:r>
         <w:rPr>
+          <w:b/>
           <w:color w:val="000000" w:themeColor="text1"/>
           <w:sz w:val="24"/>
           <w:szCs w:val="24"/>
@@ -9022,6 +9223,7 @@
       <w:proofErr w:type="spellStart"/>
       <w:r>
         <w:rPr>
+          <w:b/>
           <w:color w:val="000000" w:themeColor="text1"/>
           <w:sz w:val="24"/>
           <w:szCs w:val="24"/>
@@ -9044,7 +9246,16 @@
           <w:sz w:val="24"/>
           <w:szCs w:val="24"/>
         </w:rPr>
-        <w:t>o inputs</w:t>
+        <w:t xml:space="preserve">o </w:t>
+      </w:r>
+      <w:r>
+        <w:rPr>
+          <w:b/>
+          <w:color w:val="000000" w:themeColor="text1"/>
+          <w:sz w:val="24"/>
+          <w:szCs w:val="24"/>
+        </w:rPr>
+        <w:t>inputs</w:t>
       </w:r>
       <w:proofErr w:type="gramEnd"/>
       <w:r>
@@ -9058,6 +9269,7 @@
       <w:proofErr w:type="spellStart"/>
       <w:r>
         <w:rPr>
+          <w:b/>
           <w:color w:val="000000" w:themeColor="text1"/>
           <w:sz w:val="24"/>
           <w:szCs w:val="24"/>
@@ -9140,11 +9352,29 @@
           <w:sz w:val="24"/>
           <w:szCs w:val="24"/>
         </w:rPr>
-        <w:t xml:space="preserve">49- Ao colocar os inputs dentro da </w:t>
+        <w:t xml:space="preserve">49- Ao colocar os </w:t>
+      </w:r>
+      <w:r>
+        <w:rPr>
+          <w:b/>
+          <w:color w:val="000000" w:themeColor="text1"/>
+          <w:sz w:val="24"/>
+          <w:szCs w:val="24"/>
+        </w:rPr>
+        <w:t>inputs</w:t>
+      </w:r>
+      <w:r>
+        <w:rPr>
+          <w:color w:val="000000" w:themeColor="text1"/>
+          <w:sz w:val="24"/>
+          <w:szCs w:val="24"/>
+        </w:rPr>
+        <w:t xml:space="preserve"> dentro da </w:t>
       </w:r>
       <w:proofErr w:type="spellStart"/>
       <w:r>
         <w:rPr>
+          <w:b/>
           <w:color w:val="000000" w:themeColor="text1"/>
           <w:sz w:val="24"/>
           <w:szCs w:val="24"/>
@@ -9163,6 +9393,7 @@
       <w:proofErr w:type="spellStart"/>
       <w:r>
         <w:rPr>
+          <w:b/>
           <w:color w:val="000000" w:themeColor="text1"/>
           <w:sz w:val="24"/>
           <w:szCs w:val="24"/>
@@ -9176,11 +9407,29 @@
           <w:sz w:val="24"/>
           <w:szCs w:val="24"/>
         </w:rPr>
-        <w:t xml:space="preserve"> para formatar os outros inputs para coloca-los em </w:t>
+        <w:t xml:space="preserve"> para formatar os outros </w:t>
+      </w:r>
+      <w:r>
+        <w:rPr>
+          <w:b/>
+          <w:color w:val="000000" w:themeColor="text1"/>
+          <w:sz w:val="24"/>
+          <w:szCs w:val="24"/>
+        </w:rPr>
+        <w:t>inputs</w:t>
+      </w:r>
+      <w:r>
+        <w:rPr>
+          <w:color w:val="000000" w:themeColor="text1"/>
+          <w:sz w:val="24"/>
+          <w:szCs w:val="24"/>
+        </w:rPr>
+        <w:t xml:space="preserve"> para coloca-los em </w:t>
       </w:r>
       <w:proofErr w:type="spellStart"/>
       <w:r>
         <w:rPr>
+          <w:b/>
           <w:color w:val="000000" w:themeColor="text1"/>
           <w:sz w:val="24"/>
           <w:szCs w:val="24"/>
@@ -9392,6 +9641,7 @@
       <w:proofErr w:type="spellStart"/>
       <w:r>
         <w:rPr>
+          <w:b/>
           <w:color w:val="000000" w:themeColor="text1"/>
           <w:sz w:val="24"/>
           <w:szCs w:val="24"/>
@@ -9574,6 +9824,7 @@
       <w:proofErr w:type="spellStart"/>
       <w:r>
         <w:rPr>
+          <w:b/>
           <w:color w:val="000000" w:themeColor="text1"/>
           <w:sz w:val="24"/>
           <w:szCs w:val="24"/>
@@ -9928,7 +10179,24 @@
           <w:sz w:val="24"/>
           <w:szCs w:val="24"/>
         </w:rPr>
-        <w:t xml:space="preserve">Trocamos os tipos de inputs de texto para os seus respectivos, como por exemplo </w:t>
+        <w:t xml:space="preserve">Trocamos os tipos de </w:t>
+      </w:r>
+      <w:r>
+        <w:rPr>
+          <w:b/>
+          <w:color w:val="000000" w:themeColor="text1"/>
+          <w:sz w:val="24"/>
+          <w:szCs w:val="24"/>
+        </w:rPr>
+        <w:t>inputs</w:t>
+      </w:r>
+      <w:r>
+        <w:rPr>
+          <w:color w:val="000000" w:themeColor="text1"/>
+          <w:sz w:val="24"/>
+          <w:szCs w:val="24"/>
+        </w:rPr>
+        <w:t xml:space="preserve"> de texto para os seus respectivos, como por exemplo </w:t>
       </w:r>
       <w:proofErr w:type="spellStart"/>
       <w:r>
@@ -10056,6 +10324,7 @@
       <w:proofErr w:type="spellStart"/>
       <w:r>
         <w:rPr>
+          <w:b/>
           <w:color w:val="000000" w:themeColor="text1"/>
           <w:sz w:val="24"/>
           <w:szCs w:val="24"/>
@@ -10153,6 +10422,7 @@
       <w:proofErr w:type="spellStart"/>
       <w:r>
         <w:rPr>
+          <w:b/>
           <w:color w:val="000000" w:themeColor="text1"/>
           <w:sz w:val="24"/>
           <w:szCs w:val="24"/>
@@ -10327,6 +10597,7 @@
       <w:proofErr w:type="spellStart"/>
       <w:r>
         <w:rPr>
+          <w:b/>
           <w:color w:val="000000" w:themeColor="text1"/>
           <w:sz w:val="24"/>
           <w:szCs w:val="24"/>
@@ -10345,6 +10616,7 @@
       <w:proofErr w:type="spellStart"/>
       <w:r>
         <w:rPr>
+          <w:b/>
           <w:color w:val="000000" w:themeColor="text1"/>
           <w:sz w:val="24"/>
           <w:szCs w:val="24"/>
@@ -10440,6 +10712,7 @@
       <w:proofErr w:type="spellStart"/>
       <w:r>
         <w:rPr>
+          <w:b/>
           <w:color w:val="000000" w:themeColor="text1"/>
           <w:sz w:val="24"/>
           <w:szCs w:val="24"/>
@@ -10466,6 +10739,7 @@
       <w:proofErr w:type="spellStart"/>
       <w:r>
         <w:rPr>
+          <w:b/>
           <w:color w:val="000000" w:themeColor="text1"/>
           <w:sz w:val="24"/>
           <w:szCs w:val="24"/>
@@ -10987,6 +11261,7 @@
       <w:proofErr w:type="spellStart"/>
       <w:r>
         <w:rPr>
+          <w:b/>
           <w:color w:val="000000" w:themeColor="text1"/>
           <w:sz w:val="24"/>
           <w:szCs w:val="24"/>
@@ -11013,6 +11288,7 @@
       </w:pPr>
       <w:r>
         <w:rPr>
+          <w:noProof/>
           <w:color w:val="000000" w:themeColor="text1"/>
           <w:sz w:val="24"/>
           <w:szCs w:val="24"/>
@@ -11073,6 +11349,7 @@
       <w:proofErr w:type="spellStart"/>
       <w:r>
         <w:rPr>
+          <w:b/>
           <w:color w:val="000000" w:themeColor="text1"/>
           <w:sz w:val="24"/>
           <w:szCs w:val="24"/>
@@ -11091,6 +11368,7 @@
       <w:proofErr w:type="spellStart"/>
       <w:r>
         <w:rPr>
+          <w:b/>
           <w:color w:val="000000" w:themeColor="text1"/>
           <w:sz w:val="24"/>
           <w:szCs w:val="24"/>
@@ -11109,6 +11387,7 @@
       <w:proofErr w:type="spellStart"/>
       <w:r>
         <w:rPr>
+          <w:b/>
           <w:color w:val="000000" w:themeColor="text1"/>
           <w:sz w:val="24"/>
           <w:szCs w:val="24"/>
@@ -11127,6 +11406,7 @@
       <w:proofErr w:type="spellStart"/>
       <w:r>
         <w:rPr>
+          <w:b/>
           <w:color w:val="000000" w:themeColor="text1"/>
           <w:sz w:val="24"/>
           <w:szCs w:val="24"/>
@@ -11141,6 +11421,14 @@
           <w:szCs w:val="24"/>
         </w:rPr>
         <w:t xml:space="preserve"> que são os dados do cabeçalho da tabela</w:t>
+      </w:r>
+      <w:r>
+        <w:rPr>
+          <w:color w:val="000000" w:themeColor="text1"/>
+          <w:sz w:val="24"/>
+          <w:szCs w:val="24"/>
+        </w:rPr>
+        <w:t>.</w:t>
       </w:r>
     </w:p>
     <w:p>
@@ -11224,6 +11512,7 @@
       <w:proofErr w:type="spellStart"/>
       <w:r>
         <w:rPr>
+          <w:b/>
           <w:color w:val="000000" w:themeColor="text1"/>
           <w:sz w:val="24"/>
           <w:szCs w:val="24"/>
@@ -11246,6 +11535,14 @@
           <w:szCs w:val="24"/>
         </w:rPr>
         <w:t>externo para cima e para baixo</w:t>
+      </w:r>
+      <w:r>
+        <w:rPr>
+          <w:color w:val="000000" w:themeColor="text1"/>
+          <w:sz w:val="24"/>
+          <w:szCs w:val="24"/>
+        </w:rPr>
+        <w:t>.</w:t>
       </w:r>
     </w:p>
     <w:p>
@@ -11326,6 +11623,14 @@
         </w:rPr>
         <w:t>60- No cabeçalho da tabela adicionamos uma cor de fundo, mudamos a cor do texto e deixamos mais encorpada</w:t>
       </w:r>
+      <w:r>
+        <w:rPr>
+          <w:color w:val="000000" w:themeColor="text1"/>
+          <w:sz w:val="24"/>
+          <w:szCs w:val="24"/>
+        </w:rPr>
+        <w:t>.</w:t>
+      </w:r>
     </w:p>
     <w:p>
       <w:pPr>
@@ -11405,6 +11710,14 @@
         </w:rPr>
         <w:t>61- Colocamos uma borda nos dados da tabela e no cabeçalho conforme código</w:t>
       </w:r>
+      <w:r>
+        <w:rPr>
+          <w:color w:val="000000" w:themeColor="text1"/>
+          <w:sz w:val="24"/>
+          <w:szCs w:val="24"/>
+        </w:rPr>
+        <w:t>.</w:t>
+      </w:r>
     </w:p>
     <w:p>
       <w:pPr>
@@ -11492,6 +11805,14 @@
         </w:rPr>
         <w:t>Agora vamos dar um espaço interno para cima e para baixo e para os lados esquerdo e direito</w:t>
       </w:r>
+      <w:r>
+        <w:rPr>
+          <w:color w:val="000000" w:themeColor="text1"/>
+          <w:sz w:val="24"/>
+          <w:szCs w:val="24"/>
+        </w:rPr>
+        <w:t>.</w:t>
+      </w:r>
     </w:p>
     <w:p>
       <w:pPr>
@@ -11577,16 +11898,69 @@
           <w:sz w:val="24"/>
           <w:szCs w:val="24"/>
         </w:rPr>
-        <w:t xml:space="preserve">Da mesma forma na página de contato </w:t>
+        <w:t xml:space="preserve">Da mesma forma na página de </w:t>
+      </w:r>
+      <w:r>
+        <w:rPr>
+          <w:b/>
+          <w:color w:val="000000" w:themeColor="text1"/>
+          <w:sz w:val="24"/>
+          <w:szCs w:val="24"/>
+        </w:rPr>
+        <w:t>contato</w:t>
+      </w:r>
+      <w:r>
+        <w:rPr>
+          <w:b/>
+          <w:color w:val="000000" w:themeColor="text1"/>
+          <w:sz w:val="24"/>
+          <w:szCs w:val="24"/>
+        </w:rPr>
+        <w:t>.</w:t>
+      </w:r>
+      <w:r>
+        <w:rPr>
+          <w:b/>
+          <w:color w:val="000000" w:themeColor="text1"/>
+          <w:sz w:val="24"/>
+          <w:szCs w:val="24"/>
+        </w:rPr>
+        <w:t>html</w:t>
+      </w:r>
+      <w:r>
+        <w:rPr>
+          <w:color w:val="000000" w:themeColor="text1"/>
+          <w:sz w:val="24"/>
+          <w:szCs w:val="24"/>
+        </w:rPr>
+        <w:t xml:space="preserve"> que copiamos o </w:t>
+      </w:r>
+      <w:r>
+        <w:rPr>
+          <w:b/>
+          <w:color w:val="000000" w:themeColor="text1"/>
+          <w:sz w:val="24"/>
+          <w:szCs w:val="24"/>
+        </w:rPr>
+        <w:t>header</w:t>
+      </w:r>
+      <w:r>
+        <w:rPr>
+          <w:color w:val="000000" w:themeColor="text1"/>
+          <w:sz w:val="24"/>
+          <w:szCs w:val="24"/>
+        </w:rPr>
+        <w:t xml:space="preserve"> e </w:t>
       </w:r>
       <w:proofErr w:type="spellStart"/>
       <w:r>
         <w:rPr>
-          <w:color w:val="000000" w:themeColor="text1"/>
-          <w:sz w:val="24"/>
-          <w:szCs w:val="24"/>
-        </w:rPr>
-        <w:t>html</w:t>
+          <w:b/>
+          <w:color w:val="000000" w:themeColor="text1"/>
+          <w:sz w:val="24"/>
+          <w:szCs w:val="24"/>
+        </w:rPr>
+        <w:t>footer</w:t>
       </w:r>
       <w:proofErr w:type="spellEnd"/>
       <w:r>
@@ -11595,11 +11969,82 @@
           <w:sz w:val="24"/>
           <w:szCs w:val="24"/>
         </w:rPr>
-        <w:t xml:space="preserve"> que copiamos o header e </w:t>
+        <w:t xml:space="preserve"> da página </w:t>
+      </w:r>
+      <w:r>
+        <w:rPr>
+          <w:b/>
+          <w:color w:val="000000" w:themeColor="text1"/>
+          <w:sz w:val="24"/>
+          <w:szCs w:val="24"/>
+        </w:rPr>
+        <w:t>produtos</w:t>
+      </w:r>
+      <w:r>
+        <w:rPr>
+          <w:color w:val="000000" w:themeColor="text1"/>
+          <w:sz w:val="24"/>
+          <w:szCs w:val="24"/>
+        </w:rPr>
+        <w:t xml:space="preserve">, colocamos na página </w:t>
+      </w:r>
+      <w:r>
+        <w:rPr>
+          <w:b/>
+          <w:color w:val="000000" w:themeColor="text1"/>
+          <w:sz w:val="24"/>
+          <w:szCs w:val="24"/>
+        </w:rPr>
+        <w:t>index.html</w:t>
+      </w:r>
+      <w:r>
+        <w:rPr>
+          <w:color w:val="000000" w:themeColor="text1"/>
+          <w:sz w:val="24"/>
+          <w:szCs w:val="24"/>
+        </w:rPr>
+        <w:t xml:space="preserve"> e aplicamos o </w:t>
       </w:r>
       <w:proofErr w:type="spellStart"/>
       <w:r>
         <w:rPr>
+          <w:b/>
+          <w:color w:val="000000" w:themeColor="text1"/>
+          <w:sz w:val="24"/>
+          <w:szCs w:val="24"/>
+        </w:rPr>
+        <w:t>css</w:t>
+      </w:r>
+      <w:proofErr w:type="spellEnd"/>
+      <w:r>
+        <w:rPr>
+          <w:color w:val="000000" w:themeColor="text1"/>
+          <w:sz w:val="24"/>
+          <w:szCs w:val="24"/>
+        </w:rPr>
+        <w:t xml:space="preserve"> fazendo isso para não ter a necessidade de fazer novamente o </w:t>
+      </w:r>
+      <w:r>
+        <w:rPr>
+          <w:b/>
+          <w:color w:val="000000" w:themeColor="text1"/>
+          <w:sz w:val="24"/>
+          <w:szCs w:val="24"/>
+        </w:rPr>
+        <w:t>menu</w:t>
+      </w:r>
+      <w:r>
+        <w:rPr>
+          <w:color w:val="000000" w:themeColor="text1"/>
+          <w:sz w:val="24"/>
+          <w:szCs w:val="24"/>
+        </w:rPr>
+        <w:t xml:space="preserve"> e o </w:t>
+      </w:r>
+      <w:proofErr w:type="spellStart"/>
+      <w:r>
+        <w:rPr>
+          <w:b/>
           <w:color w:val="000000" w:themeColor="text1"/>
           <w:sz w:val="24"/>
           <w:szCs w:val="24"/>
@@ -11609,40 +12054,13 @@
       <w:proofErr w:type="spellEnd"/>
       <w:r>
         <w:rPr>
-          <w:color w:val="000000" w:themeColor="text1"/>
-          <w:sz w:val="24"/>
-          <w:szCs w:val="24"/>
-        </w:rPr>
-        <w:t xml:space="preserve"> da página produtos, colocamos na página index.html e aplicamos o </w:t>
-      </w:r>
-      <w:proofErr w:type="spellStart"/>
-      <w:r>
-        <w:rPr>
-          <w:color w:val="000000" w:themeColor="text1"/>
-          <w:sz w:val="24"/>
-          <w:szCs w:val="24"/>
-        </w:rPr>
-        <w:t>css</w:t>
-      </w:r>
-      <w:proofErr w:type="spellEnd"/>
-      <w:r>
-        <w:rPr>
-          <w:color w:val="000000" w:themeColor="text1"/>
-          <w:sz w:val="24"/>
-          <w:szCs w:val="24"/>
-        </w:rPr>
-        <w:t xml:space="preserve"> fazendo isso para não ter a necessidade de fazer novamente o menu e o </w:t>
-      </w:r>
-      <w:proofErr w:type="spellStart"/>
-      <w:r>
-        <w:rPr>
-          <w:color w:val="000000" w:themeColor="text1"/>
-          <w:sz w:val="24"/>
-          <w:szCs w:val="24"/>
-        </w:rPr>
-        <w:t>footer</w:t>
-      </w:r>
-      <w:proofErr w:type="spellEnd"/>
+          <w:b/>
+          <w:color w:val="000000" w:themeColor="text1"/>
+          <w:sz w:val="24"/>
+          <w:szCs w:val="24"/>
+        </w:rPr>
+        <w:t>.</w:t>
+      </w:r>
     </w:p>
     <w:p>
       <w:pPr>
@@ -11660,17 +12078,26 @@
         </w:rPr>
         <w:t>64- Vamos deixar a imagem do banner ocupando 100% de espaço</w:t>
       </w:r>
-    </w:p>
-    <w:p>
-      <w:pPr>
-        <w:rPr>
-          <w:color w:val="000000" w:themeColor="text1"/>
-          <w:sz w:val="24"/>
-          <w:szCs w:val="24"/>
-        </w:rPr>
-      </w:pPr>
-      <w:r>
-        <w:rPr>
+      <w:r>
+        <w:rPr>
+          <w:color w:val="000000" w:themeColor="text1"/>
+          <w:sz w:val="24"/>
+          <w:szCs w:val="24"/>
+        </w:rPr>
+        <w:t>.</w:t>
+      </w:r>
+    </w:p>
+    <w:p>
+      <w:pPr>
+        <w:rPr>
+          <w:color w:val="000000" w:themeColor="text1"/>
+          <w:sz w:val="24"/>
+          <w:szCs w:val="24"/>
+        </w:rPr>
+      </w:pPr>
+      <w:r>
+        <w:rPr>
+          <w:noProof/>
           <w:color w:val="000000" w:themeColor="text1"/>
           <w:sz w:val="24"/>
           <w:szCs w:val="24"/>
@@ -11739,6 +12166,7 @@
       <w:proofErr w:type="spellStart"/>
       <w:r>
         <w:rPr>
+          <w:b/>
           <w:color w:val="000000" w:themeColor="text1"/>
           <w:sz w:val="24"/>
           <w:szCs w:val="24"/>
@@ -11816,8 +12244,1226 @@
           </wp:inline>
         </w:drawing>
       </w:r>
+    </w:p>
+    <w:p>
+      <w:pPr>
+        <w:rPr>
+          <w:color w:val="000000" w:themeColor="text1"/>
+          <w:sz w:val="24"/>
+          <w:szCs w:val="24"/>
+        </w:rPr>
+      </w:pPr>
+      <w:r>
+        <w:rPr>
+          <w:color w:val="000000" w:themeColor="text1"/>
+          <w:sz w:val="24"/>
+          <w:szCs w:val="24"/>
+        </w:rPr>
+        <w:t xml:space="preserve">66- Na página do </w:t>
+      </w:r>
+      <w:r>
+        <w:rPr>
+          <w:b/>
+          <w:color w:val="000000" w:themeColor="text1"/>
+          <w:sz w:val="24"/>
+          <w:szCs w:val="24"/>
+        </w:rPr>
+        <w:t>index.html</w:t>
+      </w:r>
+      <w:r>
+        <w:rPr>
+          <w:color w:val="000000" w:themeColor="text1"/>
+          <w:sz w:val="24"/>
+          <w:szCs w:val="24"/>
+        </w:rPr>
+        <w:t xml:space="preserve"> trocamos as </w:t>
+      </w:r>
+      <w:proofErr w:type="spellStart"/>
+      <w:r>
+        <w:rPr>
+          <w:b/>
+          <w:color w:val="000000" w:themeColor="text1"/>
+          <w:sz w:val="24"/>
+          <w:szCs w:val="24"/>
+        </w:rPr>
+        <w:t>divs</w:t>
+      </w:r>
+      <w:proofErr w:type="spellEnd"/>
+      <w:r>
+        <w:rPr>
+          <w:color w:val="000000" w:themeColor="text1"/>
+          <w:sz w:val="24"/>
+          <w:szCs w:val="24"/>
+        </w:rPr>
+        <w:t xml:space="preserve"> por </w:t>
+      </w:r>
+      <w:proofErr w:type="spellStart"/>
+      <w:r>
+        <w:rPr>
+          <w:b/>
+          <w:color w:val="000000" w:themeColor="text1"/>
+          <w:sz w:val="24"/>
+          <w:szCs w:val="24"/>
+        </w:rPr>
+        <w:t>section</w:t>
+      </w:r>
+      <w:proofErr w:type="spellEnd"/>
+      <w:r>
+        <w:rPr>
+          <w:color w:val="000000" w:themeColor="text1"/>
+          <w:sz w:val="24"/>
+          <w:szCs w:val="24"/>
+        </w:rPr>
+        <w:t xml:space="preserve"> entendendo que as </w:t>
+      </w:r>
+      <w:proofErr w:type="spellStart"/>
+      <w:r>
+        <w:rPr>
+          <w:b/>
+          <w:color w:val="000000" w:themeColor="text1"/>
+          <w:sz w:val="24"/>
+          <w:szCs w:val="24"/>
+        </w:rPr>
+        <w:t>divs</w:t>
+      </w:r>
+      <w:proofErr w:type="spellEnd"/>
+      <w:r>
+        <w:rPr>
+          <w:color w:val="000000" w:themeColor="text1"/>
+          <w:sz w:val="24"/>
+          <w:szCs w:val="24"/>
+        </w:rPr>
+        <w:t xml:space="preserve"> que foram trocadas pelas </w:t>
+      </w:r>
+      <w:proofErr w:type="spellStart"/>
+      <w:r>
+        <w:rPr>
+          <w:b/>
+          <w:color w:val="000000" w:themeColor="text1"/>
+          <w:sz w:val="24"/>
+          <w:szCs w:val="24"/>
+        </w:rPr>
+        <w:t>section</w:t>
+      </w:r>
+      <w:proofErr w:type="spellEnd"/>
+      <w:r>
+        <w:rPr>
+          <w:color w:val="000000" w:themeColor="text1"/>
+          <w:sz w:val="24"/>
+          <w:szCs w:val="24"/>
+        </w:rPr>
+        <w:t xml:space="preserve"> tinha as divisões falando do mesmo assunto por tal motivo utilizamos </w:t>
+      </w:r>
+      <w:proofErr w:type="spellStart"/>
+      <w:r>
+        <w:rPr>
+          <w:b/>
+          <w:color w:val="000000" w:themeColor="text1"/>
+          <w:sz w:val="24"/>
+          <w:szCs w:val="24"/>
+        </w:rPr>
+        <w:t>section</w:t>
+      </w:r>
+      <w:proofErr w:type="spellEnd"/>
+      <w:r>
+        <w:rPr>
+          <w:color w:val="000000" w:themeColor="text1"/>
+          <w:sz w:val="24"/>
+          <w:szCs w:val="24"/>
+        </w:rPr>
+        <w:t xml:space="preserve"> ou seja </w:t>
+      </w:r>
+      <w:proofErr w:type="gramStart"/>
+      <w:r>
+        <w:rPr>
+          <w:color w:val="000000" w:themeColor="text1"/>
+          <w:sz w:val="24"/>
+          <w:szCs w:val="24"/>
+        </w:rPr>
+        <w:t>( quando</w:t>
+      </w:r>
+      <w:proofErr w:type="gramEnd"/>
+      <w:r>
+        <w:rPr>
+          <w:color w:val="000000" w:themeColor="text1"/>
+          <w:sz w:val="24"/>
+          <w:szCs w:val="24"/>
+        </w:rPr>
+        <w:t xml:space="preserve"> temos em nosso site uma divisão que fala sobre o mesmo assunto utilizamos </w:t>
+      </w:r>
+      <w:proofErr w:type="spellStart"/>
+      <w:r>
+        <w:rPr>
+          <w:b/>
+          <w:color w:val="000000" w:themeColor="text1"/>
+          <w:sz w:val="24"/>
+          <w:szCs w:val="24"/>
+        </w:rPr>
+        <w:t>section</w:t>
+      </w:r>
+      <w:proofErr w:type="spellEnd"/>
+      <w:r>
+        <w:rPr>
+          <w:color w:val="000000" w:themeColor="text1"/>
+          <w:sz w:val="24"/>
+          <w:szCs w:val="24"/>
+        </w:rPr>
+        <w:t xml:space="preserve"> ao invés de </w:t>
+      </w:r>
+      <w:proofErr w:type="spellStart"/>
+      <w:r>
+        <w:rPr>
+          <w:b/>
+          <w:color w:val="000000" w:themeColor="text1"/>
+          <w:sz w:val="24"/>
+          <w:szCs w:val="24"/>
+        </w:rPr>
+        <w:t>div</w:t>
+      </w:r>
+      <w:proofErr w:type="spellEnd"/>
+      <w:r>
+        <w:rPr>
+          <w:color w:val="000000" w:themeColor="text1"/>
+          <w:sz w:val="24"/>
+          <w:szCs w:val="24"/>
+        </w:rPr>
+        <w:t>).</w:t>
+      </w:r>
+    </w:p>
+    <w:p>
+      <w:pPr>
+        <w:rPr>
+          <w:color w:val="000000" w:themeColor="text1"/>
+          <w:sz w:val="24"/>
+          <w:szCs w:val="24"/>
+        </w:rPr>
+      </w:pPr>
+      <w:r>
+        <w:rPr>
+          <w:color w:val="000000" w:themeColor="text1"/>
+          <w:sz w:val="24"/>
+          <w:szCs w:val="24"/>
+        </w:rPr>
+        <w:drawing>
+          <wp:inline distT="0" distB="0" distL="0" distR="0" wp14:anchorId="0397A856" wp14:editId="637C0BDD">
+            <wp:extent cx="2029108" cy="228632"/>
+            <wp:effectExtent l="0" t="0" r="0" b="0"/>
+            <wp:docPr id="104" name="Imagem 104"/>
+            <wp:cNvGraphicFramePr>
+              <a:graphicFrameLocks xmlns:a="http://schemas.openxmlformats.org/drawingml/2006/main" noChangeAspect="1"/>
+            </wp:cNvGraphicFramePr>
+            <a:graphic xmlns:a="http://schemas.openxmlformats.org/drawingml/2006/main">
+              <a:graphicData uri="http://schemas.openxmlformats.org/drawingml/2006/picture">
+                <pic:pic xmlns:pic="http://schemas.openxmlformats.org/drawingml/2006/picture">
+                  <pic:nvPicPr>
+                    <pic:cNvPr id="1" name=""/>
+                    <pic:cNvPicPr/>
+                  </pic:nvPicPr>
+                  <pic:blipFill>
+                    <a:blip r:embed="rId104"/>
+                    <a:stretch>
+                      <a:fillRect/>
+                    </a:stretch>
+                  </pic:blipFill>
+                  <pic:spPr>
+                    <a:xfrm>
+                      <a:off x="0" y="0"/>
+                      <a:ext cx="2029108" cy="228632"/>
+                    </a:xfrm>
+                    <a:prstGeom prst="rect">
+                      <a:avLst/>
+                    </a:prstGeom>
+                  </pic:spPr>
+                </pic:pic>
+              </a:graphicData>
+            </a:graphic>
+          </wp:inline>
+        </w:drawing>
+      </w:r>
+    </w:p>
+    <w:p>
+      <w:pPr>
+        <w:rPr>
+          <w:color w:val="000000" w:themeColor="text1"/>
+          <w:sz w:val="24"/>
+          <w:szCs w:val="24"/>
+        </w:rPr>
+      </w:pPr>
+      <w:proofErr w:type="spellStart"/>
+      <w:r>
+        <w:rPr>
+          <w:b/>
+          <w:color w:val="000000" w:themeColor="text1"/>
+          <w:sz w:val="24"/>
+          <w:szCs w:val="24"/>
+        </w:rPr>
+        <w:t>Section</w:t>
+      </w:r>
+      <w:proofErr w:type="spellEnd"/>
+      <w:r>
+        <w:rPr>
+          <w:color w:val="000000" w:themeColor="text1"/>
+          <w:sz w:val="24"/>
+          <w:szCs w:val="24"/>
+        </w:rPr>
+        <w:t xml:space="preserve"> sobre a barbearia</w:t>
+      </w:r>
+      <w:r>
+        <w:rPr>
+          <w:color w:val="000000" w:themeColor="text1"/>
+          <w:sz w:val="24"/>
+          <w:szCs w:val="24"/>
+        </w:rPr>
+        <w:t>.</w:t>
+      </w:r>
+    </w:p>
+    <w:p>
+      <w:pPr>
+        <w:rPr>
+          <w:color w:val="000000" w:themeColor="text1"/>
+          <w:sz w:val="24"/>
+          <w:szCs w:val="24"/>
+        </w:rPr>
+      </w:pPr>
+      <w:r>
+        <w:rPr>
+          <w:noProof/>
+          <w:color w:val="000000" w:themeColor="text1"/>
+          <w:sz w:val="24"/>
+          <w:szCs w:val="24"/>
+        </w:rPr>
+        <w:drawing>
+          <wp:inline distT="0" distB="0" distL="0" distR="0" wp14:anchorId="3296542F">
+            <wp:extent cx="2152650" cy="209550"/>
+            <wp:effectExtent l="0" t="0" r="0" b="0"/>
+            <wp:docPr id="109" name="Imagem 109"/>
+            <wp:cNvGraphicFramePr>
+              <a:graphicFrameLocks xmlns:a="http://schemas.openxmlformats.org/drawingml/2006/main" noChangeAspect="1"/>
+            </wp:cNvGraphicFramePr>
+            <a:graphic xmlns:a="http://schemas.openxmlformats.org/drawingml/2006/main">
+              <a:graphicData uri="http://schemas.openxmlformats.org/drawingml/2006/picture">
+                <pic:pic xmlns:pic="http://schemas.openxmlformats.org/drawingml/2006/picture">
+                  <pic:nvPicPr>
+                    <pic:cNvPr id="0" name="Picture 2"/>
+                    <pic:cNvPicPr>
+                      <a:picLocks noChangeAspect="1" noChangeArrowheads="1"/>
+                    </pic:cNvPicPr>
+                  </pic:nvPicPr>
+                  <pic:blipFill>
+                    <a:blip r:embed="rId105">
+                      <a:extLst>
+                        <a:ext uri="{28A0092B-C50C-407E-A947-70E740481C1C}">
+                          <a14:useLocalDpi xmlns:a14="http://schemas.microsoft.com/office/drawing/2010/main" val="0"/>
+                        </a:ext>
+                      </a:extLst>
+                    </a:blip>
+                    <a:srcRect/>
+                    <a:stretch>
+                      <a:fillRect/>
+                    </a:stretch>
+                  </pic:blipFill>
+                  <pic:spPr bwMode="auto">
+                    <a:xfrm>
+                      <a:off x="0" y="0"/>
+                      <a:ext cx="2152650" cy="209550"/>
+                    </a:xfrm>
+                    <a:prstGeom prst="rect">
+                      <a:avLst/>
+                    </a:prstGeom>
+                    <a:noFill/>
+                  </pic:spPr>
+                </pic:pic>
+              </a:graphicData>
+            </a:graphic>
+          </wp:inline>
+        </w:drawing>
+      </w:r>
+    </w:p>
+    <w:p>
+      <w:pPr>
+        <w:rPr>
+          <w:color w:val="000000" w:themeColor="text1"/>
+          <w:sz w:val="24"/>
+          <w:szCs w:val="24"/>
+        </w:rPr>
+      </w:pPr>
+      <w:proofErr w:type="spellStart"/>
+      <w:r>
+        <w:rPr>
+          <w:b/>
+          <w:color w:val="000000" w:themeColor="text1"/>
+          <w:sz w:val="24"/>
+          <w:szCs w:val="24"/>
+        </w:rPr>
+        <w:t>Section</w:t>
+      </w:r>
+      <w:proofErr w:type="spellEnd"/>
+      <w:r>
+        <w:rPr>
+          <w:color w:val="000000" w:themeColor="text1"/>
+          <w:sz w:val="24"/>
+          <w:szCs w:val="24"/>
+        </w:rPr>
+        <w:t xml:space="preserve"> sobre os benefícios</w:t>
+      </w:r>
+      <w:r>
+        <w:rPr>
+          <w:color w:val="000000" w:themeColor="text1"/>
+          <w:sz w:val="24"/>
+          <w:szCs w:val="24"/>
+        </w:rPr>
+        <w:t>.</w:t>
+      </w:r>
+    </w:p>
+    <w:p>
+      <w:pPr>
+        <w:rPr>
+          <w:color w:val="000000" w:themeColor="text1"/>
+          <w:sz w:val="24"/>
+          <w:szCs w:val="24"/>
+        </w:rPr>
+      </w:pPr>
+      <w:r>
+        <w:rPr>
+          <w:color w:val="000000" w:themeColor="text1"/>
+          <w:sz w:val="24"/>
+          <w:szCs w:val="24"/>
+        </w:rPr>
+        <w:t xml:space="preserve">67- No subtítulo </w:t>
+      </w:r>
+      <w:r>
+        <w:rPr>
+          <w:b/>
+          <w:color w:val="000000" w:themeColor="text1"/>
+          <w:sz w:val="24"/>
+          <w:szCs w:val="24"/>
+        </w:rPr>
+        <w:t>h2</w:t>
+      </w:r>
+      <w:r>
+        <w:rPr>
+          <w:color w:val="000000" w:themeColor="text1"/>
+          <w:sz w:val="24"/>
+          <w:szCs w:val="24"/>
+        </w:rPr>
+        <w:t xml:space="preserve"> e </w:t>
+      </w:r>
+      <w:r>
+        <w:rPr>
+          <w:b/>
+          <w:color w:val="000000" w:themeColor="text1"/>
+          <w:sz w:val="24"/>
+          <w:szCs w:val="24"/>
+        </w:rPr>
+        <w:t>h3</w:t>
+      </w:r>
+      <w:r>
+        <w:rPr>
+          <w:color w:val="000000" w:themeColor="text1"/>
+          <w:sz w:val="24"/>
+          <w:szCs w:val="24"/>
+        </w:rPr>
+        <w:t xml:space="preserve"> adicionamos uma </w:t>
+      </w:r>
+      <w:proofErr w:type="spellStart"/>
+      <w:r>
+        <w:rPr>
+          <w:b/>
+          <w:color w:val="000000" w:themeColor="text1"/>
+          <w:sz w:val="24"/>
+          <w:szCs w:val="24"/>
+        </w:rPr>
+        <w:t>class</w:t>
+      </w:r>
+      <w:proofErr w:type="spellEnd"/>
+      <w:r>
+        <w:rPr>
+          <w:color w:val="000000" w:themeColor="text1"/>
+          <w:sz w:val="24"/>
+          <w:szCs w:val="24"/>
+        </w:rPr>
+        <w:t xml:space="preserve"> chamada </w:t>
+      </w:r>
+      <w:proofErr w:type="spellStart"/>
+      <w:r>
+        <w:rPr>
+          <w:b/>
+          <w:color w:val="000000" w:themeColor="text1"/>
+          <w:sz w:val="24"/>
+          <w:szCs w:val="24"/>
+        </w:rPr>
+        <w:t>titulo</w:t>
+      </w:r>
+      <w:proofErr w:type="spellEnd"/>
+      <w:r>
+        <w:rPr>
+          <w:b/>
+          <w:color w:val="000000" w:themeColor="text1"/>
+          <w:sz w:val="24"/>
+          <w:szCs w:val="24"/>
+        </w:rPr>
+        <w:t>-principal</w:t>
+      </w:r>
+      <w:r>
+        <w:rPr>
+          <w:color w:val="000000" w:themeColor="text1"/>
+          <w:sz w:val="24"/>
+          <w:szCs w:val="24"/>
+        </w:rPr>
+        <w:t xml:space="preserve"> e realizamos as seguintes configurações:</w:t>
+      </w:r>
+    </w:p>
+    <w:p>
+      <w:pPr>
+        <w:pStyle w:val="PargrafodaLista"/>
+        <w:numPr>
+          <w:ilvl w:val="0"/>
+          <w:numId w:val="9"/>
+        </w:numPr>
+        <w:rPr>
+          <w:color w:val="000000" w:themeColor="text1"/>
+          <w:sz w:val="24"/>
+          <w:szCs w:val="24"/>
+        </w:rPr>
+      </w:pPr>
+      <w:r>
+        <w:rPr>
+          <w:color w:val="000000" w:themeColor="text1"/>
+          <w:sz w:val="24"/>
+          <w:szCs w:val="24"/>
+        </w:rPr>
+        <w:t xml:space="preserve">Centralizamos os subtítulos </w:t>
+      </w:r>
+    </w:p>
+    <w:p>
+      <w:pPr>
+        <w:pStyle w:val="PargrafodaLista"/>
+        <w:numPr>
+          <w:ilvl w:val="0"/>
+          <w:numId w:val="9"/>
+        </w:numPr>
+        <w:rPr>
+          <w:color w:val="000000" w:themeColor="text1"/>
+          <w:sz w:val="24"/>
+          <w:szCs w:val="24"/>
+        </w:rPr>
+      </w:pPr>
+      <w:r>
+        <w:rPr>
+          <w:color w:val="000000" w:themeColor="text1"/>
+          <w:sz w:val="24"/>
+          <w:szCs w:val="24"/>
+        </w:rPr>
+        <w:t xml:space="preserve">Aumentamos a fonte utilizando a medida de </w:t>
+      </w:r>
+      <w:r>
+        <w:rPr>
+          <w:b/>
+          <w:color w:val="000000" w:themeColor="text1"/>
+          <w:sz w:val="24"/>
+          <w:szCs w:val="24"/>
+        </w:rPr>
+        <w:t>(em)</w:t>
+      </w:r>
+      <w:r>
+        <w:rPr>
+          <w:color w:val="000000" w:themeColor="text1"/>
+          <w:sz w:val="24"/>
+          <w:szCs w:val="24"/>
+        </w:rPr>
+        <w:t xml:space="preserve"> que temos por referência que </w:t>
+      </w:r>
+      <w:r>
+        <w:rPr>
+          <w:b/>
+          <w:color w:val="000000" w:themeColor="text1"/>
+          <w:sz w:val="24"/>
+          <w:szCs w:val="24"/>
+        </w:rPr>
+        <w:t>1em</w:t>
+      </w:r>
+      <w:r>
+        <w:rPr>
+          <w:color w:val="000000" w:themeColor="text1"/>
+          <w:sz w:val="24"/>
+          <w:szCs w:val="24"/>
+        </w:rPr>
+        <w:t xml:space="preserve"> é igual a </w:t>
+      </w:r>
+      <w:r>
+        <w:rPr>
+          <w:b/>
+          <w:color w:val="000000" w:themeColor="text1"/>
+          <w:sz w:val="24"/>
+          <w:szCs w:val="24"/>
+        </w:rPr>
+        <w:t>16px</w:t>
+      </w:r>
+      <w:r>
+        <w:rPr>
+          <w:color w:val="000000" w:themeColor="text1"/>
+          <w:sz w:val="24"/>
+          <w:szCs w:val="24"/>
+        </w:rPr>
+        <w:t xml:space="preserve"> medida padrão do navegador então </w:t>
+      </w:r>
+      <w:r>
+        <w:rPr>
+          <w:b/>
+          <w:color w:val="000000" w:themeColor="text1"/>
+          <w:sz w:val="24"/>
+          <w:szCs w:val="24"/>
+        </w:rPr>
+        <w:t>2em</w:t>
+      </w:r>
+      <w:r>
+        <w:rPr>
+          <w:color w:val="000000" w:themeColor="text1"/>
+          <w:sz w:val="24"/>
+          <w:szCs w:val="24"/>
+        </w:rPr>
+        <w:t xml:space="preserve"> é igual a </w:t>
+      </w:r>
+      <w:r>
+        <w:rPr>
+          <w:b/>
+          <w:color w:val="000000" w:themeColor="text1"/>
+          <w:sz w:val="24"/>
+          <w:szCs w:val="24"/>
+        </w:rPr>
+        <w:t>32px</w:t>
+      </w:r>
+    </w:p>
+    <w:p>
+      <w:pPr>
+        <w:pStyle w:val="PargrafodaLista"/>
+        <w:numPr>
+          <w:ilvl w:val="0"/>
+          <w:numId w:val="9"/>
+        </w:numPr>
+        <w:rPr>
+          <w:color w:val="000000" w:themeColor="text1"/>
+          <w:sz w:val="24"/>
+          <w:szCs w:val="24"/>
+        </w:rPr>
+      </w:pPr>
+      <w:r>
+        <w:rPr>
+          <w:color w:val="000000" w:themeColor="text1"/>
+          <w:sz w:val="24"/>
+          <w:szCs w:val="24"/>
+        </w:rPr>
+        <w:t>E adicionamos um espaço externo para baixo</w:t>
+      </w:r>
+    </w:p>
+    <w:p>
+      <w:pPr>
+        <w:rPr>
+          <w:color w:val="000000" w:themeColor="text1"/>
+          <w:sz w:val="24"/>
+          <w:szCs w:val="24"/>
+        </w:rPr>
+      </w:pPr>
+      <w:r>
+        <w:rPr>
+          <w:noProof/>
+          <w:color w:val="000000" w:themeColor="text1"/>
+          <w:sz w:val="24"/>
+          <w:szCs w:val="24"/>
+        </w:rPr>
+        <w:drawing>
+          <wp:inline distT="0" distB="0" distL="0" distR="0" wp14:anchorId="3B6C9857" wp14:editId="501D1048">
+            <wp:extent cx="1733550" cy="990600"/>
+            <wp:effectExtent l="0" t="0" r="0" b="0"/>
+            <wp:docPr id="112" name="Imagem 112"/>
+            <wp:cNvGraphicFramePr>
+              <a:graphicFrameLocks xmlns:a="http://schemas.openxmlformats.org/drawingml/2006/main" noChangeAspect="1"/>
+            </wp:cNvGraphicFramePr>
+            <a:graphic xmlns:a="http://schemas.openxmlformats.org/drawingml/2006/main">
+              <a:graphicData uri="http://schemas.openxmlformats.org/drawingml/2006/picture">
+                <pic:pic xmlns:pic="http://schemas.openxmlformats.org/drawingml/2006/picture">
+                  <pic:nvPicPr>
+                    <pic:cNvPr id="0" name="Picture 5"/>
+                    <pic:cNvPicPr>
+                      <a:picLocks noChangeAspect="1" noChangeArrowheads="1"/>
+                    </pic:cNvPicPr>
+                  </pic:nvPicPr>
+                  <pic:blipFill>
+                    <a:blip r:embed="rId106">
+                      <a:extLst>
+                        <a:ext uri="{28A0092B-C50C-407E-A947-70E740481C1C}">
+                          <a14:useLocalDpi xmlns:a14="http://schemas.microsoft.com/office/drawing/2010/main" val="0"/>
+                        </a:ext>
+                      </a:extLst>
+                    </a:blip>
+                    <a:srcRect/>
+                    <a:stretch>
+                      <a:fillRect/>
+                    </a:stretch>
+                  </pic:blipFill>
+                  <pic:spPr bwMode="auto">
+                    <a:xfrm>
+                      <a:off x="0" y="0"/>
+                      <a:ext cx="1733550" cy="990600"/>
+                    </a:xfrm>
+                    <a:prstGeom prst="rect">
+                      <a:avLst/>
+                    </a:prstGeom>
+                    <a:noFill/>
+                  </pic:spPr>
+                </pic:pic>
+              </a:graphicData>
+            </a:graphic>
+          </wp:inline>
+        </w:drawing>
+      </w:r>
+      <w:r>
+        <w:rPr>
+          <w:noProof/>
+          <w:color w:val="000000" w:themeColor="text1"/>
+          <w:sz w:val="24"/>
+          <w:szCs w:val="24"/>
+        </w:rPr>
+        <w:drawing>
+          <wp:inline distT="0" distB="0" distL="0" distR="0" wp14:anchorId="150504B6" wp14:editId="7C9283B2">
+            <wp:extent cx="4400550" cy="256223"/>
+            <wp:effectExtent l="0" t="0" r="0" b="0"/>
+            <wp:docPr id="110" name="Imagem 110"/>
+            <wp:cNvGraphicFramePr>
+              <a:graphicFrameLocks xmlns:a="http://schemas.openxmlformats.org/drawingml/2006/main" noChangeAspect="1"/>
+            </wp:cNvGraphicFramePr>
+            <a:graphic xmlns:a="http://schemas.openxmlformats.org/drawingml/2006/main">
+              <a:graphicData uri="http://schemas.openxmlformats.org/drawingml/2006/picture">
+                <pic:pic xmlns:pic="http://schemas.openxmlformats.org/drawingml/2006/picture">
+                  <pic:nvPicPr>
+                    <pic:cNvPr id="0" name="Picture 3"/>
+                    <pic:cNvPicPr>
+                      <a:picLocks noChangeAspect="1" noChangeArrowheads="1"/>
+                    </pic:cNvPicPr>
+                  </pic:nvPicPr>
+                  <pic:blipFill>
+                    <a:blip r:embed="rId107">
+                      <a:extLst>
+                        <a:ext uri="{28A0092B-C50C-407E-A947-70E740481C1C}">
+                          <a14:useLocalDpi xmlns:a14="http://schemas.microsoft.com/office/drawing/2010/main" val="0"/>
+                        </a:ext>
+                      </a:extLst>
+                    </a:blip>
+                    <a:srcRect/>
+                    <a:stretch>
+                      <a:fillRect/>
+                    </a:stretch>
+                  </pic:blipFill>
+                  <pic:spPr bwMode="auto">
+                    <a:xfrm>
+                      <a:off x="0" y="0"/>
+                      <a:ext cx="4524344" cy="263431"/>
+                    </a:xfrm>
+                    <a:prstGeom prst="rect">
+                      <a:avLst/>
+                    </a:prstGeom>
+                    <a:noFill/>
+                  </pic:spPr>
+                </pic:pic>
+              </a:graphicData>
+            </a:graphic>
+          </wp:inline>
+        </w:drawing>
+      </w:r>
+      <w:r>
+        <w:rPr>
+          <w:noProof/>
+          <w:color w:val="000000" w:themeColor="text1"/>
+          <w:sz w:val="24"/>
+          <w:szCs w:val="24"/>
+        </w:rPr>
+        <w:drawing>
+          <wp:inline distT="0" distB="0" distL="0" distR="0" wp14:anchorId="40BF66D9" wp14:editId="09D956B8">
+            <wp:extent cx="3267710" cy="247650"/>
+            <wp:effectExtent l="0" t="0" r="8890" b="0"/>
+            <wp:docPr id="111" name="Imagem 111"/>
+            <wp:cNvGraphicFramePr>
+              <a:graphicFrameLocks xmlns:a="http://schemas.openxmlformats.org/drawingml/2006/main" noChangeAspect="1"/>
+            </wp:cNvGraphicFramePr>
+            <a:graphic xmlns:a="http://schemas.openxmlformats.org/drawingml/2006/main">
+              <a:graphicData uri="http://schemas.openxmlformats.org/drawingml/2006/picture">
+                <pic:pic xmlns:pic="http://schemas.openxmlformats.org/drawingml/2006/picture">
+                  <pic:nvPicPr>
+                    <pic:cNvPr id="0" name="Picture 4"/>
+                    <pic:cNvPicPr>
+                      <a:picLocks noChangeAspect="1" noChangeArrowheads="1"/>
+                    </pic:cNvPicPr>
+                  </pic:nvPicPr>
+                  <pic:blipFill>
+                    <a:blip r:embed="rId108">
+                      <a:extLst>
+                        <a:ext uri="{28A0092B-C50C-407E-A947-70E740481C1C}">
+                          <a14:useLocalDpi xmlns:a14="http://schemas.microsoft.com/office/drawing/2010/main" val="0"/>
+                        </a:ext>
+                      </a:extLst>
+                    </a:blip>
+                    <a:srcRect/>
+                    <a:stretch>
+                      <a:fillRect/>
+                    </a:stretch>
+                  </pic:blipFill>
+                  <pic:spPr bwMode="auto">
+                    <a:xfrm>
+                      <a:off x="0" y="0"/>
+                      <a:ext cx="3267710" cy="247650"/>
+                    </a:xfrm>
+                    <a:prstGeom prst="rect">
+                      <a:avLst/>
+                    </a:prstGeom>
+                    <a:noFill/>
+                  </pic:spPr>
+                </pic:pic>
+              </a:graphicData>
+            </a:graphic>
+          </wp:inline>
+        </w:drawing>
+      </w:r>
+      <w:r>
+        <w:rPr>
+          <w:noProof/>
+          <w:color w:val="000000" w:themeColor="text1"/>
+          <w:sz w:val="24"/>
+          <w:szCs w:val="24"/>
+        </w:rPr>
+        <w:drawing>
+          <wp:inline distT="0" distB="0" distL="0" distR="0" wp14:anchorId="5E6D247C">
+            <wp:extent cx="5600700" cy="1378336"/>
+            <wp:effectExtent l="0" t="0" r="0" b="0"/>
+            <wp:docPr id="113" name="Imagem 113"/>
+            <wp:cNvGraphicFramePr>
+              <a:graphicFrameLocks xmlns:a="http://schemas.openxmlformats.org/drawingml/2006/main" noChangeAspect="1"/>
+            </wp:cNvGraphicFramePr>
+            <a:graphic xmlns:a="http://schemas.openxmlformats.org/drawingml/2006/main">
+              <a:graphicData uri="http://schemas.openxmlformats.org/drawingml/2006/picture">
+                <pic:pic xmlns:pic="http://schemas.openxmlformats.org/drawingml/2006/picture">
+                  <pic:nvPicPr>
+                    <pic:cNvPr id="0" name="Picture 6"/>
+                    <pic:cNvPicPr>
+                      <a:picLocks noChangeAspect="1" noChangeArrowheads="1"/>
+                    </pic:cNvPicPr>
+                  </pic:nvPicPr>
+                  <pic:blipFill>
+                    <a:blip r:embed="rId109">
+                      <a:extLst>
+                        <a:ext uri="{28A0092B-C50C-407E-A947-70E740481C1C}">
+                          <a14:useLocalDpi xmlns:a14="http://schemas.microsoft.com/office/drawing/2010/main" val="0"/>
+                        </a:ext>
+                      </a:extLst>
+                    </a:blip>
+                    <a:srcRect/>
+                    <a:stretch>
+                      <a:fillRect/>
+                    </a:stretch>
+                  </pic:blipFill>
+                  <pic:spPr bwMode="auto">
+                    <a:xfrm>
+                      <a:off x="0" y="0"/>
+                      <a:ext cx="5645450" cy="1389349"/>
+                    </a:xfrm>
+                    <a:prstGeom prst="rect">
+                      <a:avLst/>
+                    </a:prstGeom>
+                    <a:noFill/>
+                  </pic:spPr>
+                </pic:pic>
+              </a:graphicData>
+            </a:graphic>
+          </wp:inline>
+        </w:drawing>
+      </w:r>
+    </w:p>
+    <w:p>
+      <w:pPr>
+        <w:rPr>
+          <w:color w:val="000000" w:themeColor="text1"/>
+          <w:sz w:val="24"/>
+          <w:szCs w:val="24"/>
+        </w:rPr>
+      </w:pPr>
+      <w:r>
+        <w:rPr>
+          <w:color w:val="000000" w:themeColor="text1"/>
+          <w:sz w:val="24"/>
+          <w:szCs w:val="24"/>
+        </w:rPr>
+        <w:t xml:space="preserve">68- </w:t>
+      </w:r>
+      <w:r>
+        <w:rPr>
+          <w:color w:val="000000" w:themeColor="text1"/>
+          <w:sz w:val="24"/>
+          <w:szCs w:val="24"/>
+        </w:rPr>
+        <w:t xml:space="preserve">Na </w:t>
+      </w:r>
+      <w:proofErr w:type="spellStart"/>
+      <w:r>
+        <w:rPr>
+          <w:color w:val="000000" w:themeColor="text1"/>
+          <w:sz w:val="24"/>
+          <w:szCs w:val="24"/>
+        </w:rPr>
+        <w:t>section</w:t>
+      </w:r>
+      <w:proofErr w:type="spellEnd"/>
+      <w:r>
+        <w:rPr>
+          <w:color w:val="000000" w:themeColor="text1"/>
+          <w:sz w:val="24"/>
+          <w:szCs w:val="24"/>
+        </w:rPr>
+        <w:t xml:space="preserve"> principal onde tem os parágrafos demos um espaço para baixo conforme o código.</w:t>
+      </w:r>
+    </w:p>
+    <w:p>
+      <w:pPr>
+        <w:rPr>
+          <w:color w:val="000000" w:themeColor="text1"/>
+          <w:sz w:val="24"/>
+          <w:szCs w:val="24"/>
+        </w:rPr>
+      </w:pPr>
+      <w:r>
+        <w:rPr>
+          <w:noProof/>
+          <w:color w:val="000000" w:themeColor="text1"/>
+          <w:sz w:val="24"/>
+          <w:szCs w:val="24"/>
+        </w:rPr>
+        <w:drawing>
+          <wp:inline distT="0" distB="0" distL="0" distR="0" wp14:anchorId="02C65D87">
+            <wp:extent cx="1552575" cy="561975"/>
+            <wp:effectExtent l="0" t="0" r="9525" b="9525"/>
+            <wp:docPr id="114" name="Imagem 114"/>
+            <wp:cNvGraphicFramePr>
+              <a:graphicFrameLocks xmlns:a="http://schemas.openxmlformats.org/drawingml/2006/main" noChangeAspect="1"/>
+            </wp:cNvGraphicFramePr>
+            <a:graphic xmlns:a="http://schemas.openxmlformats.org/drawingml/2006/main">
+              <a:graphicData uri="http://schemas.openxmlformats.org/drawingml/2006/picture">
+                <pic:pic xmlns:pic="http://schemas.openxmlformats.org/drawingml/2006/picture">
+                  <pic:nvPicPr>
+                    <pic:cNvPr id="0" name="Picture 7"/>
+                    <pic:cNvPicPr>
+                      <a:picLocks noChangeAspect="1" noChangeArrowheads="1"/>
+                    </pic:cNvPicPr>
+                  </pic:nvPicPr>
+                  <pic:blipFill>
+                    <a:blip r:embed="rId110">
+                      <a:extLst>
+                        <a:ext uri="{28A0092B-C50C-407E-A947-70E740481C1C}">
+                          <a14:useLocalDpi xmlns:a14="http://schemas.microsoft.com/office/drawing/2010/main" val="0"/>
+                        </a:ext>
+                      </a:extLst>
+                    </a:blip>
+                    <a:srcRect/>
+                    <a:stretch>
+                      <a:fillRect/>
+                    </a:stretch>
+                  </pic:blipFill>
+                  <pic:spPr bwMode="auto">
+                    <a:xfrm>
+                      <a:off x="0" y="0"/>
+                      <a:ext cx="1552575" cy="561975"/>
+                    </a:xfrm>
+                    <a:prstGeom prst="rect">
+                      <a:avLst/>
+                    </a:prstGeom>
+                    <a:noFill/>
+                  </pic:spPr>
+                </pic:pic>
+              </a:graphicData>
+            </a:graphic>
+          </wp:inline>
+        </w:drawing>
+      </w:r>
+    </w:p>
+    <w:p>
+      <w:pPr>
+        <w:rPr>
+          <w:color w:val="000000" w:themeColor="text1"/>
+          <w:sz w:val="24"/>
+          <w:szCs w:val="24"/>
+        </w:rPr>
+      </w:pPr>
+      <w:r>
+        <w:rPr>
+          <w:color w:val="000000" w:themeColor="text1"/>
+          <w:sz w:val="24"/>
+          <w:szCs w:val="24"/>
+        </w:rPr>
+        <w:t xml:space="preserve">69- </w:t>
+      </w:r>
+      <w:proofErr w:type="spellStart"/>
+      <w:r>
+        <w:rPr>
+          <w:color w:val="000000" w:themeColor="text1"/>
+          <w:sz w:val="24"/>
+          <w:szCs w:val="24"/>
+        </w:rPr>
+        <w:t>Diminuimos</w:t>
+      </w:r>
+      <w:proofErr w:type="spellEnd"/>
+      <w:r>
+        <w:rPr>
+          <w:color w:val="000000" w:themeColor="text1"/>
+          <w:sz w:val="24"/>
+          <w:szCs w:val="24"/>
+        </w:rPr>
+        <w:t xml:space="preserve"> o tamanho da imagem pare ocupar 60% do espaço de largura da nossa página.</w:t>
+      </w:r>
+    </w:p>
+    <w:p>
+      <w:pPr>
+        <w:rPr>
+          <w:color w:val="000000" w:themeColor="text1"/>
+          <w:sz w:val="24"/>
+          <w:szCs w:val="24"/>
+        </w:rPr>
+      </w:pPr>
+      <w:r>
+        <w:rPr>
+          <w:noProof/>
+          <w:color w:val="000000" w:themeColor="text1"/>
+          <w:sz w:val="24"/>
+          <w:szCs w:val="24"/>
+        </w:rPr>
+        <w:drawing>
+          <wp:inline distT="0" distB="0" distL="0" distR="0" wp14:anchorId="2DAC98F4">
+            <wp:extent cx="1323975" cy="523875"/>
+            <wp:effectExtent l="0" t="0" r="9525" b="9525"/>
+            <wp:docPr id="115" name="Imagem 115"/>
+            <wp:cNvGraphicFramePr>
+              <a:graphicFrameLocks xmlns:a="http://schemas.openxmlformats.org/drawingml/2006/main" noChangeAspect="1"/>
+            </wp:cNvGraphicFramePr>
+            <a:graphic xmlns:a="http://schemas.openxmlformats.org/drawingml/2006/main">
+              <a:graphicData uri="http://schemas.openxmlformats.org/drawingml/2006/picture">
+                <pic:pic xmlns:pic="http://schemas.openxmlformats.org/drawingml/2006/picture">
+                  <pic:nvPicPr>
+                    <pic:cNvPr id="0" name="Picture 8"/>
+                    <pic:cNvPicPr>
+                      <a:picLocks noChangeAspect="1" noChangeArrowheads="1"/>
+                    </pic:cNvPicPr>
+                  </pic:nvPicPr>
+                  <pic:blipFill>
+                    <a:blip r:embed="rId111">
+                      <a:extLst>
+                        <a:ext uri="{28A0092B-C50C-407E-A947-70E740481C1C}">
+                          <a14:useLocalDpi xmlns:a14="http://schemas.microsoft.com/office/drawing/2010/main" val="0"/>
+                        </a:ext>
+                      </a:extLst>
+                    </a:blip>
+                    <a:srcRect/>
+                    <a:stretch>
+                      <a:fillRect/>
+                    </a:stretch>
+                  </pic:blipFill>
+                  <pic:spPr bwMode="auto">
+                    <a:xfrm>
+                      <a:off x="0" y="0"/>
+                      <a:ext cx="1323975" cy="523875"/>
+                    </a:xfrm>
+                    <a:prstGeom prst="rect">
+                      <a:avLst/>
+                    </a:prstGeom>
+                    <a:noFill/>
+                  </pic:spPr>
+                </pic:pic>
+              </a:graphicData>
+            </a:graphic>
+          </wp:inline>
+        </w:drawing>
+      </w:r>
+    </w:p>
+    <w:p>
+      <w:pPr>
+        <w:rPr>
+          <w:color w:val="000000" w:themeColor="text1"/>
+          <w:sz w:val="24"/>
+          <w:szCs w:val="24"/>
+        </w:rPr>
+      </w:pPr>
+      <w:r>
+        <w:rPr>
+          <w:color w:val="000000" w:themeColor="text1"/>
+          <w:sz w:val="24"/>
+          <w:szCs w:val="24"/>
+        </w:rPr>
+        <w:t xml:space="preserve">70- </w:t>
+      </w:r>
+      <w:r>
+        <w:rPr>
+          <w:color w:val="000000" w:themeColor="text1"/>
+          <w:sz w:val="24"/>
+          <w:szCs w:val="24"/>
+        </w:rPr>
+        <w:t xml:space="preserve">Inserimos na página a imagem utensílios, adicionamos uma </w:t>
+      </w:r>
+      <w:proofErr w:type="spellStart"/>
+      <w:r>
+        <w:rPr>
+          <w:color w:val="000000" w:themeColor="text1"/>
+          <w:sz w:val="24"/>
+          <w:szCs w:val="24"/>
+        </w:rPr>
+        <w:t>class</w:t>
+      </w:r>
+      <w:proofErr w:type="spellEnd"/>
+      <w:r>
+        <w:rPr>
+          <w:color w:val="000000" w:themeColor="text1"/>
+          <w:sz w:val="24"/>
+          <w:szCs w:val="24"/>
+        </w:rPr>
+        <w:t xml:space="preserve"> para diminuir o tamanho dela.</w:t>
+      </w:r>
+    </w:p>
+    <w:p>
+      <w:pPr>
+        <w:rPr>
+          <w:color w:val="000000" w:themeColor="text1"/>
+          <w:sz w:val="24"/>
+          <w:szCs w:val="24"/>
+        </w:rPr>
+      </w:pPr>
+      <w:r>
+        <w:rPr>
+          <w:noProof/>
+          <w:color w:val="000000" w:themeColor="text1"/>
+          <w:sz w:val="24"/>
+          <w:szCs w:val="24"/>
+        </w:rPr>
+        <w:drawing>
+          <wp:inline distT="0" distB="0" distL="0" distR="0" wp14:anchorId="6368D646" wp14:editId="47F1339D">
+            <wp:extent cx="1257300" cy="558800"/>
+            <wp:effectExtent l="0" t="0" r="0" b="0"/>
+            <wp:docPr id="116" name="Imagem 116"/>
+            <wp:cNvGraphicFramePr>
+              <a:graphicFrameLocks xmlns:a="http://schemas.openxmlformats.org/drawingml/2006/main" noChangeAspect="1"/>
+            </wp:cNvGraphicFramePr>
+            <a:graphic xmlns:a="http://schemas.openxmlformats.org/drawingml/2006/main">
+              <a:graphicData uri="http://schemas.openxmlformats.org/drawingml/2006/picture">
+                <pic:pic xmlns:pic="http://schemas.openxmlformats.org/drawingml/2006/picture">
+                  <pic:nvPicPr>
+                    <pic:cNvPr id="0" name="Picture 9"/>
+                    <pic:cNvPicPr>
+                      <a:picLocks noChangeAspect="1" noChangeArrowheads="1"/>
+                    </pic:cNvPicPr>
+                  </pic:nvPicPr>
+                  <pic:blipFill>
+                    <a:blip r:embed="rId112">
+                      <a:extLst>
+                        <a:ext uri="{28A0092B-C50C-407E-A947-70E740481C1C}">
+                          <a14:useLocalDpi xmlns:a14="http://schemas.microsoft.com/office/drawing/2010/main" val="0"/>
+                        </a:ext>
+                      </a:extLst>
+                    </a:blip>
+                    <a:srcRect/>
+                    <a:stretch>
+                      <a:fillRect/>
+                    </a:stretch>
+                  </pic:blipFill>
+                  <pic:spPr bwMode="auto">
+                    <a:xfrm>
+                      <a:off x="0" y="0"/>
+                      <a:ext cx="1285468" cy="571319"/>
+                    </a:xfrm>
+                    <a:prstGeom prst="rect">
+                      <a:avLst/>
+                    </a:prstGeom>
+                    <a:noFill/>
+                  </pic:spPr>
+                </pic:pic>
+              </a:graphicData>
+            </a:graphic>
+          </wp:inline>
+        </w:drawing>
+      </w:r>
+      <w:r>
+        <w:rPr>
+          <w:noProof/>
+          <w:color w:val="000000" w:themeColor="text1"/>
+          <w:sz w:val="24"/>
+          <w:szCs w:val="24"/>
+        </w:rPr>
+        <w:drawing>
+          <wp:inline distT="0" distB="0" distL="0" distR="0" wp14:anchorId="07B5984F">
+            <wp:extent cx="5182235" cy="361950"/>
+            <wp:effectExtent l="0" t="0" r="0" b="0"/>
+            <wp:docPr id="117" name="Imagem 117"/>
+            <wp:cNvGraphicFramePr>
+              <a:graphicFrameLocks xmlns:a="http://schemas.openxmlformats.org/drawingml/2006/main" noChangeAspect="1"/>
+            </wp:cNvGraphicFramePr>
+            <a:graphic xmlns:a="http://schemas.openxmlformats.org/drawingml/2006/main">
+              <a:graphicData uri="http://schemas.openxmlformats.org/drawingml/2006/picture">
+                <pic:pic xmlns:pic="http://schemas.openxmlformats.org/drawingml/2006/picture">
+                  <pic:nvPicPr>
+                    <pic:cNvPr id="0" name="Picture 10"/>
+                    <pic:cNvPicPr>
+                      <a:picLocks noChangeAspect="1" noChangeArrowheads="1"/>
+                    </pic:cNvPicPr>
+                  </pic:nvPicPr>
+                  <pic:blipFill>
+                    <a:blip r:embed="rId113">
+                      <a:extLst>
+                        <a:ext uri="{28A0092B-C50C-407E-A947-70E740481C1C}">
+                          <a14:useLocalDpi xmlns:a14="http://schemas.microsoft.com/office/drawing/2010/main" val="0"/>
+                        </a:ext>
+                      </a:extLst>
+                    </a:blip>
+                    <a:srcRect/>
+                    <a:stretch>
+                      <a:fillRect/>
+                    </a:stretch>
+                  </pic:blipFill>
+                  <pic:spPr bwMode="auto">
+                    <a:xfrm>
+                      <a:off x="0" y="0"/>
+                      <a:ext cx="5182235" cy="361950"/>
+                    </a:xfrm>
+                    <a:prstGeom prst="rect">
+                      <a:avLst/>
+                    </a:prstGeom>
+                    <a:noFill/>
+                  </pic:spPr>
+                </pic:pic>
+              </a:graphicData>
+            </a:graphic>
+          </wp:inline>
+        </w:drawing>
+      </w:r>
+    </w:p>
+    <w:p>
+      <w:pPr>
+        <w:rPr>
+          <w:color w:val="000000" w:themeColor="text1"/>
+          <w:sz w:val="24"/>
+          <w:szCs w:val="24"/>
+        </w:rPr>
+      </w:pPr>
+      <w:r>
+        <w:rPr>
+          <w:color w:val="000000" w:themeColor="text1"/>
+          <w:sz w:val="24"/>
+          <w:szCs w:val="24"/>
+        </w:rPr>
+        <w:t xml:space="preserve">80- </w:t>
+      </w:r>
       <w:bookmarkStart w:id="0" w:name="_GoBack"/>
       <w:bookmarkEnd w:id="0"/>
+    </w:p>
+    <w:p>
+      <w:pPr>
+        <w:rPr>
+          <w:color w:val="000000" w:themeColor="text1"/>
+          <w:sz w:val="24"/>
+          <w:szCs w:val="24"/>
+        </w:rPr>
+      </w:pPr>
     </w:p>
     <w:p>
       <w:pPr>
@@ -12632,6 +14278,119 @@
     </w:lvl>
   </w:abstractNum>
   <w:abstractNum w:abstractNumId="7" w15:restartNumberingAfterBreak="0">
+    <w:nsid w:val="441A6262"/>
+    <w:multiLevelType w:val="hybridMultilevel"/>
+    <w:tmpl w:val="2578F122"/>
+    <w:lvl w:ilvl="0" w:tplc="04160001">
+      <w:start w:val="1"/>
+      <w:numFmt w:val="bullet"/>
+      <w:lvlText w:val=""/>
+      <w:lvlJc w:val="left"/>
+      <w:pPr>
+        <w:ind w:left="720" w:hanging="360"/>
+      </w:pPr>
+      <w:rPr>
+        <w:rFonts w:ascii="Symbol" w:hAnsi="Symbol" w:hint="default"/>
+      </w:rPr>
+    </w:lvl>
+    <w:lvl w:ilvl="1" w:tplc="04160003" w:tentative="1">
+      <w:start w:val="1"/>
+      <w:numFmt w:val="bullet"/>
+      <w:lvlText w:val="o"/>
+      <w:lvlJc w:val="left"/>
+      <w:pPr>
+        <w:ind w:left="1440" w:hanging="360"/>
+      </w:pPr>
+      <w:rPr>
+        <w:rFonts w:ascii="Courier New" w:hAnsi="Courier New" w:cs="Courier New" w:hint="default"/>
+      </w:rPr>
+    </w:lvl>
+    <w:lvl w:ilvl="2" w:tplc="04160005" w:tentative="1">
+      <w:start w:val="1"/>
+      <w:numFmt w:val="bullet"/>
+      <w:lvlText w:val=""/>
+      <w:lvlJc w:val="left"/>
+      <w:pPr>
+        <w:ind w:left="2160" w:hanging="360"/>
+      </w:pPr>
+      <w:rPr>
+        <w:rFonts w:ascii="Wingdings" w:hAnsi="Wingdings" w:hint="default"/>
+      </w:rPr>
+    </w:lvl>
+    <w:lvl w:ilvl="3" w:tplc="04160001" w:tentative="1">
+      <w:start w:val="1"/>
+      <w:numFmt w:val="bullet"/>
+      <w:lvlText w:val=""/>
+      <w:lvlJc w:val="left"/>
+      <w:pPr>
+        <w:ind w:left="2880" w:hanging="360"/>
+      </w:pPr>
+      <w:rPr>
+        <w:rFonts w:ascii="Symbol" w:hAnsi="Symbol" w:hint="default"/>
+      </w:rPr>
+    </w:lvl>
+    <w:lvl w:ilvl="4" w:tplc="04160003" w:tentative="1">
+      <w:start w:val="1"/>
+      <w:numFmt w:val="bullet"/>
+      <w:lvlText w:val="o"/>
+      <w:lvlJc w:val="left"/>
+      <w:pPr>
+        <w:ind w:left="3600" w:hanging="360"/>
+      </w:pPr>
+      <w:rPr>
+        <w:rFonts w:ascii="Courier New" w:hAnsi="Courier New" w:cs="Courier New" w:hint="default"/>
+      </w:rPr>
+    </w:lvl>
+    <w:lvl w:ilvl="5" w:tplc="04160005" w:tentative="1">
+      <w:start w:val="1"/>
+      <w:numFmt w:val="bullet"/>
+      <w:lvlText w:val=""/>
+      <w:lvlJc w:val="left"/>
+      <w:pPr>
+        <w:ind w:left="4320" w:hanging="360"/>
+      </w:pPr>
+      <w:rPr>
+        <w:rFonts w:ascii="Wingdings" w:hAnsi="Wingdings" w:hint="default"/>
+      </w:rPr>
+    </w:lvl>
+    <w:lvl w:ilvl="6" w:tplc="04160001" w:tentative="1">
+      <w:start w:val="1"/>
+      <w:numFmt w:val="bullet"/>
+      <w:lvlText w:val=""/>
+      <w:lvlJc w:val="left"/>
+      <w:pPr>
+        <w:ind w:left="5040" w:hanging="360"/>
+      </w:pPr>
+      <w:rPr>
+        <w:rFonts w:ascii="Symbol" w:hAnsi="Symbol" w:hint="default"/>
+      </w:rPr>
+    </w:lvl>
+    <w:lvl w:ilvl="7" w:tplc="04160003" w:tentative="1">
+      <w:start w:val="1"/>
+      <w:numFmt w:val="bullet"/>
+      <w:lvlText w:val="o"/>
+      <w:lvlJc w:val="left"/>
+      <w:pPr>
+        <w:ind w:left="5760" w:hanging="360"/>
+      </w:pPr>
+      <w:rPr>
+        <w:rFonts w:ascii="Courier New" w:hAnsi="Courier New" w:cs="Courier New" w:hint="default"/>
+      </w:rPr>
+    </w:lvl>
+    <w:lvl w:ilvl="8" w:tplc="04160005" w:tentative="1">
+      <w:start w:val="1"/>
+      <w:numFmt w:val="bullet"/>
+      <w:lvlText w:val=""/>
+      <w:lvlJc w:val="left"/>
+      <w:pPr>
+        <w:ind w:left="6480" w:hanging="360"/>
+      </w:pPr>
+      <w:rPr>
+        <w:rFonts w:ascii="Wingdings" w:hAnsi="Wingdings" w:hint="default"/>
+      </w:rPr>
+    </w:lvl>
+  </w:abstractNum>
+  <w:abstractNum w:abstractNumId="8" w15:restartNumberingAfterBreak="0">
     <w:nsid w:val="67EB77F4"/>
     <w:multiLevelType w:val="hybridMultilevel"/>
     <w:tmpl w:val="1FAA0BA4"/>
@@ -12751,7 +14510,7 @@
     <w:abstractNumId w:val="0"/>
   </w:num>
   <w:num w:numId="3">
-    <w:abstractNumId w:val="7"/>
+    <w:abstractNumId w:val="8"/>
   </w:num>
   <w:num w:numId="4">
     <w:abstractNumId w:val="5"/>
@@ -12767,6 +14526,9 @@
   </w:num>
   <w:num w:numId="8">
     <w:abstractNumId w:val="6"/>
+  </w:num>
+  <w:num w:numId="9">
+    <w:abstractNumId w:val="7"/>
   </w:num>
 </w:numbering>
 </file>
@@ -13533,7 +15295,7 @@
 </file>
 
 <file path=customXml/itemProps1.xml><?xml version="1.0" encoding="utf-8"?>
-<ds:datastoreItem xmlns:ds="http://schemas.openxmlformats.org/officeDocument/2006/customXml" ds:itemID="{29E4A043-8509-432E-9089-47061E68DD62}">
+<ds:datastoreItem xmlns:ds="http://schemas.openxmlformats.org/officeDocument/2006/customXml" ds:itemID="{8BE66A49-80B9-4941-AAF8-4C6019989159}">
   <ds:schemaRefs>
     <ds:schemaRef ds:uri="http://schemas.openxmlformats.org/officeDocument/2006/bibliography"/>
   </ds:schemaRefs>

</xml_diff>

<commit_message>
atualização da aula do dia 02/10
</commit_message>
<xml_diff>
--- a/Apostila/Apostila Space For Men.docx
+++ b/Apostila/Apostila Space For Men.docx
@@ -12440,6 +12440,7 @@
       </w:pPr>
       <w:r>
         <w:rPr>
+          <w:noProof/>
           <w:color w:val="000000" w:themeColor="text1"/>
           <w:sz w:val="24"/>
           <w:szCs w:val="24"/>
@@ -13104,6 +13105,7 @@
       <w:proofErr w:type="spellStart"/>
       <w:r>
         <w:rPr>
+          <w:b/>
           <w:color w:val="000000" w:themeColor="text1"/>
           <w:sz w:val="24"/>
           <w:szCs w:val="24"/>
@@ -13198,23 +13200,29 @@
         </w:rPr>
         <w:t xml:space="preserve">69- </w:t>
       </w:r>
-      <w:proofErr w:type="spellStart"/>
-      <w:r>
-        <w:rPr>
-          <w:color w:val="000000" w:themeColor="text1"/>
-          <w:sz w:val="24"/>
-          <w:szCs w:val="24"/>
-        </w:rPr>
-        <w:t>Diminuimos</w:t>
-      </w:r>
-      <w:proofErr w:type="spellEnd"/>
-      <w:r>
-        <w:rPr>
-          <w:color w:val="000000" w:themeColor="text1"/>
-          <w:sz w:val="24"/>
-          <w:szCs w:val="24"/>
-        </w:rPr>
-        <w:t xml:space="preserve"> o tamanho da imagem pare ocupar 60% do espaço de largura da nossa página.</w:t>
+      <w:r>
+        <w:rPr>
+          <w:color w:val="000000" w:themeColor="text1"/>
+          <w:sz w:val="24"/>
+          <w:szCs w:val="24"/>
+        </w:rPr>
+        <w:t>Diminu</w:t>
+      </w:r>
+      <w:r>
+        <w:rPr>
+          <w:color w:val="000000" w:themeColor="text1"/>
+          <w:sz w:val="24"/>
+          <w:szCs w:val="24"/>
+        </w:rPr>
+        <w:t>í</w:t>
+      </w:r>
+      <w:r>
+        <w:rPr>
+          <w:color w:val="000000" w:themeColor="text1"/>
+          <w:sz w:val="24"/>
+          <w:szCs w:val="24"/>
+        </w:rPr>
+        <w:t>mos o tamanho da imagem pare ocupar 60% do espaço de largura da nossa página.</w:t>
       </w:r>
     </w:p>
     <w:p>
@@ -13306,6 +13314,7 @@
       <w:proofErr w:type="spellStart"/>
       <w:r>
         <w:rPr>
+          <w:b/>
           <w:color w:val="000000" w:themeColor="text1"/>
           <w:sz w:val="24"/>
           <w:szCs w:val="24"/>
@@ -13451,7 +13460,640 @@
           <w:sz w:val="24"/>
           <w:szCs w:val="24"/>
         </w:rPr>
-        <w:t xml:space="preserve">80- </w:t>
+        <w:t xml:space="preserve">71- Para colocar o texto ao lado da imagem utilizamos a técnica </w:t>
+      </w:r>
+      <w:proofErr w:type="spellStart"/>
+      <w:r>
+        <w:rPr>
+          <w:b/>
+          <w:color w:val="000000" w:themeColor="text1"/>
+          <w:sz w:val="24"/>
+          <w:szCs w:val="24"/>
+        </w:rPr>
+        <w:t>float:left</w:t>
+      </w:r>
+      <w:proofErr w:type="spellEnd"/>
+      <w:r>
+        <w:rPr>
+          <w:color w:val="000000" w:themeColor="text1"/>
+          <w:sz w:val="24"/>
+          <w:szCs w:val="24"/>
+        </w:rPr>
+        <w:t xml:space="preserve"> que faz o seguinte:</w:t>
+      </w:r>
+    </w:p>
+    <w:p>
+      <w:pPr>
+        <w:pStyle w:val="PargrafodaLista"/>
+        <w:numPr>
+          <w:ilvl w:val="0"/>
+          <w:numId w:val="10"/>
+        </w:numPr>
+        <w:rPr>
+          <w:color w:val="000000" w:themeColor="text1"/>
+          <w:sz w:val="24"/>
+          <w:szCs w:val="24"/>
+        </w:rPr>
+      </w:pPr>
+      <w:r>
+        <w:rPr>
+          <w:color w:val="000000" w:themeColor="text1"/>
+          <w:sz w:val="24"/>
+          <w:szCs w:val="24"/>
+        </w:rPr>
+        <w:t xml:space="preserve">Como o nome indica </w:t>
+      </w:r>
+      <w:proofErr w:type="spellStart"/>
+      <w:r>
+        <w:rPr>
+          <w:b/>
+          <w:color w:val="000000" w:themeColor="text1"/>
+          <w:sz w:val="24"/>
+          <w:szCs w:val="24"/>
+        </w:rPr>
+        <w:t>float</w:t>
+      </w:r>
+      <w:proofErr w:type="spellEnd"/>
+      <w:r>
+        <w:rPr>
+          <w:color w:val="000000" w:themeColor="text1"/>
+          <w:sz w:val="24"/>
+          <w:szCs w:val="24"/>
+        </w:rPr>
+        <w:t xml:space="preserve">, a imagem flutua </w:t>
+      </w:r>
+      <w:r>
+        <w:rPr>
+          <w:color w:val="000000" w:themeColor="text1"/>
+          <w:sz w:val="24"/>
+          <w:szCs w:val="24"/>
+        </w:rPr>
+        <w:t>e o texto a baixo sobe para ficar ao lado</w:t>
+      </w:r>
+    </w:p>
+    <w:p>
+      <w:pPr>
+        <w:rPr>
+          <w:color w:val="000000" w:themeColor="text1"/>
+          <w:sz w:val="24"/>
+          <w:szCs w:val="24"/>
+        </w:rPr>
+      </w:pPr>
+      <w:r>
+        <w:rPr>
+          <w:noProof/>
+          <w:color w:val="000000" w:themeColor="text1"/>
+          <w:sz w:val="24"/>
+          <w:szCs w:val="24"/>
+        </w:rPr>
+        <w:drawing>
+          <wp:inline distT="0" distB="0" distL="0" distR="0" wp14:anchorId="08ABEBBD">
+            <wp:extent cx="6248400" cy="1216797"/>
+            <wp:effectExtent l="0" t="0" r="0" b="2540"/>
+            <wp:docPr id="119" name="Imagem 119"/>
+            <wp:cNvGraphicFramePr>
+              <a:graphicFrameLocks xmlns:a="http://schemas.openxmlformats.org/drawingml/2006/main" noChangeAspect="1"/>
+            </wp:cNvGraphicFramePr>
+            <a:graphic xmlns:a="http://schemas.openxmlformats.org/drawingml/2006/main">
+              <a:graphicData uri="http://schemas.openxmlformats.org/drawingml/2006/picture">
+                <pic:pic xmlns:pic="http://schemas.openxmlformats.org/drawingml/2006/picture">
+                  <pic:nvPicPr>
+                    <pic:cNvPr id="0" name="Picture 2"/>
+                    <pic:cNvPicPr>
+                      <a:picLocks noChangeAspect="1" noChangeArrowheads="1"/>
+                    </pic:cNvPicPr>
+                  </pic:nvPicPr>
+                  <pic:blipFill>
+                    <a:blip r:embed="rId114">
+                      <a:extLst>
+                        <a:ext uri="{28A0092B-C50C-407E-A947-70E740481C1C}">
+                          <a14:useLocalDpi xmlns:a14="http://schemas.microsoft.com/office/drawing/2010/main" val="0"/>
+                        </a:ext>
+                      </a:extLst>
+                    </a:blip>
+                    <a:srcRect/>
+                    <a:stretch>
+                      <a:fillRect/>
+                    </a:stretch>
+                  </pic:blipFill>
+                  <pic:spPr bwMode="auto">
+                    <a:xfrm>
+                      <a:off x="0" y="0"/>
+                      <a:ext cx="6374476" cy="1241349"/>
+                    </a:xfrm>
+                    <a:prstGeom prst="rect">
+                      <a:avLst/>
+                    </a:prstGeom>
+                    <a:noFill/>
+                  </pic:spPr>
+                </pic:pic>
+              </a:graphicData>
+            </a:graphic>
+          </wp:inline>
+        </w:drawing>
+      </w:r>
+      <w:r>
+        <w:rPr>
+          <w:color w:val="000000" w:themeColor="text1"/>
+          <w:sz w:val="24"/>
+          <w:szCs w:val="24"/>
+        </w:rPr>
+        <w:drawing>
+          <wp:inline distT="0" distB="0" distL="0" distR="0" wp14:anchorId="11F67BA2" wp14:editId="361435E0">
+            <wp:extent cx="1267002" cy="866896"/>
+            <wp:effectExtent l="0" t="0" r="9525" b="9525"/>
+            <wp:docPr id="118" name="Imagem 118"/>
+            <wp:cNvGraphicFramePr>
+              <a:graphicFrameLocks xmlns:a="http://schemas.openxmlformats.org/drawingml/2006/main" noChangeAspect="1"/>
+            </wp:cNvGraphicFramePr>
+            <a:graphic xmlns:a="http://schemas.openxmlformats.org/drawingml/2006/main">
+              <a:graphicData uri="http://schemas.openxmlformats.org/drawingml/2006/picture">
+                <pic:pic xmlns:pic="http://schemas.openxmlformats.org/drawingml/2006/picture">
+                  <pic:nvPicPr>
+                    <pic:cNvPr id="1" name=""/>
+                    <pic:cNvPicPr/>
+                  </pic:nvPicPr>
+                  <pic:blipFill>
+                    <a:blip r:embed="rId115"/>
+                    <a:stretch>
+                      <a:fillRect/>
+                    </a:stretch>
+                  </pic:blipFill>
+                  <pic:spPr>
+                    <a:xfrm>
+                      <a:off x="0" y="0"/>
+                      <a:ext cx="1267002" cy="866896"/>
+                    </a:xfrm>
+                    <a:prstGeom prst="rect">
+                      <a:avLst/>
+                    </a:prstGeom>
+                  </pic:spPr>
+                </pic:pic>
+              </a:graphicData>
+            </a:graphic>
+          </wp:inline>
+        </w:drawing>
+      </w:r>
+    </w:p>
+    <w:p>
+      <w:pPr>
+        <w:rPr>
+          <w:color w:val="000000" w:themeColor="text1"/>
+          <w:sz w:val="24"/>
+          <w:szCs w:val="24"/>
+        </w:rPr>
+      </w:pPr>
+      <w:r>
+        <w:rPr>
+          <w:color w:val="000000" w:themeColor="text1"/>
+          <w:sz w:val="24"/>
+          <w:szCs w:val="24"/>
+        </w:rPr>
+        <w:t xml:space="preserve">72- Utilizamos o </w:t>
+      </w:r>
+      <w:proofErr w:type="spellStart"/>
+      <w:r>
+        <w:rPr>
+          <w:color w:val="000000" w:themeColor="text1"/>
+          <w:sz w:val="24"/>
+          <w:szCs w:val="24"/>
+        </w:rPr>
+        <w:t>clear:left</w:t>
+      </w:r>
+      <w:proofErr w:type="spellEnd"/>
+      <w:r>
+        <w:rPr>
+          <w:color w:val="000000" w:themeColor="text1"/>
+          <w:sz w:val="24"/>
+          <w:szCs w:val="24"/>
+        </w:rPr>
+        <w:t xml:space="preserve"> para retornar </w:t>
+      </w:r>
+      <w:proofErr w:type="gramStart"/>
+      <w:r>
+        <w:rPr>
+          <w:color w:val="000000" w:themeColor="text1"/>
+          <w:sz w:val="24"/>
+          <w:szCs w:val="24"/>
+        </w:rPr>
+        <w:t>a</w:t>
+      </w:r>
+      <w:proofErr w:type="gramEnd"/>
+      <w:r>
+        <w:rPr>
+          <w:color w:val="000000" w:themeColor="text1"/>
+          <w:sz w:val="24"/>
+          <w:szCs w:val="24"/>
+        </w:rPr>
+        <w:t xml:space="preserve"> posição dos elementos a baixo da imagem que utilizamos o </w:t>
+      </w:r>
+      <w:proofErr w:type="spellStart"/>
+      <w:r>
+        <w:rPr>
+          <w:color w:val="000000" w:themeColor="text1"/>
+          <w:sz w:val="24"/>
+          <w:szCs w:val="24"/>
+        </w:rPr>
+        <w:t>float:left</w:t>
+      </w:r>
+      <w:proofErr w:type="spellEnd"/>
+      <w:r>
+        <w:rPr>
+          <w:color w:val="000000" w:themeColor="text1"/>
+          <w:sz w:val="24"/>
+          <w:szCs w:val="24"/>
+        </w:rPr>
+        <w:t xml:space="preserve">, ou seja, quando utilizamos o </w:t>
+      </w:r>
+      <w:proofErr w:type="spellStart"/>
+      <w:r>
+        <w:rPr>
+          <w:color w:val="000000" w:themeColor="text1"/>
+          <w:sz w:val="24"/>
+          <w:szCs w:val="24"/>
+        </w:rPr>
+        <w:t>float:left</w:t>
+      </w:r>
+      <w:proofErr w:type="spellEnd"/>
+      <w:r>
+        <w:rPr>
+          <w:color w:val="000000" w:themeColor="text1"/>
+          <w:sz w:val="24"/>
+          <w:szCs w:val="24"/>
+        </w:rPr>
+        <w:t xml:space="preserve"> ele sobe todos os elementos a baixo, para retornar utilizamos o </w:t>
+      </w:r>
+      <w:proofErr w:type="spellStart"/>
+      <w:r>
+        <w:rPr>
+          <w:color w:val="000000" w:themeColor="text1"/>
+          <w:sz w:val="24"/>
+          <w:szCs w:val="24"/>
+        </w:rPr>
+        <w:t>clear:left</w:t>
+      </w:r>
+      <w:proofErr w:type="spellEnd"/>
+      <w:r>
+        <w:rPr>
+          <w:color w:val="000000" w:themeColor="text1"/>
+          <w:sz w:val="24"/>
+          <w:szCs w:val="24"/>
+        </w:rPr>
+        <w:t>.</w:t>
+      </w:r>
+    </w:p>
+    <w:p>
+      <w:pPr>
+        <w:rPr>
+          <w:color w:val="000000" w:themeColor="text1"/>
+          <w:sz w:val="24"/>
+          <w:szCs w:val="24"/>
+        </w:rPr>
+      </w:pPr>
+      <w:r>
+        <w:rPr>
+          <w:noProof/>
+          <w:color w:val="000000" w:themeColor="text1"/>
+          <w:sz w:val="24"/>
+          <w:szCs w:val="24"/>
+        </w:rPr>
+        <w:drawing>
+          <wp:inline distT="0" distB="0" distL="0" distR="0" wp14:anchorId="5BB277A7">
+            <wp:extent cx="1724025" cy="1181100"/>
+            <wp:effectExtent l="0" t="0" r="9525" b="0"/>
+            <wp:docPr id="120" name="Imagem 120"/>
+            <wp:cNvGraphicFramePr>
+              <a:graphicFrameLocks xmlns:a="http://schemas.openxmlformats.org/drawingml/2006/main" noChangeAspect="1"/>
+            </wp:cNvGraphicFramePr>
+            <a:graphic xmlns:a="http://schemas.openxmlformats.org/drawingml/2006/main">
+              <a:graphicData uri="http://schemas.openxmlformats.org/drawingml/2006/picture">
+                <pic:pic xmlns:pic="http://schemas.openxmlformats.org/drawingml/2006/picture">
+                  <pic:nvPicPr>
+                    <pic:cNvPr id="0" name="Picture 3"/>
+                    <pic:cNvPicPr>
+                      <a:picLocks noChangeAspect="1" noChangeArrowheads="1"/>
+                    </pic:cNvPicPr>
+                  </pic:nvPicPr>
+                  <pic:blipFill>
+                    <a:blip r:embed="rId116">
+                      <a:extLst>
+                        <a:ext uri="{28A0092B-C50C-407E-A947-70E740481C1C}">
+                          <a14:useLocalDpi xmlns:a14="http://schemas.microsoft.com/office/drawing/2010/main" val="0"/>
+                        </a:ext>
+                      </a:extLst>
+                    </a:blip>
+                    <a:srcRect/>
+                    <a:stretch>
+                      <a:fillRect/>
+                    </a:stretch>
+                  </pic:blipFill>
+                  <pic:spPr bwMode="auto">
+                    <a:xfrm>
+                      <a:off x="0" y="0"/>
+                      <a:ext cx="1724025" cy="1181100"/>
+                    </a:xfrm>
+                    <a:prstGeom prst="rect">
+                      <a:avLst/>
+                    </a:prstGeom>
+                    <a:noFill/>
+                  </pic:spPr>
+                </pic:pic>
+              </a:graphicData>
+            </a:graphic>
+          </wp:inline>
+        </w:drawing>
+      </w:r>
+    </w:p>
+    <w:p>
+      <w:pPr>
+        <w:rPr>
+          <w:color w:val="000000" w:themeColor="text1"/>
+          <w:sz w:val="24"/>
+          <w:szCs w:val="24"/>
+        </w:rPr>
+      </w:pPr>
+      <w:r>
+        <w:rPr>
+          <w:color w:val="000000" w:themeColor="text1"/>
+          <w:sz w:val="24"/>
+          <w:szCs w:val="24"/>
+        </w:rPr>
+        <w:t xml:space="preserve">73- </w:t>
+      </w:r>
+      <w:r>
+        <w:rPr>
+          <w:color w:val="000000" w:themeColor="text1"/>
+          <w:sz w:val="24"/>
+          <w:szCs w:val="24"/>
+        </w:rPr>
+        <w:t xml:space="preserve">Para trocar a fonte dos sites realizamos os seguintes </w:t>
+      </w:r>
+      <w:proofErr w:type="gramStart"/>
+      <w:r>
+        <w:rPr>
+          <w:color w:val="000000" w:themeColor="text1"/>
+          <w:sz w:val="24"/>
+          <w:szCs w:val="24"/>
+        </w:rPr>
+        <w:t>passos :</w:t>
+      </w:r>
+      <w:proofErr w:type="gramEnd"/>
+    </w:p>
+    <w:p>
+      <w:pPr>
+        <w:pStyle w:val="PargrafodaLista"/>
+        <w:numPr>
+          <w:ilvl w:val="0"/>
+          <w:numId w:val="10"/>
+        </w:numPr>
+        <w:rPr>
+          <w:color w:val="000000" w:themeColor="text1"/>
+          <w:sz w:val="24"/>
+          <w:szCs w:val="24"/>
+        </w:rPr>
+      </w:pPr>
+      <w:r>
+        <w:rPr>
+          <w:color w:val="000000" w:themeColor="text1"/>
+          <w:sz w:val="24"/>
+          <w:szCs w:val="24"/>
+        </w:rPr>
+        <w:t xml:space="preserve">Entra no site do </w:t>
+      </w:r>
+      <w:proofErr w:type="spellStart"/>
+      <w:r>
+        <w:rPr>
+          <w:color w:val="000000" w:themeColor="text1"/>
+          <w:sz w:val="24"/>
+          <w:szCs w:val="24"/>
+        </w:rPr>
+        <w:t>google</w:t>
+      </w:r>
+      <w:proofErr w:type="spellEnd"/>
+      <w:r>
+        <w:rPr>
+          <w:color w:val="000000" w:themeColor="text1"/>
+          <w:sz w:val="24"/>
+          <w:szCs w:val="24"/>
+        </w:rPr>
+        <w:t xml:space="preserve"> </w:t>
+      </w:r>
+      <w:proofErr w:type="spellStart"/>
+      <w:r>
+        <w:rPr>
+          <w:color w:val="000000" w:themeColor="text1"/>
+          <w:sz w:val="24"/>
+          <w:szCs w:val="24"/>
+        </w:rPr>
+        <w:t>fonts</w:t>
+      </w:r>
+      <w:proofErr w:type="spellEnd"/>
+      <w:r>
+        <w:rPr>
+          <w:color w:val="000000" w:themeColor="text1"/>
+          <w:sz w:val="24"/>
+          <w:szCs w:val="24"/>
+        </w:rPr>
+        <w:t xml:space="preserve"> </w:t>
+      </w:r>
+      <w:r>
+        <w:rPr>
+          <w:color w:val="000000" w:themeColor="text1"/>
+          <w:sz w:val="24"/>
+          <w:szCs w:val="24"/>
+        </w:rPr>
+        <w:t>{</w:t>
+      </w:r>
+      <w:r>
+        <w:rPr>
+          <w:color w:val="000000" w:themeColor="text1"/>
+          <w:sz w:val="24"/>
+          <w:szCs w:val="24"/>
+        </w:rPr>
+        <w:t>https://fonts.google.com/</w:t>
+      </w:r>
+      <w:r>
+        <w:rPr>
+          <w:color w:val="000000" w:themeColor="text1"/>
+          <w:sz w:val="24"/>
+          <w:szCs w:val="24"/>
+        </w:rPr>
+        <w:t>}</w:t>
+      </w:r>
+    </w:p>
+    <w:p>
+      <w:pPr>
+        <w:pStyle w:val="PargrafodaLista"/>
+        <w:numPr>
+          <w:ilvl w:val="0"/>
+          <w:numId w:val="10"/>
+        </w:numPr>
+        <w:rPr>
+          <w:color w:val="000000" w:themeColor="text1"/>
+          <w:sz w:val="24"/>
+          <w:szCs w:val="24"/>
+        </w:rPr>
+      </w:pPr>
+      <w:r>
+        <w:rPr>
+          <w:color w:val="000000" w:themeColor="text1"/>
+          <w:sz w:val="24"/>
+          <w:szCs w:val="24"/>
+        </w:rPr>
+        <w:t xml:space="preserve">Escolhe a </w:t>
+      </w:r>
+      <w:proofErr w:type="spellStart"/>
+      <w:r>
+        <w:rPr>
+          <w:color w:val="000000" w:themeColor="text1"/>
+          <w:sz w:val="24"/>
+          <w:szCs w:val="24"/>
+        </w:rPr>
+        <w:t>font</w:t>
+      </w:r>
+      <w:proofErr w:type="spellEnd"/>
+      <w:r>
+        <w:rPr>
+          <w:color w:val="000000" w:themeColor="text1"/>
+          <w:sz w:val="24"/>
+          <w:szCs w:val="24"/>
+        </w:rPr>
+        <w:t xml:space="preserve"> desejada para aplicar ao site </w:t>
+      </w:r>
+    </w:p>
+    <w:p>
+      <w:pPr>
+        <w:pStyle w:val="PargrafodaLista"/>
+        <w:numPr>
+          <w:ilvl w:val="0"/>
+          <w:numId w:val="10"/>
+        </w:numPr>
+        <w:rPr>
+          <w:color w:val="000000" w:themeColor="text1"/>
+          <w:sz w:val="24"/>
+          <w:szCs w:val="24"/>
+        </w:rPr>
+      </w:pPr>
+      <w:r>
+        <w:rPr>
+          <w:color w:val="000000" w:themeColor="text1"/>
+          <w:sz w:val="24"/>
+          <w:szCs w:val="24"/>
+        </w:rPr>
+        <w:t xml:space="preserve">Clicar no botão </w:t>
+      </w:r>
+      <w:proofErr w:type="spellStart"/>
+      <w:r>
+        <w:rPr>
+          <w:color w:val="000000" w:themeColor="text1"/>
+          <w:sz w:val="24"/>
+          <w:szCs w:val="24"/>
+        </w:rPr>
+        <w:t>get</w:t>
+      </w:r>
+      <w:proofErr w:type="spellEnd"/>
+      <w:r>
+        <w:rPr>
+          <w:color w:val="000000" w:themeColor="text1"/>
+          <w:sz w:val="24"/>
+          <w:szCs w:val="24"/>
+        </w:rPr>
+        <w:t xml:space="preserve"> </w:t>
+      </w:r>
+      <w:proofErr w:type="spellStart"/>
+      <w:r>
+        <w:rPr>
+          <w:color w:val="000000" w:themeColor="text1"/>
+          <w:sz w:val="24"/>
+          <w:szCs w:val="24"/>
+        </w:rPr>
+        <w:t>fonts</w:t>
+      </w:r>
+      <w:proofErr w:type="spellEnd"/>
+      <w:r>
+        <w:rPr>
+          <w:color w:val="000000" w:themeColor="text1"/>
+          <w:sz w:val="24"/>
+          <w:szCs w:val="24"/>
+        </w:rPr>
+        <w:t xml:space="preserve"> para copiar o link que será colado no </w:t>
+      </w:r>
+      <w:proofErr w:type="spellStart"/>
+      <w:r>
+        <w:rPr>
+          <w:color w:val="000000" w:themeColor="text1"/>
+          <w:sz w:val="24"/>
+          <w:szCs w:val="24"/>
+        </w:rPr>
+        <w:t>head</w:t>
+      </w:r>
+      <w:proofErr w:type="spellEnd"/>
+      <w:r>
+        <w:rPr>
+          <w:color w:val="000000" w:themeColor="text1"/>
+          <w:sz w:val="24"/>
+          <w:szCs w:val="24"/>
+        </w:rPr>
+        <w:t xml:space="preserve"> do </w:t>
+      </w:r>
+      <w:proofErr w:type="spellStart"/>
+      <w:r>
+        <w:rPr>
+          <w:color w:val="000000" w:themeColor="text1"/>
+          <w:sz w:val="24"/>
+          <w:szCs w:val="24"/>
+        </w:rPr>
+        <w:t>html</w:t>
+      </w:r>
+      <w:proofErr w:type="spellEnd"/>
+    </w:p>
+    <w:p>
+      <w:pPr>
+        <w:pStyle w:val="PargrafodaLista"/>
+        <w:numPr>
+          <w:ilvl w:val="0"/>
+          <w:numId w:val="10"/>
+        </w:numPr>
+        <w:rPr>
+          <w:color w:val="000000" w:themeColor="text1"/>
+          <w:sz w:val="24"/>
+          <w:szCs w:val="24"/>
+        </w:rPr>
+      </w:pPr>
+      <w:r>
+        <w:rPr>
+          <w:color w:val="000000" w:themeColor="text1"/>
+          <w:sz w:val="24"/>
+          <w:szCs w:val="24"/>
+        </w:rPr>
+        <w:t xml:space="preserve">Depois copiamos o link que será colado no </w:t>
+      </w:r>
+      <w:proofErr w:type="spellStart"/>
+      <w:r>
+        <w:rPr>
+          <w:color w:val="000000" w:themeColor="text1"/>
+          <w:sz w:val="24"/>
+          <w:szCs w:val="24"/>
+        </w:rPr>
+        <w:t>css</w:t>
+      </w:r>
+      <w:proofErr w:type="spellEnd"/>
+    </w:p>
+    <w:p>
+      <w:pPr>
+        <w:rPr>
+          <w:color w:val="000000" w:themeColor="text1"/>
+          <w:sz w:val="24"/>
+          <w:szCs w:val="24"/>
+        </w:rPr>
+      </w:pPr>
+      <w:r>
+        <w:rPr>
+          <w:color w:val="000000" w:themeColor="text1"/>
+          <w:sz w:val="24"/>
+          <w:szCs w:val="24"/>
+        </w:rPr>
+        <w:t xml:space="preserve">74- </w:t>
       </w:r>
       <w:bookmarkStart w:id="0" w:name="_GoBack"/>
       <w:bookmarkEnd w:id="0"/>
@@ -14391,6 +15033,119 @@
     </w:lvl>
   </w:abstractNum>
   <w:abstractNum w:abstractNumId="8" w15:restartNumberingAfterBreak="0">
+    <w:nsid w:val="4BD97793"/>
+    <w:multiLevelType w:val="hybridMultilevel"/>
+    <w:tmpl w:val="F52C3F50"/>
+    <w:lvl w:ilvl="0" w:tplc="04160001">
+      <w:start w:val="1"/>
+      <w:numFmt w:val="bullet"/>
+      <w:lvlText w:val=""/>
+      <w:lvlJc w:val="left"/>
+      <w:pPr>
+        <w:ind w:left="720" w:hanging="360"/>
+      </w:pPr>
+      <w:rPr>
+        <w:rFonts w:ascii="Symbol" w:hAnsi="Symbol" w:hint="default"/>
+      </w:rPr>
+    </w:lvl>
+    <w:lvl w:ilvl="1" w:tplc="04160003" w:tentative="1">
+      <w:start w:val="1"/>
+      <w:numFmt w:val="bullet"/>
+      <w:lvlText w:val="o"/>
+      <w:lvlJc w:val="left"/>
+      <w:pPr>
+        <w:ind w:left="1440" w:hanging="360"/>
+      </w:pPr>
+      <w:rPr>
+        <w:rFonts w:ascii="Courier New" w:hAnsi="Courier New" w:cs="Courier New" w:hint="default"/>
+      </w:rPr>
+    </w:lvl>
+    <w:lvl w:ilvl="2" w:tplc="04160005" w:tentative="1">
+      <w:start w:val="1"/>
+      <w:numFmt w:val="bullet"/>
+      <w:lvlText w:val=""/>
+      <w:lvlJc w:val="left"/>
+      <w:pPr>
+        <w:ind w:left="2160" w:hanging="360"/>
+      </w:pPr>
+      <w:rPr>
+        <w:rFonts w:ascii="Wingdings" w:hAnsi="Wingdings" w:hint="default"/>
+      </w:rPr>
+    </w:lvl>
+    <w:lvl w:ilvl="3" w:tplc="04160001" w:tentative="1">
+      <w:start w:val="1"/>
+      <w:numFmt w:val="bullet"/>
+      <w:lvlText w:val=""/>
+      <w:lvlJc w:val="left"/>
+      <w:pPr>
+        <w:ind w:left="2880" w:hanging="360"/>
+      </w:pPr>
+      <w:rPr>
+        <w:rFonts w:ascii="Symbol" w:hAnsi="Symbol" w:hint="default"/>
+      </w:rPr>
+    </w:lvl>
+    <w:lvl w:ilvl="4" w:tplc="04160003" w:tentative="1">
+      <w:start w:val="1"/>
+      <w:numFmt w:val="bullet"/>
+      <w:lvlText w:val="o"/>
+      <w:lvlJc w:val="left"/>
+      <w:pPr>
+        <w:ind w:left="3600" w:hanging="360"/>
+      </w:pPr>
+      <w:rPr>
+        <w:rFonts w:ascii="Courier New" w:hAnsi="Courier New" w:cs="Courier New" w:hint="default"/>
+      </w:rPr>
+    </w:lvl>
+    <w:lvl w:ilvl="5" w:tplc="04160005" w:tentative="1">
+      <w:start w:val="1"/>
+      <w:numFmt w:val="bullet"/>
+      <w:lvlText w:val=""/>
+      <w:lvlJc w:val="left"/>
+      <w:pPr>
+        <w:ind w:left="4320" w:hanging="360"/>
+      </w:pPr>
+      <w:rPr>
+        <w:rFonts w:ascii="Wingdings" w:hAnsi="Wingdings" w:hint="default"/>
+      </w:rPr>
+    </w:lvl>
+    <w:lvl w:ilvl="6" w:tplc="04160001" w:tentative="1">
+      <w:start w:val="1"/>
+      <w:numFmt w:val="bullet"/>
+      <w:lvlText w:val=""/>
+      <w:lvlJc w:val="left"/>
+      <w:pPr>
+        <w:ind w:left="5040" w:hanging="360"/>
+      </w:pPr>
+      <w:rPr>
+        <w:rFonts w:ascii="Symbol" w:hAnsi="Symbol" w:hint="default"/>
+      </w:rPr>
+    </w:lvl>
+    <w:lvl w:ilvl="7" w:tplc="04160003" w:tentative="1">
+      <w:start w:val="1"/>
+      <w:numFmt w:val="bullet"/>
+      <w:lvlText w:val="o"/>
+      <w:lvlJc w:val="left"/>
+      <w:pPr>
+        <w:ind w:left="5760" w:hanging="360"/>
+      </w:pPr>
+      <w:rPr>
+        <w:rFonts w:ascii="Courier New" w:hAnsi="Courier New" w:cs="Courier New" w:hint="default"/>
+      </w:rPr>
+    </w:lvl>
+    <w:lvl w:ilvl="8" w:tplc="04160005" w:tentative="1">
+      <w:start w:val="1"/>
+      <w:numFmt w:val="bullet"/>
+      <w:lvlText w:val=""/>
+      <w:lvlJc w:val="left"/>
+      <w:pPr>
+        <w:ind w:left="6480" w:hanging="360"/>
+      </w:pPr>
+      <w:rPr>
+        <w:rFonts w:ascii="Wingdings" w:hAnsi="Wingdings" w:hint="default"/>
+      </w:rPr>
+    </w:lvl>
+  </w:abstractNum>
+  <w:abstractNum w:abstractNumId="9" w15:restartNumberingAfterBreak="0">
     <w:nsid w:val="67EB77F4"/>
     <w:multiLevelType w:val="hybridMultilevel"/>
     <w:tmpl w:val="1FAA0BA4"/>
@@ -14510,7 +15265,7 @@
     <w:abstractNumId w:val="0"/>
   </w:num>
   <w:num w:numId="3">
-    <w:abstractNumId w:val="8"/>
+    <w:abstractNumId w:val="9"/>
   </w:num>
   <w:num w:numId="4">
     <w:abstractNumId w:val="5"/>
@@ -14529,6 +15284,9 @@
   </w:num>
   <w:num w:numId="9">
     <w:abstractNumId w:val="7"/>
+  </w:num>
+  <w:num w:numId="10">
+    <w:abstractNumId w:val="8"/>
   </w:num>
 </w:numbering>
 </file>
@@ -15295,7 +16053,7 @@
 </file>
 
 <file path=customXml/itemProps1.xml><?xml version="1.0" encoding="utf-8"?>
-<ds:datastoreItem xmlns:ds="http://schemas.openxmlformats.org/officeDocument/2006/customXml" ds:itemID="{8BE66A49-80B9-4941-AAF8-4C6019989159}">
+<ds:datastoreItem xmlns:ds="http://schemas.openxmlformats.org/officeDocument/2006/customXml" ds:itemID="{37ABC037-6461-424B-8CD0-97CF91E27DF0}">
   <ds:schemaRefs>
     <ds:schemaRef ds:uri="http://schemas.openxmlformats.org/officeDocument/2006/bibliography"/>
   </ds:schemaRefs>

</xml_diff>

<commit_message>
atualização da aula do di 05/10
</commit_message>
<xml_diff>
--- a/Apostila/Apostila Space For Men.docx
+++ b/Apostila/Apostila Space For Men.docx
@@ -13594,6 +13594,7 @@
       </w:r>
       <w:r>
         <w:rPr>
+          <w:noProof/>
           <w:color w:val="000000" w:themeColor="text1"/>
           <w:sz w:val="24"/>
           <w:szCs w:val="24"/>
@@ -13654,6 +13655,7 @@
       <w:proofErr w:type="spellStart"/>
       <w:r>
         <w:rPr>
+          <w:b/>
           <w:color w:val="000000" w:themeColor="text1"/>
           <w:sz w:val="24"/>
           <w:szCs w:val="24"/>
@@ -13690,6 +13692,7 @@
       <w:proofErr w:type="spellStart"/>
       <w:r>
         <w:rPr>
+          <w:b/>
           <w:color w:val="000000" w:themeColor="text1"/>
           <w:sz w:val="24"/>
           <w:szCs w:val="24"/>
@@ -13708,6 +13711,7 @@
       <w:proofErr w:type="spellStart"/>
       <w:r>
         <w:rPr>
+          <w:b/>
           <w:color w:val="000000" w:themeColor="text1"/>
           <w:sz w:val="24"/>
           <w:szCs w:val="24"/>
@@ -13726,6 +13730,7 @@
       <w:proofErr w:type="spellStart"/>
       <w:r>
         <w:rPr>
+          <w:b/>
           <w:color w:val="000000" w:themeColor="text1"/>
           <w:sz w:val="24"/>
           <w:szCs w:val="24"/>
@@ -14095,8 +14100,1078 @@
         </w:rPr>
         <w:t xml:space="preserve">74- </w:t>
       </w:r>
+      <w:r>
+        <w:rPr>
+          <w:color w:val="000000" w:themeColor="text1"/>
+          <w:sz w:val="24"/>
+          <w:szCs w:val="24"/>
+        </w:rPr>
+        <w:t xml:space="preserve">Para adicionar o mapa vamos ao </w:t>
+      </w:r>
+      <w:proofErr w:type="spellStart"/>
+      <w:r>
+        <w:rPr>
+          <w:color w:val="000000" w:themeColor="text1"/>
+          <w:sz w:val="24"/>
+          <w:szCs w:val="24"/>
+        </w:rPr>
+        <w:t>google</w:t>
+      </w:r>
+      <w:proofErr w:type="spellEnd"/>
+      <w:r>
+        <w:rPr>
+          <w:color w:val="000000" w:themeColor="text1"/>
+          <w:sz w:val="24"/>
+          <w:szCs w:val="24"/>
+        </w:rPr>
+        <w:t xml:space="preserve"> </w:t>
+      </w:r>
+      <w:proofErr w:type="spellStart"/>
+      <w:r>
+        <w:rPr>
+          <w:color w:val="000000" w:themeColor="text1"/>
+          <w:sz w:val="24"/>
+          <w:szCs w:val="24"/>
+        </w:rPr>
+        <w:t>maps</w:t>
+      </w:r>
+      <w:proofErr w:type="spellEnd"/>
+      <w:r>
+        <w:rPr>
+          <w:color w:val="000000" w:themeColor="text1"/>
+          <w:sz w:val="24"/>
+          <w:szCs w:val="24"/>
+        </w:rPr>
+        <w:t xml:space="preserve"> e digitamos o nome desejado na pesquisa.</w:t>
+      </w:r>
+    </w:p>
+    <w:p>
+      <w:pPr>
+        <w:rPr>
+          <w:color w:val="000000" w:themeColor="text1"/>
+          <w:sz w:val="24"/>
+          <w:szCs w:val="24"/>
+        </w:rPr>
+      </w:pPr>
+      <w:r>
+        <w:rPr>
+          <w:color w:val="000000" w:themeColor="text1"/>
+          <w:sz w:val="24"/>
+          <w:szCs w:val="24"/>
+        </w:rPr>
+        <w:drawing>
+          <wp:inline distT="0" distB="0" distL="0" distR="0" wp14:anchorId="532E9FC1" wp14:editId="0782F6DC">
+            <wp:extent cx="5829300" cy="3362671"/>
+            <wp:effectExtent l="0" t="0" r="0" b="9525"/>
+            <wp:docPr id="121" name="Imagem 121"/>
+            <wp:cNvGraphicFramePr>
+              <a:graphicFrameLocks xmlns:a="http://schemas.openxmlformats.org/drawingml/2006/main" noChangeAspect="1"/>
+            </wp:cNvGraphicFramePr>
+            <a:graphic xmlns:a="http://schemas.openxmlformats.org/drawingml/2006/main">
+              <a:graphicData uri="http://schemas.openxmlformats.org/drawingml/2006/picture">
+                <pic:pic xmlns:pic="http://schemas.openxmlformats.org/drawingml/2006/picture">
+                  <pic:nvPicPr>
+                    <pic:cNvPr id="1" name=""/>
+                    <pic:cNvPicPr/>
+                  </pic:nvPicPr>
+                  <pic:blipFill>
+                    <a:blip r:embed="rId117"/>
+                    <a:stretch>
+                      <a:fillRect/>
+                    </a:stretch>
+                  </pic:blipFill>
+                  <pic:spPr>
+                    <a:xfrm>
+                      <a:off x="0" y="0"/>
+                      <a:ext cx="5852182" cy="3375870"/>
+                    </a:xfrm>
+                    <a:prstGeom prst="rect">
+                      <a:avLst/>
+                    </a:prstGeom>
+                  </pic:spPr>
+                </pic:pic>
+              </a:graphicData>
+            </a:graphic>
+          </wp:inline>
+        </w:drawing>
+      </w:r>
+    </w:p>
+    <w:p>
+      <w:pPr>
+        <w:rPr>
+          <w:color w:val="000000" w:themeColor="text1"/>
+          <w:sz w:val="24"/>
+          <w:szCs w:val="24"/>
+        </w:rPr>
+      </w:pPr>
+      <w:r>
+        <w:rPr>
+          <w:noProof/>
+          <w:color w:val="000000" w:themeColor="text1"/>
+          <w:sz w:val="24"/>
+          <w:szCs w:val="24"/>
+        </w:rPr>
+        <mc:AlternateContent>
+          <mc:Choice Requires="wps">
+            <w:drawing>
+              <wp:anchor distT="0" distB="0" distL="114300" distR="114300" simplePos="0" relativeHeight="251682816" behindDoc="0" locked="0" layoutInCell="1" allowOverlap="1">
+                <wp:simplePos x="0" y="0"/>
+                <wp:positionH relativeFrom="column">
+                  <wp:posOffset>323850</wp:posOffset>
+                </wp:positionH>
+                <wp:positionV relativeFrom="paragraph">
+                  <wp:posOffset>133350</wp:posOffset>
+                </wp:positionV>
+                <wp:extent cx="1209675" cy="466725"/>
+                <wp:effectExtent l="38100" t="0" r="28575" b="66675"/>
+                <wp:wrapNone/>
+                <wp:docPr id="124" name="Conector de Seta Reta 124"/>
+                <wp:cNvGraphicFramePr/>
+                <a:graphic xmlns:a="http://schemas.openxmlformats.org/drawingml/2006/main">
+                  <a:graphicData uri="http://schemas.microsoft.com/office/word/2010/wordprocessingShape">
+                    <wps:wsp>
+                      <wps:cNvCnPr/>
+                      <wps:spPr>
+                        <a:xfrm flipH="1">
+                          <a:off x="0" y="0"/>
+                          <a:ext cx="1209675" cy="466725"/>
+                        </a:xfrm>
+                        <a:prstGeom prst="straightConnector1">
+                          <a:avLst/>
+                        </a:prstGeom>
+                        <a:ln>
+                          <a:tailEnd type="triangle"/>
+                        </a:ln>
+                      </wps:spPr>
+                      <wps:style>
+                        <a:lnRef idx="1">
+                          <a:schemeClr val="accent1"/>
+                        </a:lnRef>
+                        <a:fillRef idx="0">
+                          <a:schemeClr val="accent1"/>
+                        </a:fillRef>
+                        <a:effectRef idx="0">
+                          <a:schemeClr val="accent1"/>
+                        </a:effectRef>
+                        <a:fontRef idx="minor">
+                          <a:schemeClr val="tx1"/>
+                        </a:fontRef>
+                      </wps:style>
+                      <wps:bodyPr/>
+                    </wps:wsp>
+                  </a:graphicData>
+                </a:graphic>
+              </wp:anchor>
+            </w:drawing>
+          </mc:Choice>
+          <mc:Fallback>
+            <w:pict>
+              <v:shapetype w14:anchorId="41ED4A8F" id="_x0000_t32" coordsize="21600,21600" o:spt="32" o:oned="t" path="m,l21600,21600e" filled="f">
+                <v:path arrowok="t" fillok="f" o:connecttype="none"/>
+                <o:lock v:ext="edit" shapetype="t"/>
+              </v:shapetype>
+              <v:shape id="Conector de Seta Reta 124" o:spid="_x0000_s1026" type="#_x0000_t32" style="position:absolute;margin-left:25.5pt;margin-top:10.5pt;width:95.25pt;height:36.75pt;flip:x;z-index:251682816;visibility:visible;mso-wrap-style:square;mso-wrap-distance-left:9pt;mso-wrap-distance-top:0;mso-wrap-distance-right:9pt;mso-wrap-distance-bottom:0;mso-position-horizontal:absolute;mso-position-horizontal-relative:text;mso-position-vertical:absolute;mso-position-vertical-relative:text" o:gfxdata="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" strokecolor="#4472c4 [3204]" strokeweight=".5pt">
+                <v:stroke endarrow="block" joinstyle="miter"/>
+              </v:shape>
+            </w:pict>
+          </mc:Fallback>
+        </mc:AlternateContent>
+      </w:r>
+      <w:r>
+        <w:rPr>
+          <w:color w:val="000000" w:themeColor="text1"/>
+          <w:sz w:val="24"/>
+          <w:szCs w:val="24"/>
+        </w:rPr>
+        <w:t>75- Vamos clicar nas 3 linhas</w:t>
+      </w:r>
+      <w:r>
+        <w:rPr>
+          <w:color w:val="000000" w:themeColor="text1"/>
+          <w:sz w:val="24"/>
+          <w:szCs w:val="24"/>
+        </w:rPr>
+        <w:t>.</w:t>
+      </w:r>
+    </w:p>
+    <w:p>
+      <w:pPr>
+        <w:rPr>
+          <w:color w:val="000000" w:themeColor="text1"/>
+          <w:sz w:val="24"/>
+          <w:szCs w:val="24"/>
+        </w:rPr>
+      </w:pPr>
+      <w:r>
+        <w:rPr>
+          <w:noProof/>
+          <w:color w:val="000000" w:themeColor="text1"/>
+          <w:sz w:val="24"/>
+          <w:szCs w:val="24"/>
+        </w:rPr>
+        <w:drawing>
+          <wp:inline distT="0" distB="0" distL="0" distR="0" wp14:anchorId="77C7113F">
+            <wp:extent cx="4448810" cy="3305810"/>
+            <wp:effectExtent l="0" t="0" r="8890" b="8890"/>
+            <wp:docPr id="123" name="Imagem 123"/>
+            <wp:cNvGraphicFramePr>
+              <a:graphicFrameLocks xmlns:a="http://schemas.openxmlformats.org/drawingml/2006/main" noChangeAspect="1"/>
+            </wp:cNvGraphicFramePr>
+            <a:graphic xmlns:a="http://schemas.openxmlformats.org/drawingml/2006/main">
+              <a:graphicData uri="http://schemas.openxmlformats.org/drawingml/2006/picture">
+                <pic:pic xmlns:pic="http://schemas.openxmlformats.org/drawingml/2006/picture">
+                  <pic:nvPicPr>
+                    <pic:cNvPr id="0" name="Picture 3"/>
+                    <pic:cNvPicPr>
+                      <a:picLocks noChangeAspect="1" noChangeArrowheads="1"/>
+                    </pic:cNvPicPr>
+                  </pic:nvPicPr>
+                  <pic:blipFill>
+                    <a:blip r:embed="rId118">
+                      <a:extLst>
+                        <a:ext uri="{28A0092B-C50C-407E-A947-70E740481C1C}">
+                          <a14:useLocalDpi xmlns:a14="http://schemas.microsoft.com/office/drawing/2010/main" val="0"/>
+                        </a:ext>
+                      </a:extLst>
+                    </a:blip>
+                    <a:srcRect/>
+                    <a:stretch>
+                      <a:fillRect/>
+                    </a:stretch>
+                  </pic:blipFill>
+                  <pic:spPr bwMode="auto">
+                    <a:xfrm>
+                      <a:off x="0" y="0"/>
+                      <a:ext cx="4448810" cy="3305810"/>
+                    </a:xfrm>
+                    <a:prstGeom prst="rect">
+                      <a:avLst/>
+                    </a:prstGeom>
+                    <a:noFill/>
+                  </pic:spPr>
+                </pic:pic>
+              </a:graphicData>
+            </a:graphic>
+          </wp:inline>
+        </w:drawing>
+      </w:r>
+    </w:p>
+    <w:p>
+      <w:pPr>
+        <w:rPr>
+          <w:color w:val="000000" w:themeColor="text1"/>
+          <w:sz w:val="24"/>
+          <w:szCs w:val="24"/>
+        </w:rPr>
+      </w:pPr>
+      <w:r>
+        <w:rPr>
+          <w:noProof/>
+          <w:color w:val="000000" w:themeColor="text1"/>
+          <w:sz w:val="24"/>
+          <w:szCs w:val="24"/>
+        </w:rPr>
+        <mc:AlternateContent>
+          <mc:Choice Requires="wps">
+            <w:drawing>
+              <wp:anchor distT="0" distB="0" distL="114300" distR="114300" simplePos="0" relativeHeight="251683840" behindDoc="0" locked="0" layoutInCell="1" allowOverlap="1">
+                <wp:simplePos x="0" y="0"/>
+                <wp:positionH relativeFrom="column">
+                  <wp:posOffset>1114425</wp:posOffset>
+                </wp:positionH>
+                <wp:positionV relativeFrom="paragraph">
+                  <wp:posOffset>160655</wp:posOffset>
+                </wp:positionV>
+                <wp:extent cx="2085975" cy="2609850"/>
+                <wp:effectExtent l="38100" t="0" r="28575" b="57150"/>
+                <wp:wrapNone/>
+                <wp:docPr id="126" name="Conector de Seta Reta 126"/>
+                <wp:cNvGraphicFramePr/>
+                <a:graphic xmlns:a="http://schemas.openxmlformats.org/drawingml/2006/main">
+                  <a:graphicData uri="http://schemas.microsoft.com/office/word/2010/wordprocessingShape">
+                    <wps:wsp>
+                      <wps:cNvCnPr/>
+                      <wps:spPr>
+                        <a:xfrm flipH="1">
+                          <a:off x="0" y="0"/>
+                          <a:ext cx="2085975" cy="2609850"/>
+                        </a:xfrm>
+                        <a:prstGeom prst="straightConnector1">
+                          <a:avLst/>
+                        </a:prstGeom>
+                        <a:ln>
+                          <a:tailEnd type="triangle"/>
+                        </a:ln>
+                      </wps:spPr>
+                      <wps:style>
+                        <a:lnRef idx="1">
+                          <a:schemeClr val="accent1"/>
+                        </a:lnRef>
+                        <a:fillRef idx="0">
+                          <a:schemeClr val="accent1"/>
+                        </a:fillRef>
+                        <a:effectRef idx="0">
+                          <a:schemeClr val="accent1"/>
+                        </a:effectRef>
+                        <a:fontRef idx="minor">
+                          <a:schemeClr val="tx1"/>
+                        </a:fontRef>
+                      </wps:style>
+                      <wps:bodyPr/>
+                    </wps:wsp>
+                  </a:graphicData>
+                </a:graphic>
+              </wp:anchor>
+            </w:drawing>
+          </mc:Choice>
+          <mc:Fallback>
+            <w:pict>
+              <v:shape w14:anchorId="75A68D43" id="Conector de Seta Reta 126" o:spid="_x0000_s1026" type="#_x0000_t32" style="position:absolute;margin-left:87.75pt;margin-top:12.65pt;width:164.25pt;height:205.5pt;flip:x;z-index:251683840;visibility:visible;mso-wrap-style:square;mso-wrap-distance-left:9pt;mso-wrap-distance-top:0;mso-wrap-distance-right:9pt;mso-wrap-distance-bottom:0;mso-position-horizontal:absolute;mso-position-horizontal-relative:text;mso-position-vertical:absolute;mso-position-vertical-relative:text" o:gfxdata="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" strokecolor="#4472c4 [3204]" strokeweight=".5pt">
+                <v:stroke endarrow="block" joinstyle="miter"/>
+              </v:shape>
+            </w:pict>
+          </mc:Fallback>
+        </mc:AlternateContent>
+      </w:r>
+      <w:r>
+        <w:rPr>
+          <w:color w:val="000000" w:themeColor="text1"/>
+          <w:sz w:val="24"/>
+          <w:szCs w:val="24"/>
+        </w:rPr>
+        <w:t>76- Vai aparecer a seguinte tela no campo compartilhar ou incorporar mapa, vamos clicar.</w:t>
+      </w:r>
+    </w:p>
+    <w:p>
+      <w:pPr>
+        <w:rPr>
+          <w:color w:val="000000" w:themeColor="text1"/>
+          <w:sz w:val="24"/>
+          <w:szCs w:val="24"/>
+        </w:rPr>
+      </w:pPr>
+      <w:r>
+        <w:rPr>
+          <w:noProof/>
+          <w:color w:val="000000" w:themeColor="text1"/>
+          <w:sz w:val="24"/>
+          <w:szCs w:val="24"/>
+        </w:rPr>
+        <mc:AlternateContent>
+          <mc:Choice Requires="wps">
+            <w:drawing>
+              <wp:anchor distT="0" distB="0" distL="114300" distR="114300" simplePos="0" relativeHeight="251684864" behindDoc="0" locked="0" layoutInCell="1" allowOverlap="1">
+                <wp:simplePos x="0" y="0"/>
+                <wp:positionH relativeFrom="column">
+                  <wp:posOffset>1657349</wp:posOffset>
+                </wp:positionH>
+                <wp:positionV relativeFrom="paragraph">
+                  <wp:posOffset>2152650</wp:posOffset>
+                </wp:positionV>
+                <wp:extent cx="1057275" cy="371475"/>
+                <wp:effectExtent l="0" t="38100" r="47625" b="28575"/>
+                <wp:wrapNone/>
+                <wp:docPr id="129" name="Conector de Seta Reta 129"/>
+                <wp:cNvGraphicFramePr/>
+                <a:graphic xmlns:a="http://schemas.openxmlformats.org/drawingml/2006/main">
+                  <a:graphicData uri="http://schemas.microsoft.com/office/word/2010/wordprocessingShape">
+                    <wps:wsp>
+                      <wps:cNvCnPr/>
+                      <wps:spPr>
+                        <a:xfrm flipV="1">
+                          <a:off x="0" y="0"/>
+                          <a:ext cx="1057275" cy="371475"/>
+                        </a:xfrm>
+                        <a:prstGeom prst="straightConnector1">
+                          <a:avLst/>
+                        </a:prstGeom>
+                        <a:ln>
+                          <a:tailEnd type="triangle"/>
+                        </a:ln>
+                      </wps:spPr>
+                      <wps:style>
+                        <a:lnRef idx="1">
+                          <a:schemeClr val="accent1"/>
+                        </a:lnRef>
+                        <a:fillRef idx="0">
+                          <a:schemeClr val="accent1"/>
+                        </a:fillRef>
+                        <a:effectRef idx="0">
+                          <a:schemeClr val="accent1"/>
+                        </a:effectRef>
+                        <a:fontRef idx="minor">
+                          <a:schemeClr val="tx1"/>
+                        </a:fontRef>
+                      </wps:style>
+                      <wps:bodyPr/>
+                    </wps:wsp>
+                  </a:graphicData>
+                </a:graphic>
+              </wp:anchor>
+            </w:drawing>
+          </mc:Choice>
+          <mc:Fallback>
+            <w:pict>
+              <v:shape w14:anchorId="59EA2734" id="Conector de Seta Reta 129" o:spid="_x0000_s1026" type="#_x0000_t32" style="position:absolute;margin-left:130.5pt;margin-top:169.5pt;width:83.25pt;height:29.25pt;flip:y;z-index:251684864;visibility:visible;mso-wrap-style:square;mso-wrap-distance-left:9pt;mso-wrap-distance-top:0;mso-wrap-distance-right:9pt;mso-wrap-distance-bottom:0;mso-position-horizontal:absolute;mso-position-horizontal-relative:text;mso-position-vertical:absolute;mso-position-vertical-relative:text" o:gfxdata="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" strokecolor="#4472c4 [3204]" strokeweight=".5pt">
+                <v:stroke endarrow="block" joinstyle="miter"/>
+              </v:shape>
+            </w:pict>
+          </mc:Fallback>
+        </mc:AlternateContent>
+      </w:r>
+      <w:r>
+        <w:rPr>
+          <w:noProof/>
+          <w:color w:val="000000" w:themeColor="text1"/>
+          <w:sz w:val="24"/>
+          <w:szCs w:val="24"/>
+        </w:rPr>
+        <w:drawing>
+          <wp:inline distT="0" distB="0" distL="0" distR="0" wp14:anchorId="670ABFE6">
+            <wp:extent cx="2111318" cy="2952750"/>
+            <wp:effectExtent l="0" t="0" r="3810" b="0"/>
+            <wp:docPr id="125" name="Imagem 125"/>
+            <wp:cNvGraphicFramePr>
+              <a:graphicFrameLocks xmlns:a="http://schemas.openxmlformats.org/drawingml/2006/main" noChangeAspect="1"/>
+            </wp:cNvGraphicFramePr>
+            <a:graphic xmlns:a="http://schemas.openxmlformats.org/drawingml/2006/main">
+              <a:graphicData uri="http://schemas.openxmlformats.org/drawingml/2006/picture">
+                <pic:pic xmlns:pic="http://schemas.openxmlformats.org/drawingml/2006/picture">
+                  <pic:nvPicPr>
+                    <pic:cNvPr id="0" name="Picture 4"/>
+                    <pic:cNvPicPr>
+                      <a:picLocks noChangeAspect="1" noChangeArrowheads="1"/>
+                    </pic:cNvPicPr>
+                  </pic:nvPicPr>
+                  <pic:blipFill>
+                    <a:blip r:embed="rId119">
+                      <a:extLst>
+                        <a:ext uri="{28A0092B-C50C-407E-A947-70E740481C1C}">
+                          <a14:useLocalDpi xmlns:a14="http://schemas.microsoft.com/office/drawing/2010/main" val="0"/>
+                        </a:ext>
+                      </a:extLst>
+                    </a:blip>
+                    <a:srcRect/>
+                    <a:stretch>
+                      <a:fillRect/>
+                    </a:stretch>
+                  </pic:blipFill>
+                  <pic:spPr bwMode="auto">
+                    <a:xfrm>
+                      <a:off x="0" y="0"/>
+                      <a:ext cx="2124043" cy="2970547"/>
+                    </a:xfrm>
+                    <a:prstGeom prst="rect">
+                      <a:avLst/>
+                    </a:prstGeom>
+                    <a:noFill/>
+                  </pic:spPr>
+                </pic:pic>
+              </a:graphicData>
+            </a:graphic>
+          </wp:inline>
+        </w:drawing>
+      </w:r>
+      <w:r>
+        <w:rPr>
+          <w:noProof/>
+          <w:color w:val="000000" w:themeColor="text1"/>
+          <w:sz w:val="24"/>
+          <w:szCs w:val="24"/>
+        </w:rPr>
+        <w:drawing>
+          <wp:inline distT="0" distB="0" distL="0" distR="0" wp14:anchorId="0A3166A6">
+            <wp:extent cx="3051833" cy="2952115"/>
+            <wp:effectExtent l="0" t="0" r="0" b="635"/>
+            <wp:docPr id="128" name="Imagem 128"/>
+            <wp:cNvGraphicFramePr>
+              <a:graphicFrameLocks xmlns:a="http://schemas.openxmlformats.org/drawingml/2006/main" noChangeAspect="1"/>
+            </wp:cNvGraphicFramePr>
+            <a:graphic xmlns:a="http://schemas.openxmlformats.org/drawingml/2006/main">
+              <a:graphicData uri="http://schemas.openxmlformats.org/drawingml/2006/picture">
+                <pic:pic xmlns:pic="http://schemas.openxmlformats.org/drawingml/2006/picture">
+                  <pic:nvPicPr>
+                    <pic:cNvPr id="0" name="Picture 6"/>
+                    <pic:cNvPicPr>
+                      <a:picLocks noChangeAspect="1" noChangeArrowheads="1"/>
+                    </pic:cNvPicPr>
+                  </pic:nvPicPr>
+                  <pic:blipFill>
+                    <a:blip r:embed="rId120">
+                      <a:extLst>
+                        <a:ext uri="{28A0092B-C50C-407E-A947-70E740481C1C}">
+                          <a14:useLocalDpi xmlns:a14="http://schemas.microsoft.com/office/drawing/2010/main" val="0"/>
+                        </a:ext>
+                      </a:extLst>
+                    </a:blip>
+                    <a:srcRect/>
+                    <a:stretch>
+                      <a:fillRect/>
+                    </a:stretch>
+                  </pic:blipFill>
+                  <pic:spPr bwMode="auto">
+                    <a:xfrm>
+                      <a:off x="0" y="0"/>
+                      <a:ext cx="3071755" cy="2971386"/>
+                    </a:xfrm>
+                    <a:prstGeom prst="rect">
+                      <a:avLst/>
+                    </a:prstGeom>
+                    <a:noFill/>
+                  </pic:spPr>
+                </pic:pic>
+              </a:graphicData>
+            </a:graphic>
+          </wp:inline>
+        </w:drawing>
+      </w:r>
+    </w:p>
+    <w:p>
+      <w:pPr>
+        <w:rPr>
+          <w:color w:val="000000" w:themeColor="text1"/>
+          <w:sz w:val="24"/>
+          <w:szCs w:val="24"/>
+        </w:rPr>
+      </w:pPr>
+      <w:r>
+        <w:rPr>
+          <w:color w:val="000000" w:themeColor="text1"/>
+          <w:sz w:val="24"/>
+          <w:szCs w:val="24"/>
+        </w:rPr>
+        <w:t xml:space="preserve">77- E no texto que se encontra copiar </w:t>
+      </w:r>
+      <w:proofErr w:type="spellStart"/>
+      <w:r>
+        <w:rPr>
+          <w:color w:val="000000" w:themeColor="text1"/>
+          <w:sz w:val="24"/>
+          <w:szCs w:val="24"/>
+        </w:rPr>
+        <w:t>html</w:t>
+      </w:r>
+      <w:proofErr w:type="spellEnd"/>
+      <w:r>
+        <w:rPr>
+          <w:color w:val="000000" w:themeColor="text1"/>
+          <w:sz w:val="24"/>
+          <w:szCs w:val="24"/>
+        </w:rPr>
+        <w:t xml:space="preserve"> vamos clicar e colar na nossa página index.html conforme imagem.</w:t>
+      </w:r>
+    </w:p>
+    <w:p>
+      <w:pPr>
+        <w:rPr>
+          <w:color w:val="000000" w:themeColor="text1"/>
+          <w:sz w:val="24"/>
+          <w:szCs w:val="24"/>
+        </w:rPr>
+      </w:pPr>
+      <w:r>
+        <w:rPr>
+          <w:noProof/>
+          <w:color w:val="000000" w:themeColor="text1"/>
+          <w:sz w:val="24"/>
+          <w:szCs w:val="24"/>
+        </w:rPr>
+        <mc:AlternateContent>
+          <mc:Choice Requires="wps">
+            <w:drawing>
+              <wp:anchor distT="0" distB="0" distL="114300" distR="114300" simplePos="0" relativeHeight="251686912" behindDoc="0" locked="0" layoutInCell="1" allowOverlap="1">
+                <wp:simplePos x="0" y="0"/>
+                <wp:positionH relativeFrom="column">
+                  <wp:posOffset>4876800</wp:posOffset>
+                </wp:positionH>
+                <wp:positionV relativeFrom="paragraph">
+                  <wp:posOffset>3151505</wp:posOffset>
+                </wp:positionV>
+                <wp:extent cx="2057400" cy="561975"/>
+                <wp:effectExtent l="38100" t="57150" r="19050" b="28575"/>
+                <wp:wrapNone/>
+                <wp:docPr id="133" name="Conector de Seta Reta 133"/>
+                <wp:cNvGraphicFramePr/>
+                <a:graphic xmlns:a="http://schemas.openxmlformats.org/drawingml/2006/main">
+                  <a:graphicData uri="http://schemas.microsoft.com/office/word/2010/wordprocessingShape">
+                    <wps:wsp>
+                      <wps:cNvCnPr/>
+                      <wps:spPr>
+                        <a:xfrm flipH="1" flipV="1">
+                          <a:off x="0" y="0"/>
+                          <a:ext cx="2057400" cy="561975"/>
+                        </a:xfrm>
+                        <a:prstGeom prst="straightConnector1">
+                          <a:avLst/>
+                        </a:prstGeom>
+                        <a:ln>
+                          <a:tailEnd type="triangle"/>
+                        </a:ln>
+                      </wps:spPr>
+                      <wps:style>
+                        <a:lnRef idx="1">
+                          <a:schemeClr val="accent1"/>
+                        </a:lnRef>
+                        <a:fillRef idx="0">
+                          <a:schemeClr val="accent1"/>
+                        </a:fillRef>
+                        <a:effectRef idx="0">
+                          <a:schemeClr val="accent1"/>
+                        </a:effectRef>
+                        <a:fontRef idx="minor">
+                          <a:schemeClr val="tx1"/>
+                        </a:fontRef>
+                      </wps:style>
+                      <wps:bodyPr/>
+                    </wps:wsp>
+                  </a:graphicData>
+                </a:graphic>
+              </wp:anchor>
+            </w:drawing>
+          </mc:Choice>
+          <mc:Fallback>
+            <w:pict>
+              <v:shape w14:anchorId="270AEB85" id="Conector de Seta Reta 133" o:spid="_x0000_s1026" type="#_x0000_t32" style="position:absolute;margin-left:384pt;margin-top:248.15pt;width:162pt;height:44.25pt;flip:x y;z-index:251686912;visibility:visible;mso-wrap-style:square;mso-wrap-distance-left:9pt;mso-wrap-distance-top:0;mso-wrap-distance-right:9pt;mso-wrap-distance-bottom:0;mso-position-horizontal:absolute;mso-position-horizontal-relative:text;mso-position-vertical:absolute;mso-position-vertical-relative:text" o:gfxdata="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" strokecolor="#4472c4 [3204]" strokeweight=".5pt">
+                <v:stroke endarrow="block" joinstyle="miter"/>
+              </v:shape>
+            </w:pict>
+          </mc:Fallback>
+        </mc:AlternateContent>
+      </w:r>
+      <w:r>
+        <w:rPr>
+          <w:noProof/>
+          <w:color w:val="000000" w:themeColor="text1"/>
+          <w:sz w:val="24"/>
+          <w:szCs w:val="24"/>
+        </w:rPr>
+        <mc:AlternateContent>
+          <mc:Choice Requires="wps">
+            <w:drawing>
+              <wp:anchor distT="0" distB="0" distL="114300" distR="114300" simplePos="0" relativeHeight="251685888" behindDoc="0" locked="0" layoutInCell="1" allowOverlap="1">
+                <wp:simplePos x="0" y="0"/>
+                <wp:positionH relativeFrom="column">
+                  <wp:posOffset>4305300</wp:posOffset>
+                </wp:positionH>
+                <wp:positionV relativeFrom="paragraph">
+                  <wp:posOffset>3132455</wp:posOffset>
+                </wp:positionV>
+                <wp:extent cx="771525" cy="619125"/>
+                <wp:effectExtent l="38100" t="38100" r="28575" b="28575"/>
+                <wp:wrapNone/>
+                <wp:docPr id="132" name="Conector de Seta Reta 132"/>
+                <wp:cNvGraphicFramePr/>
+                <a:graphic xmlns:a="http://schemas.openxmlformats.org/drawingml/2006/main">
+                  <a:graphicData uri="http://schemas.microsoft.com/office/word/2010/wordprocessingShape">
+                    <wps:wsp>
+                      <wps:cNvCnPr/>
+                      <wps:spPr>
+                        <a:xfrm flipH="1" flipV="1">
+                          <a:off x="0" y="0"/>
+                          <a:ext cx="771525" cy="619125"/>
+                        </a:xfrm>
+                        <a:prstGeom prst="straightConnector1">
+                          <a:avLst/>
+                        </a:prstGeom>
+                        <a:ln>
+                          <a:tailEnd type="triangle"/>
+                        </a:ln>
+                      </wps:spPr>
+                      <wps:style>
+                        <a:lnRef idx="1">
+                          <a:schemeClr val="accent1"/>
+                        </a:lnRef>
+                        <a:fillRef idx="0">
+                          <a:schemeClr val="accent1"/>
+                        </a:fillRef>
+                        <a:effectRef idx="0">
+                          <a:schemeClr val="accent1"/>
+                        </a:effectRef>
+                        <a:fontRef idx="minor">
+                          <a:schemeClr val="tx1"/>
+                        </a:fontRef>
+                      </wps:style>
+                      <wps:bodyPr/>
+                    </wps:wsp>
+                  </a:graphicData>
+                </a:graphic>
+              </wp:anchor>
+            </w:drawing>
+          </mc:Choice>
+          <mc:Fallback>
+            <w:pict>
+              <v:shape w14:anchorId="6DB79EDE" id="Conector de Seta Reta 132" o:spid="_x0000_s1026" type="#_x0000_t32" style="position:absolute;margin-left:339pt;margin-top:246.65pt;width:60.75pt;height:48.75pt;flip:x y;z-index:251685888;visibility:visible;mso-wrap-style:square;mso-wrap-distance-left:9pt;mso-wrap-distance-top:0;mso-wrap-distance-right:9pt;mso-wrap-distance-bottom:0;mso-position-horizontal:absolute;mso-position-horizontal-relative:text;mso-position-vertical:absolute;mso-position-vertical-relative:text" o:gfxdata="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" strokecolor="#4472c4 [3204]" strokeweight=".5pt">
+                <v:stroke endarrow="block" joinstyle="miter"/>
+              </v:shape>
+            </w:pict>
+          </mc:Fallback>
+        </mc:AlternateContent>
+      </w:r>
+      <w:r>
+        <w:rPr>
+          <w:noProof/>
+          <w:color w:val="000000" w:themeColor="text1"/>
+          <w:sz w:val="24"/>
+          <w:szCs w:val="24"/>
+        </w:rPr>
+        <w:drawing>
+          <wp:inline distT="0" distB="0" distL="0" distR="0" wp14:anchorId="392F7C2F">
+            <wp:extent cx="3714750" cy="3496914"/>
+            <wp:effectExtent l="0" t="0" r="0" b="8890"/>
+            <wp:docPr id="130" name="Imagem 130"/>
+            <wp:cNvGraphicFramePr>
+              <a:graphicFrameLocks xmlns:a="http://schemas.openxmlformats.org/drawingml/2006/main" noChangeAspect="1"/>
+            </wp:cNvGraphicFramePr>
+            <a:graphic xmlns:a="http://schemas.openxmlformats.org/drawingml/2006/main">
+              <a:graphicData uri="http://schemas.openxmlformats.org/drawingml/2006/picture">
+                <pic:pic xmlns:pic="http://schemas.openxmlformats.org/drawingml/2006/picture">
+                  <pic:nvPicPr>
+                    <pic:cNvPr id="0" name="Picture 7"/>
+                    <pic:cNvPicPr>
+                      <a:picLocks noChangeAspect="1" noChangeArrowheads="1"/>
+                    </pic:cNvPicPr>
+                  </pic:nvPicPr>
+                  <pic:blipFill>
+                    <a:blip r:embed="rId121">
+                      <a:extLst>
+                        <a:ext uri="{28A0092B-C50C-407E-A947-70E740481C1C}">
+                          <a14:useLocalDpi xmlns:a14="http://schemas.microsoft.com/office/drawing/2010/main" val="0"/>
+                        </a:ext>
+                      </a:extLst>
+                    </a:blip>
+                    <a:srcRect/>
+                    <a:stretch>
+                      <a:fillRect/>
+                    </a:stretch>
+                  </pic:blipFill>
+                  <pic:spPr bwMode="auto">
+                    <a:xfrm>
+                      <a:off x="0" y="0"/>
+                      <a:ext cx="3725385" cy="3506926"/>
+                    </a:xfrm>
+                    <a:prstGeom prst="rect">
+                      <a:avLst/>
+                    </a:prstGeom>
+                    <a:noFill/>
+                  </pic:spPr>
+                </pic:pic>
+              </a:graphicData>
+            </a:graphic>
+          </wp:inline>
+        </w:drawing>
+      </w:r>
+      <w:r>
+        <w:rPr>
+          <w:noProof/>
+          <w:color w:val="000000" w:themeColor="text1"/>
+          <w:sz w:val="24"/>
+          <w:szCs w:val="24"/>
+        </w:rPr>
+        <w:drawing>
+          <wp:inline distT="0" distB="0" distL="0" distR="0" wp14:anchorId="5F34D8BD">
+            <wp:extent cx="7248525" cy="1005447"/>
+            <wp:effectExtent l="0" t="0" r="0" b="4445"/>
+            <wp:docPr id="131" name="Imagem 131"/>
+            <wp:cNvGraphicFramePr>
+              <a:graphicFrameLocks xmlns:a="http://schemas.openxmlformats.org/drawingml/2006/main" noChangeAspect="1"/>
+            </wp:cNvGraphicFramePr>
+            <a:graphic xmlns:a="http://schemas.openxmlformats.org/drawingml/2006/main">
+              <a:graphicData uri="http://schemas.openxmlformats.org/drawingml/2006/picture">
+                <pic:pic xmlns:pic="http://schemas.openxmlformats.org/drawingml/2006/picture">
+                  <pic:nvPicPr>
+                    <pic:cNvPr id="0" name="Picture 8"/>
+                    <pic:cNvPicPr>
+                      <a:picLocks noChangeAspect="1" noChangeArrowheads="1"/>
+                    </pic:cNvPicPr>
+                  </pic:nvPicPr>
+                  <pic:blipFill>
+                    <a:blip r:embed="rId122">
+                      <a:extLst>
+                        <a:ext uri="{28A0092B-C50C-407E-A947-70E740481C1C}">
+                          <a14:useLocalDpi xmlns:a14="http://schemas.microsoft.com/office/drawing/2010/main" val="0"/>
+                        </a:ext>
+                      </a:extLst>
+                    </a:blip>
+                    <a:srcRect/>
+                    <a:stretch>
+                      <a:fillRect/>
+                    </a:stretch>
+                  </pic:blipFill>
+                  <pic:spPr bwMode="auto">
+                    <a:xfrm>
+                      <a:off x="0" y="0"/>
+                      <a:ext cx="7478909" cy="1037404"/>
+                    </a:xfrm>
+                    <a:prstGeom prst="rect">
+                      <a:avLst/>
+                    </a:prstGeom>
+                    <a:noFill/>
+                  </pic:spPr>
+                </pic:pic>
+              </a:graphicData>
+            </a:graphic>
+          </wp:inline>
+        </w:drawing>
+      </w:r>
+    </w:p>
+    <w:p>
+      <w:pPr>
+        <w:rPr>
+          <w:color w:val="000000" w:themeColor="text1"/>
+          <w:sz w:val="24"/>
+          <w:szCs w:val="24"/>
+        </w:rPr>
+      </w:pPr>
+      <w:r>
+        <w:rPr>
+          <w:color w:val="000000" w:themeColor="text1"/>
+          <w:sz w:val="24"/>
+          <w:szCs w:val="24"/>
+        </w:rPr>
+        <w:t xml:space="preserve">78- Para melhorar a largura do mapa em nossa página no </w:t>
+      </w:r>
+      <w:proofErr w:type="spellStart"/>
+      <w:r>
+        <w:rPr>
+          <w:color w:val="000000" w:themeColor="text1"/>
+          <w:sz w:val="24"/>
+          <w:szCs w:val="24"/>
+        </w:rPr>
+        <w:t>html</w:t>
+      </w:r>
+      <w:proofErr w:type="spellEnd"/>
+      <w:r>
+        <w:rPr>
+          <w:color w:val="000000" w:themeColor="text1"/>
+          <w:sz w:val="24"/>
+          <w:szCs w:val="24"/>
+        </w:rPr>
+        <w:t xml:space="preserve"> na </w:t>
+      </w:r>
+      <w:proofErr w:type="spellStart"/>
+      <w:r>
+        <w:rPr>
+          <w:color w:val="000000" w:themeColor="text1"/>
+          <w:sz w:val="24"/>
+          <w:szCs w:val="24"/>
+        </w:rPr>
+        <w:t>tag</w:t>
+      </w:r>
+      <w:proofErr w:type="spellEnd"/>
+      <w:r>
+        <w:rPr>
+          <w:color w:val="000000" w:themeColor="text1"/>
+          <w:sz w:val="24"/>
+          <w:szCs w:val="24"/>
+        </w:rPr>
+        <w:t xml:space="preserve"> </w:t>
+      </w:r>
+      <w:proofErr w:type="spellStart"/>
+      <w:r>
+        <w:rPr>
+          <w:color w:val="000000" w:themeColor="text1"/>
+          <w:sz w:val="24"/>
+          <w:szCs w:val="24"/>
+        </w:rPr>
+        <w:t>iframe</w:t>
+      </w:r>
+      <w:proofErr w:type="spellEnd"/>
+      <w:r>
+        <w:rPr>
+          <w:color w:val="000000" w:themeColor="text1"/>
+          <w:sz w:val="24"/>
+          <w:szCs w:val="24"/>
+        </w:rPr>
+        <w:t xml:space="preserve"> no </w:t>
+      </w:r>
+      <w:proofErr w:type="spellStart"/>
+      <w:r>
+        <w:rPr>
+          <w:color w:val="000000" w:themeColor="text1"/>
+          <w:sz w:val="24"/>
+          <w:szCs w:val="24"/>
+        </w:rPr>
+        <w:t>witdth</w:t>
+      </w:r>
+      <w:proofErr w:type="spellEnd"/>
+      <w:r>
+        <w:rPr>
+          <w:color w:val="000000" w:themeColor="text1"/>
+          <w:sz w:val="24"/>
+          <w:szCs w:val="24"/>
+        </w:rPr>
+        <w:t xml:space="preserve"> colocamos 100% e na altura 300 conforme imagem acima.</w:t>
+      </w:r>
+    </w:p>
+    <w:p>
+      <w:pPr>
+        <w:rPr>
+          <w:color w:val="000000" w:themeColor="text1"/>
+          <w:sz w:val="24"/>
+          <w:szCs w:val="24"/>
+        </w:rPr>
+      </w:pPr>
+      <w:r>
+        <w:rPr>
+          <w:color w:val="000000" w:themeColor="text1"/>
+          <w:sz w:val="24"/>
+          <w:szCs w:val="24"/>
+        </w:rPr>
+        <w:t xml:space="preserve">79- No </w:t>
+      </w:r>
+      <w:proofErr w:type="spellStart"/>
+      <w:r>
+        <w:rPr>
+          <w:color w:val="000000" w:themeColor="text1"/>
+          <w:sz w:val="24"/>
+          <w:szCs w:val="24"/>
+        </w:rPr>
+        <w:t>css</w:t>
+      </w:r>
+      <w:proofErr w:type="spellEnd"/>
+      <w:r>
+        <w:rPr>
+          <w:color w:val="000000" w:themeColor="text1"/>
+          <w:sz w:val="24"/>
+          <w:szCs w:val="24"/>
+        </w:rPr>
+        <w:t xml:space="preserve"> na </w:t>
+      </w:r>
+      <w:proofErr w:type="spellStart"/>
+      <w:r>
+        <w:rPr>
+          <w:color w:val="000000" w:themeColor="text1"/>
+          <w:sz w:val="24"/>
+          <w:szCs w:val="24"/>
+        </w:rPr>
+        <w:t>class</w:t>
+      </w:r>
+      <w:proofErr w:type="spellEnd"/>
+      <w:r>
+        <w:rPr>
+          <w:color w:val="000000" w:themeColor="text1"/>
+          <w:sz w:val="24"/>
+          <w:szCs w:val="24"/>
+        </w:rPr>
+        <w:t xml:space="preserve"> mapa colocamos um espaço </w:t>
+      </w:r>
+      <w:proofErr w:type="spellStart"/>
+      <w:r>
+        <w:rPr>
+          <w:color w:val="000000" w:themeColor="text1"/>
+          <w:sz w:val="24"/>
+          <w:szCs w:val="24"/>
+        </w:rPr>
+        <w:t>inter</w:t>
+      </w:r>
+      <w:proofErr w:type="spellEnd"/>
+      <w:r>
+        <w:rPr>
+          <w:color w:val="000000" w:themeColor="text1"/>
+          <w:sz w:val="24"/>
+          <w:szCs w:val="24"/>
+        </w:rPr>
+        <w:t xml:space="preserve"> tanto para cima tanto para baixo e demos um espaço externo no parágrafo para baixo conforme imagem de código.</w:t>
+      </w:r>
+    </w:p>
+    <w:p>
+      <w:pPr>
+        <w:rPr>
+          <w:color w:val="000000" w:themeColor="text1"/>
+          <w:sz w:val="24"/>
+          <w:szCs w:val="24"/>
+        </w:rPr>
+      </w:pPr>
+      <w:r>
+        <w:rPr>
+          <w:noProof/>
+          <w:color w:val="000000" w:themeColor="text1"/>
+          <w:sz w:val="24"/>
+          <w:szCs w:val="24"/>
+        </w:rPr>
+        <w:drawing>
+          <wp:inline distT="0" distB="0" distL="0" distR="0" wp14:anchorId="5ED5CFAE">
+            <wp:extent cx="1895475" cy="1609725"/>
+            <wp:effectExtent l="0" t="0" r="9525" b="9525"/>
+            <wp:docPr id="134" name="Imagem 134"/>
+            <wp:cNvGraphicFramePr>
+              <a:graphicFrameLocks xmlns:a="http://schemas.openxmlformats.org/drawingml/2006/main" noChangeAspect="1"/>
+            </wp:cNvGraphicFramePr>
+            <a:graphic xmlns:a="http://schemas.openxmlformats.org/drawingml/2006/main">
+              <a:graphicData uri="http://schemas.openxmlformats.org/drawingml/2006/picture">
+                <pic:pic xmlns:pic="http://schemas.openxmlformats.org/drawingml/2006/picture">
+                  <pic:nvPicPr>
+                    <pic:cNvPr id="0" name="Picture 9"/>
+                    <pic:cNvPicPr>
+                      <a:picLocks noChangeAspect="1" noChangeArrowheads="1"/>
+                    </pic:cNvPicPr>
+                  </pic:nvPicPr>
+                  <pic:blipFill>
+                    <a:blip r:embed="rId123">
+                      <a:extLst>
+                        <a:ext uri="{28A0092B-C50C-407E-A947-70E740481C1C}">
+                          <a14:useLocalDpi xmlns:a14="http://schemas.microsoft.com/office/drawing/2010/main" val="0"/>
+                        </a:ext>
+                      </a:extLst>
+                    </a:blip>
+                    <a:srcRect/>
+                    <a:stretch>
+                      <a:fillRect/>
+                    </a:stretch>
+                  </pic:blipFill>
+                  <pic:spPr bwMode="auto">
+                    <a:xfrm>
+                      <a:off x="0" y="0"/>
+                      <a:ext cx="1895475" cy="1609725"/>
+                    </a:xfrm>
+                    <a:prstGeom prst="rect">
+                      <a:avLst/>
+                    </a:prstGeom>
+                    <a:noFill/>
+                  </pic:spPr>
+                </pic:pic>
+              </a:graphicData>
+            </a:graphic>
+          </wp:inline>
+        </w:drawing>
+      </w:r>
+    </w:p>
+    <w:p>
+      <w:pPr>
+        <w:rPr>
+          <w:color w:val="000000" w:themeColor="text1"/>
+          <w:sz w:val="24"/>
+          <w:szCs w:val="24"/>
+        </w:rPr>
+      </w:pPr>
+      <w:r>
+        <w:rPr>
+          <w:color w:val="000000" w:themeColor="text1"/>
+          <w:sz w:val="24"/>
+          <w:szCs w:val="24"/>
+        </w:rPr>
+        <w:t xml:space="preserve">80- </w:t>
+      </w:r>
       <w:bookmarkStart w:id="0" w:name="_GoBack"/>
       <w:bookmarkEnd w:id="0"/>
+    </w:p>
+    <w:p>
+      <w:pPr>
+        <w:rPr>
+          <w:color w:val="000000" w:themeColor="text1"/>
+          <w:sz w:val="24"/>
+          <w:szCs w:val="24"/>
+        </w:rPr>
+      </w:pPr>
+    </w:p>
+    <w:p>
+      <w:pPr>
+        <w:rPr>
+          <w:color w:val="000000" w:themeColor="text1"/>
+          <w:sz w:val="24"/>
+          <w:szCs w:val="24"/>
+        </w:rPr>
+      </w:pPr>
     </w:p>
     <w:p>
       <w:pPr>
@@ -16053,7 +17128,7 @@
 </file>
 
 <file path=customXml/itemProps1.xml><?xml version="1.0" encoding="utf-8"?>
-<ds:datastoreItem xmlns:ds="http://schemas.openxmlformats.org/officeDocument/2006/customXml" ds:itemID="{37ABC037-6461-424B-8CD0-97CF91E27DF0}">
+<ds:datastoreItem xmlns:ds="http://schemas.openxmlformats.org/officeDocument/2006/customXml" ds:itemID="{50959004-6157-4586-8EF1-4B8DC830FD81}">
   <ds:schemaRefs>
     <ds:schemaRef ds:uri="http://schemas.openxmlformats.org/officeDocument/2006/bibliography"/>
   </ds:schemaRefs>

</xml_diff>

<commit_message>
atualização da aula dia 06/10
</commit_message>
<xml_diff>
--- a/Apostila/Apostila Space For Men.docx
+++ b/Apostila/Apostila Space For Men.docx
@@ -14155,6 +14155,7 @@
       </w:pPr>
       <w:r>
         <w:rPr>
+          <w:noProof/>
           <w:color w:val="000000" w:themeColor="text1"/>
           <w:sz w:val="24"/>
           <w:szCs w:val="24"/>
@@ -15152,8 +15153,1105 @@
         </w:rPr>
         <w:t xml:space="preserve">80- </w:t>
       </w:r>
+      <w:r>
+        <w:rPr>
+          <w:color w:val="000000" w:themeColor="text1"/>
+          <w:sz w:val="24"/>
+          <w:szCs w:val="24"/>
+        </w:rPr>
+        <w:t>Adi</w:t>
+      </w:r>
+      <w:r>
+        <w:rPr>
+          <w:color w:val="000000" w:themeColor="text1"/>
+          <w:sz w:val="24"/>
+          <w:szCs w:val="24"/>
+        </w:rPr>
+        <w:t>cionamos vídeo de YouTube em nosso site.</w:t>
+      </w:r>
+    </w:p>
+    <w:p>
+      <w:pPr>
+        <w:pStyle w:val="PargrafodaLista"/>
+        <w:numPr>
+          <w:ilvl w:val="0"/>
+          <w:numId w:val="11"/>
+        </w:numPr>
+        <w:rPr>
+          <w:color w:val="000000" w:themeColor="text1"/>
+          <w:sz w:val="24"/>
+          <w:szCs w:val="24"/>
+        </w:rPr>
+      </w:pPr>
+      <w:r>
+        <w:rPr>
+          <w:color w:val="000000" w:themeColor="text1"/>
+          <w:sz w:val="24"/>
+          <w:szCs w:val="24"/>
+        </w:rPr>
+        <w:t>Entra no site do YouTube e escolhe o vídeo desejado.</w:t>
+      </w:r>
+    </w:p>
+    <w:p>
+      <w:pPr>
+        <w:pStyle w:val="PargrafodaLista"/>
+        <w:numPr>
+          <w:ilvl w:val="0"/>
+          <w:numId w:val="11"/>
+        </w:numPr>
+        <w:rPr>
+          <w:color w:val="000000" w:themeColor="text1"/>
+          <w:sz w:val="24"/>
+          <w:szCs w:val="24"/>
+        </w:rPr>
+      </w:pPr>
+      <w:r>
+        <w:rPr>
+          <w:color w:val="000000" w:themeColor="text1"/>
+          <w:sz w:val="24"/>
+          <w:szCs w:val="24"/>
+        </w:rPr>
+        <w:t>Logo a baixo do vídeo clicar no botão compartilhar.</w:t>
+      </w:r>
+    </w:p>
+    <w:p>
+      <w:pPr>
+        <w:pStyle w:val="PargrafodaLista"/>
+        <w:numPr>
+          <w:ilvl w:val="0"/>
+          <w:numId w:val="11"/>
+        </w:numPr>
+        <w:rPr>
+          <w:color w:val="000000" w:themeColor="text1"/>
+          <w:sz w:val="24"/>
+          <w:szCs w:val="24"/>
+        </w:rPr>
+      </w:pPr>
+      <w:r>
+        <w:rPr>
+          <w:color w:val="000000" w:themeColor="text1"/>
+          <w:sz w:val="24"/>
+          <w:szCs w:val="24"/>
+        </w:rPr>
+        <w:t>Escolhe a opção incorporar.</w:t>
+      </w:r>
+    </w:p>
+    <w:p>
+      <w:pPr>
+        <w:pStyle w:val="PargrafodaLista"/>
+        <w:numPr>
+          <w:ilvl w:val="0"/>
+          <w:numId w:val="11"/>
+        </w:numPr>
+        <w:rPr>
+          <w:color w:val="000000" w:themeColor="text1"/>
+          <w:sz w:val="24"/>
+          <w:szCs w:val="24"/>
+        </w:rPr>
+      </w:pPr>
+      <w:r>
+        <w:rPr>
+          <w:color w:val="000000" w:themeColor="text1"/>
+          <w:sz w:val="24"/>
+          <w:szCs w:val="24"/>
+        </w:rPr>
+        <w:t xml:space="preserve">Copiar o link que surgiu e colar na página </w:t>
+      </w:r>
+      <w:proofErr w:type="spellStart"/>
+      <w:r>
+        <w:rPr>
+          <w:color w:val="000000" w:themeColor="text1"/>
+          <w:sz w:val="24"/>
+          <w:szCs w:val="24"/>
+        </w:rPr>
+        <w:t>html</w:t>
+      </w:r>
+      <w:proofErr w:type="spellEnd"/>
+      <w:r>
+        <w:rPr>
+          <w:color w:val="000000" w:themeColor="text1"/>
+          <w:sz w:val="24"/>
+          <w:szCs w:val="24"/>
+        </w:rPr>
+        <w:t xml:space="preserve"> que estamos trabalhando.</w:t>
+      </w:r>
+    </w:p>
+    <w:p>
+      <w:pPr>
+        <w:pStyle w:val="PargrafodaLista"/>
+        <w:numPr>
+          <w:ilvl w:val="0"/>
+          <w:numId w:val="11"/>
+        </w:numPr>
+        <w:rPr>
+          <w:color w:val="000000" w:themeColor="text1"/>
+          <w:sz w:val="24"/>
+          <w:szCs w:val="24"/>
+        </w:rPr>
+      </w:pPr>
+      <w:r>
+        <w:rPr>
+          <w:color w:val="000000" w:themeColor="text1"/>
+          <w:sz w:val="24"/>
+          <w:szCs w:val="24"/>
+        </w:rPr>
+        <w:t xml:space="preserve">Criamos uma </w:t>
+      </w:r>
+      <w:proofErr w:type="spellStart"/>
+      <w:r>
+        <w:rPr>
+          <w:color w:val="000000" w:themeColor="text1"/>
+          <w:sz w:val="24"/>
+          <w:szCs w:val="24"/>
+        </w:rPr>
+        <w:t>div</w:t>
+      </w:r>
+      <w:proofErr w:type="spellEnd"/>
+      <w:r>
+        <w:rPr>
+          <w:color w:val="000000" w:themeColor="text1"/>
+          <w:sz w:val="24"/>
+          <w:szCs w:val="24"/>
+        </w:rPr>
+        <w:t xml:space="preserve"> para trabalhar com o vídeo.</w:t>
+      </w:r>
+    </w:p>
+    <w:p>
+      <w:pPr>
+        <w:rPr>
+          <w:color w:val="000000" w:themeColor="text1"/>
+          <w:sz w:val="24"/>
+          <w:szCs w:val="24"/>
+        </w:rPr>
+      </w:pPr>
+      <w:r>
+        <w:rPr>
+          <w:color w:val="000000" w:themeColor="text1"/>
+          <w:sz w:val="24"/>
+          <w:szCs w:val="24"/>
+        </w:rPr>
+        <w:drawing>
+          <wp:inline distT="0" distB="0" distL="0" distR="0" wp14:anchorId="502A9FB7" wp14:editId="7D6E3B28">
+            <wp:extent cx="10126488" cy="400106"/>
+            <wp:effectExtent l="0" t="0" r="0" b="0"/>
+            <wp:docPr id="122" name="Imagem 122"/>
+            <wp:cNvGraphicFramePr>
+              <a:graphicFrameLocks xmlns:a="http://schemas.openxmlformats.org/drawingml/2006/main" noChangeAspect="1"/>
+            </wp:cNvGraphicFramePr>
+            <a:graphic xmlns:a="http://schemas.openxmlformats.org/drawingml/2006/main">
+              <a:graphicData uri="http://schemas.openxmlformats.org/drawingml/2006/picture">
+                <pic:pic xmlns:pic="http://schemas.openxmlformats.org/drawingml/2006/picture">
+                  <pic:nvPicPr>
+                    <pic:cNvPr id="1" name=""/>
+                    <pic:cNvPicPr/>
+                  </pic:nvPicPr>
+                  <pic:blipFill>
+                    <a:blip r:embed="rId124"/>
+                    <a:stretch>
+                      <a:fillRect/>
+                    </a:stretch>
+                  </pic:blipFill>
+                  <pic:spPr>
+                    <a:xfrm>
+                      <a:off x="0" y="0"/>
+                      <a:ext cx="10126488" cy="400106"/>
+                    </a:xfrm>
+                    <a:prstGeom prst="rect">
+                      <a:avLst/>
+                    </a:prstGeom>
+                  </pic:spPr>
+                </pic:pic>
+              </a:graphicData>
+            </a:graphic>
+          </wp:inline>
+        </w:drawing>
+      </w:r>
+    </w:p>
+    <w:p>
+      <w:pPr>
+        <w:rPr>
+          <w:color w:val="000000" w:themeColor="text1"/>
+          <w:sz w:val="24"/>
+          <w:szCs w:val="24"/>
+        </w:rPr>
+      </w:pPr>
+      <w:r>
+        <w:rPr>
+          <w:color w:val="000000" w:themeColor="text1"/>
+          <w:sz w:val="24"/>
+          <w:szCs w:val="24"/>
+        </w:rPr>
+        <w:t>81-</w:t>
+      </w:r>
+      <w:r>
+        <w:rPr>
+          <w:color w:val="000000" w:themeColor="text1"/>
+          <w:sz w:val="24"/>
+          <w:szCs w:val="24"/>
+        </w:rPr>
+        <w:t xml:space="preserve"> Adicionamos uma largura na </w:t>
+      </w:r>
+      <w:proofErr w:type="spellStart"/>
+      <w:r>
+        <w:rPr>
+          <w:color w:val="000000" w:themeColor="text1"/>
+          <w:sz w:val="24"/>
+          <w:szCs w:val="24"/>
+        </w:rPr>
+        <w:t>div</w:t>
+      </w:r>
+      <w:proofErr w:type="spellEnd"/>
+      <w:r>
+        <w:rPr>
+          <w:color w:val="000000" w:themeColor="text1"/>
+          <w:sz w:val="24"/>
+          <w:szCs w:val="24"/>
+        </w:rPr>
+        <w:t xml:space="preserve"> vídeo de 560px e centralizamos usando o espaço externo.</w:t>
+      </w:r>
+    </w:p>
+    <w:p>
+      <w:pPr>
+        <w:rPr>
+          <w:color w:val="000000" w:themeColor="text1"/>
+          <w:sz w:val="24"/>
+          <w:szCs w:val="24"/>
+        </w:rPr>
+      </w:pPr>
+      <w:r>
+        <w:rPr>
+          <w:noProof/>
+          <w:color w:val="000000" w:themeColor="text1"/>
+          <w:sz w:val="24"/>
+          <w:szCs w:val="24"/>
+        </w:rPr>
+        <w:drawing>
+          <wp:inline distT="0" distB="0" distL="0" distR="0" wp14:anchorId="5254D184">
+            <wp:extent cx="1552575" cy="733425"/>
+            <wp:effectExtent l="0" t="0" r="9525" b="9525"/>
+            <wp:docPr id="127" name="Imagem 127"/>
+            <wp:cNvGraphicFramePr>
+              <a:graphicFrameLocks xmlns:a="http://schemas.openxmlformats.org/drawingml/2006/main" noChangeAspect="1"/>
+            </wp:cNvGraphicFramePr>
+            <a:graphic xmlns:a="http://schemas.openxmlformats.org/drawingml/2006/main">
+              <a:graphicData uri="http://schemas.openxmlformats.org/drawingml/2006/picture">
+                <pic:pic xmlns:pic="http://schemas.openxmlformats.org/drawingml/2006/picture">
+                  <pic:nvPicPr>
+                    <pic:cNvPr id="0" name="Picture 2"/>
+                    <pic:cNvPicPr>
+                      <a:picLocks noChangeAspect="1" noChangeArrowheads="1"/>
+                    </pic:cNvPicPr>
+                  </pic:nvPicPr>
+                  <pic:blipFill>
+                    <a:blip r:embed="rId125">
+                      <a:extLst>
+                        <a:ext uri="{28A0092B-C50C-407E-A947-70E740481C1C}">
+                          <a14:useLocalDpi xmlns:a14="http://schemas.microsoft.com/office/drawing/2010/main" val="0"/>
+                        </a:ext>
+                      </a:extLst>
+                    </a:blip>
+                    <a:srcRect/>
+                    <a:stretch>
+                      <a:fillRect/>
+                    </a:stretch>
+                  </pic:blipFill>
+                  <pic:spPr bwMode="auto">
+                    <a:xfrm>
+                      <a:off x="0" y="0"/>
+                      <a:ext cx="1552575" cy="733425"/>
+                    </a:xfrm>
+                    <a:prstGeom prst="rect">
+                      <a:avLst/>
+                    </a:prstGeom>
+                    <a:noFill/>
+                  </pic:spPr>
+                </pic:pic>
+              </a:graphicData>
+            </a:graphic>
+          </wp:inline>
+        </w:drawing>
+      </w:r>
+    </w:p>
+    <w:p>
+      <w:pPr>
+        <w:rPr>
+          <w:color w:val="000000" w:themeColor="text1"/>
+          <w:sz w:val="24"/>
+          <w:szCs w:val="24"/>
+        </w:rPr>
+      </w:pPr>
+      <w:r>
+        <w:rPr>
+          <w:color w:val="000000" w:themeColor="text1"/>
+          <w:sz w:val="24"/>
+          <w:szCs w:val="24"/>
+        </w:rPr>
+        <w:t xml:space="preserve">82- Para trabalhar </w:t>
+      </w:r>
+      <w:r>
+        <w:rPr>
+          <w:color w:val="000000" w:themeColor="text1"/>
+          <w:sz w:val="24"/>
+          <w:szCs w:val="24"/>
+        </w:rPr>
+        <w:t xml:space="preserve">com a lista e a imagem benefícios criamos uma </w:t>
+      </w:r>
+      <w:proofErr w:type="spellStart"/>
+      <w:r>
+        <w:rPr>
+          <w:color w:val="000000" w:themeColor="text1"/>
+          <w:sz w:val="24"/>
+          <w:szCs w:val="24"/>
+        </w:rPr>
+        <w:t>div</w:t>
+      </w:r>
+      <w:proofErr w:type="spellEnd"/>
+      <w:r>
+        <w:rPr>
+          <w:color w:val="000000" w:themeColor="text1"/>
+          <w:sz w:val="24"/>
+          <w:szCs w:val="24"/>
+        </w:rPr>
+        <w:t xml:space="preserve"> para envolve-los conforme o código, e na lista adicionamos uma </w:t>
+      </w:r>
+      <w:proofErr w:type="spellStart"/>
+      <w:r>
+        <w:rPr>
+          <w:color w:val="000000" w:themeColor="text1"/>
+          <w:sz w:val="24"/>
+          <w:szCs w:val="24"/>
+        </w:rPr>
+        <w:t>class</w:t>
+      </w:r>
+      <w:proofErr w:type="spellEnd"/>
+      <w:r>
+        <w:rPr>
+          <w:color w:val="000000" w:themeColor="text1"/>
+          <w:sz w:val="24"/>
+          <w:szCs w:val="24"/>
+        </w:rPr>
+        <w:t xml:space="preserve"> chamada lista-</w:t>
+      </w:r>
+      <w:proofErr w:type="spellStart"/>
+      <w:r>
+        <w:rPr>
+          <w:color w:val="000000" w:themeColor="text1"/>
+          <w:sz w:val="24"/>
+          <w:szCs w:val="24"/>
+        </w:rPr>
+        <w:t>beneficios</w:t>
+      </w:r>
+      <w:proofErr w:type="spellEnd"/>
+      <w:r>
+        <w:rPr>
+          <w:color w:val="000000" w:themeColor="text1"/>
+          <w:sz w:val="24"/>
+          <w:szCs w:val="24"/>
+        </w:rPr>
+        <w:t>.</w:t>
+      </w:r>
+    </w:p>
+    <w:p>
+      <w:pPr>
+        <w:rPr>
+          <w:color w:val="000000" w:themeColor="text1"/>
+          <w:sz w:val="24"/>
+          <w:szCs w:val="24"/>
+        </w:rPr>
+      </w:pPr>
+      <w:r>
+        <w:rPr>
+          <w:color w:val="000000" w:themeColor="text1"/>
+          <w:sz w:val="24"/>
+          <w:szCs w:val="24"/>
+        </w:rPr>
+        <w:drawing>
+          <wp:inline distT="0" distB="0" distL="0" distR="0" wp14:anchorId="72857BC2" wp14:editId="59F10A10">
+            <wp:extent cx="4600575" cy="1843408"/>
+            <wp:effectExtent l="0" t="0" r="0" b="4445"/>
+            <wp:docPr id="135" name="Imagem 135"/>
+            <wp:cNvGraphicFramePr>
+              <a:graphicFrameLocks xmlns:a="http://schemas.openxmlformats.org/drawingml/2006/main" noChangeAspect="1"/>
+            </wp:cNvGraphicFramePr>
+            <a:graphic xmlns:a="http://schemas.openxmlformats.org/drawingml/2006/main">
+              <a:graphicData uri="http://schemas.openxmlformats.org/drawingml/2006/picture">
+                <pic:pic xmlns:pic="http://schemas.openxmlformats.org/drawingml/2006/picture">
+                  <pic:nvPicPr>
+                    <pic:cNvPr id="1" name=""/>
+                    <pic:cNvPicPr/>
+                  </pic:nvPicPr>
+                  <pic:blipFill>
+                    <a:blip r:embed="rId126"/>
+                    <a:stretch>
+                      <a:fillRect/>
+                    </a:stretch>
+                  </pic:blipFill>
+                  <pic:spPr>
+                    <a:xfrm>
+                      <a:off x="0" y="0"/>
+                      <a:ext cx="4619864" cy="1851137"/>
+                    </a:xfrm>
+                    <a:prstGeom prst="rect">
+                      <a:avLst/>
+                    </a:prstGeom>
+                  </pic:spPr>
+                </pic:pic>
+              </a:graphicData>
+            </a:graphic>
+          </wp:inline>
+        </w:drawing>
+      </w:r>
+    </w:p>
+    <w:p>
+      <w:pPr>
+        <w:rPr>
+          <w:color w:val="000000" w:themeColor="text1"/>
+          <w:sz w:val="24"/>
+          <w:szCs w:val="24"/>
+        </w:rPr>
+      </w:pPr>
+      <w:r>
+        <w:rPr>
+          <w:color w:val="000000" w:themeColor="text1"/>
+          <w:sz w:val="24"/>
+          <w:szCs w:val="24"/>
+        </w:rPr>
+        <w:t xml:space="preserve">83- No </w:t>
+      </w:r>
+      <w:proofErr w:type="spellStart"/>
+      <w:r>
+        <w:rPr>
+          <w:color w:val="000000" w:themeColor="text1"/>
+          <w:sz w:val="24"/>
+          <w:szCs w:val="24"/>
+        </w:rPr>
+        <w:t>css</w:t>
+      </w:r>
+      <w:proofErr w:type="spellEnd"/>
+      <w:r>
+        <w:rPr>
+          <w:color w:val="000000" w:themeColor="text1"/>
+          <w:sz w:val="24"/>
+          <w:szCs w:val="24"/>
+        </w:rPr>
+        <w:t xml:space="preserve"> demos uma largura para a </w:t>
+      </w:r>
+      <w:proofErr w:type="spellStart"/>
+      <w:r>
+        <w:rPr>
+          <w:color w:val="000000" w:themeColor="text1"/>
+          <w:sz w:val="24"/>
+          <w:szCs w:val="24"/>
+        </w:rPr>
+        <w:t>div</w:t>
+      </w:r>
+      <w:proofErr w:type="spellEnd"/>
+      <w:r>
+        <w:rPr>
+          <w:color w:val="000000" w:themeColor="text1"/>
+          <w:sz w:val="24"/>
+          <w:szCs w:val="24"/>
+        </w:rPr>
+        <w:t xml:space="preserve"> conteúdo-</w:t>
+      </w:r>
+      <w:proofErr w:type="spellStart"/>
+      <w:r>
+        <w:rPr>
+          <w:color w:val="000000" w:themeColor="text1"/>
+          <w:sz w:val="24"/>
+          <w:szCs w:val="24"/>
+        </w:rPr>
+        <w:t>beneficios</w:t>
+      </w:r>
+      <w:proofErr w:type="spellEnd"/>
+      <w:r>
+        <w:rPr>
+          <w:color w:val="000000" w:themeColor="text1"/>
+          <w:sz w:val="24"/>
+          <w:szCs w:val="24"/>
+        </w:rPr>
+        <w:t xml:space="preserve"> e centralizamos usando </w:t>
+      </w:r>
+      <w:proofErr w:type="spellStart"/>
+      <w:r>
+        <w:rPr>
+          <w:color w:val="000000" w:themeColor="text1"/>
+          <w:sz w:val="24"/>
+          <w:szCs w:val="24"/>
+        </w:rPr>
+        <w:t>margin</w:t>
+      </w:r>
+      <w:proofErr w:type="spellEnd"/>
+      <w:r>
+        <w:rPr>
+          <w:color w:val="000000" w:themeColor="text1"/>
+          <w:sz w:val="24"/>
+          <w:szCs w:val="24"/>
+        </w:rPr>
+        <w:t xml:space="preserve"> 0 auto.</w:t>
+      </w:r>
+    </w:p>
+    <w:p>
+      <w:pPr>
+        <w:rPr>
+          <w:color w:val="000000" w:themeColor="text1"/>
+          <w:sz w:val="24"/>
+          <w:szCs w:val="24"/>
+        </w:rPr>
+      </w:pPr>
+      <w:r>
+        <w:rPr>
+          <w:noProof/>
+          <w:color w:val="000000" w:themeColor="text1"/>
+          <w:sz w:val="24"/>
+          <w:szCs w:val="24"/>
+        </w:rPr>
+        <w:drawing>
+          <wp:inline distT="0" distB="0" distL="0" distR="0" wp14:anchorId="3B679872">
+            <wp:extent cx="1590675" cy="771525"/>
+            <wp:effectExtent l="0" t="0" r="9525" b="9525"/>
+            <wp:docPr id="136" name="Imagem 136"/>
+            <wp:cNvGraphicFramePr>
+              <a:graphicFrameLocks xmlns:a="http://schemas.openxmlformats.org/drawingml/2006/main" noChangeAspect="1"/>
+            </wp:cNvGraphicFramePr>
+            <a:graphic xmlns:a="http://schemas.openxmlformats.org/drawingml/2006/main">
+              <a:graphicData uri="http://schemas.openxmlformats.org/drawingml/2006/picture">
+                <pic:pic xmlns:pic="http://schemas.openxmlformats.org/drawingml/2006/picture">
+                  <pic:nvPicPr>
+                    <pic:cNvPr id="0" name="Picture 3"/>
+                    <pic:cNvPicPr>
+                      <a:picLocks noChangeAspect="1" noChangeArrowheads="1"/>
+                    </pic:cNvPicPr>
+                  </pic:nvPicPr>
+                  <pic:blipFill>
+                    <a:blip r:embed="rId127">
+                      <a:extLst>
+                        <a:ext uri="{28A0092B-C50C-407E-A947-70E740481C1C}">
+                          <a14:useLocalDpi xmlns:a14="http://schemas.microsoft.com/office/drawing/2010/main" val="0"/>
+                        </a:ext>
+                      </a:extLst>
+                    </a:blip>
+                    <a:srcRect/>
+                    <a:stretch>
+                      <a:fillRect/>
+                    </a:stretch>
+                  </pic:blipFill>
+                  <pic:spPr bwMode="auto">
+                    <a:xfrm>
+                      <a:off x="0" y="0"/>
+                      <a:ext cx="1590675" cy="771525"/>
+                    </a:xfrm>
+                    <a:prstGeom prst="rect">
+                      <a:avLst/>
+                    </a:prstGeom>
+                    <a:noFill/>
+                  </pic:spPr>
+                </pic:pic>
+              </a:graphicData>
+            </a:graphic>
+          </wp:inline>
+        </w:drawing>
+      </w:r>
+    </w:p>
+    <w:p>
+      <w:pPr>
+        <w:rPr>
+          <w:color w:val="000000" w:themeColor="text1"/>
+          <w:sz w:val="24"/>
+          <w:szCs w:val="24"/>
+        </w:rPr>
+      </w:pPr>
+      <w:r>
+        <w:rPr>
+          <w:color w:val="000000" w:themeColor="text1"/>
+          <w:sz w:val="24"/>
+          <w:szCs w:val="24"/>
+        </w:rPr>
+        <w:t>84- E na lista-</w:t>
+      </w:r>
+      <w:proofErr w:type="spellStart"/>
+      <w:r>
+        <w:rPr>
+          <w:color w:val="000000" w:themeColor="text1"/>
+          <w:sz w:val="24"/>
+          <w:szCs w:val="24"/>
+        </w:rPr>
+        <w:t>beneficios</w:t>
+      </w:r>
+      <w:proofErr w:type="spellEnd"/>
+      <w:r>
+        <w:rPr>
+          <w:color w:val="000000" w:themeColor="text1"/>
+          <w:sz w:val="24"/>
+          <w:szCs w:val="24"/>
+        </w:rPr>
+        <w:t xml:space="preserve"> demos uma largura de 40% para ficar ao lado da imagem.</w:t>
+      </w:r>
+    </w:p>
+    <w:p>
+      <w:pPr>
+        <w:rPr>
+          <w:color w:val="000000" w:themeColor="text1"/>
+          <w:sz w:val="24"/>
+          <w:szCs w:val="24"/>
+        </w:rPr>
+      </w:pPr>
+      <w:r>
+        <w:rPr>
+          <w:noProof/>
+          <w:color w:val="000000" w:themeColor="text1"/>
+          <w:sz w:val="24"/>
+          <w:szCs w:val="24"/>
+        </w:rPr>
+        <w:drawing>
+          <wp:inline distT="0" distB="0" distL="0" distR="0" wp14:anchorId="3C65E8CC">
+            <wp:extent cx="1390650" cy="581025"/>
+            <wp:effectExtent l="0" t="0" r="0" b="9525"/>
+            <wp:docPr id="137" name="Imagem 137"/>
+            <wp:cNvGraphicFramePr>
+              <a:graphicFrameLocks xmlns:a="http://schemas.openxmlformats.org/drawingml/2006/main" noChangeAspect="1"/>
+            </wp:cNvGraphicFramePr>
+            <a:graphic xmlns:a="http://schemas.openxmlformats.org/drawingml/2006/main">
+              <a:graphicData uri="http://schemas.openxmlformats.org/drawingml/2006/picture">
+                <pic:pic xmlns:pic="http://schemas.openxmlformats.org/drawingml/2006/picture">
+                  <pic:nvPicPr>
+                    <pic:cNvPr id="0" name="Picture 4"/>
+                    <pic:cNvPicPr>
+                      <a:picLocks noChangeAspect="1" noChangeArrowheads="1"/>
+                    </pic:cNvPicPr>
+                  </pic:nvPicPr>
+                  <pic:blipFill>
+                    <a:blip r:embed="rId128">
+                      <a:extLst>
+                        <a:ext uri="{28A0092B-C50C-407E-A947-70E740481C1C}">
+                          <a14:useLocalDpi xmlns:a14="http://schemas.microsoft.com/office/drawing/2010/main" val="0"/>
+                        </a:ext>
+                      </a:extLst>
+                    </a:blip>
+                    <a:srcRect/>
+                    <a:stretch>
+                      <a:fillRect/>
+                    </a:stretch>
+                  </pic:blipFill>
+                  <pic:spPr bwMode="auto">
+                    <a:xfrm>
+                      <a:off x="0" y="0"/>
+                      <a:ext cx="1390650" cy="581025"/>
+                    </a:xfrm>
+                    <a:prstGeom prst="rect">
+                      <a:avLst/>
+                    </a:prstGeom>
+                    <a:noFill/>
+                  </pic:spPr>
+                </pic:pic>
+              </a:graphicData>
+            </a:graphic>
+          </wp:inline>
+        </w:drawing>
+      </w:r>
+    </w:p>
+    <w:p>
+      <w:pPr>
+        <w:rPr>
+          <w:color w:val="000000" w:themeColor="text1"/>
+          <w:sz w:val="24"/>
+          <w:szCs w:val="24"/>
+        </w:rPr>
+      </w:pPr>
+      <w:r>
+        <w:rPr>
+          <w:color w:val="000000" w:themeColor="text1"/>
+          <w:sz w:val="24"/>
+          <w:szCs w:val="24"/>
+        </w:rPr>
+        <w:t xml:space="preserve">85- </w:t>
+      </w:r>
+      <w:r>
+        <w:rPr>
+          <w:color w:val="000000" w:themeColor="text1"/>
+          <w:sz w:val="24"/>
+          <w:szCs w:val="24"/>
+        </w:rPr>
+        <w:t>Para colocar a imagem ao lado da lista colocamos display</w:t>
+      </w:r>
+      <w:r>
+        <w:rPr>
+          <w:color w:val="000000" w:themeColor="text1"/>
+          <w:sz w:val="24"/>
+          <w:szCs w:val="24"/>
+        </w:rPr>
+        <w:t xml:space="preserve">: </w:t>
+      </w:r>
+      <w:proofErr w:type="spellStart"/>
+      <w:r>
+        <w:rPr>
+          <w:color w:val="000000" w:themeColor="text1"/>
+          <w:sz w:val="24"/>
+          <w:szCs w:val="24"/>
+        </w:rPr>
+        <w:t>inline-block</w:t>
+      </w:r>
+      <w:proofErr w:type="spellEnd"/>
+      <w:r>
+        <w:rPr>
+          <w:color w:val="000000" w:themeColor="text1"/>
+          <w:sz w:val="24"/>
+          <w:szCs w:val="24"/>
+        </w:rPr>
+        <w:t xml:space="preserve"> na lista e observamos que mesmo assim a lista não ficou ao lado da imagem e nessa situação quando temos uma lista que ocupa 40% e uma imagem que ocupa 60% o código no </w:t>
+      </w:r>
+      <w:proofErr w:type="spellStart"/>
+      <w:r>
+        <w:rPr>
+          <w:color w:val="000000" w:themeColor="text1"/>
+          <w:sz w:val="24"/>
+          <w:szCs w:val="24"/>
+        </w:rPr>
+        <w:t>html</w:t>
+      </w:r>
+      <w:proofErr w:type="spellEnd"/>
+      <w:r>
+        <w:rPr>
+          <w:color w:val="000000" w:themeColor="text1"/>
+          <w:sz w:val="24"/>
+          <w:szCs w:val="24"/>
+        </w:rPr>
+        <w:t xml:space="preserve"> conta precisamos colocar um ao lado do outro conforme código.</w:t>
+      </w:r>
+    </w:p>
+    <w:p>
+      <w:pPr>
+        <w:rPr>
+          <w:color w:val="000000" w:themeColor="text1"/>
+          <w:sz w:val="24"/>
+          <w:szCs w:val="24"/>
+        </w:rPr>
+      </w:pPr>
+      <w:r>
+        <w:rPr>
+          <w:noProof/>
+          <w:color w:val="000000" w:themeColor="text1"/>
+          <w:sz w:val="24"/>
+          <w:szCs w:val="24"/>
+        </w:rPr>
+        <w:drawing>
+          <wp:inline distT="0" distB="0" distL="0" distR="0" wp14:anchorId="67B9D322">
+            <wp:extent cx="5010150" cy="1677900"/>
+            <wp:effectExtent l="0" t="0" r="0" b="0"/>
+            <wp:docPr id="138" name="Imagem 138"/>
+            <wp:cNvGraphicFramePr>
+              <a:graphicFrameLocks xmlns:a="http://schemas.openxmlformats.org/drawingml/2006/main" noChangeAspect="1"/>
+            </wp:cNvGraphicFramePr>
+            <a:graphic xmlns:a="http://schemas.openxmlformats.org/drawingml/2006/main">
+              <a:graphicData uri="http://schemas.openxmlformats.org/drawingml/2006/picture">
+                <pic:pic xmlns:pic="http://schemas.openxmlformats.org/drawingml/2006/picture">
+                  <pic:nvPicPr>
+                    <pic:cNvPr id="0" name="Picture 5"/>
+                    <pic:cNvPicPr>
+                      <a:picLocks noChangeAspect="1" noChangeArrowheads="1"/>
+                    </pic:cNvPicPr>
+                  </pic:nvPicPr>
+                  <pic:blipFill>
+                    <a:blip r:embed="rId129">
+                      <a:extLst>
+                        <a:ext uri="{28A0092B-C50C-407E-A947-70E740481C1C}">
+                          <a14:useLocalDpi xmlns:a14="http://schemas.microsoft.com/office/drawing/2010/main" val="0"/>
+                        </a:ext>
+                      </a:extLst>
+                    </a:blip>
+                    <a:srcRect/>
+                    <a:stretch>
+                      <a:fillRect/>
+                    </a:stretch>
+                  </pic:blipFill>
+                  <pic:spPr bwMode="auto">
+                    <a:xfrm>
+                      <a:off x="0" y="0"/>
+                      <a:ext cx="5051344" cy="1691696"/>
+                    </a:xfrm>
+                    <a:prstGeom prst="rect">
+                      <a:avLst/>
+                    </a:prstGeom>
+                    <a:noFill/>
+                  </pic:spPr>
+                </pic:pic>
+              </a:graphicData>
+            </a:graphic>
+          </wp:inline>
+        </w:drawing>
+      </w:r>
+      <w:r>
+        <w:rPr>
+          <w:noProof/>
+          <w:color w:val="000000" w:themeColor="text1"/>
+          <w:sz w:val="24"/>
+          <w:szCs w:val="24"/>
+        </w:rPr>
+        <w:drawing>
+          <wp:inline distT="0" distB="0" distL="0" distR="0" wp14:anchorId="6972A936">
+            <wp:extent cx="1924050" cy="1000125"/>
+            <wp:effectExtent l="0" t="0" r="0" b="9525"/>
+            <wp:docPr id="139" name="Imagem 139"/>
+            <wp:cNvGraphicFramePr>
+              <a:graphicFrameLocks xmlns:a="http://schemas.openxmlformats.org/drawingml/2006/main" noChangeAspect="1"/>
+            </wp:cNvGraphicFramePr>
+            <a:graphic xmlns:a="http://schemas.openxmlformats.org/drawingml/2006/main">
+              <a:graphicData uri="http://schemas.openxmlformats.org/drawingml/2006/picture">
+                <pic:pic xmlns:pic="http://schemas.openxmlformats.org/drawingml/2006/picture">
+                  <pic:nvPicPr>
+                    <pic:cNvPr id="0" name="Picture 6"/>
+                    <pic:cNvPicPr>
+                      <a:picLocks noChangeAspect="1" noChangeArrowheads="1"/>
+                    </pic:cNvPicPr>
+                  </pic:nvPicPr>
+                  <pic:blipFill>
+                    <a:blip r:embed="rId130">
+                      <a:extLst>
+                        <a:ext uri="{28A0092B-C50C-407E-A947-70E740481C1C}">
+                          <a14:useLocalDpi xmlns:a14="http://schemas.microsoft.com/office/drawing/2010/main" val="0"/>
+                        </a:ext>
+                      </a:extLst>
+                    </a:blip>
+                    <a:srcRect/>
+                    <a:stretch>
+                      <a:fillRect/>
+                    </a:stretch>
+                  </pic:blipFill>
+                  <pic:spPr bwMode="auto">
+                    <a:xfrm>
+                      <a:off x="0" y="0"/>
+                      <a:ext cx="1924050" cy="1000125"/>
+                    </a:xfrm>
+                    <a:prstGeom prst="rect">
+                      <a:avLst/>
+                    </a:prstGeom>
+                    <a:noFill/>
+                  </pic:spPr>
+                </pic:pic>
+              </a:graphicData>
+            </a:graphic>
+          </wp:inline>
+        </w:drawing>
+      </w:r>
+    </w:p>
+    <w:p>
+      <w:pPr>
+        <w:rPr>
+          <w:color w:val="000000" w:themeColor="text1"/>
+          <w:sz w:val="24"/>
+          <w:szCs w:val="24"/>
+        </w:rPr>
+      </w:pPr>
+      <w:r>
+        <w:rPr>
+          <w:color w:val="000000" w:themeColor="text1"/>
+          <w:sz w:val="24"/>
+          <w:szCs w:val="24"/>
+        </w:rPr>
+        <w:t xml:space="preserve">86- </w:t>
+      </w:r>
+      <w:r>
+        <w:rPr>
+          <w:color w:val="000000" w:themeColor="text1"/>
+          <w:sz w:val="24"/>
+          <w:szCs w:val="24"/>
+        </w:rPr>
+        <w:t>Adicionamos mais dois ite</w:t>
+      </w:r>
+      <w:r>
+        <w:rPr>
+          <w:color w:val="000000" w:themeColor="text1"/>
+          <w:sz w:val="24"/>
+          <w:szCs w:val="24"/>
+        </w:rPr>
+        <w:t>n</w:t>
+      </w:r>
+      <w:r>
+        <w:rPr>
+          <w:color w:val="000000" w:themeColor="text1"/>
+          <w:sz w:val="24"/>
+          <w:szCs w:val="24"/>
+        </w:rPr>
+        <w:t xml:space="preserve">s </w:t>
+      </w:r>
+      <w:r>
+        <w:rPr>
+          <w:color w:val="000000" w:themeColor="text1"/>
+          <w:sz w:val="24"/>
+          <w:szCs w:val="24"/>
+        </w:rPr>
+        <w:t xml:space="preserve">à lista, e demos um espaço entre os itens dela no </w:t>
+      </w:r>
+      <w:proofErr w:type="spellStart"/>
+      <w:r>
+        <w:rPr>
+          <w:color w:val="000000" w:themeColor="text1"/>
+          <w:sz w:val="24"/>
+          <w:szCs w:val="24"/>
+        </w:rPr>
+        <w:t>css</w:t>
+      </w:r>
+      <w:proofErr w:type="spellEnd"/>
+      <w:r>
+        <w:rPr>
+          <w:color w:val="000000" w:themeColor="text1"/>
+          <w:sz w:val="24"/>
+          <w:szCs w:val="24"/>
+        </w:rPr>
+        <w:t>.</w:t>
+      </w:r>
+    </w:p>
+    <w:p>
+      <w:pPr>
+        <w:rPr>
+          <w:color w:val="000000" w:themeColor="text1"/>
+          <w:sz w:val="24"/>
+          <w:szCs w:val="24"/>
+        </w:rPr>
+      </w:pPr>
+      <w:r>
+        <w:rPr>
+          <w:noProof/>
+          <w:color w:val="000000" w:themeColor="text1"/>
+          <w:sz w:val="24"/>
+          <w:szCs w:val="24"/>
+        </w:rPr>
+        <w:drawing>
+          <wp:inline distT="0" distB="0" distL="0" distR="0" wp14:anchorId="4096242A">
+            <wp:extent cx="3200400" cy="1056497"/>
+            <wp:effectExtent l="0" t="0" r="0" b="0"/>
+            <wp:docPr id="141" name="Imagem 141"/>
+            <wp:cNvGraphicFramePr>
+              <a:graphicFrameLocks xmlns:a="http://schemas.openxmlformats.org/drawingml/2006/main" noChangeAspect="1"/>
+            </wp:cNvGraphicFramePr>
+            <a:graphic xmlns:a="http://schemas.openxmlformats.org/drawingml/2006/main">
+              <a:graphicData uri="http://schemas.openxmlformats.org/drawingml/2006/picture">
+                <pic:pic xmlns:pic="http://schemas.openxmlformats.org/drawingml/2006/picture">
+                  <pic:nvPicPr>
+                    <pic:cNvPr id="0" name="Picture 8"/>
+                    <pic:cNvPicPr>
+                      <a:picLocks noChangeAspect="1" noChangeArrowheads="1"/>
+                    </pic:cNvPicPr>
+                  </pic:nvPicPr>
+                  <pic:blipFill>
+                    <a:blip r:embed="rId131">
+                      <a:extLst>
+                        <a:ext uri="{28A0092B-C50C-407E-A947-70E740481C1C}">
+                          <a14:useLocalDpi xmlns:a14="http://schemas.microsoft.com/office/drawing/2010/main" val="0"/>
+                        </a:ext>
+                      </a:extLst>
+                    </a:blip>
+                    <a:srcRect/>
+                    <a:stretch>
+                      <a:fillRect/>
+                    </a:stretch>
+                  </pic:blipFill>
+                  <pic:spPr bwMode="auto">
+                    <a:xfrm>
+                      <a:off x="0" y="0"/>
+                      <a:ext cx="3229422" cy="1066077"/>
+                    </a:xfrm>
+                    <a:prstGeom prst="rect">
+                      <a:avLst/>
+                    </a:prstGeom>
+                    <a:noFill/>
+                  </pic:spPr>
+                </pic:pic>
+              </a:graphicData>
+            </a:graphic>
+          </wp:inline>
+        </w:drawing>
+      </w:r>
+      <w:r>
+        <w:rPr>
+          <w:noProof/>
+          <w:color w:val="000000" w:themeColor="text1"/>
+          <w:sz w:val="24"/>
+          <w:szCs w:val="24"/>
+        </w:rPr>
+        <w:drawing>
+          <wp:inline distT="0" distB="0" distL="0" distR="0" wp14:anchorId="6E2C2C80">
+            <wp:extent cx="1657350" cy="714375"/>
+            <wp:effectExtent l="0" t="0" r="0" b="9525"/>
+            <wp:docPr id="140" name="Imagem 140"/>
+            <wp:cNvGraphicFramePr>
+              <a:graphicFrameLocks xmlns:a="http://schemas.openxmlformats.org/drawingml/2006/main" noChangeAspect="1"/>
+            </wp:cNvGraphicFramePr>
+            <a:graphic xmlns:a="http://schemas.openxmlformats.org/drawingml/2006/main">
+              <a:graphicData uri="http://schemas.openxmlformats.org/drawingml/2006/picture">
+                <pic:pic xmlns:pic="http://schemas.openxmlformats.org/drawingml/2006/picture">
+                  <pic:nvPicPr>
+                    <pic:cNvPr id="0" name="Picture 7"/>
+                    <pic:cNvPicPr>
+                      <a:picLocks noChangeAspect="1" noChangeArrowheads="1"/>
+                    </pic:cNvPicPr>
+                  </pic:nvPicPr>
+                  <pic:blipFill>
+                    <a:blip r:embed="rId132">
+                      <a:extLst>
+                        <a:ext uri="{28A0092B-C50C-407E-A947-70E740481C1C}">
+                          <a14:useLocalDpi xmlns:a14="http://schemas.microsoft.com/office/drawing/2010/main" val="0"/>
+                        </a:ext>
+                      </a:extLst>
+                    </a:blip>
+                    <a:srcRect/>
+                    <a:stretch>
+                      <a:fillRect/>
+                    </a:stretch>
+                  </pic:blipFill>
+                  <pic:spPr bwMode="auto">
+                    <a:xfrm>
+                      <a:off x="0" y="0"/>
+                      <a:ext cx="1657350" cy="714375"/>
+                    </a:xfrm>
+                    <a:prstGeom prst="rect">
+                      <a:avLst/>
+                    </a:prstGeom>
+                    <a:noFill/>
+                  </pic:spPr>
+                </pic:pic>
+              </a:graphicData>
+            </a:graphic>
+          </wp:inline>
+        </w:drawing>
+      </w:r>
+    </w:p>
+    <w:p>
+      <w:pPr>
+        <w:rPr>
+          <w:color w:val="000000" w:themeColor="text1"/>
+          <w:sz w:val="24"/>
+          <w:szCs w:val="24"/>
+        </w:rPr>
+      </w:pPr>
+      <w:r>
+        <w:rPr>
+          <w:color w:val="000000" w:themeColor="text1"/>
+          <w:sz w:val="24"/>
+          <w:szCs w:val="24"/>
+        </w:rPr>
+        <w:t xml:space="preserve">87- </w:t>
+      </w:r>
       <w:bookmarkStart w:id="0" w:name="_GoBack"/>
       <w:bookmarkEnd w:id="0"/>
+    </w:p>
+    <w:p>
+      <w:pPr>
+        <w:rPr>
+          <w:color w:val="000000" w:themeColor="text1"/>
+          <w:sz w:val="24"/>
+          <w:szCs w:val="24"/>
+        </w:rPr>
+      </w:pPr>
+    </w:p>
+    <w:p>
+      <w:pPr>
+        <w:rPr>
+          <w:color w:val="000000" w:themeColor="text1"/>
+          <w:sz w:val="24"/>
+          <w:szCs w:val="24"/>
+        </w:rPr>
+      </w:pPr>
     </w:p>
     <w:p>
       <w:pPr>
@@ -16108,9 +17206,9 @@
     </w:lvl>
   </w:abstractNum>
   <w:abstractNum w:abstractNumId="8" w15:restartNumberingAfterBreak="0">
-    <w:nsid w:val="4BD97793"/>
+    <w:nsid w:val="470B21D8"/>
     <w:multiLevelType w:val="hybridMultilevel"/>
-    <w:tmpl w:val="F52C3F50"/>
+    <w:tmpl w:val="2B862F14"/>
     <w:lvl w:ilvl="0" w:tplc="04160001">
       <w:start w:val="1"/>
       <w:numFmt w:val="bullet"/>
@@ -16221,6 +17319,119 @@
     </w:lvl>
   </w:abstractNum>
   <w:abstractNum w:abstractNumId="9" w15:restartNumberingAfterBreak="0">
+    <w:nsid w:val="4BD97793"/>
+    <w:multiLevelType w:val="hybridMultilevel"/>
+    <w:tmpl w:val="F52C3F50"/>
+    <w:lvl w:ilvl="0" w:tplc="04160001">
+      <w:start w:val="1"/>
+      <w:numFmt w:val="bullet"/>
+      <w:lvlText w:val=""/>
+      <w:lvlJc w:val="left"/>
+      <w:pPr>
+        <w:ind w:left="720" w:hanging="360"/>
+      </w:pPr>
+      <w:rPr>
+        <w:rFonts w:ascii="Symbol" w:hAnsi="Symbol" w:hint="default"/>
+      </w:rPr>
+    </w:lvl>
+    <w:lvl w:ilvl="1" w:tplc="04160003" w:tentative="1">
+      <w:start w:val="1"/>
+      <w:numFmt w:val="bullet"/>
+      <w:lvlText w:val="o"/>
+      <w:lvlJc w:val="left"/>
+      <w:pPr>
+        <w:ind w:left="1440" w:hanging="360"/>
+      </w:pPr>
+      <w:rPr>
+        <w:rFonts w:ascii="Courier New" w:hAnsi="Courier New" w:cs="Courier New" w:hint="default"/>
+      </w:rPr>
+    </w:lvl>
+    <w:lvl w:ilvl="2" w:tplc="04160005" w:tentative="1">
+      <w:start w:val="1"/>
+      <w:numFmt w:val="bullet"/>
+      <w:lvlText w:val=""/>
+      <w:lvlJc w:val="left"/>
+      <w:pPr>
+        <w:ind w:left="2160" w:hanging="360"/>
+      </w:pPr>
+      <w:rPr>
+        <w:rFonts w:ascii="Wingdings" w:hAnsi="Wingdings" w:hint="default"/>
+      </w:rPr>
+    </w:lvl>
+    <w:lvl w:ilvl="3" w:tplc="04160001" w:tentative="1">
+      <w:start w:val="1"/>
+      <w:numFmt w:val="bullet"/>
+      <w:lvlText w:val=""/>
+      <w:lvlJc w:val="left"/>
+      <w:pPr>
+        <w:ind w:left="2880" w:hanging="360"/>
+      </w:pPr>
+      <w:rPr>
+        <w:rFonts w:ascii="Symbol" w:hAnsi="Symbol" w:hint="default"/>
+      </w:rPr>
+    </w:lvl>
+    <w:lvl w:ilvl="4" w:tplc="04160003" w:tentative="1">
+      <w:start w:val="1"/>
+      <w:numFmt w:val="bullet"/>
+      <w:lvlText w:val="o"/>
+      <w:lvlJc w:val="left"/>
+      <w:pPr>
+        <w:ind w:left="3600" w:hanging="360"/>
+      </w:pPr>
+      <w:rPr>
+        <w:rFonts w:ascii="Courier New" w:hAnsi="Courier New" w:cs="Courier New" w:hint="default"/>
+      </w:rPr>
+    </w:lvl>
+    <w:lvl w:ilvl="5" w:tplc="04160005" w:tentative="1">
+      <w:start w:val="1"/>
+      <w:numFmt w:val="bullet"/>
+      <w:lvlText w:val=""/>
+      <w:lvlJc w:val="left"/>
+      <w:pPr>
+        <w:ind w:left="4320" w:hanging="360"/>
+      </w:pPr>
+      <w:rPr>
+        <w:rFonts w:ascii="Wingdings" w:hAnsi="Wingdings" w:hint="default"/>
+      </w:rPr>
+    </w:lvl>
+    <w:lvl w:ilvl="6" w:tplc="04160001" w:tentative="1">
+      <w:start w:val="1"/>
+      <w:numFmt w:val="bullet"/>
+      <w:lvlText w:val=""/>
+      <w:lvlJc w:val="left"/>
+      <w:pPr>
+        <w:ind w:left="5040" w:hanging="360"/>
+      </w:pPr>
+      <w:rPr>
+        <w:rFonts w:ascii="Symbol" w:hAnsi="Symbol" w:hint="default"/>
+      </w:rPr>
+    </w:lvl>
+    <w:lvl w:ilvl="7" w:tplc="04160003" w:tentative="1">
+      <w:start w:val="1"/>
+      <w:numFmt w:val="bullet"/>
+      <w:lvlText w:val="o"/>
+      <w:lvlJc w:val="left"/>
+      <w:pPr>
+        <w:ind w:left="5760" w:hanging="360"/>
+      </w:pPr>
+      <w:rPr>
+        <w:rFonts w:ascii="Courier New" w:hAnsi="Courier New" w:cs="Courier New" w:hint="default"/>
+      </w:rPr>
+    </w:lvl>
+    <w:lvl w:ilvl="8" w:tplc="04160005" w:tentative="1">
+      <w:start w:val="1"/>
+      <w:numFmt w:val="bullet"/>
+      <w:lvlText w:val=""/>
+      <w:lvlJc w:val="left"/>
+      <w:pPr>
+        <w:ind w:left="6480" w:hanging="360"/>
+      </w:pPr>
+      <w:rPr>
+        <w:rFonts w:ascii="Wingdings" w:hAnsi="Wingdings" w:hint="default"/>
+      </w:rPr>
+    </w:lvl>
+  </w:abstractNum>
+  <w:abstractNum w:abstractNumId="10" w15:restartNumberingAfterBreak="0">
     <w:nsid w:val="67EB77F4"/>
     <w:multiLevelType w:val="hybridMultilevel"/>
     <w:tmpl w:val="1FAA0BA4"/>
@@ -16340,7 +17551,7 @@
     <w:abstractNumId w:val="0"/>
   </w:num>
   <w:num w:numId="3">
-    <w:abstractNumId w:val="9"/>
+    <w:abstractNumId w:val="10"/>
   </w:num>
   <w:num w:numId="4">
     <w:abstractNumId w:val="5"/>
@@ -16361,6 +17572,9 @@
     <w:abstractNumId w:val="7"/>
   </w:num>
   <w:num w:numId="10">
+    <w:abstractNumId w:val="9"/>
+  </w:num>
+  <w:num w:numId="11">
     <w:abstractNumId w:val="8"/>
   </w:num>
 </w:numbering>
@@ -17128,7 +18342,7 @@
 </file>
 
 <file path=customXml/itemProps1.xml><?xml version="1.0" encoding="utf-8"?>
-<ds:datastoreItem xmlns:ds="http://schemas.openxmlformats.org/officeDocument/2006/customXml" ds:itemID="{50959004-6157-4586-8EF1-4B8DC830FD81}">
+<ds:datastoreItem xmlns:ds="http://schemas.openxmlformats.org/officeDocument/2006/customXml" ds:itemID="{742E8FAD-EEEC-470B-A9DA-744952096A39}">
   <ds:schemaRefs>
     <ds:schemaRef ds:uri="http://schemas.openxmlformats.org/officeDocument/2006/bibliography"/>
   </ds:schemaRefs>

</xml_diff>

<commit_message>
atualização da aula dia 13/10
</commit_message>
<xml_diff>
--- a/Apostila/Apostila Space For Men.docx
+++ b/Apostila/Apostila Space For Men.docx
@@ -14026,6 +14026,7 @@
       <w:proofErr w:type="spellStart"/>
       <w:r>
         <w:rPr>
+          <w:b/>
           <w:color w:val="000000" w:themeColor="text1"/>
           <w:sz w:val="24"/>
           <w:szCs w:val="24"/>
@@ -14044,6 +14045,7 @@
       <w:proofErr w:type="spellStart"/>
       <w:r>
         <w:rPr>
+          <w:b/>
           <w:color w:val="000000" w:themeColor="text1"/>
           <w:sz w:val="24"/>
           <w:szCs w:val="24"/>
@@ -14076,6 +14078,7 @@
       <w:proofErr w:type="spellStart"/>
       <w:r>
         <w:rPr>
+          <w:b/>
           <w:color w:val="000000" w:themeColor="text1"/>
           <w:sz w:val="24"/>
           <w:szCs w:val="24"/>
@@ -14646,6 +14649,7 @@
       <w:proofErr w:type="spellStart"/>
       <w:r>
         <w:rPr>
+          <w:b/>
           <w:color w:val="000000" w:themeColor="text1"/>
           <w:sz w:val="24"/>
           <w:szCs w:val="24"/>
@@ -14659,7 +14663,24 @@
           <w:sz w:val="24"/>
           <w:szCs w:val="24"/>
         </w:rPr>
-        <w:t xml:space="preserve"> vamos clicar e colar na nossa página index.html conforme imagem.</w:t>
+        <w:t xml:space="preserve"> vamos clicar e colar na nossa página </w:t>
+      </w:r>
+      <w:r>
+        <w:rPr>
+          <w:b/>
+          <w:color w:val="000000" w:themeColor="text1"/>
+          <w:sz w:val="24"/>
+          <w:szCs w:val="24"/>
+        </w:rPr>
+        <w:t>index.html</w:t>
+      </w:r>
+      <w:r>
+        <w:rPr>
+          <w:color w:val="000000" w:themeColor="text1"/>
+          <w:sz w:val="24"/>
+          <w:szCs w:val="24"/>
+        </w:rPr>
+        <w:t xml:space="preserve"> conforme imagem.</w:t>
       </w:r>
     </w:p>
     <w:p>
@@ -14934,6 +14955,7 @@
       <w:proofErr w:type="spellStart"/>
       <w:r>
         <w:rPr>
+          <w:b/>
           <w:color w:val="000000" w:themeColor="text1"/>
           <w:sz w:val="24"/>
           <w:szCs w:val="24"/>
@@ -14952,6 +14974,7 @@
       <w:proofErr w:type="spellStart"/>
       <w:r>
         <w:rPr>
+          <w:b/>
           <w:color w:val="000000" w:themeColor="text1"/>
           <w:sz w:val="24"/>
           <w:szCs w:val="24"/>
@@ -14970,6 +14993,7 @@
       <w:proofErr w:type="spellStart"/>
       <w:r>
         <w:rPr>
+          <w:b/>
           <w:color w:val="000000" w:themeColor="text1"/>
           <w:sz w:val="24"/>
           <w:szCs w:val="24"/>
@@ -14988,6 +15012,7 @@
       <w:proofErr w:type="spellStart"/>
       <w:r>
         <w:rPr>
+          <w:b/>
           <w:color w:val="000000" w:themeColor="text1"/>
           <w:sz w:val="24"/>
           <w:szCs w:val="24"/>
@@ -15023,6 +15048,7 @@
       <w:proofErr w:type="spellStart"/>
       <w:r>
         <w:rPr>
+          <w:b/>
           <w:color w:val="000000" w:themeColor="text1"/>
           <w:sz w:val="24"/>
           <w:szCs w:val="24"/>
@@ -15041,6 +15067,7 @@
       <w:proofErr w:type="spellStart"/>
       <w:r>
         <w:rPr>
+          <w:b/>
           <w:color w:val="000000" w:themeColor="text1"/>
           <w:sz w:val="24"/>
           <w:szCs w:val="24"/>
@@ -15059,6 +15086,7 @@
       <w:proofErr w:type="spellStart"/>
       <w:r>
         <w:rPr>
+          <w:b/>
           <w:color w:val="000000" w:themeColor="text1"/>
           <w:sz w:val="24"/>
           <w:szCs w:val="24"/>
@@ -15260,6 +15288,7 @@
       <w:proofErr w:type="spellStart"/>
       <w:r>
         <w:rPr>
+          <w:b/>
           <w:color w:val="000000" w:themeColor="text1"/>
           <w:sz w:val="24"/>
           <w:szCs w:val="24"/>
@@ -15300,6 +15329,7 @@
       <w:proofErr w:type="spellStart"/>
       <w:r>
         <w:rPr>
+          <w:b/>
           <w:color w:val="000000" w:themeColor="text1"/>
           <w:sz w:val="24"/>
           <w:szCs w:val="24"/>
@@ -15326,6 +15356,7 @@
       </w:pPr>
       <w:r>
         <w:rPr>
+          <w:noProof/>
           <w:color w:val="000000" w:themeColor="text1"/>
           <w:sz w:val="24"/>
           <w:szCs w:val="24"/>
@@ -15394,6 +15425,7 @@
       <w:proofErr w:type="spellStart"/>
       <w:r>
         <w:rPr>
+          <w:b/>
           <w:color w:val="000000" w:themeColor="text1"/>
           <w:sz w:val="24"/>
           <w:szCs w:val="24"/>
@@ -15407,7 +15439,24 @@
           <w:sz w:val="24"/>
           <w:szCs w:val="24"/>
         </w:rPr>
-        <w:t xml:space="preserve"> vídeo de 560px e centralizamos usando o espaço externo.</w:t>
+        <w:t xml:space="preserve"> vídeo de </w:t>
+      </w:r>
+      <w:r>
+        <w:rPr>
+          <w:b/>
+          <w:color w:val="000000" w:themeColor="text1"/>
+          <w:sz w:val="24"/>
+          <w:szCs w:val="24"/>
+        </w:rPr>
+        <w:t>560px</w:t>
+      </w:r>
+      <w:r>
+        <w:rPr>
+          <w:color w:val="000000" w:themeColor="text1"/>
+          <w:sz w:val="24"/>
+          <w:szCs w:val="24"/>
+        </w:rPr>
+        <w:t xml:space="preserve"> e centralizamos usando o espaço externo.</w:t>
       </w:r>
     </w:p>
     <w:p>
@@ -15499,6 +15548,7 @@
       <w:proofErr w:type="spellStart"/>
       <w:r>
         <w:rPr>
+          <w:b/>
           <w:color w:val="000000" w:themeColor="text1"/>
           <w:sz w:val="24"/>
           <w:szCs w:val="24"/>
@@ -15517,6 +15567,7 @@
       <w:proofErr w:type="spellStart"/>
       <w:r>
         <w:rPr>
+          <w:b/>
           <w:color w:val="000000" w:themeColor="text1"/>
           <w:sz w:val="24"/>
           <w:szCs w:val="24"/>
@@ -15530,11 +15581,21 @@
           <w:sz w:val="24"/>
           <w:szCs w:val="24"/>
         </w:rPr>
-        <w:t xml:space="preserve"> chamada lista-</w:t>
+        <w:t xml:space="preserve"> chamada </w:t>
+      </w:r>
+      <w:r>
+        <w:rPr>
+          <w:b/>
+          <w:color w:val="000000" w:themeColor="text1"/>
+          <w:sz w:val="24"/>
+          <w:szCs w:val="24"/>
+        </w:rPr>
+        <w:t>lista-</w:t>
       </w:r>
       <w:proofErr w:type="spellStart"/>
       <w:r>
         <w:rPr>
+          <w:b/>
           <w:color w:val="000000" w:themeColor="text1"/>
           <w:sz w:val="24"/>
           <w:szCs w:val="24"/>
@@ -15561,6 +15622,7 @@
       </w:pPr>
       <w:r>
         <w:rPr>
+          <w:noProof/>
           <w:color w:val="000000" w:themeColor="text1"/>
           <w:sz w:val="24"/>
           <w:szCs w:val="24"/>
@@ -15621,6 +15683,7 @@
       <w:proofErr w:type="spellStart"/>
       <w:r>
         <w:rPr>
+          <w:b/>
           <w:color w:val="000000" w:themeColor="text1"/>
           <w:sz w:val="24"/>
           <w:szCs w:val="24"/>
@@ -15639,6 +15702,7 @@
       <w:proofErr w:type="spellStart"/>
       <w:r>
         <w:rPr>
+          <w:b/>
           <w:color w:val="000000" w:themeColor="text1"/>
           <w:sz w:val="24"/>
           <w:szCs w:val="24"/>
@@ -15652,11 +15716,21 @@
           <w:sz w:val="24"/>
           <w:szCs w:val="24"/>
         </w:rPr>
-        <w:t xml:space="preserve"> conteúdo-</w:t>
+        <w:t xml:space="preserve"> </w:t>
+      </w:r>
+      <w:r>
+        <w:rPr>
+          <w:b/>
+          <w:color w:val="000000" w:themeColor="text1"/>
+          <w:sz w:val="24"/>
+          <w:szCs w:val="24"/>
+        </w:rPr>
+        <w:t>conteúdo-</w:t>
       </w:r>
       <w:proofErr w:type="spellStart"/>
       <w:r>
         <w:rPr>
+          <w:b/>
           <w:color w:val="000000" w:themeColor="text1"/>
           <w:sz w:val="24"/>
           <w:szCs w:val="24"/>
@@ -15675,6 +15749,7 @@
       <w:proofErr w:type="spellStart"/>
       <w:r>
         <w:rPr>
+          <w:b/>
           <w:color w:val="000000" w:themeColor="text1"/>
           <w:sz w:val="24"/>
           <w:szCs w:val="24"/>
@@ -15688,7 +15763,41 @@
           <w:sz w:val="24"/>
           <w:szCs w:val="24"/>
         </w:rPr>
-        <w:t xml:space="preserve"> 0 auto.</w:t>
+        <w:t xml:space="preserve"> </w:t>
+      </w:r>
+      <w:r>
+        <w:rPr>
+          <w:b/>
+          <w:color w:val="000000" w:themeColor="text1"/>
+          <w:sz w:val="24"/>
+          <w:szCs w:val="24"/>
+        </w:rPr>
+        <w:t>0</w:t>
+      </w:r>
+      <w:r>
+        <w:rPr>
+          <w:color w:val="000000" w:themeColor="text1"/>
+          <w:sz w:val="24"/>
+          <w:szCs w:val="24"/>
+        </w:rPr>
+        <w:t xml:space="preserve"> </w:t>
+      </w:r>
+      <w:r>
+        <w:rPr>
+          <w:b/>
+          <w:color w:val="000000" w:themeColor="text1"/>
+          <w:sz w:val="24"/>
+          <w:szCs w:val="24"/>
+        </w:rPr>
+        <w:t>auto</w:t>
+      </w:r>
+      <w:r>
+        <w:rPr>
+          <w:color w:val="000000" w:themeColor="text1"/>
+          <w:sz w:val="24"/>
+          <w:szCs w:val="24"/>
+        </w:rPr>
+        <w:t>.</w:t>
       </w:r>
     </w:p>
     <w:p>
@@ -15767,11 +15876,21 @@
           <w:sz w:val="24"/>
           <w:szCs w:val="24"/>
         </w:rPr>
-        <w:t>84- E na lista-</w:t>
+        <w:t xml:space="preserve">84- E na </w:t>
+      </w:r>
+      <w:r>
+        <w:rPr>
+          <w:b/>
+          <w:color w:val="000000" w:themeColor="text1"/>
+          <w:sz w:val="24"/>
+          <w:szCs w:val="24"/>
+        </w:rPr>
+        <w:t>lista-</w:t>
       </w:r>
       <w:proofErr w:type="spellStart"/>
       <w:r>
         <w:rPr>
+          <w:b/>
           <w:color w:val="000000" w:themeColor="text1"/>
           <w:sz w:val="24"/>
           <w:szCs w:val="24"/>
@@ -15872,10 +15991,20 @@
           <w:sz w:val="24"/>
           <w:szCs w:val="24"/>
         </w:rPr>
-        <w:t>Para colocar a imagem ao lado da lista colocamos display</w:t>
-      </w:r>
-      <w:r>
-        <w:rPr>
+        <w:t xml:space="preserve">Para colocar a imagem ao lado da lista colocamos </w:t>
+      </w:r>
+      <w:r>
+        <w:rPr>
+          <w:b/>
+          <w:color w:val="000000" w:themeColor="text1"/>
+          <w:sz w:val="24"/>
+          <w:szCs w:val="24"/>
+        </w:rPr>
+        <w:t>display</w:t>
+      </w:r>
+      <w:r>
+        <w:rPr>
+          <w:b/>
           <w:color w:val="000000" w:themeColor="text1"/>
           <w:sz w:val="24"/>
           <w:szCs w:val="24"/>
@@ -15885,6 +16014,7 @@
       <w:proofErr w:type="spellStart"/>
       <w:r>
         <w:rPr>
+          <w:b/>
           <w:color w:val="000000" w:themeColor="text1"/>
           <w:sz w:val="24"/>
           <w:szCs w:val="24"/>
@@ -15903,6 +16033,7 @@
       <w:proofErr w:type="spellStart"/>
       <w:r>
         <w:rPr>
+          <w:b/>
           <w:color w:val="000000" w:themeColor="text1"/>
           <w:sz w:val="24"/>
           <w:szCs w:val="24"/>
@@ -16085,6 +16216,7 @@
       <w:proofErr w:type="spellStart"/>
       <w:r>
         <w:rPr>
+          <w:b/>
           <w:color w:val="000000" w:themeColor="text1"/>
           <w:sz w:val="24"/>
           <w:szCs w:val="24"/>
@@ -16232,26 +16364,1549 @@
         </w:rPr>
         <w:t xml:space="preserve">87- </w:t>
       </w:r>
+      <w:r>
+        <w:rPr>
+          <w:color w:val="000000" w:themeColor="text1"/>
+          <w:sz w:val="24"/>
+          <w:szCs w:val="24"/>
+        </w:rPr>
+        <w:t>Adicionando ícones a minha página conforme código.</w:t>
+      </w:r>
+    </w:p>
+    <w:p>
+      <w:pPr>
+        <w:rPr>
+          <w:color w:val="000000" w:themeColor="text1"/>
+          <w:sz w:val="24"/>
+          <w:szCs w:val="24"/>
+        </w:rPr>
+      </w:pPr>
+      <w:r>
+        <w:rPr>
+          <w:color w:val="000000" w:themeColor="text1"/>
+          <w:sz w:val="24"/>
+          <w:szCs w:val="24"/>
+        </w:rPr>
+        <w:t>Acessando o site de Unicode através do Google.</w:t>
+      </w:r>
+    </w:p>
+    <w:p>
+      <w:pPr>
+        <w:rPr>
+          <w:color w:val="000000" w:themeColor="text1"/>
+          <w:sz w:val="24"/>
+          <w:szCs w:val="24"/>
+        </w:rPr>
+      </w:pPr>
+      <w:r>
+        <w:rPr>
+          <w:noProof/>
+          <w:color w:val="000000" w:themeColor="text1"/>
+          <w:sz w:val="24"/>
+          <w:szCs w:val="24"/>
+        </w:rPr>
+        <w:drawing>
+          <wp:inline distT="0" distB="0" distL="0" distR="0" wp14:anchorId="0221BC0C">
+            <wp:extent cx="6049010" cy="2724785"/>
+            <wp:effectExtent l="0" t="0" r="8890" b="0"/>
+            <wp:docPr id="144" name="Imagem 144"/>
+            <wp:cNvGraphicFramePr>
+              <a:graphicFrameLocks xmlns:a="http://schemas.openxmlformats.org/drawingml/2006/main" noChangeAspect="1"/>
+            </wp:cNvGraphicFramePr>
+            <a:graphic xmlns:a="http://schemas.openxmlformats.org/drawingml/2006/main">
+              <a:graphicData uri="http://schemas.openxmlformats.org/drawingml/2006/picture">
+                <pic:pic xmlns:pic="http://schemas.openxmlformats.org/drawingml/2006/picture">
+                  <pic:nvPicPr>
+                    <pic:cNvPr id="0" name="Picture 2"/>
+                    <pic:cNvPicPr>
+                      <a:picLocks noChangeAspect="1" noChangeArrowheads="1"/>
+                    </pic:cNvPicPr>
+                  </pic:nvPicPr>
+                  <pic:blipFill>
+                    <a:blip r:embed="rId133">
+                      <a:extLst>
+                        <a:ext uri="{28A0092B-C50C-407E-A947-70E740481C1C}">
+                          <a14:useLocalDpi xmlns:a14="http://schemas.microsoft.com/office/drawing/2010/main" val="0"/>
+                        </a:ext>
+                      </a:extLst>
+                    </a:blip>
+                    <a:srcRect/>
+                    <a:stretch>
+                      <a:fillRect/>
+                    </a:stretch>
+                  </pic:blipFill>
+                  <pic:spPr bwMode="auto">
+                    <a:xfrm>
+                      <a:off x="0" y="0"/>
+                      <a:ext cx="6049010" cy="2724785"/>
+                    </a:xfrm>
+                    <a:prstGeom prst="rect">
+                      <a:avLst/>
+                    </a:prstGeom>
+                    <a:noFill/>
+                  </pic:spPr>
+                </pic:pic>
+              </a:graphicData>
+            </a:graphic>
+          </wp:inline>
+        </w:drawing>
+      </w:r>
+    </w:p>
+    <w:p>
+      <w:pPr>
+        <w:rPr>
+          <w:color w:val="000000" w:themeColor="text1"/>
+          <w:sz w:val="24"/>
+          <w:szCs w:val="24"/>
+        </w:rPr>
+      </w:pPr>
+      <w:r>
+        <w:rPr>
+          <w:color w:val="000000" w:themeColor="text1"/>
+          <w:sz w:val="24"/>
+          <w:szCs w:val="24"/>
+        </w:rPr>
+        <w:t>Copiamos a estrela e colamos no código.</w:t>
+      </w:r>
+    </w:p>
+    <w:p>
+      <w:pPr>
+        <w:rPr>
+          <w:color w:val="000000" w:themeColor="text1"/>
+          <w:sz w:val="24"/>
+          <w:szCs w:val="24"/>
+        </w:rPr>
+      </w:pPr>
+      <w:r>
+        <w:rPr>
+          <w:noProof/>
+          <w:color w:val="000000" w:themeColor="text1"/>
+          <w:sz w:val="24"/>
+          <w:szCs w:val="24"/>
+        </w:rPr>
+        <w:drawing>
+          <wp:inline distT="0" distB="0" distL="0" distR="0" wp14:anchorId="487927AD" wp14:editId="6AF3E76B">
+            <wp:extent cx="1295400" cy="954098"/>
+            <wp:effectExtent l="0" t="0" r="0" b="0"/>
+            <wp:docPr id="143" name="Imagem 143"/>
+            <wp:cNvGraphicFramePr>
+              <a:graphicFrameLocks xmlns:a="http://schemas.openxmlformats.org/drawingml/2006/main" noChangeAspect="1"/>
+            </wp:cNvGraphicFramePr>
+            <a:graphic xmlns:a="http://schemas.openxmlformats.org/drawingml/2006/main">
+              <a:graphicData uri="http://schemas.openxmlformats.org/drawingml/2006/picture">
+                <pic:pic xmlns:pic="http://schemas.openxmlformats.org/drawingml/2006/picture">
+                  <pic:nvPicPr>
+                    <pic:cNvPr id="1" name=""/>
+                    <pic:cNvPicPr/>
+                  </pic:nvPicPr>
+                  <pic:blipFill>
+                    <a:blip r:embed="rId134"/>
+                    <a:stretch>
+                      <a:fillRect/>
+                    </a:stretch>
+                  </pic:blipFill>
+                  <pic:spPr>
+                    <a:xfrm>
+                      <a:off x="0" y="0"/>
+                      <a:ext cx="1298897" cy="956674"/>
+                    </a:xfrm>
+                    <a:prstGeom prst="rect">
+                      <a:avLst/>
+                    </a:prstGeom>
+                  </pic:spPr>
+                </pic:pic>
+              </a:graphicData>
+            </a:graphic>
+          </wp:inline>
+        </w:drawing>
+      </w:r>
+      <w:r>
+        <w:rPr>
+          <w:noProof/>
+          <w:color w:val="000000" w:themeColor="text1"/>
+          <w:sz w:val="24"/>
+          <w:szCs w:val="24"/>
+        </w:rPr>
+        <w:drawing>
+          <wp:inline distT="0" distB="0" distL="0" distR="0" wp14:anchorId="67935BF0" wp14:editId="21BB59D9">
+            <wp:extent cx="1381318" cy="562053"/>
+            <wp:effectExtent l="0" t="0" r="9525" b="0"/>
+            <wp:docPr id="142" name="Imagem 142"/>
+            <wp:cNvGraphicFramePr>
+              <a:graphicFrameLocks xmlns:a="http://schemas.openxmlformats.org/drawingml/2006/main" noChangeAspect="1"/>
+            </wp:cNvGraphicFramePr>
+            <a:graphic xmlns:a="http://schemas.openxmlformats.org/drawingml/2006/main">
+              <a:graphicData uri="http://schemas.openxmlformats.org/drawingml/2006/picture">
+                <pic:pic xmlns:pic="http://schemas.openxmlformats.org/drawingml/2006/picture">
+                  <pic:nvPicPr>
+                    <pic:cNvPr id="1" name=""/>
+                    <pic:cNvPicPr/>
+                  </pic:nvPicPr>
+                  <pic:blipFill>
+                    <a:blip r:embed="rId135"/>
+                    <a:stretch>
+                      <a:fillRect/>
+                    </a:stretch>
+                  </pic:blipFill>
+                  <pic:spPr>
+                    <a:xfrm>
+                      <a:off x="0" y="0"/>
+                      <a:ext cx="1381318" cy="562053"/>
+                    </a:xfrm>
+                    <a:prstGeom prst="rect">
+                      <a:avLst/>
+                    </a:prstGeom>
+                  </pic:spPr>
+                </pic:pic>
+              </a:graphicData>
+            </a:graphic>
+          </wp:inline>
+        </w:drawing>
+      </w:r>
+    </w:p>
+    <w:p>
+      <w:pPr>
+        <w:rPr>
+          <w:color w:val="000000" w:themeColor="text1"/>
+          <w:sz w:val="24"/>
+          <w:szCs w:val="24"/>
+        </w:rPr>
+      </w:pPr>
+      <w:r>
+        <w:rPr>
+          <w:color w:val="000000" w:themeColor="text1"/>
+          <w:sz w:val="24"/>
+          <w:szCs w:val="24"/>
+        </w:rPr>
+        <w:t xml:space="preserve">88- </w:t>
+      </w:r>
+      <w:r>
+        <w:rPr>
+          <w:color w:val="000000" w:themeColor="text1"/>
+          <w:sz w:val="24"/>
+          <w:szCs w:val="24"/>
+        </w:rPr>
+        <w:t xml:space="preserve">Queremos que o primeiro item da minha lista </w:t>
+      </w:r>
+      <w:r>
+        <w:rPr>
+          <w:color w:val="000000" w:themeColor="text1"/>
+          <w:sz w:val="24"/>
+          <w:szCs w:val="24"/>
+        </w:rPr>
+        <w:t>fica em negrito.</w:t>
+      </w:r>
+    </w:p>
+    <w:p>
+      <w:pPr>
+        <w:rPr>
+          <w:color w:val="000000" w:themeColor="text1"/>
+          <w:sz w:val="24"/>
+          <w:szCs w:val="24"/>
+        </w:rPr>
+      </w:pPr>
+      <w:r>
+        <w:rPr>
+          <w:noProof/>
+          <w:color w:val="000000" w:themeColor="text1"/>
+          <w:sz w:val="24"/>
+          <w:szCs w:val="24"/>
+        </w:rPr>
+        <w:drawing>
+          <wp:inline distT="0" distB="0" distL="0" distR="0" wp14:anchorId="793191D7" wp14:editId="7DB4E022">
+            <wp:extent cx="1478311" cy="1095375"/>
+            <wp:effectExtent l="0" t="0" r="7620" b="0"/>
+            <wp:docPr id="146" name="Imagem 146"/>
+            <wp:cNvGraphicFramePr>
+              <a:graphicFrameLocks xmlns:a="http://schemas.openxmlformats.org/drawingml/2006/main" noChangeAspect="1"/>
+            </wp:cNvGraphicFramePr>
+            <a:graphic xmlns:a="http://schemas.openxmlformats.org/drawingml/2006/main">
+              <a:graphicData uri="http://schemas.openxmlformats.org/drawingml/2006/picture">
+                <pic:pic xmlns:pic="http://schemas.openxmlformats.org/drawingml/2006/picture">
+                  <pic:nvPicPr>
+                    <pic:cNvPr id="1" name=""/>
+                    <pic:cNvPicPr/>
+                  </pic:nvPicPr>
+                  <pic:blipFill>
+                    <a:blip r:embed="rId136"/>
+                    <a:stretch>
+                      <a:fillRect/>
+                    </a:stretch>
+                  </pic:blipFill>
+                  <pic:spPr>
+                    <a:xfrm>
+                      <a:off x="0" y="0"/>
+                      <a:ext cx="1480519" cy="1097011"/>
+                    </a:xfrm>
+                    <a:prstGeom prst="rect">
+                      <a:avLst/>
+                    </a:prstGeom>
+                  </pic:spPr>
+                </pic:pic>
+              </a:graphicData>
+            </a:graphic>
+          </wp:inline>
+        </w:drawing>
+      </w:r>
+      <w:r>
+        <w:rPr>
+          <w:noProof/>
+          <w:color w:val="000000" w:themeColor="text1"/>
+          <w:sz w:val="24"/>
+          <w:szCs w:val="24"/>
+        </w:rPr>
+        <w:drawing>
+          <wp:inline distT="0" distB="0" distL="0" distR="0" wp14:anchorId="1E46520A" wp14:editId="0C49D0F4">
+            <wp:extent cx="1686160" cy="752580"/>
+            <wp:effectExtent l="0" t="0" r="9525" b="9525"/>
+            <wp:docPr id="145" name="Imagem 145"/>
+            <wp:cNvGraphicFramePr>
+              <a:graphicFrameLocks xmlns:a="http://schemas.openxmlformats.org/drawingml/2006/main" noChangeAspect="1"/>
+            </wp:cNvGraphicFramePr>
+            <a:graphic xmlns:a="http://schemas.openxmlformats.org/drawingml/2006/main">
+              <a:graphicData uri="http://schemas.openxmlformats.org/drawingml/2006/picture">
+                <pic:pic xmlns:pic="http://schemas.openxmlformats.org/drawingml/2006/picture">
+                  <pic:nvPicPr>
+                    <pic:cNvPr id="1" name=""/>
+                    <pic:cNvPicPr/>
+                  </pic:nvPicPr>
+                  <pic:blipFill>
+                    <a:blip r:embed="rId137"/>
+                    <a:stretch>
+                      <a:fillRect/>
+                    </a:stretch>
+                  </pic:blipFill>
+                  <pic:spPr>
+                    <a:xfrm>
+                      <a:off x="0" y="0"/>
+                      <a:ext cx="1686160" cy="752580"/>
+                    </a:xfrm>
+                    <a:prstGeom prst="rect">
+                      <a:avLst/>
+                    </a:prstGeom>
+                  </pic:spPr>
+                </pic:pic>
+              </a:graphicData>
+            </a:graphic>
+          </wp:inline>
+        </w:drawing>
+      </w:r>
+    </w:p>
+    <w:p>
+      <w:pPr>
+        <w:rPr>
+          <w:color w:val="000000" w:themeColor="text1"/>
+          <w:sz w:val="24"/>
+          <w:szCs w:val="24"/>
+        </w:rPr>
+      </w:pPr>
+      <w:r>
+        <w:rPr>
+          <w:color w:val="000000" w:themeColor="text1"/>
+          <w:sz w:val="24"/>
+          <w:szCs w:val="24"/>
+        </w:rPr>
+        <w:t xml:space="preserve">89- Degrade: </w:t>
+      </w:r>
+    </w:p>
+    <w:p>
+      <w:pPr>
+        <w:rPr>
+          <w:color w:val="000000" w:themeColor="text1"/>
+          <w:sz w:val="24"/>
+          <w:szCs w:val="24"/>
+        </w:rPr>
+      </w:pPr>
+      <w:r>
+        <w:rPr>
+          <w:color w:val="000000" w:themeColor="text1"/>
+          <w:sz w:val="24"/>
+          <w:szCs w:val="24"/>
+        </w:rPr>
+        <w:t xml:space="preserve">O degrade de cor é uma sequência de tons contínuo, podendo ser limitado ou ilimitado. Ou seja, a área onde duas ou mais cores são sobrepostas. Cada uma com suas identidades formando uma transição suave entre as </w:t>
+      </w:r>
+      <w:proofErr w:type="gramStart"/>
+      <w:r>
+        <w:rPr>
+          <w:color w:val="000000" w:themeColor="text1"/>
+          <w:sz w:val="24"/>
+          <w:szCs w:val="24"/>
+        </w:rPr>
+        <w:t>cores  no</w:t>
+      </w:r>
+      <w:proofErr w:type="gramEnd"/>
+      <w:r>
+        <w:rPr>
+          <w:color w:val="000000" w:themeColor="text1"/>
+          <w:sz w:val="24"/>
+          <w:szCs w:val="24"/>
+        </w:rPr>
+        <w:t xml:space="preserve"> sentido de </w:t>
+      </w:r>
+      <w:r>
+        <w:rPr>
+          <w:color w:val="000000" w:themeColor="text1"/>
+          <w:sz w:val="24"/>
+          <w:szCs w:val="24"/>
+        </w:rPr>
+        <w:t>apresentar aspectos.</w:t>
+      </w:r>
+    </w:p>
+    <w:p>
+      <w:pPr>
+        <w:rPr>
+          <w:color w:val="000000" w:themeColor="text1"/>
+          <w:sz w:val="24"/>
+          <w:szCs w:val="24"/>
+        </w:rPr>
+      </w:pPr>
+      <w:r>
+        <w:rPr>
+          <w:color w:val="000000" w:themeColor="text1"/>
+          <w:sz w:val="24"/>
+          <w:szCs w:val="24"/>
+        </w:rPr>
+        <w:t xml:space="preserve">Para o degrade colocamos duas cores de fundo, uma na </w:t>
+      </w:r>
+      <w:proofErr w:type="spellStart"/>
+      <w:r>
+        <w:rPr>
+          <w:b/>
+          <w:color w:val="000000" w:themeColor="text1"/>
+          <w:sz w:val="24"/>
+          <w:szCs w:val="24"/>
+        </w:rPr>
+        <w:t>section</w:t>
+      </w:r>
+      <w:proofErr w:type="spellEnd"/>
+      <w:r>
+        <w:rPr>
+          <w:color w:val="000000" w:themeColor="text1"/>
+          <w:sz w:val="24"/>
+          <w:szCs w:val="24"/>
+        </w:rPr>
+        <w:t xml:space="preserve"> principal e outra na </w:t>
+      </w:r>
+      <w:proofErr w:type="spellStart"/>
+      <w:r>
+        <w:rPr>
+          <w:b/>
+          <w:color w:val="000000" w:themeColor="text1"/>
+          <w:sz w:val="24"/>
+          <w:szCs w:val="24"/>
+        </w:rPr>
+        <w:t>section</w:t>
+      </w:r>
+      <w:proofErr w:type="spellEnd"/>
+      <w:r>
+        <w:rPr>
+          <w:color w:val="000000" w:themeColor="text1"/>
+          <w:sz w:val="24"/>
+          <w:szCs w:val="24"/>
+        </w:rPr>
+        <w:t xml:space="preserve"> benefícios.</w:t>
+      </w:r>
+    </w:p>
+    <w:p>
+      <w:pPr>
+        <w:rPr>
+          <w:color w:val="000000" w:themeColor="text1"/>
+          <w:sz w:val="24"/>
+          <w:szCs w:val="24"/>
+        </w:rPr>
+      </w:pPr>
+      <w:r>
+        <w:rPr>
+          <w:noProof/>
+          <w:color w:val="000000" w:themeColor="text1"/>
+          <w:sz w:val="24"/>
+          <w:szCs w:val="24"/>
+        </w:rPr>
+        <w:drawing>
+          <wp:inline distT="0" distB="0" distL="0" distR="0" wp14:anchorId="5FB717E5" wp14:editId="76F87674">
+            <wp:extent cx="2438740" cy="762106"/>
+            <wp:effectExtent l="0" t="0" r="0" b="0"/>
+            <wp:docPr id="147" name="Imagem 147"/>
+            <wp:cNvGraphicFramePr>
+              <a:graphicFrameLocks xmlns:a="http://schemas.openxmlformats.org/drawingml/2006/main" noChangeAspect="1"/>
+            </wp:cNvGraphicFramePr>
+            <a:graphic xmlns:a="http://schemas.openxmlformats.org/drawingml/2006/main">
+              <a:graphicData uri="http://schemas.openxmlformats.org/drawingml/2006/picture">
+                <pic:pic xmlns:pic="http://schemas.openxmlformats.org/drawingml/2006/picture">
+                  <pic:nvPicPr>
+                    <pic:cNvPr id="1" name=""/>
+                    <pic:cNvPicPr/>
+                  </pic:nvPicPr>
+                  <pic:blipFill>
+                    <a:blip r:embed="rId138"/>
+                    <a:stretch>
+                      <a:fillRect/>
+                    </a:stretch>
+                  </pic:blipFill>
+                  <pic:spPr>
+                    <a:xfrm>
+                      <a:off x="0" y="0"/>
+                      <a:ext cx="2438740" cy="762106"/>
+                    </a:xfrm>
+                    <a:prstGeom prst="rect">
+                      <a:avLst/>
+                    </a:prstGeom>
+                  </pic:spPr>
+                </pic:pic>
+              </a:graphicData>
+            </a:graphic>
+          </wp:inline>
+        </w:drawing>
+      </w:r>
+      <w:r>
+        <w:rPr>
+          <w:noProof/>
+          <w:color w:val="000000" w:themeColor="text1"/>
+          <w:sz w:val="24"/>
+          <w:szCs w:val="24"/>
+        </w:rPr>
+        <w:drawing>
+          <wp:inline distT="0" distB="0" distL="0" distR="0" wp14:anchorId="74839011" wp14:editId="58D1ECC9">
+            <wp:extent cx="2277035" cy="762000"/>
+            <wp:effectExtent l="0" t="0" r="9525" b="0"/>
+            <wp:docPr id="149" name="Imagem 149"/>
+            <wp:cNvGraphicFramePr>
+              <a:graphicFrameLocks xmlns:a="http://schemas.openxmlformats.org/drawingml/2006/main" noChangeAspect="1"/>
+            </wp:cNvGraphicFramePr>
+            <a:graphic xmlns:a="http://schemas.openxmlformats.org/drawingml/2006/main">
+              <a:graphicData uri="http://schemas.openxmlformats.org/drawingml/2006/picture">
+                <pic:pic xmlns:pic="http://schemas.openxmlformats.org/drawingml/2006/picture">
+                  <pic:nvPicPr>
+                    <pic:cNvPr id="1" name=""/>
+                    <pic:cNvPicPr/>
+                  </pic:nvPicPr>
+                  <pic:blipFill>
+                    <a:blip r:embed="rId139"/>
+                    <a:stretch>
+                      <a:fillRect/>
+                    </a:stretch>
+                  </pic:blipFill>
+                  <pic:spPr>
+                    <a:xfrm>
+                      <a:off x="0" y="0"/>
+                      <a:ext cx="2288838" cy="765950"/>
+                    </a:xfrm>
+                    <a:prstGeom prst="rect">
+                      <a:avLst/>
+                    </a:prstGeom>
+                  </pic:spPr>
+                </pic:pic>
+              </a:graphicData>
+            </a:graphic>
+          </wp:inline>
+        </w:drawing>
+      </w:r>
+    </w:p>
+    <w:p>
+      <w:pPr>
+        <w:rPr>
+          <w:color w:val="000000" w:themeColor="text1"/>
+          <w:sz w:val="24"/>
+          <w:szCs w:val="24"/>
+        </w:rPr>
+      </w:pPr>
+      <w:r>
+        <w:rPr>
+          <w:color w:val="000000" w:themeColor="text1"/>
+          <w:sz w:val="24"/>
+          <w:szCs w:val="24"/>
+        </w:rPr>
+        <w:t xml:space="preserve">90- </w:t>
+      </w:r>
+      <w:r>
+        <w:rPr>
+          <w:color w:val="000000" w:themeColor="text1"/>
+          <w:sz w:val="24"/>
+          <w:szCs w:val="24"/>
+        </w:rPr>
+        <w:t xml:space="preserve">Para fazer o degrade tiramos a configuração do </w:t>
+      </w:r>
+      <w:proofErr w:type="spellStart"/>
+      <w:r>
+        <w:rPr>
+          <w:b/>
+          <w:color w:val="000000" w:themeColor="text1"/>
+          <w:sz w:val="24"/>
+          <w:szCs w:val="24"/>
+        </w:rPr>
+        <w:t>main</w:t>
+      </w:r>
+      <w:proofErr w:type="spellEnd"/>
+      <w:r>
+        <w:rPr>
+          <w:color w:val="000000" w:themeColor="text1"/>
+          <w:sz w:val="24"/>
+          <w:szCs w:val="24"/>
+        </w:rPr>
+        <w:t xml:space="preserve"> que era </w:t>
+      </w:r>
+      <w:proofErr w:type="spellStart"/>
+      <w:r>
+        <w:rPr>
+          <w:b/>
+          <w:color w:val="000000" w:themeColor="text1"/>
+          <w:sz w:val="24"/>
+          <w:szCs w:val="24"/>
+        </w:rPr>
+        <w:t>width</w:t>
+      </w:r>
+      <w:proofErr w:type="spellEnd"/>
+      <w:r>
+        <w:rPr>
+          <w:b/>
+          <w:color w:val="000000" w:themeColor="text1"/>
+          <w:sz w:val="24"/>
+          <w:szCs w:val="24"/>
+        </w:rPr>
+        <w:t>:</w:t>
+      </w:r>
+      <w:r>
+        <w:rPr>
+          <w:color w:val="000000" w:themeColor="text1"/>
+          <w:sz w:val="24"/>
+          <w:szCs w:val="24"/>
+        </w:rPr>
+        <w:t xml:space="preserve"> </w:t>
+      </w:r>
+      <w:r>
+        <w:rPr>
+          <w:b/>
+          <w:color w:val="000000" w:themeColor="text1"/>
+          <w:sz w:val="24"/>
+          <w:szCs w:val="24"/>
+        </w:rPr>
+        <w:t>940px</w:t>
+      </w:r>
+      <w:r>
+        <w:rPr>
+          <w:color w:val="000000" w:themeColor="text1"/>
+          <w:sz w:val="24"/>
+          <w:szCs w:val="24"/>
+        </w:rPr>
+        <w:t xml:space="preserve"> e </w:t>
+      </w:r>
+      <w:proofErr w:type="spellStart"/>
+      <w:r>
+        <w:rPr>
+          <w:b/>
+          <w:color w:val="000000" w:themeColor="text1"/>
+          <w:sz w:val="24"/>
+          <w:szCs w:val="24"/>
+        </w:rPr>
+        <w:t>margin</w:t>
+      </w:r>
+      <w:proofErr w:type="spellEnd"/>
+      <w:r>
+        <w:rPr>
+          <w:b/>
+          <w:color w:val="000000" w:themeColor="text1"/>
+          <w:sz w:val="24"/>
+          <w:szCs w:val="24"/>
+        </w:rPr>
+        <w:t>:</w:t>
+      </w:r>
+      <w:r>
+        <w:rPr>
+          <w:color w:val="000000" w:themeColor="text1"/>
+          <w:sz w:val="24"/>
+          <w:szCs w:val="24"/>
+        </w:rPr>
+        <w:t xml:space="preserve"> </w:t>
+      </w:r>
+      <w:r>
+        <w:rPr>
+          <w:b/>
+          <w:color w:val="000000" w:themeColor="text1"/>
+          <w:sz w:val="24"/>
+          <w:szCs w:val="24"/>
+        </w:rPr>
+        <w:t>0</w:t>
+      </w:r>
+      <w:r>
+        <w:rPr>
+          <w:color w:val="000000" w:themeColor="text1"/>
+          <w:sz w:val="24"/>
+          <w:szCs w:val="24"/>
+        </w:rPr>
+        <w:t xml:space="preserve"> auto e colocamos na </w:t>
+      </w:r>
+      <w:proofErr w:type="spellStart"/>
+      <w:r>
+        <w:rPr>
+          <w:b/>
+          <w:color w:val="000000" w:themeColor="text1"/>
+          <w:sz w:val="24"/>
+          <w:szCs w:val="24"/>
+        </w:rPr>
+        <w:t>section</w:t>
+      </w:r>
+      <w:proofErr w:type="spellEnd"/>
+      <w:r>
+        <w:rPr>
+          <w:color w:val="000000" w:themeColor="text1"/>
+          <w:sz w:val="24"/>
+          <w:szCs w:val="24"/>
+        </w:rPr>
+        <w:t xml:space="preserve"> principal e mapa. Assim a cor de fundo da </w:t>
+      </w:r>
+      <w:proofErr w:type="spellStart"/>
+      <w:r>
+        <w:rPr>
+          <w:b/>
+          <w:color w:val="000000" w:themeColor="text1"/>
+          <w:sz w:val="24"/>
+          <w:szCs w:val="24"/>
+        </w:rPr>
+        <w:t>section</w:t>
+      </w:r>
+      <w:proofErr w:type="spellEnd"/>
+      <w:r>
+        <w:rPr>
+          <w:b/>
+          <w:color w:val="000000" w:themeColor="text1"/>
+          <w:sz w:val="24"/>
+          <w:szCs w:val="24"/>
+        </w:rPr>
+        <w:t xml:space="preserve"> benefícios</w:t>
+      </w:r>
+      <w:r>
+        <w:rPr>
+          <w:color w:val="000000" w:themeColor="text1"/>
+          <w:sz w:val="24"/>
+          <w:szCs w:val="24"/>
+        </w:rPr>
+        <w:t xml:space="preserve"> ocupou a largura toda.</w:t>
+      </w:r>
+    </w:p>
+    <w:p>
+      <w:pPr>
+        <w:rPr>
+          <w:color w:val="000000" w:themeColor="text1"/>
+          <w:sz w:val="24"/>
+          <w:szCs w:val="24"/>
+        </w:rPr>
+      </w:pPr>
+      <w:r>
+        <w:rPr>
+          <w:noProof/>
+          <w:color w:val="000000" w:themeColor="text1"/>
+          <w:sz w:val="24"/>
+          <w:szCs w:val="24"/>
+        </w:rPr>
+        <w:drawing>
+          <wp:inline distT="0" distB="0" distL="0" distR="0" wp14:anchorId="29793193" wp14:editId="296F8B2D">
+            <wp:extent cx="2133600" cy="969819"/>
+            <wp:effectExtent l="0" t="0" r="0" b="1905"/>
+            <wp:docPr id="151" name="Imagem 151"/>
+            <wp:cNvGraphicFramePr>
+              <a:graphicFrameLocks xmlns:a="http://schemas.openxmlformats.org/drawingml/2006/main" noChangeAspect="1"/>
+            </wp:cNvGraphicFramePr>
+            <a:graphic xmlns:a="http://schemas.openxmlformats.org/drawingml/2006/main">
+              <a:graphicData uri="http://schemas.openxmlformats.org/drawingml/2006/picture">
+                <pic:pic xmlns:pic="http://schemas.openxmlformats.org/drawingml/2006/picture">
+                  <pic:nvPicPr>
+                    <pic:cNvPr id="1" name=""/>
+                    <pic:cNvPicPr/>
+                  </pic:nvPicPr>
+                  <pic:blipFill>
+                    <a:blip r:embed="rId140"/>
+                    <a:stretch>
+                      <a:fillRect/>
+                    </a:stretch>
+                  </pic:blipFill>
+                  <pic:spPr>
+                    <a:xfrm>
+                      <a:off x="0" y="0"/>
+                      <a:ext cx="2138065" cy="971848"/>
+                    </a:xfrm>
+                    <a:prstGeom prst="rect">
+                      <a:avLst/>
+                    </a:prstGeom>
+                  </pic:spPr>
+                </pic:pic>
+              </a:graphicData>
+            </a:graphic>
+          </wp:inline>
+        </w:drawing>
+      </w:r>
+      <w:r>
+        <w:rPr>
+          <w:noProof/>
+          <w:color w:val="000000" w:themeColor="text1"/>
+          <w:sz w:val="24"/>
+          <w:szCs w:val="24"/>
+        </w:rPr>
+        <w:drawing>
+          <wp:inline distT="0" distB="0" distL="0" distR="0" wp14:anchorId="4AF3D518" wp14:editId="4933B0B2">
+            <wp:extent cx="1590897" cy="962159"/>
+            <wp:effectExtent l="0" t="0" r="9525" b="9525"/>
+            <wp:docPr id="150" name="Imagem 150"/>
+            <wp:cNvGraphicFramePr>
+              <a:graphicFrameLocks xmlns:a="http://schemas.openxmlformats.org/drawingml/2006/main" noChangeAspect="1"/>
+            </wp:cNvGraphicFramePr>
+            <a:graphic xmlns:a="http://schemas.openxmlformats.org/drawingml/2006/main">
+              <a:graphicData uri="http://schemas.openxmlformats.org/drawingml/2006/picture">
+                <pic:pic xmlns:pic="http://schemas.openxmlformats.org/drawingml/2006/picture">
+                  <pic:nvPicPr>
+                    <pic:cNvPr id="1" name=""/>
+                    <pic:cNvPicPr/>
+                  </pic:nvPicPr>
+                  <pic:blipFill>
+                    <a:blip r:embed="rId141"/>
+                    <a:stretch>
+                      <a:fillRect/>
+                    </a:stretch>
+                  </pic:blipFill>
+                  <pic:spPr>
+                    <a:xfrm>
+                      <a:off x="0" y="0"/>
+                      <a:ext cx="1590897" cy="962159"/>
+                    </a:xfrm>
+                    <a:prstGeom prst="rect">
+                      <a:avLst/>
+                    </a:prstGeom>
+                  </pic:spPr>
+                </pic:pic>
+              </a:graphicData>
+            </a:graphic>
+          </wp:inline>
+        </w:drawing>
+      </w:r>
+    </w:p>
+    <w:p>
+      <w:pPr>
+        <w:rPr>
+          <w:b/>
+          <w:color w:val="000000" w:themeColor="text1"/>
+          <w:sz w:val="24"/>
+          <w:szCs w:val="24"/>
+        </w:rPr>
+      </w:pPr>
+      <w:r>
+        <w:rPr>
+          <w:color w:val="000000" w:themeColor="text1"/>
+          <w:sz w:val="24"/>
+          <w:szCs w:val="24"/>
+        </w:rPr>
+        <w:t xml:space="preserve">91- </w:t>
+      </w:r>
+      <w:r>
+        <w:rPr>
+          <w:color w:val="000000" w:themeColor="text1"/>
+          <w:sz w:val="24"/>
+          <w:szCs w:val="24"/>
+        </w:rPr>
+        <w:t>E realizamos o código q ir</w:t>
+      </w:r>
+      <w:r>
+        <w:rPr>
+          <w:color w:val="000000" w:themeColor="text1"/>
+          <w:sz w:val="24"/>
+          <w:szCs w:val="24"/>
+        </w:rPr>
+        <w:t>á</w:t>
+      </w:r>
+      <w:r>
+        <w:rPr>
+          <w:color w:val="000000" w:themeColor="text1"/>
+          <w:sz w:val="24"/>
+          <w:szCs w:val="24"/>
+        </w:rPr>
+        <w:t xml:space="preserve"> fazer </w:t>
+      </w:r>
+      <w:r>
+        <w:rPr>
+          <w:color w:val="000000" w:themeColor="text1"/>
+          <w:sz w:val="24"/>
+          <w:szCs w:val="24"/>
+        </w:rPr>
+        <w:t xml:space="preserve">o </w:t>
+      </w:r>
+      <w:r>
+        <w:rPr>
+          <w:b/>
+          <w:color w:val="000000" w:themeColor="text1"/>
+          <w:sz w:val="24"/>
+          <w:szCs w:val="24"/>
+        </w:rPr>
+        <w:t>degrade</w:t>
+      </w:r>
+      <w:r>
+        <w:rPr>
+          <w:color w:val="000000" w:themeColor="text1"/>
+          <w:sz w:val="24"/>
+          <w:szCs w:val="24"/>
+        </w:rPr>
+        <w:t xml:space="preserve"> na </w:t>
+      </w:r>
+      <w:proofErr w:type="spellStart"/>
+      <w:r>
+        <w:rPr>
+          <w:b/>
+          <w:color w:val="000000" w:themeColor="text1"/>
+          <w:sz w:val="24"/>
+          <w:szCs w:val="24"/>
+        </w:rPr>
+        <w:t>section</w:t>
+      </w:r>
+      <w:proofErr w:type="spellEnd"/>
+      <w:r>
+        <w:rPr>
+          <w:color w:val="000000" w:themeColor="text1"/>
+          <w:sz w:val="24"/>
+          <w:szCs w:val="24"/>
+        </w:rPr>
+        <w:t xml:space="preserve"> </w:t>
+      </w:r>
+      <w:r>
+        <w:rPr>
+          <w:b/>
+          <w:color w:val="000000" w:themeColor="text1"/>
+          <w:sz w:val="24"/>
+          <w:szCs w:val="24"/>
+        </w:rPr>
+        <w:t>mapa</w:t>
+      </w:r>
+      <w:r>
+        <w:rPr>
+          <w:color w:val="000000" w:themeColor="text1"/>
+          <w:sz w:val="24"/>
+          <w:szCs w:val="24"/>
+        </w:rPr>
+        <w:t xml:space="preserve"> porque ela está entre as duas sessões que colocamos cor </w:t>
+      </w:r>
+      <w:proofErr w:type="gramStart"/>
+      <w:r>
+        <w:rPr>
+          <w:b/>
+          <w:color w:val="000000" w:themeColor="text1"/>
+          <w:sz w:val="24"/>
+          <w:szCs w:val="24"/>
+        </w:rPr>
+        <w:t>(.principal</w:t>
+      </w:r>
+      <w:proofErr w:type="gramEnd"/>
+      <w:r>
+        <w:rPr>
+          <w:b/>
+          <w:color w:val="000000" w:themeColor="text1"/>
+          <w:sz w:val="24"/>
+          <w:szCs w:val="24"/>
+        </w:rPr>
+        <w:t xml:space="preserve"> e .benefícios)</w:t>
+      </w:r>
+      <w:r>
+        <w:rPr>
+          <w:b/>
+          <w:color w:val="000000" w:themeColor="text1"/>
+          <w:sz w:val="24"/>
+          <w:szCs w:val="24"/>
+        </w:rPr>
+        <w:t>.</w:t>
+      </w:r>
+    </w:p>
+    <w:p>
+      <w:pPr>
+        <w:rPr>
+          <w:color w:val="000000" w:themeColor="text1"/>
+          <w:sz w:val="24"/>
+          <w:szCs w:val="24"/>
+        </w:rPr>
+      </w:pPr>
+      <w:r>
+        <w:rPr>
+          <w:color w:val="000000" w:themeColor="text1"/>
+          <w:sz w:val="24"/>
+          <w:szCs w:val="24"/>
+        </w:rPr>
+        <w:drawing>
+          <wp:inline distT="0" distB="0" distL="0" distR="0" wp14:anchorId="78A8B5B4" wp14:editId="2D6A058C">
+            <wp:extent cx="4115374" cy="866896"/>
+            <wp:effectExtent l="0" t="0" r="0" b="9525"/>
+            <wp:docPr id="148" name="Imagem 148"/>
+            <wp:cNvGraphicFramePr>
+              <a:graphicFrameLocks xmlns:a="http://schemas.openxmlformats.org/drawingml/2006/main" noChangeAspect="1"/>
+            </wp:cNvGraphicFramePr>
+            <a:graphic xmlns:a="http://schemas.openxmlformats.org/drawingml/2006/main">
+              <a:graphicData uri="http://schemas.openxmlformats.org/drawingml/2006/picture">
+                <pic:pic xmlns:pic="http://schemas.openxmlformats.org/drawingml/2006/picture">
+                  <pic:nvPicPr>
+                    <pic:cNvPr id="1" name=""/>
+                    <pic:cNvPicPr/>
+                  </pic:nvPicPr>
+                  <pic:blipFill>
+                    <a:blip r:embed="rId142"/>
+                    <a:stretch>
+                      <a:fillRect/>
+                    </a:stretch>
+                  </pic:blipFill>
+                  <pic:spPr>
+                    <a:xfrm>
+                      <a:off x="0" y="0"/>
+                      <a:ext cx="4115374" cy="866896"/>
+                    </a:xfrm>
+                    <a:prstGeom prst="rect">
+                      <a:avLst/>
+                    </a:prstGeom>
+                  </pic:spPr>
+                </pic:pic>
+              </a:graphicData>
+            </a:graphic>
+          </wp:inline>
+        </w:drawing>
+      </w:r>
+    </w:p>
+    <w:p>
+      <w:pPr>
+        <w:rPr>
+          <w:color w:val="000000" w:themeColor="text1"/>
+          <w:sz w:val="24"/>
+          <w:szCs w:val="24"/>
+        </w:rPr>
+      </w:pPr>
+      <w:r>
+        <w:rPr>
+          <w:color w:val="000000" w:themeColor="text1"/>
+          <w:sz w:val="24"/>
+          <w:szCs w:val="24"/>
+        </w:rPr>
+        <w:t>92- Opacidade</w:t>
+      </w:r>
+      <w:r>
+        <w:rPr>
+          <w:color w:val="000000" w:themeColor="text1"/>
+          <w:sz w:val="24"/>
+          <w:szCs w:val="24"/>
+        </w:rPr>
+        <w:t>.</w:t>
+      </w:r>
+    </w:p>
+    <w:p>
+      <w:pPr>
+        <w:rPr>
+          <w:color w:val="000000" w:themeColor="text1"/>
+          <w:sz w:val="24"/>
+          <w:szCs w:val="24"/>
+        </w:rPr>
+      </w:pPr>
+      <w:r>
+        <w:rPr>
+          <w:color w:val="000000" w:themeColor="text1"/>
+          <w:sz w:val="24"/>
+          <w:szCs w:val="24"/>
+        </w:rPr>
+        <w:t>O que é opacidade?</w:t>
+      </w:r>
+    </w:p>
+    <w:p>
+      <w:pPr>
+        <w:rPr>
+          <w:color w:val="000000" w:themeColor="text1"/>
+          <w:sz w:val="24"/>
+          <w:szCs w:val="24"/>
+        </w:rPr>
+      </w:pPr>
+      <w:r>
+        <w:rPr>
+          <w:color w:val="000000" w:themeColor="text1"/>
+          <w:sz w:val="24"/>
+          <w:szCs w:val="24"/>
+        </w:rPr>
+        <w:t>É uma camada a mais que coloca em cima do elemento, essa camada ajuda a luz passar ou não, como por exemplo um insulfilme de um carro que ao ser aplicado ajuda que a luz do lado de fora não passa completamente.</w:t>
+      </w:r>
+    </w:p>
+    <w:p>
+      <w:pPr>
+        <w:rPr>
+          <w:color w:val="000000" w:themeColor="text1"/>
+          <w:sz w:val="24"/>
+          <w:szCs w:val="24"/>
+        </w:rPr>
+      </w:pPr>
+      <w:proofErr w:type="spellStart"/>
+      <w:r>
+        <w:rPr>
+          <w:b/>
+          <w:color w:val="000000" w:themeColor="text1"/>
+          <w:sz w:val="24"/>
+          <w:szCs w:val="24"/>
+        </w:rPr>
+        <w:t>Opacity</w:t>
+      </w:r>
+      <w:proofErr w:type="spellEnd"/>
+      <w:r>
+        <w:rPr>
+          <w:color w:val="000000" w:themeColor="text1"/>
+          <w:sz w:val="24"/>
+          <w:szCs w:val="24"/>
+        </w:rPr>
+        <w:t xml:space="preserve"> vai de 1 a 0:</w:t>
+      </w:r>
+    </w:p>
+    <w:p>
+      <w:pPr>
+        <w:rPr>
+          <w:color w:val="000000" w:themeColor="text1"/>
+          <w:sz w:val="24"/>
+          <w:szCs w:val="24"/>
+        </w:rPr>
+      </w:pPr>
+      <w:r>
+        <w:rPr>
+          <w:color w:val="000000" w:themeColor="text1"/>
+          <w:sz w:val="24"/>
+          <w:szCs w:val="24"/>
+        </w:rPr>
+        <w:t>0-</w:t>
+      </w:r>
+      <w:r>
+        <w:rPr>
+          <w:color w:val="000000" w:themeColor="text1"/>
+          <w:sz w:val="24"/>
+          <w:szCs w:val="24"/>
+        </w:rPr>
+        <w:t xml:space="preserve"> </w:t>
+      </w:r>
+      <w:r>
+        <w:rPr>
+          <w:color w:val="000000" w:themeColor="text1"/>
+          <w:sz w:val="24"/>
+          <w:szCs w:val="24"/>
+        </w:rPr>
+        <w:t>Exibe nada</w:t>
+      </w:r>
+      <w:r>
+        <w:rPr>
+          <w:color w:val="000000" w:themeColor="text1"/>
+          <w:sz w:val="24"/>
+          <w:szCs w:val="24"/>
+        </w:rPr>
+        <w:t>.</w:t>
+      </w:r>
+    </w:p>
+    <w:p>
+      <w:pPr>
+        <w:rPr>
+          <w:color w:val="000000" w:themeColor="text1"/>
+          <w:sz w:val="24"/>
+          <w:szCs w:val="24"/>
+        </w:rPr>
+      </w:pPr>
+      <w:r>
+        <w:rPr>
+          <w:color w:val="000000" w:themeColor="text1"/>
+          <w:sz w:val="24"/>
+          <w:szCs w:val="24"/>
+        </w:rPr>
+        <w:t>1-</w:t>
+      </w:r>
+      <w:r>
+        <w:rPr>
+          <w:color w:val="000000" w:themeColor="text1"/>
+          <w:sz w:val="24"/>
+          <w:szCs w:val="24"/>
+        </w:rPr>
+        <w:t xml:space="preserve"> </w:t>
+      </w:r>
+      <w:r>
+        <w:rPr>
+          <w:color w:val="000000" w:themeColor="text1"/>
+          <w:sz w:val="24"/>
+          <w:szCs w:val="24"/>
+        </w:rPr>
+        <w:t>Exibe o elemento inteiro.</w:t>
+      </w:r>
+    </w:p>
+    <w:p>
+      <w:r>
+        <w:drawing>
+          <wp:inline distT="0" distB="0" distL="0" distR="0" wp14:anchorId="6A395BE5" wp14:editId="1294F973">
+            <wp:extent cx="1952898" cy="1619476"/>
+            <wp:effectExtent l="0" t="0" r="9525" b="0"/>
+            <wp:docPr id="152" name="Imagem 152"/>
+            <wp:cNvGraphicFramePr>
+              <a:graphicFrameLocks xmlns:a="http://schemas.openxmlformats.org/drawingml/2006/main" noChangeAspect="1"/>
+            </wp:cNvGraphicFramePr>
+            <a:graphic xmlns:a="http://schemas.openxmlformats.org/drawingml/2006/main">
+              <a:graphicData uri="http://schemas.openxmlformats.org/drawingml/2006/picture">
+                <pic:pic xmlns:pic="http://schemas.openxmlformats.org/drawingml/2006/picture">
+                  <pic:nvPicPr>
+                    <pic:cNvPr id="1" name=""/>
+                    <pic:cNvPicPr/>
+                  </pic:nvPicPr>
+                  <pic:blipFill>
+                    <a:blip r:embed="rId143"/>
+                    <a:stretch>
+                      <a:fillRect/>
+                    </a:stretch>
+                  </pic:blipFill>
+                  <pic:spPr>
+                    <a:xfrm>
+                      <a:off x="0" y="0"/>
+                      <a:ext cx="1952898" cy="1619476"/>
+                    </a:xfrm>
+                    <a:prstGeom prst="rect">
+                      <a:avLst/>
+                    </a:prstGeom>
+                  </pic:spPr>
+                </pic:pic>
+              </a:graphicData>
+            </a:graphic>
+          </wp:inline>
+        </w:drawing>
+      </w:r>
+    </w:p>
+    <w:p>
+      <w:r>
+        <w:t>93- Sobra nos elementos.</w:t>
+      </w:r>
+    </w:p>
+    <w:p>
+      <w:r>
+        <w:t>Como funciona a sombra?</w:t>
+      </w:r>
+    </w:p>
+    <w:p>
+      <w:r>
+        <w:t xml:space="preserve">É como se colocasse uma luz em cima do elemento que vai refletir a sombra em baixo. Na </w:t>
+      </w:r>
+      <w:proofErr w:type="spellStart"/>
+      <w:r>
+        <w:rPr>
+          <w:b/>
+        </w:rPr>
+        <w:t>class</w:t>
+      </w:r>
+      <w:proofErr w:type="spellEnd"/>
+      <w:r>
+        <w:t xml:space="preserve"> </w:t>
+      </w:r>
+      <w:proofErr w:type="spellStart"/>
+      <w:r>
+        <w:rPr>
+          <w:b/>
+        </w:rPr>
+        <w:t>imagembeneficios</w:t>
+      </w:r>
+      <w:proofErr w:type="spellEnd"/>
+      <w:r>
+        <w:t xml:space="preserve"> vamos colocar um </w:t>
+      </w:r>
+      <w:r>
+        <w:rPr>
+          <w:b/>
+        </w:rPr>
+        <w:t>box-</w:t>
+      </w:r>
+      <w:proofErr w:type="spellStart"/>
+      <w:r>
+        <w:rPr>
+          <w:b/>
+        </w:rPr>
+        <w:t>shadow</w:t>
+      </w:r>
+      <w:proofErr w:type="spellEnd"/>
+      <w:r>
+        <w:t>, que significa sombra em caixa, que possui eixo x e y.</w:t>
+      </w:r>
+    </w:p>
+    <w:p>
+      <w:r>
+        <w:drawing>
+          <wp:inline distT="0" distB="0" distL="0" distR="0" wp14:anchorId="38DABFB1" wp14:editId="0D90E3D3">
+            <wp:extent cx="2562583" cy="1000265"/>
+            <wp:effectExtent l="0" t="0" r="0" b="9525"/>
+            <wp:docPr id="153" name="Imagem 153"/>
+            <wp:cNvGraphicFramePr>
+              <a:graphicFrameLocks xmlns:a="http://schemas.openxmlformats.org/drawingml/2006/main" noChangeAspect="1"/>
+            </wp:cNvGraphicFramePr>
+            <a:graphic xmlns:a="http://schemas.openxmlformats.org/drawingml/2006/main">
+              <a:graphicData uri="http://schemas.openxmlformats.org/drawingml/2006/picture">
+                <pic:pic xmlns:pic="http://schemas.openxmlformats.org/drawingml/2006/picture">
+                  <pic:nvPicPr>
+                    <pic:cNvPr id="1" name=""/>
+                    <pic:cNvPicPr/>
+                  </pic:nvPicPr>
+                  <pic:blipFill>
+                    <a:blip r:embed="rId144"/>
+                    <a:stretch>
+                      <a:fillRect/>
+                    </a:stretch>
+                  </pic:blipFill>
+                  <pic:spPr>
+                    <a:xfrm>
+                      <a:off x="0" y="0"/>
+                      <a:ext cx="2562583" cy="1000265"/>
+                    </a:xfrm>
+                    <a:prstGeom prst="rect">
+                      <a:avLst/>
+                    </a:prstGeom>
+                  </pic:spPr>
+                </pic:pic>
+              </a:graphicData>
+            </a:graphic>
+          </wp:inline>
+        </w:drawing>
+      </w:r>
+    </w:p>
+    <w:p>
+      <w:r>
+        <w:t xml:space="preserve">94- Para melhorar o espalhamento da sombra existe um terceiro elemento chamado </w:t>
+      </w:r>
+      <w:proofErr w:type="spellStart"/>
+      <w:r>
+        <w:t>bluer</w:t>
+      </w:r>
+      <w:proofErr w:type="spellEnd"/>
+      <w:r>
+        <w:t xml:space="preserve"> que vai do solido para transparente.</w:t>
+      </w:r>
+    </w:p>
+    <w:p>
+      <w:r>
+        <w:rPr>
+          <w:noProof/>
+        </w:rPr>
+        <w:drawing>
+          <wp:inline distT="0" distB="0" distL="0" distR="0" wp14:anchorId="3867CC99">
+            <wp:extent cx="2896235" cy="1009650"/>
+            <wp:effectExtent l="0" t="0" r="0" b="0"/>
+            <wp:docPr id="154" name="Imagem 154"/>
+            <wp:cNvGraphicFramePr>
+              <a:graphicFrameLocks xmlns:a="http://schemas.openxmlformats.org/drawingml/2006/main" noChangeAspect="1"/>
+            </wp:cNvGraphicFramePr>
+            <a:graphic xmlns:a="http://schemas.openxmlformats.org/drawingml/2006/main">
+              <a:graphicData uri="http://schemas.openxmlformats.org/drawingml/2006/picture">
+                <pic:pic xmlns:pic="http://schemas.openxmlformats.org/drawingml/2006/picture">
+                  <pic:nvPicPr>
+                    <pic:cNvPr id="0" name="Picture 2"/>
+                    <pic:cNvPicPr>
+                      <a:picLocks noChangeAspect="1" noChangeArrowheads="1"/>
+                    </pic:cNvPicPr>
+                  </pic:nvPicPr>
+                  <pic:blipFill>
+                    <a:blip r:embed="rId145">
+                      <a:extLst>
+                        <a:ext uri="{28A0092B-C50C-407E-A947-70E740481C1C}">
+                          <a14:useLocalDpi xmlns:a14="http://schemas.microsoft.com/office/drawing/2010/main" val="0"/>
+                        </a:ext>
+                      </a:extLst>
+                    </a:blip>
+                    <a:srcRect/>
+                    <a:stretch>
+                      <a:fillRect/>
+                    </a:stretch>
+                  </pic:blipFill>
+                  <pic:spPr bwMode="auto">
+                    <a:xfrm>
+                      <a:off x="0" y="0"/>
+                      <a:ext cx="2896235" cy="1009650"/>
+                    </a:xfrm>
+                    <a:prstGeom prst="rect">
+                      <a:avLst/>
+                    </a:prstGeom>
+                    <a:noFill/>
+                  </pic:spPr>
+                </pic:pic>
+              </a:graphicData>
+            </a:graphic>
+          </wp:inline>
+        </w:drawing>
+      </w:r>
+    </w:p>
+    <w:p>
+      <w:r>
+        <w:t xml:space="preserve">95- Temos a quarta propriedade que configura </w:t>
+      </w:r>
+      <w:r>
+        <w:t>a intensidade da borda a partir do tamanho do elemento, isto é, o tamanho da sombra projetada.</w:t>
+      </w:r>
+    </w:p>
+    <w:p>
+      <w:r>
+        <w:drawing>
+          <wp:inline distT="0" distB="0" distL="0" distR="0" wp14:anchorId="6B169C70" wp14:editId="5D7C6EBF">
+            <wp:extent cx="3048000" cy="1001104"/>
+            <wp:effectExtent l="0" t="0" r="0" b="8890"/>
+            <wp:docPr id="155" name="Imagem 155"/>
+            <wp:cNvGraphicFramePr>
+              <a:graphicFrameLocks xmlns:a="http://schemas.openxmlformats.org/drawingml/2006/main" noChangeAspect="1"/>
+            </wp:cNvGraphicFramePr>
+            <a:graphic xmlns:a="http://schemas.openxmlformats.org/drawingml/2006/main">
+              <a:graphicData uri="http://schemas.openxmlformats.org/drawingml/2006/picture">
+                <pic:pic xmlns:pic="http://schemas.openxmlformats.org/drawingml/2006/picture">
+                  <pic:nvPicPr>
+                    <pic:cNvPr id="1" name=""/>
+                    <pic:cNvPicPr/>
+                  </pic:nvPicPr>
+                  <pic:blipFill>
+                    <a:blip r:embed="rId146"/>
+                    <a:stretch>
+                      <a:fillRect/>
+                    </a:stretch>
+                  </pic:blipFill>
+                  <pic:spPr>
+                    <a:xfrm>
+                      <a:off x="0" y="0"/>
+                      <a:ext cx="3067252" cy="1007427"/>
+                    </a:xfrm>
+                    <a:prstGeom prst="rect">
+                      <a:avLst/>
+                    </a:prstGeom>
+                  </pic:spPr>
+                </pic:pic>
+              </a:graphicData>
+            </a:graphic>
+          </wp:inline>
+        </w:drawing>
+      </w:r>
+    </w:p>
+    <w:p>
+      <w:r>
+        <w:t>96- Design responsivo.</w:t>
+      </w:r>
+    </w:p>
+    <w:p>
+      <w:r>
+        <w:t xml:space="preserve">O que podemos </w:t>
+      </w:r>
+      <w:r>
+        <w:t>fazer para saber se nossa página está adaptada para o uso de celular?</w:t>
+      </w:r>
+    </w:p>
+    <w:p>
+      <w:r>
+        <w:t>Tem duas formas de abrir e verificar a ferramenta do desenvolvedor onde observamos se o site está ou não para o celular.</w:t>
+      </w:r>
+    </w:p>
+    <w:p>
+      <w:pPr>
+        <w:pStyle w:val="PargrafodaLista"/>
+        <w:numPr>
+          <w:ilvl w:val="0"/>
+          <w:numId w:val="16"/>
+        </w:numPr>
+        <w:rPr>
+          <w:color w:val="000000" w:themeColor="text1"/>
+          <w:sz w:val="24"/>
+          <w:szCs w:val="24"/>
+        </w:rPr>
+      </w:pPr>
+      <w:proofErr w:type="spellStart"/>
+      <w:r>
+        <w:rPr>
+          <w:color w:val="000000" w:themeColor="text1"/>
+          <w:sz w:val="24"/>
+          <w:szCs w:val="24"/>
+        </w:rPr>
+        <w:t>Ctrl</w:t>
+      </w:r>
+      <w:proofErr w:type="spellEnd"/>
+      <w:r>
+        <w:rPr>
+          <w:color w:val="000000" w:themeColor="text1"/>
+          <w:sz w:val="24"/>
+          <w:szCs w:val="24"/>
+        </w:rPr>
+        <w:t xml:space="preserve"> + shift + i</w:t>
+      </w:r>
+    </w:p>
+    <w:p>
+      <w:pPr>
+        <w:pStyle w:val="PargrafodaLista"/>
+        <w:numPr>
+          <w:ilvl w:val="0"/>
+          <w:numId w:val="16"/>
+        </w:numPr>
+        <w:rPr>
+          <w:color w:val="000000" w:themeColor="text1"/>
+          <w:sz w:val="24"/>
+          <w:szCs w:val="24"/>
+        </w:rPr>
+      </w:pPr>
+      <w:r>
+        <w:rPr>
+          <w:color w:val="000000" w:themeColor="text1"/>
+          <w:sz w:val="24"/>
+          <w:szCs w:val="24"/>
+        </w:rPr>
+        <w:t>F12</w:t>
+      </w:r>
+    </w:p>
+    <w:p>
+      <w:pPr>
+        <w:rPr>
+          <w:color w:val="000000" w:themeColor="text1"/>
+          <w:sz w:val="24"/>
+          <w:szCs w:val="24"/>
+        </w:rPr>
+      </w:pPr>
+      <w:r>
+        <w:rPr>
+          <w:color w:val="000000" w:themeColor="text1"/>
+          <w:sz w:val="24"/>
+          <w:szCs w:val="24"/>
+        </w:rPr>
+        <w:drawing>
+          <wp:inline distT="0" distB="0" distL="0" distR="0" wp14:anchorId="4C3469ED" wp14:editId="25B0FAF3">
+            <wp:extent cx="7038975" cy="3130187"/>
+            <wp:effectExtent l="0" t="0" r="0" b="0"/>
+            <wp:docPr id="156" name="Imagem 156"/>
+            <wp:cNvGraphicFramePr>
+              <a:graphicFrameLocks xmlns:a="http://schemas.openxmlformats.org/drawingml/2006/main" noChangeAspect="1"/>
+            </wp:cNvGraphicFramePr>
+            <a:graphic xmlns:a="http://schemas.openxmlformats.org/drawingml/2006/main">
+              <a:graphicData uri="http://schemas.openxmlformats.org/drawingml/2006/picture">
+                <pic:pic xmlns:pic="http://schemas.openxmlformats.org/drawingml/2006/picture">
+                  <pic:nvPicPr>
+                    <pic:cNvPr id="1" name=""/>
+                    <pic:cNvPicPr/>
+                  </pic:nvPicPr>
+                  <pic:blipFill>
+                    <a:blip r:embed="rId147"/>
+                    <a:stretch>
+                      <a:fillRect/>
+                    </a:stretch>
+                  </pic:blipFill>
+                  <pic:spPr>
+                    <a:xfrm>
+                      <a:off x="0" y="0"/>
+                      <a:ext cx="7077304" cy="3147231"/>
+                    </a:xfrm>
+                    <a:prstGeom prst="rect">
+                      <a:avLst/>
+                    </a:prstGeom>
+                  </pic:spPr>
+                </pic:pic>
+              </a:graphicData>
+            </a:graphic>
+          </wp:inline>
+        </w:drawing>
+      </w:r>
+    </w:p>
+    <w:p>
+      <w:pPr>
+        <w:rPr>
+          <w:color w:val="000000" w:themeColor="text1"/>
+          <w:sz w:val="24"/>
+          <w:szCs w:val="24"/>
+        </w:rPr>
+      </w:pPr>
+      <w:r>
+        <w:rPr>
+          <w:color w:val="000000" w:themeColor="text1"/>
+          <w:sz w:val="24"/>
+          <w:szCs w:val="24"/>
+        </w:rPr>
+        <w:t xml:space="preserve">97- </w:t>
+      </w:r>
       <w:bookmarkStart w:id="0" w:name="_GoBack"/>
       <w:bookmarkEnd w:id="0"/>
-    </w:p>
-    <w:p>
-      <w:pPr>
-        <w:rPr>
-          <w:color w:val="000000" w:themeColor="text1"/>
-          <w:sz w:val="24"/>
-          <w:szCs w:val="24"/>
-        </w:rPr>
-      </w:pPr>
-    </w:p>
-    <w:p>
-      <w:pPr>
-        <w:rPr>
-          <w:color w:val="000000" w:themeColor="text1"/>
-          <w:sz w:val="24"/>
-          <w:szCs w:val="24"/>
-        </w:rPr>
-      </w:pPr>
     </w:p>
     <w:p>
       <w:pPr>
@@ -16415,6 +18070,95 @@
     </w:lvl>
   </w:abstractNum>
   <w:abstractNum w:abstractNumId="1" w15:restartNumberingAfterBreak="0">
+    <w:nsid w:val="05287288"/>
+    <w:multiLevelType w:val="hybridMultilevel"/>
+    <w:tmpl w:val="082CE674"/>
+    <w:lvl w:ilvl="0" w:tplc="6EA2DFEC">
+      <w:start w:val="1"/>
+      <w:numFmt w:val="decimal"/>
+      <w:lvlText w:val="%1-"/>
+      <w:lvlJc w:val="left"/>
+      <w:pPr>
+        <w:ind w:left="720" w:hanging="360"/>
+      </w:pPr>
+      <w:rPr>
+        <w:rFonts w:hint="default"/>
+      </w:rPr>
+    </w:lvl>
+    <w:lvl w:ilvl="1" w:tplc="04160019" w:tentative="1">
+      <w:start w:val="1"/>
+      <w:numFmt w:val="lowerLetter"/>
+      <w:lvlText w:val="%2."/>
+      <w:lvlJc w:val="left"/>
+      <w:pPr>
+        <w:ind w:left="1440" w:hanging="360"/>
+      </w:pPr>
+    </w:lvl>
+    <w:lvl w:ilvl="2" w:tplc="0416001B" w:tentative="1">
+      <w:start w:val="1"/>
+      <w:numFmt w:val="lowerRoman"/>
+      <w:lvlText w:val="%3."/>
+      <w:lvlJc w:val="right"/>
+      <w:pPr>
+        <w:ind w:left="2160" w:hanging="180"/>
+      </w:pPr>
+    </w:lvl>
+    <w:lvl w:ilvl="3" w:tplc="0416000F" w:tentative="1">
+      <w:start w:val="1"/>
+      <w:numFmt w:val="decimal"/>
+      <w:lvlText w:val="%4."/>
+      <w:lvlJc w:val="left"/>
+      <w:pPr>
+        <w:ind w:left="2880" w:hanging="360"/>
+      </w:pPr>
+    </w:lvl>
+    <w:lvl w:ilvl="4" w:tplc="04160019" w:tentative="1">
+      <w:start w:val="1"/>
+      <w:numFmt w:val="lowerLetter"/>
+      <w:lvlText w:val="%5."/>
+      <w:lvlJc w:val="left"/>
+      <w:pPr>
+        <w:ind w:left="3600" w:hanging="360"/>
+      </w:pPr>
+    </w:lvl>
+    <w:lvl w:ilvl="5" w:tplc="0416001B" w:tentative="1">
+      <w:start w:val="1"/>
+      <w:numFmt w:val="lowerRoman"/>
+      <w:lvlText w:val="%6."/>
+      <w:lvlJc w:val="right"/>
+      <w:pPr>
+        <w:ind w:left="4320" w:hanging="180"/>
+      </w:pPr>
+    </w:lvl>
+    <w:lvl w:ilvl="6" w:tplc="0416000F" w:tentative="1">
+      <w:start w:val="1"/>
+      <w:numFmt w:val="decimal"/>
+      <w:lvlText w:val="%7."/>
+      <w:lvlJc w:val="left"/>
+      <w:pPr>
+        <w:ind w:left="5040" w:hanging="360"/>
+      </w:pPr>
+    </w:lvl>
+    <w:lvl w:ilvl="7" w:tplc="04160019" w:tentative="1">
+      <w:start w:val="1"/>
+      <w:numFmt w:val="lowerLetter"/>
+      <w:lvlText w:val="%8."/>
+      <w:lvlJc w:val="left"/>
+      <w:pPr>
+        <w:ind w:left="5760" w:hanging="360"/>
+      </w:pPr>
+    </w:lvl>
+    <w:lvl w:ilvl="8" w:tplc="0416001B" w:tentative="1">
+      <w:start w:val="1"/>
+      <w:numFmt w:val="lowerRoman"/>
+      <w:lvlText w:val="%9."/>
+      <w:lvlJc w:val="right"/>
+      <w:pPr>
+        <w:ind w:left="6480" w:hanging="180"/>
+      </w:pPr>
+    </w:lvl>
+  </w:abstractNum>
+  <w:abstractNum w:abstractNumId="2" w15:restartNumberingAfterBreak="0">
     <w:nsid w:val="0E5F7DAA"/>
     <w:multiLevelType w:val="hybridMultilevel"/>
     <w:tmpl w:val="5A782AC4"/>
@@ -16527,7 +18271,7 @@
       </w:rPr>
     </w:lvl>
   </w:abstractNum>
-  <w:abstractNum w:abstractNumId="2" w15:restartNumberingAfterBreak="0">
+  <w:abstractNum w:abstractNumId="3" w15:restartNumberingAfterBreak="0">
     <w:nsid w:val="1A445747"/>
     <w:multiLevelType w:val="hybridMultilevel"/>
     <w:tmpl w:val="1FB6CAB6"/>
@@ -16640,7 +18384,7 @@
       </w:rPr>
     </w:lvl>
   </w:abstractNum>
-  <w:abstractNum w:abstractNumId="3" w15:restartNumberingAfterBreak="0">
+  <w:abstractNum w:abstractNumId="4" w15:restartNumberingAfterBreak="0">
     <w:nsid w:val="1E8914BE"/>
     <w:multiLevelType w:val="hybridMultilevel"/>
     <w:tmpl w:val="F32ED7BA"/>
@@ -16753,7 +18497,7 @@
       </w:rPr>
     </w:lvl>
   </w:abstractNum>
-  <w:abstractNum w:abstractNumId="4" w15:restartNumberingAfterBreak="0">
+  <w:abstractNum w:abstractNumId="5" w15:restartNumberingAfterBreak="0">
     <w:nsid w:val="327609CD"/>
     <w:multiLevelType w:val="hybridMultilevel"/>
     <w:tmpl w:val="92809BF0"/>
@@ -16866,7 +18610,96 @@
       </w:rPr>
     </w:lvl>
   </w:abstractNum>
-  <w:abstractNum w:abstractNumId="5" w15:restartNumberingAfterBreak="0">
+  <w:abstractNum w:abstractNumId="6" w15:restartNumberingAfterBreak="0">
+    <w:nsid w:val="348873D8"/>
+    <w:multiLevelType w:val="hybridMultilevel"/>
+    <w:tmpl w:val="CB2CCE98"/>
+    <w:lvl w:ilvl="0" w:tplc="29F28708">
+      <w:start w:val="1"/>
+      <w:numFmt w:val="decimal"/>
+      <w:lvlText w:val="%1-"/>
+      <w:lvlJc w:val="left"/>
+      <w:pPr>
+        <w:ind w:left="720" w:hanging="360"/>
+      </w:pPr>
+      <w:rPr>
+        <w:rFonts w:hint="default"/>
+      </w:rPr>
+    </w:lvl>
+    <w:lvl w:ilvl="1" w:tplc="04160019" w:tentative="1">
+      <w:start w:val="1"/>
+      <w:numFmt w:val="lowerLetter"/>
+      <w:lvlText w:val="%2."/>
+      <w:lvlJc w:val="left"/>
+      <w:pPr>
+        <w:ind w:left="1440" w:hanging="360"/>
+      </w:pPr>
+    </w:lvl>
+    <w:lvl w:ilvl="2" w:tplc="0416001B" w:tentative="1">
+      <w:start w:val="1"/>
+      <w:numFmt w:val="lowerRoman"/>
+      <w:lvlText w:val="%3."/>
+      <w:lvlJc w:val="right"/>
+      <w:pPr>
+        <w:ind w:left="2160" w:hanging="180"/>
+      </w:pPr>
+    </w:lvl>
+    <w:lvl w:ilvl="3" w:tplc="0416000F" w:tentative="1">
+      <w:start w:val="1"/>
+      <w:numFmt w:val="decimal"/>
+      <w:lvlText w:val="%4."/>
+      <w:lvlJc w:val="left"/>
+      <w:pPr>
+        <w:ind w:left="2880" w:hanging="360"/>
+      </w:pPr>
+    </w:lvl>
+    <w:lvl w:ilvl="4" w:tplc="04160019" w:tentative="1">
+      <w:start w:val="1"/>
+      <w:numFmt w:val="lowerLetter"/>
+      <w:lvlText w:val="%5."/>
+      <w:lvlJc w:val="left"/>
+      <w:pPr>
+        <w:ind w:left="3600" w:hanging="360"/>
+      </w:pPr>
+    </w:lvl>
+    <w:lvl w:ilvl="5" w:tplc="0416001B" w:tentative="1">
+      <w:start w:val="1"/>
+      <w:numFmt w:val="lowerRoman"/>
+      <w:lvlText w:val="%6."/>
+      <w:lvlJc w:val="right"/>
+      <w:pPr>
+        <w:ind w:left="4320" w:hanging="180"/>
+      </w:pPr>
+    </w:lvl>
+    <w:lvl w:ilvl="6" w:tplc="0416000F" w:tentative="1">
+      <w:start w:val="1"/>
+      <w:numFmt w:val="decimal"/>
+      <w:lvlText w:val="%7."/>
+      <w:lvlJc w:val="left"/>
+      <w:pPr>
+        <w:ind w:left="5040" w:hanging="360"/>
+      </w:pPr>
+    </w:lvl>
+    <w:lvl w:ilvl="7" w:tplc="04160019" w:tentative="1">
+      <w:start w:val="1"/>
+      <w:numFmt w:val="lowerLetter"/>
+      <w:lvlText w:val="%8."/>
+      <w:lvlJc w:val="left"/>
+      <w:pPr>
+        <w:ind w:left="5760" w:hanging="360"/>
+      </w:pPr>
+    </w:lvl>
+    <w:lvl w:ilvl="8" w:tplc="0416001B" w:tentative="1">
+      <w:start w:val="1"/>
+      <w:numFmt w:val="lowerRoman"/>
+      <w:lvlText w:val="%9."/>
+      <w:lvlJc w:val="right"/>
+      <w:pPr>
+        <w:ind w:left="6480" w:hanging="180"/>
+      </w:pPr>
+    </w:lvl>
+  </w:abstractNum>
+  <w:abstractNum w:abstractNumId="7" w15:restartNumberingAfterBreak="0">
     <w:nsid w:val="4137159B"/>
     <w:multiLevelType w:val="hybridMultilevel"/>
     <w:tmpl w:val="432C6DCC"/>
@@ -16979,7 +18812,7 @@
       </w:rPr>
     </w:lvl>
   </w:abstractNum>
-  <w:abstractNum w:abstractNumId="6" w15:restartNumberingAfterBreak="0">
+  <w:abstractNum w:abstractNumId="8" w15:restartNumberingAfterBreak="0">
     <w:nsid w:val="4350088B"/>
     <w:multiLevelType w:val="hybridMultilevel"/>
     <w:tmpl w:val="BB0A0D6C"/>
@@ -17092,7 +18925,7 @@
       </w:rPr>
     </w:lvl>
   </w:abstractNum>
-  <w:abstractNum w:abstractNumId="7" w15:restartNumberingAfterBreak="0">
+  <w:abstractNum w:abstractNumId="9" w15:restartNumberingAfterBreak="0">
     <w:nsid w:val="441A6262"/>
     <w:multiLevelType w:val="hybridMultilevel"/>
     <w:tmpl w:val="2578F122"/>
@@ -17205,7 +19038,7 @@
       </w:rPr>
     </w:lvl>
   </w:abstractNum>
-  <w:abstractNum w:abstractNumId="8" w15:restartNumberingAfterBreak="0">
+  <w:abstractNum w:abstractNumId="10" w15:restartNumberingAfterBreak="0">
     <w:nsid w:val="470B21D8"/>
     <w:multiLevelType w:val="hybridMultilevel"/>
     <w:tmpl w:val="2B862F14"/>
@@ -17318,7 +19151,96 @@
       </w:rPr>
     </w:lvl>
   </w:abstractNum>
-  <w:abstractNum w:abstractNumId="9" w15:restartNumberingAfterBreak="0">
+  <w:abstractNum w:abstractNumId="11" w15:restartNumberingAfterBreak="0">
+    <w:nsid w:val="4A567898"/>
+    <w:multiLevelType w:val="hybridMultilevel"/>
+    <w:tmpl w:val="FEEE9A96"/>
+    <w:lvl w:ilvl="0" w:tplc="B882E552">
+      <w:start w:val="1"/>
+      <w:numFmt w:val="decimal"/>
+      <w:lvlText w:val="%1-"/>
+      <w:lvlJc w:val="left"/>
+      <w:pPr>
+        <w:ind w:left="720" w:hanging="360"/>
+      </w:pPr>
+      <w:rPr>
+        <w:rFonts w:hint="default"/>
+      </w:rPr>
+    </w:lvl>
+    <w:lvl w:ilvl="1" w:tplc="04160019" w:tentative="1">
+      <w:start w:val="1"/>
+      <w:numFmt w:val="lowerLetter"/>
+      <w:lvlText w:val="%2."/>
+      <w:lvlJc w:val="left"/>
+      <w:pPr>
+        <w:ind w:left="1440" w:hanging="360"/>
+      </w:pPr>
+    </w:lvl>
+    <w:lvl w:ilvl="2" w:tplc="0416001B" w:tentative="1">
+      <w:start w:val="1"/>
+      <w:numFmt w:val="lowerRoman"/>
+      <w:lvlText w:val="%3."/>
+      <w:lvlJc w:val="right"/>
+      <w:pPr>
+        <w:ind w:left="2160" w:hanging="180"/>
+      </w:pPr>
+    </w:lvl>
+    <w:lvl w:ilvl="3" w:tplc="0416000F" w:tentative="1">
+      <w:start w:val="1"/>
+      <w:numFmt w:val="decimal"/>
+      <w:lvlText w:val="%4."/>
+      <w:lvlJc w:val="left"/>
+      <w:pPr>
+        <w:ind w:left="2880" w:hanging="360"/>
+      </w:pPr>
+    </w:lvl>
+    <w:lvl w:ilvl="4" w:tplc="04160019" w:tentative="1">
+      <w:start w:val="1"/>
+      <w:numFmt w:val="lowerLetter"/>
+      <w:lvlText w:val="%5."/>
+      <w:lvlJc w:val="left"/>
+      <w:pPr>
+        <w:ind w:left="3600" w:hanging="360"/>
+      </w:pPr>
+    </w:lvl>
+    <w:lvl w:ilvl="5" w:tplc="0416001B" w:tentative="1">
+      <w:start w:val="1"/>
+      <w:numFmt w:val="lowerRoman"/>
+      <w:lvlText w:val="%6."/>
+      <w:lvlJc w:val="right"/>
+      <w:pPr>
+        <w:ind w:left="4320" w:hanging="180"/>
+      </w:pPr>
+    </w:lvl>
+    <w:lvl w:ilvl="6" w:tplc="0416000F" w:tentative="1">
+      <w:start w:val="1"/>
+      <w:numFmt w:val="decimal"/>
+      <w:lvlText w:val="%7."/>
+      <w:lvlJc w:val="left"/>
+      <w:pPr>
+        <w:ind w:left="5040" w:hanging="360"/>
+      </w:pPr>
+    </w:lvl>
+    <w:lvl w:ilvl="7" w:tplc="04160019" w:tentative="1">
+      <w:start w:val="1"/>
+      <w:numFmt w:val="lowerLetter"/>
+      <w:lvlText w:val="%8."/>
+      <w:lvlJc w:val="left"/>
+      <w:pPr>
+        <w:ind w:left="5760" w:hanging="360"/>
+      </w:pPr>
+    </w:lvl>
+    <w:lvl w:ilvl="8" w:tplc="0416001B" w:tentative="1">
+      <w:start w:val="1"/>
+      <w:numFmt w:val="lowerRoman"/>
+      <w:lvlText w:val="%9."/>
+      <w:lvlJc w:val="right"/>
+      <w:pPr>
+        <w:ind w:left="6480" w:hanging="180"/>
+      </w:pPr>
+    </w:lvl>
+  </w:abstractNum>
+  <w:abstractNum w:abstractNumId="12" w15:restartNumberingAfterBreak="0">
     <w:nsid w:val="4BD97793"/>
     <w:multiLevelType w:val="hybridMultilevel"/>
     <w:tmpl w:val="F52C3F50"/>
@@ -17431,7 +19353,96 @@
       </w:rPr>
     </w:lvl>
   </w:abstractNum>
-  <w:abstractNum w:abstractNumId="10" w15:restartNumberingAfterBreak="0">
+  <w:abstractNum w:abstractNumId="13" w15:restartNumberingAfterBreak="0">
+    <w:nsid w:val="4CAD583E"/>
+    <w:multiLevelType w:val="hybridMultilevel"/>
+    <w:tmpl w:val="01709D9A"/>
+    <w:lvl w:ilvl="0" w:tplc="AD26FE4A">
+      <w:start w:val="1"/>
+      <w:numFmt w:val="decimal"/>
+      <w:lvlText w:val="%1-"/>
+      <w:lvlJc w:val="left"/>
+      <w:pPr>
+        <w:ind w:left="720" w:hanging="360"/>
+      </w:pPr>
+      <w:rPr>
+        <w:rFonts w:hint="default"/>
+      </w:rPr>
+    </w:lvl>
+    <w:lvl w:ilvl="1" w:tplc="04160019" w:tentative="1">
+      <w:start w:val="1"/>
+      <w:numFmt w:val="lowerLetter"/>
+      <w:lvlText w:val="%2."/>
+      <w:lvlJc w:val="left"/>
+      <w:pPr>
+        <w:ind w:left="1440" w:hanging="360"/>
+      </w:pPr>
+    </w:lvl>
+    <w:lvl w:ilvl="2" w:tplc="0416001B" w:tentative="1">
+      <w:start w:val="1"/>
+      <w:numFmt w:val="lowerRoman"/>
+      <w:lvlText w:val="%3."/>
+      <w:lvlJc w:val="right"/>
+      <w:pPr>
+        <w:ind w:left="2160" w:hanging="180"/>
+      </w:pPr>
+    </w:lvl>
+    <w:lvl w:ilvl="3" w:tplc="0416000F" w:tentative="1">
+      <w:start w:val="1"/>
+      <w:numFmt w:val="decimal"/>
+      <w:lvlText w:val="%4."/>
+      <w:lvlJc w:val="left"/>
+      <w:pPr>
+        <w:ind w:left="2880" w:hanging="360"/>
+      </w:pPr>
+    </w:lvl>
+    <w:lvl w:ilvl="4" w:tplc="04160019" w:tentative="1">
+      <w:start w:val="1"/>
+      <w:numFmt w:val="lowerLetter"/>
+      <w:lvlText w:val="%5."/>
+      <w:lvlJc w:val="left"/>
+      <w:pPr>
+        <w:ind w:left="3600" w:hanging="360"/>
+      </w:pPr>
+    </w:lvl>
+    <w:lvl w:ilvl="5" w:tplc="0416001B" w:tentative="1">
+      <w:start w:val="1"/>
+      <w:numFmt w:val="lowerRoman"/>
+      <w:lvlText w:val="%6."/>
+      <w:lvlJc w:val="right"/>
+      <w:pPr>
+        <w:ind w:left="4320" w:hanging="180"/>
+      </w:pPr>
+    </w:lvl>
+    <w:lvl w:ilvl="6" w:tplc="0416000F" w:tentative="1">
+      <w:start w:val="1"/>
+      <w:numFmt w:val="decimal"/>
+      <w:lvlText w:val="%7."/>
+      <w:lvlJc w:val="left"/>
+      <w:pPr>
+        <w:ind w:left="5040" w:hanging="360"/>
+      </w:pPr>
+    </w:lvl>
+    <w:lvl w:ilvl="7" w:tplc="04160019" w:tentative="1">
+      <w:start w:val="1"/>
+      <w:numFmt w:val="lowerLetter"/>
+      <w:lvlText w:val="%8."/>
+      <w:lvlJc w:val="left"/>
+      <w:pPr>
+        <w:ind w:left="5760" w:hanging="360"/>
+      </w:pPr>
+    </w:lvl>
+    <w:lvl w:ilvl="8" w:tplc="0416001B" w:tentative="1">
+      <w:start w:val="1"/>
+      <w:numFmt w:val="lowerRoman"/>
+      <w:lvlText w:val="%9."/>
+      <w:lvlJc w:val="right"/>
+      <w:pPr>
+        <w:ind w:left="6480" w:hanging="180"/>
+      </w:pPr>
+    </w:lvl>
+  </w:abstractNum>
+  <w:abstractNum w:abstractNumId="14" w15:restartNumberingAfterBreak="0">
     <w:nsid w:val="67EB77F4"/>
     <w:multiLevelType w:val="hybridMultilevel"/>
     <w:tmpl w:val="1FAA0BA4"/>
@@ -17544,38 +19555,141 @@
       </w:rPr>
     </w:lvl>
   </w:abstractNum>
+  <w:abstractNum w:abstractNumId="15" w15:restartNumberingAfterBreak="0">
+    <w:nsid w:val="75866949"/>
+    <w:multiLevelType w:val="hybridMultilevel"/>
+    <w:tmpl w:val="706668EA"/>
+    <w:lvl w:ilvl="0" w:tplc="BF2EEBE0">
+      <w:numFmt w:val="decimal"/>
+      <w:lvlText w:val="%1-"/>
+      <w:lvlJc w:val="left"/>
+      <w:pPr>
+        <w:ind w:left="720" w:hanging="360"/>
+      </w:pPr>
+      <w:rPr>
+        <w:rFonts w:hint="default"/>
+      </w:rPr>
+    </w:lvl>
+    <w:lvl w:ilvl="1" w:tplc="04160019" w:tentative="1">
+      <w:start w:val="1"/>
+      <w:numFmt w:val="lowerLetter"/>
+      <w:lvlText w:val="%2."/>
+      <w:lvlJc w:val="left"/>
+      <w:pPr>
+        <w:ind w:left="1440" w:hanging="360"/>
+      </w:pPr>
+    </w:lvl>
+    <w:lvl w:ilvl="2" w:tplc="0416001B" w:tentative="1">
+      <w:start w:val="1"/>
+      <w:numFmt w:val="lowerRoman"/>
+      <w:lvlText w:val="%3."/>
+      <w:lvlJc w:val="right"/>
+      <w:pPr>
+        <w:ind w:left="2160" w:hanging="180"/>
+      </w:pPr>
+    </w:lvl>
+    <w:lvl w:ilvl="3" w:tplc="0416000F" w:tentative="1">
+      <w:start w:val="1"/>
+      <w:numFmt w:val="decimal"/>
+      <w:lvlText w:val="%4."/>
+      <w:lvlJc w:val="left"/>
+      <w:pPr>
+        <w:ind w:left="2880" w:hanging="360"/>
+      </w:pPr>
+    </w:lvl>
+    <w:lvl w:ilvl="4" w:tplc="04160019" w:tentative="1">
+      <w:start w:val="1"/>
+      <w:numFmt w:val="lowerLetter"/>
+      <w:lvlText w:val="%5."/>
+      <w:lvlJc w:val="left"/>
+      <w:pPr>
+        <w:ind w:left="3600" w:hanging="360"/>
+      </w:pPr>
+    </w:lvl>
+    <w:lvl w:ilvl="5" w:tplc="0416001B" w:tentative="1">
+      <w:start w:val="1"/>
+      <w:numFmt w:val="lowerRoman"/>
+      <w:lvlText w:val="%6."/>
+      <w:lvlJc w:val="right"/>
+      <w:pPr>
+        <w:ind w:left="4320" w:hanging="180"/>
+      </w:pPr>
+    </w:lvl>
+    <w:lvl w:ilvl="6" w:tplc="0416000F" w:tentative="1">
+      <w:start w:val="1"/>
+      <w:numFmt w:val="decimal"/>
+      <w:lvlText w:val="%7."/>
+      <w:lvlJc w:val="left"/>
+      <w:pPr>
+        <w:ind w:left="5040" w:hanging="360"/>
+      </w:pPr>
+    </w:lvl>
+    <w:lvl w:ilvl="7" w:tplc="04160019" w:tentative="1">
+      <w:start w:val="1"/>
+      <w:numFmt w:val="lowerLetter"/>
+      <w:lvlText w:val="%8."/>
+      <w:lvlJc w:val="left"/>
+      <w:pPr>
+        <w:ind w:left="5760" w:hanging="360"/>
+      </w:pPr>
+    </w:lvl>
+    <w:lvl w:ilvl="8" w:tplc="0416001B" w:tentative="1">
+      <w:start w:val="1"/>
+      <w:numFmt w:val="lowerRoman"/>
+      <w:lvlText w:val="%9."/>
+      <w:lvlJc w:val="right"/>
+      <w:pPr>
+        <w:ind w:left="6480" w:hanging="180"/>
+      </w:pPr>
+    </w:lvl>
+  </w:abstractNum>
   <w:num w:numId="1">
-    <w:abstractNumId w:val="1"/>
+    <w:abstractNumId w:val="2"/>
   </w:num>
   <w:num w:numId="2">
     <w:abstractNumId w:val="0"/>
   </w:num>
   <w:num w:numId="3">
+    <w:abstractNumId w:val="14"/>
+  </w:num>
+  <w:num w:numId="4">
+    <w:abstractNumId w:val="7"/>
+  </w:num>
+  <w:num w:numId="5">
+    <w:abstractNumId w:val="3"/>
+  </w:num>
+  <w:num w:numId="6">
+    <w:abstractNumId w:val="4"/>
+  </w:num>
+  <w:num w:numId="7">
+    <w:abstractNumId w:val="5"/>
+  </w:num>
+  <w:num w:numId="8">
+    <w:abstractNumId w:val="8"/>
+  </w:num>
+  <w:num w:numId="9">
+    <w:abstractNumId w:val="9"/>
+  </w:num>
+  <w:num w:numId="10">
+    <w:abstractNumId w:val="12"/>
+  </w:num>
+  <w:num w:numId="11">
     <w:abstractNumId w:val="10"/>
   </w:num>
-  <w:num w:numId="4">
-    <w:abstractNumId w:val="5"/>
+  <w:num w:numId="12">
+    <w:abstractNumId w:val="1"/>
   </w:num>
-  <w:num w:numId="5">
-    <w:abstractNumId w:val="2"/>
+  <w:num w:numId="13">
+    <w:abstractNumId w:val="11"/>
   </w:num>
-  <w:num w:numId="6">
-    <w:abstractNumId w:val="3"/>
+  <w:num w:numId="14">
+    <w:abstractNumId w:val="15"/>
   </w:num>
-  <w:num w:numId="7">
-    <w:abstractNumId w:val="4"/>
-  </w:num>
-  <w:num w:numId="8">
+  <w:num w:numId="15">
     <w:abstractNumId w:val="6"/>
   </w:num>
-  <w:num w:numId="9">
-    <w:abstractNumId w:val="7"/>
-  </w:num>
-  <w:num w:numId="10">
-    <w:abstractNumId w:val="9"/>
-  </w:num>
-  <w:num w:numId="11">
-    <w:abstractNumId w:val="8"/>
+  <w:num w:numId="16">
+    <w:abstractNumId w:val="13"/>
   </w:num>
 </w:numbering>
 </file>
@@ -18342,7 +20456,7 @@
 </file>
 
 <file path=customXml/itemProps1.xml><?xml version="1.0" encoding="utf-8"?>
-<ds:datastoreItem xmlns:ds="http://schemas.openxmlformats.org/officeDocument/2006/customXml" ds:itemID="{742E8FAD-EEEC-470B-A9DA-744952096A39}">
+<ds:datastoreItem xmlns:ds="http://schemas.openxmlformats.org/officeDocument/2006/customXml" ds:itemID="{8C137BA0-BD97-4031-83CC-8D2DCFBB724F}">
   <ds:schemaRefs>
     <ds:schemaRef ds:uri="http://schemas.openxmlformats.org/officeDocument/2006/bibliography"/>
   </ds:schemaRefs>

</xml_diff>

<commit_message>
atualizacao da aula de ontem
</commit_message>
<xml_diff>
--- a/Apostila/Apostila Space For Men.docx
+++ b/Apostila/Apostila Space For Men.docx
@@ -17320,6 +17320,7 @@
       </w:pPr>
       <w:r>
         <w:rPr>
+          <w:noProof/>
           <w:color w:val="000000" w:themeColor="text1"/>
           <w:sz w:val="24"/>
           <w:szCs w:val="24"/>
@@ -17524,6 +17525,9 @@
     </w:p>
     <w:p>
       <w:r>
+        <w:rPr>
+          <w:noProof/>
+        </w:rPr>
         <w:drawing>
           <wp:inline distT="0" distB="0" distL="0" distR="0" wp14:anchorId="6A395BE5" wp14:editId="1294F973">
             <wp:extent cx="1952898" cy="1619476"/>
@@ -17617,6 +17621,9 @@
     </w:p>
     <w:p>
       <w:r>
+        <w:rPr>
+          <w:noProof/>
+        </w:rPr>
         <w:drawing>
           <wp:inline distT="0" distB="0" distL="0" distR="0" wp14:anchorId="38DABFB1" wp14:editId="0D90E3D3">
             <wp:extent cx="2562583" cy="1000265"/>
@@ -17729,6 +17736,9 @@
     </w:p>
     <w:p>
       <w:r>
+        <w:rPr>
+          <w:noProof/>
+        </w:rPr>
         <w:drawing>
           <wp:inline distT="0" distB="0" distL="0" distR="0" wp14:anchorId="6B169C70" wp14:editId="5D7C6EBF">
             <wp:extent cx="3048000" cy="1001104"/>
@@ -17848,6 +17858,7 @@
       </w:pPr>
       <w:r>
         <w:rPr>
+          <w:noProof/>
           <w:color w:val="000000" w:themeColor="text1"/>
           <w:sz w:val="24"/>
           <w:szCs w:val="24"/>
@@ -17905,17 +17916,523 @@
         </w:rPr>
         <w:t xml:space="preserve">97- </w:t>
       </w:r>
+      <w:r>
+        <w:rPr>
+          <w:color w:val="000000" w:themeColor="text1"/>
+          <w:sz w:val="24"/>
+          <w:szCs w:val="24"/>
+        </w:rPr>
+        <w:t>O código abaixo mostra uma ex</w:t>
+      </w:r>
+      <w:r>
+        <w:rPr>
+          <w:color w:val="000000" w:themeColor="text1"/>
+          <w:sz w:val="24"/>
+          <w:szCs w:val="24"/>
+        </w:rPr>
+        <w:t xml:space="preserve">ceção caso a tela que esteja </w:t>
+      </w:r>
+      <w:proofErr w:type="spellStart"/>
+      <w:r>
+        <w:rPr>
+          <w:color w:val="000000" w:themeColor="text1"/>
+          <w:sz w:val="24"/>
+          <w:szCs w:val="24"/>
+        </w:rPr>
+        <w:t>renderizando</w:t>
+      </w:r>
+      <w:proofErr w:type="spellEnd"/>
+      <w:r>
+        <w:rPr>
+          <w:color w:val="000000" w:themeColor="text1"/>
+          <w:sz w:val="24"/>
+          <w:szCs w:val="24"/>
+        </w:rPr>
+        <w:t xml:space="preserve"> o site seja menor que 480px vai acionar o código de imagem</w:t>
+      </w:r>
+    </w:p>
+    <w:p>
+      <w:pPr>
+        <w:rPr>
+          <w:color w:val="000000" w:themeColor="text1"/>
+          <w:sz w:val="24"/>
+          <w:szCs w:val="24"/>
+        </w:rPr>
+      </w:pPr>
+      <w:r>
+        <w:rPr>
+          <w:color w:val="000000" w:themeColor="text1"/>
+          <w:sz w:val="24"/>
+          <w:szCs w:val="24"/>
+        </w:rPr>
+        <w:drawing>
+          <wp:inline distT="0" distB="0" distL="0" distR="0" wp14:anchorId="6BA54ABB" wp14:editId="11870999">
+            <wp:extent cx="3057952" cy="638264"/>
+            <wp:effectExtent l="0" t="0" r="9525" b="9525"/>
+            <wp:docPr id="157" name="Imagem 157"/>
+            <wp:cNvGraphicFramePr>
+              <a:graphicFrameLocks xmlns:a="http://schemas.openxmlformats.org/drawingml/2006/main" noChangeAspect="1"/>
+            </wp:cNvGraphicFramePr>
+            <a:graphic xmlns:a="http://schemas.openxmlformats.org/drawingml/2006/main">
+              <a:graphicData uri="http://schemas.openxmlformats.org/drawingml/2006/picture">
+                <pic:pic xmlns:pic="http://schemas.openxmlformats.org/drawingml/2006/picture">
+                  <pic:nvPicPr>
+                    <pic:cNvPr id="1" name=""/>
+                    <pic:cNvPicPr/>
+                  </pic:nvPicPr>
+                  <pic:blipFill>
+                    <a:blip r:embed="rId148"/>
+                    <a:stretch>
+                      <a:fillRect/>
+                    </a:stretch>
+                  </pic:blipFill>
+                  <pic:spPr>
+                    <a:xfrm>
+                      <a:off x="0" y="0"/>
+                      <a:ext cx="3057952" cy="638264"/>
+                    </a:xfrm>
+                    <a:prstGeom prst="rect">
+                      <a:avLst/>
+                    </a:prstGeom>
+                  </pic:spPr>
+                </pic:pic>
+              </a:graphicData>
+            </a:graphic>
+          </wp:inline>
+        </w:drawing>
+      </w:r>
+    </w:p>
+    <w:p>
+      <w:pPr>
+        <w:rPr>
+          <w:color w:val="000000" w:themeColor="text1"/>
+          <w:sz w:val="24"/>
+          <w:szCs w:val="24"/>
+        </w:rPr>
+      </w:pPr>
+      <w:r>
+        <w:rPr>
+          <w:color w:val="000000" w:themeColor="text1"/>
+          <w:sz w:val="24"/>
+          <w:szCs w:val="24"/>
+        </w:rPr>
+        <w:t xml:space="preserve">98- </w:t>
+      </w:r>
+      <w:r>
+        <w:rPr>
+          <w:color w:val="000000" w:themeColor="text1"/>
+          <w:sz w:val="24"/>
+          <w:szCs w:val="24"/>
+        </w:rPr>
+        <w:t xml:space="preserve">Para deixar o menu </w:t>
+      </w:r>
+      <w:proofErr w:type="spellStart"/>
+      <w:r>
+        <w:rPr>
+          <w:color w:val="000000" w:themeColor="text1"/>
+          <w:sz w:val="24"/>
+          <w:szCs w:val="24"/>
+        </w:rPr>
+        <w:t>section</w:t>
+      </w:r>
+      <w:proofErr w:type="spellEnd"/>
+      <w:r>
+        <w:rPr>
+          <w:color w:val="000000" w:themeColor="text1"/>
+          <w:sz w:val="24"/>
+          <w:szCs w:val="24"/>
+        </w:rPr>
+        <w:t xml:space="preserve"> principal, mapa, mapa-</w:t>
+      </w:r>
+      <w:proofErr w:type="spellStart"/>
+      <w:r>
+        <w:rPr>
+          <w:color w:val="000000" w:themeColor="text1"/>
+          <w:sz w:val="24"/>
+          <w:szCs w:val="24"/>
+        </w:rPr>
+        <w:t>conteudo</w:t>
+      </w:r>
+      <w:proofErr w:type="spellEnd"/>
+      <w:r>
+        <w:rPr>
+          <w:color w:val="000000" w:themeColor="text1"/>
+          <w:sz w:val="24"/>
+          <w:szCs w:val="24"/>
+        </w:rPr>
+        <w:t xml:space="preserve">, benefícios e vídeos em nossa página index.html responsivo utilizamos a largura </w:t>
+      </w:r>
+      <w:proofErr w:type="spellStart"/>
+      <w:r>
+        <w:rPr>
+          <w:color w:val="000000" w:themeColor="text1"/>
+          <w:sz w:val="24"/>
+          <w:szCs w:val="24"/>
+        </w:rPr>
+        <w:t>width:auto</w:t>
+      </w:r>
+      <w:proofErr w:type="spellEnd"/>
+      <w:r>
+        <w:rPr>
+          <w:color w:val="000000" w:themeColor="text1"/>
+          <w:sz w:val="24"/>
+          <w:szCs w:val="24"/>
+        </w:rPr>
+        <w:t xml:space="preserve"> e se dá porque o nosso site </w:t>
+      </w:r>
+      <w:proofErr w:type="gramStart"/>
+      <w:r>
+        <w:rPr>
+          <w:color w:val="000000" w:themeColor="text1"/>
+          <w:sz w:val="24"/>
+          <w:szCs w:val="24"/>
+        </w:rPr>
+        <w:t>esta</w:t>
+      </w:r>
+      <w:proofErr w:type="gramEnd"/>
+      <w:r>
+        <w:rPr>
+          <w:color w:val="000000" w:themeColor="text1"/>
+          <w:sz w:val="24"/>
+          <w:szCs w:val="24"/>
+        </w:rPr>
+        <w:t xml:space="preserve"> bem estruturado ficando fácil de fazer a parte responsiva conforme imagem</w:t>
+      </w:r>
+    </w:p>
+    <w:p>
+      <w:pPr>
+        <w:rPr>
+          <w:color w:val="000000" w:themeColor="text1"/>
+          <w:sz w:val="24"/>
+          <w:szCs w:val="24"/>
+        </w:rPr>
+      </w:pPr>
+      <w:r>
+        <w:rPr>
+          <w:color w:val="000000" w:themeColor="text1"/>
+          <w:sz w:val="24"/>
+          <w:szCs w:val="24"/>
+        </w:rPr>
+        <w:drawing>
+          <wp:inline distT="0" distB="0" distL="0" distR="0" wp14:anchorId="1D377316" wp14:editId="01EA4536">
+            <wp:extent cx="5464266" cy="790575"/>
+            <wp:effectExtent l="0" t="0" r="3175" b="0"/>
+            <wp:docPr id="158" name="Imagem 158"/>
+            <wp:cNvGraphicFramePr>
+              <a:graphicFrameLocks xmlns:a="http://schemas.openxmlformats.org/drawingml/2006/main" noChangeAspect="1"/>
+            </wp:cNvGraphicFramePr>
+            <a:graphic xmlns:a="http://schemas.openxmlformats.org/drawingml/2006/main">
+              <a:graphicData uri="http://schemas.openxmlformats.org/drawingml/2006/picture">
+                <pic:pic xmlns:pic="http://schemas.openxmlformats.org/drawingml/2006/picture">
+                  <pic:nvPicPr>
+                    <pic:cNvPr id="1" name=""/>
+                    <pic:cNvPicPr/>
+                  </pic:nvPicPr>
+                  <pic:blipFill>
+                    <a:blip r:embed="rId149"/>
+                    <a:stretch>
+                      <a:fillRect/>
+                    </a:stretch>
+                  </pic:blipFill>
+                  <pic:spPr>
+                    <a:xfrm>
+                      <a:off x="0" y="0"/>
+                      <a:ext cx="5466151" cy="790848"/>
+                    </a:xfrm>
+                    <a:prstGeom prst="rect">
+                      <a:avLst/>
+                    </a:prstGeom>
+                  </pic:spPr>
+                </pic:pic>
+              </a:graphicData>
+            </a:graphic>
+          </wp:inline>
+        </w:drawing>
+      </w:r>
+    </w:p>
+    <w:p>
+      <w:pPr>
+        <w:rPr>
+          <w:color w:val="000000" w:themeColor="text1"/>
+          <w:sz w:val="24"/>
+          <w:szCs w:val="24"/>
+        </w:rPr>
+      </w:pPr>
+      <w:r>
+        <w:rPr>
+          <w:color w:val="000000" w:themeColor="text1"/>
+          <w:sz w:val="24"/>
+          <w:szCs w:val="24"/>
+        </w:rPr>
+        <w:t xml:space="preserve">99- </w:t>
+      </w:r>
+      <w:r>
+        <w:rPr>
+          <w:color w:val="000000" w:themeColor="text1"/>
+          <w:sz w:val="24"/>
+          <w:szCs w:val="24"/>
+        </w:rPr>
+        <w:t xml:space="preserve">Para centralizar o logo q </w:t>
+      </w:r>
+      <w:proofErr w:type="gramStart"/>
+      <w:r>
+        <w:rPr>
+          <w:color w:val="000000" w:themeColor="text1"/>
+          <w:sz w:val="24"/>
+          <w:szCs w:val="24"/>
+        </w:rPr>
+        <w:t>esta</w:t>
+      </w:r>
+      <w:proofErr w:type="gramEnd"/>
+      <w:r>
+        <w:rPr>
+          <w:color w:val="000000" w:themeColor="text1"/>
+          <w:sz w:val="24"/>
+          <w:szCs w:val="24"/>
+        </w:rPr>
+        <w:t xml:space="preserve"> dentro do h1 usamos o código abaixo</w:t>
+      </w:r>
+    </w:p>
+    <w:p>
+      <w:pPr>
+        <w:rPr>
+          <w:color w:val="000000" w:themeColor="text1"/>
+          <w:sz w:val="24"/>
+          <w:szCs w:val="24"/>
+        </w:rPr>
+      </w:pPr>
+      <w:r>
+        <w:rPr>
+          <w:color w:val="000000" w:themeColor="text1"/>
+          <w:sz w:val="24"/>
+          <w:szCs w:val="24"/>
+        </w:rPr>
+        <w:drawing>
+          <wp:inline distT="0" distB="0" distL="0" distR="0" wp14:anchorId="1E1A055C" wp14:editId="0E085E0B">
+            <wp:extent cx="5324475" cy="1249773"/>
+            <wp:effectExtent l="0" t="0" r="0" b="7620"/>
+            <wp:docPr id="159" name="Imagem 159"/>
+            <wp:cNvGraphicFramePr>
+              <a:graphicFrameLocks xmlns:a="http://schemas.openxmlformats.org/drawingml/2006/main" noChangeAspect="1"/>
+            </wp:cNvGraphicFramePr>
+            <a:graphic xmlns:a="http://schemas.openxmlformats.org/drawingml/2006/main">
+              <a:graphicData uri="http://schemas.openxmlformats.org/drawingml/2006/picture">
+                <pic:pic xmlns:pic="http://schemas.openxmlformats.org/drawingml/2006/picture">
+                  <pic:nvPicPr>
+                    <pic:cNvPr id="1" name=""/>
+                    <pic:cNvPicPr/>
+                  </pic:nvPicPr>
+                  <pic:blipFill>
+                    <a:blip r:embed="rId150"/>
+                    <a:stretch>
+                      <a:fillRect/>
+                    </a:stretch>
+                  </pic:blipFill>
+                  <pic:spPr>
+                    <a:xfrm>
+                      <a:off x="0" y="0"/>
+                      <a:ext cx="5333180" cy="1251816"/>
+                    </a:xfrm>
+                    <a:prstGeom prst="rect">
+                      <a:avLst/>
+                    </a:prstGeom>
+                  </pic:spPr>
+                </pic:pic>
+              </a:graphicData>
+            </a:graphic>
+          </wp:inline>
+        </w:drawing>
+      </w:r>
+    </w:p>
+    <w:p>
+      <w:pPr>
+        <w:rPr>
+          <w:color w:val="000000" w:themeColor="text1"/>
+          <w:sz w:val="24"/>
+          <w:szCs w:val="24"/>
+        </w:rPr>
+      </w:pPr>
+      <w:r>
+        <w:rPr>
+          <w:color w:val="000000" w:themeColor="text1"/>
+          <w:sz w:val="24"/>
+          <w:szCs w:val="24"/>
+        </w:rPr>
+        <w:t xml:space="preserve">100- Para colocar o menu abaixo do logo utilizamos o position: </w:t>
+      </w:r>
+      <w:proofErr w:type="spellStart"/>
+      <w:r>
+        <w:rPr>
+          <w:color w:val="000000" w:themeColor="text1"/>
+          <w:sz w:val="24"/>
+          <w:szCs w:val="24"/>
+        </w:rPr>
+        <w:t>static</w:t>
+      </w:r>
+      <w:proofErr w:type="spellEnd"/>
+      <w:r>
+        <w:rPr>
+          <w:color w:val="000000" w:themeColor="text1"/>
+          <w:sz w:val="24"/>
+          <w:szCs w:val="24"/>
+        </w:rPr>
+        <w:t xml:space="preserve"> conforme código</w:t>
+      </w:r>
+    </w:p>
+    <w:p>
+      <w:pPr>
+        <w:rPr>
+          <w:color w:val="000000" w:themeColor="text1"/>
+          <w:sz w:val="24"/>
+          <w:szCs w:val="24"/>
+        </w:rPr>
+      </w:pPr>
+      <w:r>
+        <w:rPr>
+          <w:color w:val="000000" w:themeColor="text1"/>
+          <w:sz w:val="24"/>
+          <w:szCs w:val="24"/>
+        </w:rPr>
+        <w:drawing>
+          <wp:inline distT="0" distB="0" distL="0" distR="0" wp14:anchorId="210E16BA" wp14:editId="35DFC8EE">
+            <wp:extent cx="5317406" cy="1666875"/>
+            <wp:effectExtent l="0" t="0" r="0" b="0"/>
+            <wp:docPr id="160" name="Imagem 160"/>
+            <wp:cNvGraphicFramePr>
+              <a:graphicFrameLocks xmlns:a="http://schemas.openxmlformats.org/drawingml/2006/main" noChangeAspect="1"/>
+            </wp:cNvGraphicFramePr>
+            <a:graphic xmlns:a="http://schemas.openxmlformats.org/drawingml/2006/main">
+              <a:graphicData uri="http://schemas.openxmlformats.org/drawingml/2006/picture">
+                <pic:pic xmlns:pic="http://schemas.openxmlformats.org/drawingml/2006/picture">
+                  <pic:nvPicPr>
+                    <pic:cNvPr id="1" name=""/>
+                    <pic:cNvPicPr/>
+                  </pic:nvPicPr>
+                  <pic:blipFill>
+                    <a:blip r:embed="rId151"/>
+                    <a:stretch>
+                      <a:fillRect/>
+                    </a:stretch>
+                  </pic:blipFill>
+                  <pic:spPr>
+                    <a:xfrm>
+                      <a:off x="0" y="0"/>
+                      <a:ext cx="5326897" cy="1669850"/>
+                    </a:xfrm>
+                    <a:prstGeom prst="rect">
+                      <a:avLst/>
+                    </a:prstGeom>
+                  </pic:spPr>
+                </pic:pic>
+              </a:graphicData>
+            </a:graphic>
+          </wp:inline>
+        </w:drawing>
+      </w:r>
+    </w:p>
+    <w:p>
+      <w:pPr>
+        <w:rPr>
+          <w:color w:val="000000" w:themeColor="text1"/>
+          <w:sz w:val="24"/>
+          <w:szCs w:val="24"/>
+        </w:rPr>
+      </w:pPr>
+      <w:r>
+        <w:rPr>
+          <w:color w:val="000000" w:themeColor="text1"/>
+          <w:sz w:val="24"/>
+          <w:szCs w:val="24"/>
+        </w:rPr>
+        <w:t xml:space="preserve">101- </w:t>
+      </w:r>
+      <w:r>
+        <w:rPr>
+          <w:color w:val="000000" w:themeColor="text1"/>
+          <w:sz w:val="24"/>
+          <w:szCs w:val="24"/>
+        </w:rPr>
+        <w:t>Colocamos a lista e a imagem um embaixo do outro pra ficar melhor ao ver no celular</w:t>
+      </w:r>
+    </w:p>
+    <w:p>
+      <w:pPr>
+        <w:rPr>
+          <w:color w:val="000000" w:themeColor="text1"/>
+          <w:sz w:val="24"/>
+          <w:szCs w:val="24"/>
+        </w:rPr>
+      </w:pPr>
+      <w:r>
+        <w:rPr>
+          <w:color w:val="000000" w:themeColor="text1"/>
+          <w:sz w:val="24"/>
+          <w:szCs w:val="24"/>
+        </w:rPr>
+        <w:drawing>
+          <wp:inline distT="0" distB="0" distL="0" distR="0" wp14:anchorId="5DF995CA" wp14:editId="3987B056">
+            <wp:extent cx="5248275" cy="1947889"/>
+            <wp:effectExtent l="0" t="0" r="0" b="0"/>
+            <wp:docPr id="161" name="Imagem 161"/>
+            <wp:cNvGraphicFramePr>
+              <a:graphicFrameLocks xmlns:a="http://schemas.openxmlformats.org/drawingml/2006/main" noChangeAspect="1"/>
+            </wp:cNvGraphicFramePr>
+            <a:graphic xmlns:a="http://schemas.openxmlformats.org/drawingml/2006/main">
+              <a:graphicData uri="http://schemas.openxmlformats.org/drawingml/2006/picture">
+                <pic:pic xmlns:pic="http://schemas.openxmlformats.org/drawingml/2006/picture">
+                  <pic:nvPicPr>
+                    <pic:cNvPr id="1" name=""/>
+                    <pic:cNvPicPr/>
+                  </pic:nvPicPr>
+                  <pic:blipFill>
+                    <a:blip r:embed="rId152"/>
+                    <a:stretch>
+                      <a:fillRect/>
+                    </a:stretch>
+                  </pic:blipFill>
+                  <pic:spPr>
+                    <a:xfrm>
+                      <a:off x="0" y="0"/>
+                      <a:ext cx="5264864" cy="1954046"/>
+                    </a:xfrm>
+                    <a:prstGeom prst="rect">
+                      <a:avLst/>
+                    </a:prstGeom>
+                  </pic:spPr>
+                </pic:pic>
+              </a:graphicData>
+            </a:graphic>
+          </wp:inline>
+        </w:drawing>
+      </w:r>
+    </w:p>
+    <w:p>
+      <w:pPr>
+        <w:rPr>
+          <w:color w:val="000000" w:themeColor="text1"/>
+          <w:sz w:val="24"/>
+          <w:szCs w:val="24"/>
+        </w:rPr>
+      </w:pPr>
+      <w:r>
+        <w:rPr>
+          <w:color w:val="000000" w:themeColor="text1"/>
+          <w:sz w:val="24"/>
+          <w:szCs w:val="24"/>
+        </w:rPr>
+        <w:t>102-</w:t>
+      </w:r>
+    </w:p>
+    <w:p>
+      <w:pPr>
+        <w:rPr>
+          <w:color w:val="000000" w:themeColor="text1"/>
+          <w:sz w:val="24"/>
+          <w:szCs w:val="24"/>
+        </w:rPr>
+      </w:pPr>
       <w:bookmarkStart w:id="0" w:name="_GoBack"/>
       <w:bookmarkEnd w:id="0"/>
-    </w:p>
-    <w:p>
-      <w:pPr>
-        <w:rPr>
-          <w:color w:val="000000" w:themeColor="text1"/>
-          <w:sz w:val="24"/>
-          <w:szCs w:val="24"/>
-        </w:rPr>
-      </w:pPr>
     </w:p>
     <w:p>
       <w:pPr>
@@ -20456,7 +20973,7 @@
 </file>
 
 <file path=customXml/itemProps1.xml><?xml version="1.0" encoding="utf-8"?>
-<ds:datastoreItem xmlns:ds="http://schemas.openxmlformats.org/officeDocument/2006/customXml" ds:itemID="{8C137BA0-BD97-4031-83CC-8D2DCFBB724F}">
+<ds:datastoreItem xmlns:ds="http://schemas.openxmlformats.org/officeDocument/2006/customXml" ds:itemID="{1A278231-F932-4F83-BD06-2B6A0B85A2E2}">
   <ds:schemaRefs>
     <ds:schemaRef ds:uri="http://schemas.openxmlformats.org/officeDocument/2006/bibliography"/>
   </ds:schemaRefs>

</xml_diff>

<commit_message>
atualização da ultima aula
</commit_message>
<xml_diff>
--- a/Apostila/Apostila Space For Men.docx
+++ b/Apostila/Apostila Space For Men.docx
@@ -17667,6 +17667,9 @@
       </w:r>
       <w:proofErr w:type="spellStart"/>
       <w:r>
+        <w:rPr>
+          <w:b/>
+        </w:rPr>
         <w:t>bluer</w:t>
       </w:r>
       <w:proofErr w:type="spellEnd"/>
@@ -17802,6 +17805,7 @@
           <w:numId w:val="16"/>
         </w:numPr>
         <w:rPr>
+          <w:b/>
           <w:color w:val="000000" w:themeColor="text1"/>
           <w:sz w:val="24"/>
           <w:szCs w:val="24"/>
@@ -17810,6 +17814,7 @@
       <w:proofErr w:type="spellStart"/>
       <w:r>
         <w:rPr>
+          <w:b/>
           <w:color w:val="000000" w:themeColor="text1"/>
           <w:sz w:val="24"/>
           <w:szCs w:val="24"/>
@@ -17819,6 +17824,7 @@
       <w:proofErr w:type="spellEnd"/>
       <w:r>
         <w:rPr>
+          <w:b/>
           <w:color w:val="000000" w:themeColor="text1"/>
           <w:sz w:val="24"/>
           <w:szCs w:val="24"/>
@@ -17834,13 +17840,15 @@
           <w:numId w:val="16"/>
         </w:numPr>
         <w:rPr>
-          <w:color w:val="000000" w:themeColor="text1"/>
-          <w:sz w:val="24"/>
-          <w:szCs w:val="24"/>
-        </w:rPr>
-      </w:pPr>
-      <w:r>
-        <w:rPr>
+          <w:b/>
+          <w:color w:val="000000" w:themeColor="text1"/>
+          <w:sz w:val="24"/>
+          <w:szCs w:val="24"/>
+        </w:rPr>
+      </w:pPr>
+      <w:r>
+        <w:rPr>
+          <w:b/>
           <w:color w:val="000000" w:themeColor="text1"/>
           <w:sz w:val="24"/>
           <w:szCs w:val="24"/>
@@ -17948,19 +17956,45 @@
           <w:sz w:val="24"/>
           <w:szCs w:val="24"/>
         </w:rPr>
-        <w:t xml:space="preserve"> o site seja menor que 480px vai acionar o código de imagem</w:t>
-      </w:r>
-    </w:p>
-    <w:p>
-      <w:pPr>
-        <w:rPr>
-          <w:color w:val="000000" w:themeColor="text1"/>
-          <w:sz w:val="24"/>
-          <w:szCs w:val="24"/>
-        </w:rPr>
-      </w:pPr>
-      <w:r>
-        <w:rPr>
+        <w:t xml:space="preserve"> o site seja menor que </w:t>
+      </w:r>
+      <w:r>
+        <w:rPr>
+          <w:b/>
+          <w:color w:val="000000" w:themeColor="text1"/>
+          <w:sz w:val="24"/>
+          <w:szCs w:val="24"/>
+        </w:rPr>
+        <w:t>480px</w:t>
+      </w:r>
+      <w:r>
+        <w:rPr>
+          <w:color w:val="000000" w:themeColor="text1"/>
+          <w:sz w:val="24"/>
+          <w:szCs w:val="24"/>
+        </w:rPr>
+        <w:t xml:space="preserve"> vai acionar o código de imagem</w:t>
+      </w:r>
+      <w:r>
+        <w:rPr>
+          <w:color w:val="000000" w:themeColor="text1"/>
+          <w:sz w:val="24"/>
+          <w:szCs w:val="24"/>
+        </w:rPr>
+        <w:t>.</w:t>
+      </w:r>
+    </w:p>
+    <w:p>
+      <w:pPr>
+        <w:rPr>
+          <w:color w:val="000000" w:themeColor="text1"/>
+          <w:sz w:val="24"/>
+          <w:szCs w:val="24"/>
+        </w:rPr>
+      </w:pPr>
+      <w:r>
+        <w:rPr>
+          <w:noProof/>
           <w:color w:val="000000" w:themeColor="text1"/>
           <w:sz w:val="24"/>
           <w:szCs w:val="24"/>
@@ -18029,6 +18063,7 @@
       <w:proofErr w:type="spellStart"/>
       <w:r>
         <w:rPr>
+          <w:b/>
           <w:color w:val="000000" w:themeColor="text1"/>
           <w:sz w:val="24"/>
           <w:szCs w:val="24"/>
@@ -18042,11 +18077,55 @@
           <w:sz w:val="24"/>
           <w:szCs w:val="24"/>
         </w:rPr>
-        <w:t xml:space="preserve"> principal, mapa, mapa-</w:t>
+        <w:t xml:space="preserve"> </w:t>
+      </w:r>
+      <w:r>
+        <w:rPr>
+          <w:b/>
+          <w:color w:val="000000" w:themeColor="text1"/>
+          <w:sz w:val="24"/>
+          <w:szCs w:val="24"/>
+        </w:rPr>
+        <w:t>principal</w:t>
+      </w:r>
+      <w:r>
+        <w:rPr>
+          <w:color w:val="000000" w:themeColor="text1"/>
+          <w:sz w:val="24"/>
+          <w:szCs w:val="24"/>
+        </w:rPr>
+        <w:t xml:space="preserve">, </w:t>
+      </w:r>
+      <w:r>
+        <w:rPr>
+          <w:b/>
+          <w:color w:val="000000" w:themeColor="text1"/>
+          <w:sz w:val="24"/>
+          <w:szCs w:val="24"/>
+        </w:rPr>
+        <w:t>mapa</w:t>
+      </w:r>
+      <w:r>
+        <w:rPr>
+          <w:color w:val="000000" w:themeColor="text1"/>
+          <w:sz w:val="24"/>
+          <w:szCs w:val="24"/>
+        </w:rPr>
+        <w:t xml:space="preserve">, </w:t>
+      </w:r>
+      <w:r>
+        <w:rPr>
+          <w:b/>
+          <w:color w:val="000000" w:themeColor="text1"/>
+          <w:sz w:val="24"/>
+          <w:szCs w:val="24"/>
+        </w:rPr>
+        <w:t>mapa-</w:t>
       </w:r>
       <w:proofErr w:type="spellStart"/>
       <w:r>
         <w:rPr>
+          <w:b/>
           <w:color w:val="000000" w:themeColor="text1"/>
           <w:sz w:val="24"/>
           <w:szCs w:val="24"/>
@@ -18060,11 +18139,63 @@
           <w:sz w:val="24"/>
           <w:szCs w:val="24"/>
         </w:rPr>
-        <w:t xml:space="preserve">, benefícios e vídeos em nossa página index.html responsivo utilizamos a largura </w:t>
+        <w:t xml:space="preserve">, </w:t>
+      </w:r>
+      <w:r>
+        <w:rPr>
+          <w:b/>
+          <w:color w:val="000000" w:themeColor="text1"/>
+          <w:sz w:val="24"/>
+          <w:szCs w:val="24"/>
+        </w:rPr>
+        <w:t>benefícios</w:t>
+      </w:r>
+      <w:r>
+        <w:rPr>
+          <w:color w:val="000000" w:themeColor="text1"/>
+          <w:sz w:val="24"/>
+          <w:szCs w:val="24"/>
+        </w:rPr>
+        <w:t xml:space="preserve"> e </w:t>
+      </w:r>
+      <w:r>
+        <w:rPr>
+          <w:b/>
+          <w:color w:val="000000" w:themeColor="text1"/>
+          <w:sz w:val="24"/>
+          <w:szCs w:val="24"/>
+        </w:rPr>
+        <w:t>vídeos</w:t>
+      </w:r>
+      <w:r>
+        <w:rPr>
+          <w:color w:val="000000" w:themeColor="text1"/>
+          <w:sz w:val="24"/>
+          <w:szCs w:val="24"/>
+        </w:rPr>
+        <w:t xml:space="preserve"> em nossa página </w:t>
+      </w:r>
+      <w:r>
+        <w:rPr>
+          <w:b/>
+          <w:color w:val="000000" w:themeColor="text1"/>
+          <w:sz w:val="24"/>
+          <w:szCs w:val="24"/>
+        </w:rPr>
+        <w:t>index.html</w:t>
+      </w:r>
+      <w:r>
+        <w:rPr>
+          <w:color w:val="000000" w:themeColor="text1"/>
+          <w:sz w:val="24"/>
+          <w:szCs w:val="24"/>
+        </w:rPr>
+        <w:t xml:space="preserve"> responsivo utilizamos a largura </w:t>
       </w:r>
       <w:proofErr w:type="spellStart"/>
       <w:r>
         <w:rPr>
+          <w:b/>
           <w:color w:val="000000" w:themeColor="text1"/>
           <w:sz w:val="24"/>
           <w:szCs w:val="24"/>
@@ -18098,17 +18229,26 @@
         </w:rPr>
         <w:t xml:space="preserve"> bem estruturado ficando fácil de fazer a parte responsiva conforme imagem</w:t>
       </w:r>
-    </w:p>
-    <w:p>
-      <w:pPr>
-        <w:rPr>
-          <w:color w:val="000000" w:themeColor="text1"/>
-          <w:sz w:val="24"/>
-          <w:szCs w:val="24"/>
-        </w:rPr>
-      </w:pPr>
-      <w:r>
-        <w:rPr>
+      <w:r>
+        <w:rPr>
+          <w:color w:val="000000" w:themeColor="text1"/>
+          <w:sz w:val="24"/>
+          <w:szCs w:val="24"/>
+        </w:rPr>
+        <w:t>.</w:t>
+      </w:r>
+    </w:p>
+    <w:p>
+      <w:pPr>
+        <w:rPr>
+          <w:color w:val="000000" w:themeColor="text1"/>
+          <w:sz w:val="24"/>
+          <w:szCs w:val="24"/>
+        </w:rPr>
+      </w:pPr>
+      <w:r>
+        <w:rPr>
+          <w:noProof/>
           <w:color w:val="000000" w:themeColor="text1"/>
           <w:sz w:val="24"/>
           <w:szCs w:val="24"/>
@@ -18190,19 +18330,45 @@
           <w:sz w:val="24"/>
           <w:szCs w:val="24"/>
         </w:rPr>
-        <w:t xml:space="preserve"> dentro do h1 usamos o código abaixo</w:t>
-      </w:r>
-    </w:p>
-    <w:p>
-      <w:pPr>
-        <w:rPr>
-          <w:color w:val="000000" w:themeColor="text1"/>
-          <w:sz w:val="24"/>
-          <w:szCs w:val="24"/>
-        </w:rPr>
-      </w:pPr>
-      <w:r>
-        <w:rPr>
+        <w:t xml:space="preserve"> dentro do </w:t>
+      </w:r>
+      <w:r>
+        <w:rPr>
+          <w:b/>
+          <w:color w:val="000000" w:themeColor="text1"/>
+          <w:sz w:val="24"/>
+          <w:szCs w:val="24"/>
+        </w:rPr>
+        <w:t>h1</w:t>
+      </w:r>
+      <w:r>
+        <w:rPr>
+          <w:color w:val="000000" w:themeColor="text1"/>
+          <w:sz w:val="24"/>
+          <w:szCs w:val="24"/>
+        </w:rPr>
+        <w:t xml:space="preserve"> usamos o código abaixo</w:t>
+      </w:r>
+      <w:r>
+        <w:rPr>
+          <w:color w:val="000000" w:themeColor="text1"/>
+          <w:sz w:val="24"/>
+          <w:szCs w:val="24"/>
+        </w:rPr>
+        <w:t>.</w:t>
+      </w:r>
+    </w:p>
+    <w:p>
+      <w:pPr>
+        <w:rPr>
+          <w:color w:val="000000" w:themeColor="text1"/>
+          <w:sz w:val="24"/>
+          <w:szCs w:val="24"/>
+        </w:rPr>
+      </w:pPr>
+      <w:r>
+        <w:rPr>
+          <w:noProof/>
           <w:color w:val="000000" w:themeColor="text1"/>
           <w:sz w:val="24"/>
           <w:szCs w:val="24"/>
@@ -18258,11 +18424,21 @@
           <w:sz w:val="24"/>
           <w:szCs w:val="24"/>
         </w:rPr>
-        <w:t xml:space="preserve">100- Para colocar o menu abaixo do logo utilizamos o position: </w:t>
+        <w:t xml:space="preserve">100- Para colocar o menu abaixo do logo utilizamos o </w:t>
+      </w:r>
+      <w:r>
+        <w:rPr>
+          <w:b/>
+          <w:color w:val="000000" w:themeColor="text1"/>
+          <w:sz w:val="24"/>
+          <w:szCs w:val="24"/>
+        </w:rPr>
+        <w:t xml:space="preserve">position: </w:t>
       </w:r>
       <w:proofErr w:type="spellStart"/>
       <w:r>
         <w:rPr>
+          <w:b/>
           <w:color w:val="000000" w:themeColor="text1"/>
           <w:sz w:val="24"/>
           <w:szCs w:val="24"/>
@@ -18278,17 +18454,26 @@
         </w:rPr>
         <w:t xml:space="preserve"> conforme código</w:t>
       </w:r>
-    </w:p>
-    <w:p>
-      <w:pPr>
-        <w:rPr>
-          <w:color w:val="000000" w:themeColor="text1"/>
-          <w:sz w:val="24"/>
-          <w:szCs w:val="24"/>
-        </w:rPr>
-      </w:pPr>
-      <w:r>
-        <w:rPr>
+      <w:r>
+        <w:rPr>
+          <w:color w:val="000000" w:themeColor="text1"/>
+          <w:sz w:val="24"/>
+          <w:szCs w:val="24"/>
+        </w:rPr>
+        <w:t>.</w:t>
+      </w:r>
+    </w:p>
+    <w:p>
+      <w:pPr>
+        <w:rPr>
+          <w:color w:val="000000" w:themeColor="text1"/>
+          <w:sz w:val="24"/>
+          <w:szCs w:val="24"/>
+        </w:rPr>
+      </w:pPr>
+      <w:r>
+        <w:rPr>
+          <w:noProof/>
           <w:color w:val="000000" w:themeColor="text1"/>
           <w:sz w:val="24"/>
           <w:szCs w:val="24"/>
@@ -18354,17 +18539,26 @@
         </w:rPr>
         <w:t>Colocamos a lista e a imagem um embaixo do outro pra ficar melhor ao ver no celular</w:t>
       </w:r>
-    </w:p>
-    <w:p>
-      <w:pPr>
-        <w:rPr>
-          <w:color w:val="000000" w:themeColor="text1"/>
-          <w:sz w:val="24"/>
-          <w:szCs w:val="24"/>
-        </w:rPr>
-      </w:pPr>
-      <w:r>
-        <w:rPr>
+      <w:r>
+        <w:rPr>
+          <w:color w:val="000000" w:themeColor="text1"/>
+          <w:sz w:val="24"/>
+          <w:szCs w:val="24"/>
+        </w:rPr>
+        <w:t>.</w:t>
+      </w:r>
+    </w:p>
+    <w:p>
+      <w:pPr>
+        <w:rPr>
+          <w:color w:val="000000" w:themeColor="text1"/>
+          <w:sz w:val="24"/>
+          <w:szCs w:val="24"/>
+        </w:rPr>
+      </w:pPr>
+      <w:r>
+        <w:rPr>
+          <w:noProof/>
           <w:color w:val="000000" w:themeColor="text1"/>
           <w:sz w:val="24"/>
           <w:szCs w:val="24"/>
@@ -18422,26 +18616,1151 @@
         </w:rPr>
         <w:t>102-</w:t>
       </w:r>
-    </w:p>
-    <w:p>
-      <w:pPr>
-        <w:rPr>
-          <w:color w:val="000000" w:themeColor="text1"/>
-          <w:sz w:val="24"/>
-          <w:szCs w:val="24"/>
-        </w:rPr>
-      </w:pPr>
+      <w:r>
+        <w:rPr>
+          <w:color w:val="000000" w:themeColor="text1"/>
+          <w:sz w:val="24"/>
+          <w:szCs w:val="24"/>
+        </w:rPr>
+        <w:t xml:space="preserve"> Da mesma forma que realizamos no arquivo </w:t>
+      </w:r>
+      <w:r>
+        <w:rPr>
+          <w:b/>
+          <w:color w:val="000000" w:themeColor="text1"/>
+          <w:sz w:val="24"/>
+          <w:szCs w:val="24"/>
+        </w:rPr>
+        <w:t>style.css</w:t>
+      </w:r>
+      <w:r>
+        <w:rPr>
+          <w:color w:val="000000" w:themeColor="text1"/>
+          <w:sz w:val="24"/>
+          <w:szCs w:val="24"/>
+        </w:rPr>
+        <w:t xml:space="preserve"> para deixar a página responsiva vamos fazer o mesmo </w:t>
+      </w:r>
+      <w:r>
+        <w:rPr>
+          <w:color w:val="000000" w:themeColor="text1"/>
+          <w:sz w:val="24"/>
+          <w:szCs w:val="24"/>
+        </w:rPr>
+        <w:t>código conforme imagem abaixo para deixar a página produtos pronta para ser visualizada pelo celular</w:t>
+      </w:r>
+      <w:r>
+        <w:rPr>
+          <w:color w:val="000000" w:themeColor="text1"/>
+          <w:sz w:val="24"/>
+          <w:szCs w:val="24"/>
+        </w:rPr>
+        <w:t>.</w:t>
+      </w:r>
+    </w:p>
+    <w:p>
+      <w:pPr>
+        <w:rPr>
+          <w:color w:val="000000" w:themeColor="text1"/>
+          <w:sz w:val="24"/>
+          <w:szCs w:val="24"/>
+        </w:rPr>
+      </w:pPr>
+      <w:r>
+        <w:rPr>
+          <w:color w:val="000000" w:themeColor="text1"/>
+          <w:sz w:val="24"/>
+          <w:szCs w:val="24"/>
+        </w:rPr>
+        <w:drawing>
+          <wp:inline distT="0" distB="0" distL="0" distR="0" wp14:anchorId="4C8EEEBD" wp14:editId="5BA78762">
+            <wp:extent cx="2819400" cy="715898"/>
+            <wp:effectExtent l="0" t="0" r="0" b="8255"/>
+            <wp:docPr id="162" name="Imagem 162"/>
+            <wp:cNvGraphicFramePr>
+              <a:graphicFrameLocks xmlns:a="http://schemas.openxmlformats.org/drawingml/2006/main" noChangeAspect="1"/>
+            </wp:cNvGraphicFramePr>
+            <a:graphic xmlns:a="http://schemas.openxmlformats.org/drawingml/2006/main">
+              <a:graphicData uri="http://schemas.openxmlformats.org/drawingml/2006/picture">
+                <pic:pic xmlns:pic="http://schemas.openxmlformats.org/drawingml/2006/picture">
+                  <pic:nvPicPr>
+                    <pic:cNvPr id="1" name=""/>
+                    <pic:cNvPicPr/>
+                  </pic:nvPicPr>
+                  <pic:blipFill>
+                    <a:blip r:embed="rId153"/>
+                    <a:stretch>
+                      <a:fillRect/>
+                    </a:stretch>
+                  </pic:blipFill>
+                  <pic:spPr>
+                    <a:xfrm>
+                      <a:off x="0" y="0"/>
+                      <a:ext cx="2824817" cy="717273"/>
+                    </a:xfrm>
+                    <a:prstGeom prst="rect">
+                      <a:avLst/>
+                    </a:prstGeom>
+                  </pic:spPr>
+                </pic:pic>
+              </a:graphicData>
+            </a:graphic>
+          </wp:inline>
+        </w:drawing>
+      </w:r>
+    </w:p>
+    <w:p>
+      <w:pPr>
+        <w:rPr>
+          <w:color w:val="000000" w:themeColor="text1"/>
+          <w:sz w:val="24"/>
+          <w:szCs w:val="24"/>
+        </w:rPr>
+      </w:pPr>
+      <w:r>
+        <w:rPr>
+          <w:color w:val="000000" w:themeColor="text1"/>
+          <w:sz w:val="24"/>
+          <w:szCs w:val="24"/>
+        </w:rPr>
+        <w:t xml:space="preserve">103- </w:t>
+      </w:r>
+      <w:r>
+        <w:rPr>
+          <w:color w:val="000000" w:themeColor="text1"/>
+          <w:sz w:val="24"/>
+          <w:szCs w:val="24"/>
+        </w:rPr>
+        <w:t>Como o menu é o mesmo para as três páginas o código para deixar o menu responsivo se repete</w:t>
+      </w:r>
+      <w:r>
+        <w:rPr>
+          <w:color w:val="000000" w:themeColor="text1"/>
+          <w:sz w:val="24"/>
+          <w:szCs w:val="24"/>
+        </w:rPr>
+        <w:t>.</w:t>
+      </w:r>
+    </w:p>
+    <w:p>
+      <w:pPr>
+        <w:rPr>
+          <w:color w:val="000000" w:themeColor="text1"/>
+          <w:sz w:val="24"/>
+          <w:szCs w:val="24"/>
+        </w:rPr>
+      </w:pPr>
+      <w:r>
+        <w:rPr>
+          <w:color w:val="000000" w:themeColor="text1"/>
+          <w:sz w:val="24"/>
+          <w:szCs w:val="24"/>
+        </w:rPr>
+        <w:drawing>
+          <wp:inline distT="0" distB="0" distL="0" distR="0" wp14:anchorId="0EFBC32C" wp14:editId="6E8F72E8">
+            <wp:extent cx="2733675" cy="1811269"/>
+            <wp:effectExtent l="0" t="0" r="0" b="0"/>
+            <wp:docPr id="163" name="Imagem 163"/>
+            <wp:cNvGraphicFramePr>
+              <a:graphicFrameLocks xmlns:a="http://schemas.openxmlformats.org/drawingml/2006/main" noChangeAspect="1"/>
+            </wp:cNvGraphicFramePr>
+            <a:graphic xmlns:a="http://schemas.openxmlformats.org/drawingml/2006/main">
+              <a:graphicData uri="http://schemas.openxmlformats.org/drawingml/2006/picture">
+                <pic:pic xmlns:pic="http://schemas.openxmlformats.org/drawingml/2006/picture">
+                  <pic:nvPicPr>
+                    <pic:cNvPr id="1" name=""/>
+                    <pic:cNvPicPr/>
+                  </pic:nvPicPr>
+                  <pic:blipFill>
+                    <a:blip r:embed="rId154"/>
+                    <a:stretch>
+                      <a:fillRect/>
+                    </a:stretch>
+                  </pic:blipFill>
+                  <pic:spPr>
+                    <a:xfrm>
+                      <a:off x="0" y="0"/>
+                      <a:ext cx="2745799" cy="1819302"/>
+                    </a:xfrm>
+                    <a:prstGeom prst="rect">
+                      <a:avLst/>
+                    </a:prstGeom>
+                  </pic:spPr>
+                </pic:pic>
+              </a:graphicData>
+            </a:graphic>
+          </wp:inline>
+        </w:drawing>
+      </w:r>
+    </w:p>
+    <w:p>
+      <w:pPr>
+        <w:rPr>
+          <w:color w:val="000000" w:themeColor="text1"/>
+          <w:sz w:val="24"/>
+          <w:szCs w:val="24"/>
+        </w:rPr>
+      </w:pPr>
+      <w:r>
+        <w:rPr>
+          <w:color w:val="000000" w:themeColor="text1"/>
+          <w:sz w:val="24"/>
+          <w:szCs w:val="24"/>
+        </w:rPr>
+        <w:t xml:space="preserve">104- </w:t>
+      </w:r>
+      <w:r>
+        <w:rPr>
+          <w:color w:val="000000" w:themeColor="text1"/>
+          <w:sz w:val="24"/>
+          <w:szCs w:val="24"/>
+        </w:rPr>
+        <w:t xml:space="preserve">Na </w:t>
+      </w:r>
+      <w:proofErr w:type="spellStart"/>
+      <w:proofErr w:type="gramStart"/>
+      <w:r>
+        <w:rPr>
+          <w:b/>
+          <w:color w:val="000000" w:themeColor="text1"/>
+          <w:sz w:val="24"/>
+          <w:szCs w:val="24"/>
+        </w:rPr>
+        <w:t>class</w:t>
+      </w:r>
+      <w:proofErr w:type="spellEnd"/>
+      <w:r>
+        <w:rPr>
+          <w:b/>
+          <w:color w:val="000000" w:themeColor="text1"/>
+          <w:sz w:val="24"/>
+          <w:szCs w:val="24"/>
+        </w:rPr>
+        <w:t xml:space="preserve"> .</w:t>
+      </w:r>
+      <w:r>
+        <w:rPr>
+          <w:b/>
+          <w:color w:val="000000" w:themeColor="text1"/>
+          <w:sz w:val="24"/>
+          <w:szCs w:val="24"/>
+        </w:rPr>
+        <w:t>produtos</w:t>
+      </w:r>
+      <w:proofErr w:type="gramEnd"/>
+      <w:r>
+        <w:rPr>
+          <w:color w:val="000000" w:themeColor="text1"/>
+          <w:sz w:val="24"/>
+          <w:szCs w:val="24"/>
+        </w:rPr>
+        <w:t xml:space="preserve"> colocamos os seguintes códigos:</w:t>
+      </w:r>
+    </w:p>
+    <w:p>
+      <w:pPr>
+        <w:pStyle w:val="PargrafodaLista"/>
+        <w:numPr>
+          <w:ilvl w:val="0"/>
+          <w:numId w:val="17"/>
+        </w:numPr>
+        <w:rPr>
+          <w:color w:val="000000" w:themeColor="text1"/>
+          <w:sz w:val="24"/>
+          <w:szCs w:val="24"/>
+        </w:rPr>
+      </w:pPr>
+      <w:r>
+        <w:rPr>
+          <w:color w:val="000000" w:themeColor="text1"/>
+          <w:sz w:val="24"/>
+          <w:szCs w:val="24"/>
+        </w:rPr>
+        <w:t>Produto aparecer 100% da tela em largura.</w:t>
+      </w:r>
+    </w:p>
+    <w:p>
+      <w:pPr>
+        <w:pStyle w:val="PargrafodaLista"/>
+        <w:numPr>
+          <w:ilvl w:val="0"/>
+          <w:numId w:val="17"/>
+        </w:numPr>
+        <w:rPr>
+          <w:color w:val="000000" w:themeColor="text1"/>
+          <w:sz w:val="24"/>
+          <w:szCs w:val="24"/>
+        </w:rPr>
+      </w:pPr>
+      <w:r>
+        <w:rPr>
+          <w:color w:val="000000" w:themeColor="text1"/>
+          <w:sz w:val="24"/>
+          <w:szCs w:val="24"/>
+        </w:rPr>
+        <w:t xml:space="preserve">Aumentamos o espaço interno </w:t>
+      </w:r>
+      <w:r>
+        <w:rPr>
+          <w:b/>
+          <w:color w:val="000000" w:themeColor="text1"/>
+          <w:sz w:val="24"/>
+          <w:szCs w:val="24"/>
+        </w:rPr>
+        <w:t>10px</w:t>
+      </w:r>
+      <w:r>
+        <w:rPr>
+          <w:color w:val="000000" w:themeColor="text1"/>
+          <w:sz w:val="24"/>
+          <w:szCs w:val="24"/>
+        </w:rPr>
+        <w:t xml:space="preserve"> para todos os lados.</w:t>
+      </w:r>
+    </w:p>
+    <w:p>
+      <w:pPr>
+        <w:pStyle w:val="PargrafodaLista"/>
+        <w:numPr>
+          <w:ilvl w:val="0"/>
+          <w:numId w:val="17"/>
+        </w:numPr>
+        <w:rPr>
+          <w:color w:val="000000" w:themeColor="text1"/>
+          <w:sz w:val="24"/>
+          <w:szCs w:val="24"/>
+        </w:rPr>
+      </w:pPr>
+      <w:r>
+        <w:rPr>
+          <w:color w:val="000000" w:themeColor="text1"/>
+          <w:sz w:val="24"/>
+          <w:szCs w:val="24"/>
+        </w:rPr>
+        <w:t xml:space="preserve">Ao colocar </w:t>
+      </w:r>
+      <w:r>
+        <w:rPr>
+          <w:b/>
+          <w:color w:val="000000" w:themeColor="text1"/>
+          <w:sz w:val="24"/>
+          <w:szCs w:val="24"/>
+        </w:rPr>
+        <w:t>box-</w:t>
+      </w:r>
+      <w:proofErr w:type="spellStart"/>
+      <w:r>
+        <w:rPr>
+          <w:b/>
+          <w:color w:val="000000" w:themeColor="text1"/>
+          <w:sz w:val="24"/>
+          <w:szCs w:val="24"/>
+        </w:rPr>
+        <w:t>sizing</w:t>
+      </w:r>
+      <w:proofErr w:type="spellEnd"/>
+      <w:r>
+        <w:rPr>
+          <w:b/>
+          <w:color w:val="000000" w:themeColor="text1"/>
+          <w:sz w:val="24"/>
+          <w:szCs w:val="24"/>
+        </w:rPr>
+        <w:t>:</w:t>
+      </w:r>
+      <w:r>
+        <w:rPr>
+          <w:color w:val="000000" w:themeColor="text1"/>
+          <w:sz w:val="24"/>
+          <w:szCs w:val="24"/>
+        </w:rPr>
+        <w:t xml:space="preserve"> não contamos o tamanho da borda.</w:t>
+      </w:r>
+    </w:p>
+    <w:p>
+      <w:pPr>
+        <w:rPr>
+          <w:color w:val="000000" w:themeColor="text1"/>
+          <w:sz w:val="24"/>
+          <w:szCs w:val="24"/>
+        </w:rPr>
+      </w:pPr>
+      <w:r>
+        <w:rPr>
+          <w:color w:val="000000" w:themeColor="text1"/>
+          <w:sz w:val="24"/>
+          <w:szCs w:val="24"/>
+        </w:rPr>
+        <w:drawing>
+          <wp:inline distT="0" distB="0" distL="0" distR="0" wp14:anchorId="37D068E9" wp14:editId="297170C6">
+            <wp:extent cx="1866900" cy="850185"/>
+            <wp:effectExtent l="0" t="0" r="0" b="7620"/>
+            <wp:docPr id="165" name="Imagem 165"/>
+            <wp:cNvGraphicFramePr>
+              <a:graphicFrameLocks xmlns:a="http://schemas.openxmlformats.org/drawingml/2006/main" noChangeAspect="1"/>
+            </wp:cNvGraphicFramePr>
+            <a:graphic xmlns:a="http://schemas.openxmlformats.org/drawingml/2006/main">
+              <a:graphicData uri="http://schemas.openxmlformats.org/drawingml/2006/picture">
+                <pic:pic xmlns:pic="http://schemas.openxmlformats.org/drawingml/2006/picture">
+                  <pic:nvPicPr>
+                    <pic:cNvPr id="1" name=""/>
+                    <pic:cNvPicPr/>
+                  </pic:nvPicPr>
+                  <pic:blipFill>
+                    <a:blip r:embed="rId155"/>
+                    <a:stretch>
+                      <a:fillRect/>
+                    </a:stretch>
+                  </pic:blipFill>
+                  <pic:spPr>
+                    <a:xfrm>
+                      <a:off x="0" y="0"/>
+                      <a:ext cx="1873136" cy="853025"/>
+                    </a:xfrm>
+                    <a:prstGeom prst="rect">
+                      <a:avLst/>
+                    </a:prstGeom>
+                  </pic:spPr>
+                </pic:pic>
+              </a:graphicData>
+            </a:graphic>
+          </wp:inline>
+        </w:drawing>
+      </w:r>
+    </w:p>
+    <w:p>
+      <w:pPr>
+        <w:rPr>
+          <w:color w:val="000000" w:themeColor="text1"/>
+          <w:sz w:val="24"/>
+          <w:szCs w:val="24"/>
+        </w:rPr>
+      </w:pPr>
+      <w:r>
+        <w:rPr>
+          <w:color w:val="000000" w:themeColor="text1"/>
+          <w:sz w:val="24"/>
+          <w:szCs w:val="24"/>
+        </w:rPr>
+        <w:t xml:space="preserve">105- Na </w:t>
+      </w:r>
+      <w:proofErr w:type="spellStart"/>
+      <w:proofErr w:type="gramStart"/>
+      <w:r>
+        <w:rPr>
+          <w:b/>
+          <w:color w:val="000000" w:themeColor="text1"/>
+          <w:sz w:val="24"/>
+          <w:szCs w:val="24"/>
+        </w:rPr>
+        <w:t>class</w:t>
+      </w:r>
+      <w:proofErr w:type="spellEnd"/>
+      <w:r>
+        <w:rPr>
+          <w:b/>
+          <w:color w:val="000000" w:themeColor="text1"/>
+          <w:sz w:val="24"/>
+          <w:szCs w:val="24"/>
+        </w:rPr>
+        <w:t xml:space="preserve"> .produtos</w:t>
+      </w:r>
+      <w:proofErr w:type="gramEnd"/>
+      <w:r>
+        <w:rPr>
+          <w:b/>
+          <w:color w:val="000000" w:themeColor="text1"/>
+          <w:sz w:val="24"/>
+          <w:szCs w:val="24"/>
+        </w:rPr>
+        <w:t xml:space="preserve"> li</w:t>
+      </w:r>
+      <w:r>
+        <w:rPr>
+          <w:color w:val="000000" w:themeColor="text1"/>
+          <w:sz w:val="24"/>
+          <w:szCs w:val="24"/>
+        </w:rPr>
+        <w:t xml:space="preserve"> deixamos</w:t>
+      </w:r>
+      <w:r>
+        <w:rPr>
+          <w:color w:val="000000" w:themeColor="text1"/>
+          <w:sz w:val="24"/>
+          <w:szCs w:val="24"/>
+        </w:rPr>
+        <w:t>:</w:t>
+      </w:r>
+    </w:p>
+    <w:p>
+      <w:pPr>
+        <w:pStyle w:val="PargrafodaLista"/>
+        <w:numPr>
+          <w:ilvl w:val="0"/>
+          <w:numId w:val="18"/>
+        </w:numPr>
+        <w:rPr>
+          <w:color w:val="000000" w:themeColor="text1"/>
+          <w:sz w:val="24"/>
+          <w:szCs w:val="24"/>
+        </w:rPr>
+      </w:pPr>
+      <w:r>
+        <w:rPr>
+          <w:color w:val="000000" w:themeColor="text1"/>
+          <w:sz w:val="24"/>
+          <w:szCs w:val="24"/>
+        </w:rPr>
+        <w:t>Cada item de produtos ficar um em baixo do outro</w:t>
+      </w:r>
+      <w:r>
+        <w:rPr>
+          <w:color w:val="000000" w:themeColor="text1"/>
+          <w:sz w:val="24"/>
+          <w:szCs w:val="24"/>
+        </w:rPr>
+        <w:t>.</w:t>
+      </w:r>
+    </w:p>
+    <w:p>
+      <w:pPr>
+        <w:pStyle w:val="PargrafodaLista"/>
+        <w:numPr>
+          <w:ilvl w:val="0"/>
+          <w:numId w:val="18"/>
+        </w:numPr>
+        <w:rPr>
+          <w:color w:val="000000" w:themeColor="text1"/>
+          <w:sz w:val="24"/>
+          <w:szCs w:val="24"/>
+        </w:rPr>
+      </w:pPr>
+      <w:r>
+        <w:rPr>
+          <w:color w:val="000000" w:themeColor="text1"/>
+          <w:sz w:val="24"/>
+          <w:szCs w:val="24"/>
+        </w:rPr>
+        <w:t xml:space="preserve">Cada item do produto aparecer na tela do celular </w:t>
+      </w:r>
+      <w:r>
+        <w:rPr>
+          <w:color w:val="000000" w:themeColor="text1"/>
+          <w:sz w:val="24"/>
+          <w:szCs w:val="24"/>
+        </w:rPr>
+        <w:t>com 100% de largura.</w:t>
+      </w:r>
+    </w:p>
+    <w:p>
+      <w:pPr>
+        <w:pStyle w:val="PargrafodaLista"/>
+        <w:numPr>
+          <w:ilvl w:val="0"/>
+          <w:numId w:val="18"/>
+        </w:numPr>
+        <w:rPr>
+          <w:color w:val="000000" w:themeColor="text1"/>
+          <w:sz w:val="24"/>
+          <w:szCs w:val="24"/>
+        </w:rPr>
+      </w:pPr>
+      <w:r>
+        <w:rPr>
+          <w:color w:val="000000" w:themeColor="text1"/>
+          <w:sz w:val="24"/>
+          <w:szCs w:val="24"/>
+        </w:rPr>
+        <w:t>Demos um espaço externo tanto para cima como para baixo de 10px.</w:t>
+      </w:r>
+    </w:p>
+    <w:p>
+      <w:pPr>
+        <w:pStyle w:val="PargrafodaLista"/>
+        <w:numPr>
+          <w:ilvl w:val="0"/>
+          <w:numId w:val="18"/>
+        </w:numPr>
+        <w:rPr>
+          <w:color w:val="000000" w:themeColor="text1"/>
+          <w:sz w:val="24"/>
+          <w:szCs w:val="24"/>
+        </w:rPr>
+      </w:pPr>
+      <w:r>
+        <w:rPr>
+          <w:color w:val="000000" w:themeColor="text1"/>
+          <w:sz w:val="24"/>
+          <w:szCs w:val="24"/>
+        </w:rPr>
+        <w:t>E utilizamos box-</w:t>
+      </w:r>
+      <w:proofErr w:type="spellStart"/>
+      <w:r>
+        <w:rPr>
+          <w:color w:val="000000" w:themeColor="text1"/>
+          <w:sz w:val="24"/>
+          <w:szCs w:val="24"/>
+        </w:rPr>
+        <w:t>sizing</w:t>
+      </w:r>
+      <w:proofErr w:type="spellEnd"/>
+      <w:r>
+        <w:rPr>
+          <w:color w:val="000000" w:themeColor="text1"/>
+          <w:sz w:val="24"/>
+          <w:szCs w:val="24"/>
+        </w:rPr>
+        <w:t xml:space="preserve"> para contar o valor da borda.</w:t>
+      </w:r>
+    </w:p>
+    <w:p>
+      <w:pPr>
+        <w:rPr>
+          <w:color w:val="000000" w:themeColor="text1"/>
+          <w:sz w:val="24"/>
+          <w:szCs w:val="24"/>
+        </w:rPr>
+      </w:pPr>
+      <w:r>
+        <w:rPr>
+          <w:noProof/>
+          <w:color w:val="000000" w:themeColor="text1"/>
+          <w:sz w:val="24"/>
+          <w:szCs w:val="24"/>
+        </w:rPr>
+        <w:drawing>
+          <wp:inline distT="0" distB="0" distL="0" distR="0" wp14:anchorId="40BE0849">
+            <wp:extent cx="1863672" cy="990600"/>
+            <wp:effectExtent l="0" t="0" r="3810" b="0"/>
+            <wp:docPr id="166" name="Imagem 166"/>
+            <wp:cNvGraphicFramePr>
+              <a:graphicFrameLocks xmlns:a="http://schemas.openxmlformats.org/drawingml/2006/main" noChangeAspect="1"/>
+            </wp:cNvGraphicFramePr>
+            <a:graphic xmlns:a="http://schemas.openxmlformats.org/drawingml/2006/main">
+              <a:graphicData uri="http://schemas.openxmlformats.org/drawingml/2006/picture">
+                <pic:pic xmlns:pic="http://schemas.openxmlformats.org/drawingml/2006/picture">
+                  <pic:nvPicPr>
+                    <pic:cNvPr id="0" name="Picture 2"/>
+                    <pic:cNvPicPr>
+                      <a:picLocks noChangeAspect="1" noChangeArrowheads="1"/>
+                    </pic:cNvPicPr>
+                  </pic:nvPicPr>
+                  <pic:blipFill>
+                    <a:blip r:embed="rId156">
+                      <a:extLst>
+                        <a:ext uri="{28A0092B-C50C-407E-A947-70E740481C1C}">
+                          <a14:useLocalDpi xmlns:a14="http://schemas.microsoft.com/office/drawing/2010/main" val="0"/>
+                        </a:ext>
+                      </a:extLst>
+                    </a:blip>
+                    <a:srcRect/>
+                    <a:stretch>
+                      <a:fillRect/>
+                    </a:stretch>
+                  </pic:blipFill>
+                  <pic:spPr bwMode="auto">
+                    <a:xfrm>
+                      <a:off x="0" y="0"/>
+                      <a:ext cx="1870218" cy="994079"/>
+                    </a:xfrm>
+                    <a:prstGeom prst="rect">
+                      <a:avLst/>
+                    </a:prstGeom>
+                    <a:noFill/>
+                  </pic:spPr>
+                </pic:pic>
+              </a:graphicData>
+            </a:graphic>
+          </wp:inline>
+        </w:drawing>
+      </w:r>
+    </w:p>
+    <w:p>
+      <w:pPr>
+        <w:rPr>
+          <w:color w:val="000000" w:themeColor="text1"/>
+          <w:sz w:val="24"/>
+          <w:szCs w:val="24"/>
+        </w:rPr>
+      </w:pPr>
+      <w:r>
+        <w:rPr>
+          <w:color w:val="000000" w:themeColor="text1"/>
+          <w:sz w:val="24"/>
+          <w:szCs w:val="24"/>
+        </w:rPr>
+        <w:t xml:space="preserve">106- </w:t>
+      </w:r>
+      <w:r>
+        <w:rPr>
+          <w:color w:val="000000" w:themeColor="text1"/>
+          <w:sz w:val="24"/>
+          <w:szCs w:val="24"/>
+        </w:rPr>
+        <w:t>Na página dos contatos para deixar responsiva colocamos os seguintes códigos:</w:t>
+      </w:r>
+    </w:p>
+    <w:p>
+      <w:pPr>
+        <w:pStyle w:val="PargrafodaLista"/>
+        <w:numPr>
+          <w:ilvl w:val="0"/>
+          <w:numId w:val="20"/>
+        </w:numPr>
+        <w:rPr>
+          <w:color w:val="000000" w:themeColor="text1"/>
+          <w:sz w:val="24"/>
+          <w:szCs w:val="24"/>
+        </w:rPr>
+      </w:pPr>
+      <w:r>
+        <w:rPr>
+          <w:color w:val="000000" w:themeColor="text1"/>
+          <w:sz w:val="24"/>
+          <w:szCs w:val="24"/>
+        </w:rPr>
+        <w:t>Deixamos o menu responsivo utilizando o código anterior das páginas index.html e produtos.html.</w:t>
+      </w:r>
+    </w:p>
+    <w:p>
+      <w:pPr>
+        <w:rPr>
+          <w:color w:val="000000" w:themeColor="text1"/>
+          <w:sz w:val="24"/>
+          <w:szCs w:val="24"/>
+        </w:rPr>
+      </w:pPr>
+      <w:r>
+        <w:rPr>
+          <w:color w:val="000000" w:themeColor="text1"/>
+          <w:sz w:val="24"/>
+          <w:szCs w:val="24"/>
+        </w:rPr>
+        <w:drawing>
+          <wp:inline distT="0" distB="0" distL="0" distR="0" wp14:anchorId="03EE7179" wp14:editId="76D1F6A8">
+            <wp:extent cx="2533650" cy="1958527"/>
+            <wp:effectExtent l="0" t="0" r="0" b="3810"/>
+            <wp:docPr id="167" name="Imagem 167"/>
+            <wp:cNvGraphicFramePr>
+              <a:graphicFrameLocks xmlns:a="http://schemas.openxmlformats.org/drawingml/2006/main" noChangeAspect="1"/>
+            </wp:cNvGraphicFramePr>
+            <a:graphic xmlns:a="http://schemas.openxmlformats.org/drawingml/2006/main">
+              <a:graphicData uri="http://schemas.openxmlformats.org/drawingml/2006/picture">
+                <pic:pic xmlns:pic="http://schemas.openxmlformats.org/drawingml/2006/picture">
+                  <pic:nvPicPr>
+                    <pic:cNvPr id="1" name=""/>
+                    <pic:cNvPicPr/>
+                  </pic:nvPicPr>
+                  <pic:blipFill>
+                    <a:blip r:embed="rId157"/>
+                    <a:stretch>
+                      <a:fillRect/>
+                    </a:stretch>
+                  </pic:blipFill>
+                  <pic:spPr>
+                    <a:xfrm>
+                      <a:off x="0" y="0"/>
+                      <a:ext cx="2541114" cy="1964297"/>
+                    </a:xfrm>
+                    <a:prstGeom prst="rect">
+                      <a:avLst/>
+                    </a:prstGeom>
+                  </pic:spPr>
+                </pic:pic>
+              </a:graphicData>
+            </a:graphic>
+          </wp:inline>
+        </w:drawing>
+      </w:r>
+    </w:p>
+    <w:p>
+      <w:pPr>
+        <w:rPr>
+          <w:color w:val="000000" w:themeColor="text1"/>
+          <w:sz w:val="24"/>
+          <w:szCs w:val="24"/>
+        </w:rPr>
+      </w:pPr>
+      <w:r>
+        <w:rPr>
+          <w:color w:val="000000" w:themeColor="text1"/>
+          <w:sz w:val="24"/>
+          <w:szCs w:val="24"/>
+        </w:rPr>
+        <w:t xml:space="preserve">107- No </w:t>
+      </w:r>
+      <w:proofErr w:type="spellStart"/>
+      <w:r>
+        <w:rPr>
+          <w:color w:val="000000" w:themeColor="text1"/>
+          <w:sz w:val="24"/>
+          <w:szCs w:val="24"/>
+        </w:rPr>
+        <w:t>main</w:t>
+      </w:r>
+      <w:proofErr w:type="spellEnd"/>
+      <w:r>
+        <w:rPr>
+          <w:color w:val="000000" w:themeColor="text1"/>
+          <w:sz w:val="24"/>
+          <w:szCs w:val="24"/>
+        </w:rPr>
+        <w:t xml:space="preserve"> onde se encontra o formulário deixamos que a largura seja automática e demos um espaço interno para a esquerda co</w:t>
+      </w:r>
+      <w:r>
+        <w:rPr>
+          <w:color w:val="000000" w:themeColor="text1"/>
+          <w:sz w:val="24"/>
+          <w:szCs w:val="24"/>
+        </w:rPr>
+        <w:t>n</w:t>
+      </w:r>
+      <w:r>
+        <w:rPr>
+          <w:color w:val="000000" w:themeColor="text1"/>
+          <w:sz w:val="24"/>
+          <w:szCs w:val="24"/>
+        </w:rPr>
+        <w:t>forme código</w:t>
+      </w:r>
+      <w:r>
+        <w:rPr>
+          <w:color w:val="000000" w:themeColor="text1"/>
+          <w:sz w:val="24"/>
+          <w:szCs w:val="24"/>
+        </w:rPr>
+        <w:br/>
+      </w:r>
+      <w:r>
+        <w:rPr>
+          <w:noProof/>
+          <w:color w:val="000000" w:themeColor="text1"/>
+          <w:sz w:val="24"/>
+          <w:szCs w:val="24"/>
+        </w:rPr>
+        <w:drawing>
+          <wp:inline distT="0" distB="0" distL="0" distR="0" wp14:anchorId="30023113">
+            <wp:extent cx="1701165" cy="723900"/>
+            <wp:effectExtent l="0" t="0" r="0" b="0"/>
+            <wp:docPr id="168" name="Imagem 168"/>
+            <wp:cNvGraphicFramePr>
+              <a:graphicFrameLocks xmlns:a="http://schemas.openxmlformats.org/drawingml/2006/main" noChangeAspect="1"/>
+            </wp:cNvGraphicFramePr>
+            <a:graphic xmlns:a="http://schemas.openxmlformats.org/drawingml/2006/main">
+              <a:graphicData uri="http://schemas.openxmlformats.org/drawingml/2006/picture">
+                <pic:pic xmlns:pic="http://schemas.openxmlformats.org/drawingml/2006/picture">
+                  <pic:nvPicPr>
+                    <pic:cNvPr id="0" name="Picture 3"/>
+                    <pic:cNvPicPr>
+                      <a:picLocks noChangeAspect="1" noChangeArrowheads="1"/>
+                    </pic:cNvPicPr>
+                  </pic:nvPicPr>
+                  <pic:blipFill>
+                    <a:blip r:embed="rId158">
+                      <a:extLst>
+                        <a:ext uri="{28A0092B-C50C-407E-A947-70E740481C1C}">
+                          <a14:useLocalDpi xmlns:a14="http://schemas.microsoft.com/office/drawing/2010/main" val="0"/>
+                        </a:ext>
+                      </a:extLst>
+                    </a:blip>
+                    <a:srcRect/>
+                    <a:stretch>
+                      <a:fillRect/>
+                    </a:stretch>
+                  </pic:blipFill>
+                  <pic:spPr bwMode="auto">
+                    <a:xfrm>
+                      <a:off x="0" y="0"/>
+                      <a:ext cx="1702096" cy="724296"/>
+                    </a:xfrm>
+                    <a:prstGeom prst="rect">
+                      <a:avLst/>
+                    </a:prstGeom>
+                    <a:noFill/>
+                  </pic:spPr>
+                </pic:pic>
+              </a:graphicData>
+            </a:graphic>
+          </wp:inline>
+        </w:drawing>
+      </w:r>
+    </w:p>
+    <w:p>
+      <w:pPr>
+        <w:rPr>
+          <w:color w:val="000000" w:themeColor="text1"/>
+          <w:sz w:val="24"/>
+          <w:szCs w:val="24"/>
+        </w:rPr>
+      </w:pPr>
+      <w:r>
+        <w:rPr>
+          <w:color w:val="000000" w:themeColor="text1"/>
+          <w:sz w:val="24"/>
+          <w:szCs w:val="24"/>
+        </w:rPr>
+        <w:t xml:space="preserve">108- No input deixamos da seguinte forma </w:t>
+      </w:r>
+    </w:p>
+    <w:p>
+      <w:pPr>
+        <w:pStyle w:val="PargrafodaLista"/>
+        <w:numPr>
+          <w:ilvl w:val="0"/>
+          <w:numId w:val="20"/>
+        </w:numPr>
+        <w:rPr>
+          <w:color w:val="000000" w:themeColor="text1"/>
+          <w:sz w:val="24"/>
+          <w:szCs w:val="24"/>
+        </w:rPr>
+      </w:pPr>
+      <w:r>
+        <w:rPr>
+          <w:color w:val="000000" w:themeColor="text1"/>
+          <w:sz w:val="24"/>
+          <w:szCs w:val="24"/>
+        </w:rPr>
+        <w:t>Para cada item dos inputs-padrão ocupasse 90% de largura.</w:t>
+      </w:r>
+    </w:p>
+    <w:p>
+      <w:pPr>
+        <w:pStyle w:val="PargrafodaLista"/>
+        <w:numPr>
+          <w:ilvl w:val="0"/>
+          <w:numId w:val="20"/>
+        </w:numPr>
+        <w:rPr>
+          <w:color w:val="000000" w:themeColor="text1"/>
+          <w:sz w:val="24"/>
+          <w:szCs w:val="24"/>
+        </w:rPr>
+      </w:pPr>
+      <w:r>
+        <w:rPr>
+          <w:color w:val="000000" w:themeColor="text1"/>
+          <w:sz w:val="24"/>
+          <w:szCs w:val="24"/>
+        </w:rPr>
+        <w:t>E demos um espaço interno para todos os lados de 10px.</w:t>
+      </w:r>
+    </w:p>
+    <w:p>
+      <w:pPr>
+        <w:rPr>
+          <w:color w:val="000000" w:themeColor="text1"/>
+          <w:sz w:val="24"/>
+          <w:szCs w:val="24"/>
+        </w:rPr>
+      </w:pPr>
+      <w:r>
+        <w:rPr>
+          <w:noProof/>
+          <w:color w:val="000000" w:themeColor="text1"/>
+          <w:sz w:val="24"/>
+          <w:szCs w:val="24"/>
+        </w:rPr>
+        <w:drawing>
+          <wp:inline distT="0" distB="0" distL="0" distR="0" wp14:anchorId="4BB8FEB2">
+            <wp:extent cx="1343025" cy="717507"/>
+            <wp:effectExtent l="0" t="0" r="0" b="6985"/>
+            <wp:docPr id="169" name="Imagem 169"/>
+            <wp:cNvGraphicFramePr>
+              <a:graphicFrameLocks xmlns:a="http://schemas.openxmlformats.org/drawingml/2006/main" noChangeAspect="1"/>
+            </wp:cNvGraphicFramePr>
+            <a:graphic xmlns:a="http://schemas.openxmlformats.org/drawingml/2006/main">
+              <a:graphicData uri="http://schemas.openxmlformats.org/drawingml/2006/picture">
+                <pic:pic xmlns:pic="http://schemas.openxmlformats.org/drawingml/2006/picture">
+                  <pic:nvPicPr>
+                    <pic:cNvPr id="0" name="Picture 4"/>
+                    <pic:cNvPicPr>
+                      <a:picLocks noChangeAspect="1" noChangeArrowheads="1"/>
+                    </pic:cNvPicPr>
+                  </pic:nvPicPr>
+                  <pic:blipFill>
+                    <a:blip r:embed="rId159">
+                      <a:extLst>
+                        <a:ext uri="{28A0092B-C50C-407E-A947-70E740481C1C}">
+                          <a14:useLocalDpi xmlns:a14="http://schemas.microsoft.com/office/drawing/2010/main" val="0"/>
+                        </a:ext>
+                      </a:extLst>
+                    </a:blip>
+                    <a:srcRect/>
+                    <a:stretch>
+                      <a:fillRect/>
+                    </a:stretch>
+                  </pic:blipFill>
+                  <pic:spPr bwMode="auto">
+                    <a:xfrm>
+                      <a:off x="0" y="0"/>
+                      <a:ext cx="1355889" cy="724380"/>
+                    </a:xfrm>
+                    <a:prstGeom prst="rect">
+                      <a:avLst/>
+                    </a:prstGeom>
+                    <a:noFill/>
+                  </pic:spPr>
+                </pic:pic>
+              </a:graphicData>
+            </a:graphic>
+          </wp:inline>
+        </w:drawing>
+      </w:r>
+    </w:p>
+    <w:p>
+      <w:pPr>
+        <w:rPr>
+          <w:color w:val="000000" w:themeColor="text1"/>
+          <w:sz w:val="24"/>
+          <w:szCs w:val="24"/>
+        </w:rPr>
+      </w:pPr>
+      <w:r>
+        <w:rPr>
+          <w:color w:val="000000" w:themeColor="text1"/>
+          <w:sz w:val="24"/>
+          <w:szCs w:val="24"/>
+        </w:rPr>
+        <w:t>109- No botão enviar ficou da seguinte forma:</w:t>
+      </w:r>
+    </w:p>
+    <w:p>
+      <w:pPr>
+        <w:pStyle w:val="PargrafodaLista"/>
+        <w:numPr>
+          <w:ilvl w:val="0"/>
+          <w:numId w:val="21"/>
+        </w:numPr>
+        <w:rPr>
+          <w:color w:val="000000" w:themeColor="text1"/>
+          <w:sz w:val="24"/>
+          <w:szCs w:val="24"/>
+        </w:rPr>
+      </w:pPr>
+      <w:r>
+        <w:rPr>
+          <w:color w:val="000000" w:themeColor="text1"/>
+          <w:sz w:val="24"/>
+          <w:szCs w:val="24"/>
+        </w:rPr>
+        <w:t xml:space="preserve">Demos uma largura para o botão de 80% </w:t>
+      </w:r>
+    </w:p>
+    <w:p>
+      <w:pPr>
+        <w:pStyle w:val="PargrafodaLista"/>
+        <w:numPr>
+          <w:ilvl w:val="0"/>
+          <w:numId w:val="21"/>
+        </w:numPr>
+        <w:rPr>
+          <w:color w:val="000000" w:themeColor="text1"/>
+          <w:sz w:val="24"/>
+          <w:szCs w:val="24"/>
+        </w:rPr>
+      </w:pPr>
+      <w:r>
+        <w:rPr>
+          <w:color w:val="000000" w:themeColor="text1"/>
+          <w:sz w:val="24"/>
+          <w:szCs w:val="24"/>
+        </w:rPr>
+        <w:t>Aumentamos o espaço interno de 15px para todos os lados</w:t>
+      </w:r>
+    </w:p>
+    <w:p>
+      <w:pPr>
+        <w:pStyle w:val="PargrafodaLista"/>
+        <w:numPr>
+          <w:ilvl w:val="0"/>
+          <w:numId w:val="21"/>
+        </w:numPr>
+        <w:rPr>
+          <w:color w:val="000000" w:themeColor="text1"/>
+          <w:sz w:val="24"/>
+          <w:szCs w:val="24"/>
+        </w:rPr>
+      </w:pPr>
+      <w:r>
+        <w:rPr>
+          <w:color w:val="000000" w:themeColor="text1"/>
+          <w:sz w:val="24"/>
+          <w:szCs w:val="24"/>
+        </w:rPr>
+        <w:t>Aumentamos o tamanho da fonte para 16px</w:t>
+      </w:r>
+    </w:p>
+    <w:p>
+      <w:pPr>
+        <w:rPr>
+          <w:color w:val="000000" w:themeColor="text1"/>
+          <w:sz w:val="24"/>
+          <w:szCs w:val="24"/>
+        </w:rPr>
+      </w:pPr>
+      <w:r>
+        <w:rPr>
+          <w:color w:val="000000" w:themeColor="text1"/>
+          <w:sz w:val="24"/>
+          <w:szCs w:val="24"/>
+        </w:rPr>
+        <w:drawing>
+          <wp:inline distT="0" distB="0" distL="0" distR="0" wp14:anchorId="635931C8" wp14:editId="3F61CD8C">
+            <wp:extent cx="1371600" cy="836341"/>
+            <wp:effectExtent l="0" t="0" r="0" b="1905"/>
+            <wp:docPr id="170" name="Imagem 170"/>
+            <wp:cNvGraphicFramePr>
+              <a:graphicFrameLocks xmlns:a="http://schemas.openxmlformats.org/drawingml/2006/main" noChangeAspect="1"/>
+            </wp:cNvGraphicFramePr>
+            <a:graphic xmlns:a="http://schemas.openxmlformats.org/drawingml/2006/main">
+              <a:graphicData uri="http://schemas.openxmlformats.org/drawingml/2006/picture">
+                <pic:pic xmlns:pic="http://schemas.openxmlformats.org/drawingml/2006/picture">
+                  <pic:nvPicPr>
+                    <pic:cNvPr id="1" name=""/>
+                    <pic:cNvPicPr/>
+                  </pic:nvPicPr>
+                  <pic:blipFill>
+                    <a:blip r:embed="rId160"/>
+                    <a:stretch>
+                      <a:fillRect/>
+                    </a:stretch>
+                  </pic:blipFill>
+                  <pic:spPr>
+                    <a:xfrm>
+                      <a:off x="0" y="0"/>
+                      <a:ext cx="1380443" cy="841733"/>
+                    </a:xfrm>
+                    <a:prstGeom prst="rect">
+                      <a:avLst/>
+                    </a:prstGeom>
+                  </pic:spPr>
+                </pic:pic>
+              </a:graphicData>
+            </a:graphic>
+          </wp:inline>
+        </w:drawing>
+      </w:r>
+    </w:p>
+    <w:p>
+      <w:pPr>
+        <w:rPr>
+          <w:color w:val="000000" w:themeColor="text1"/>
+          <w:sz w:val="24"/>
+          <w:szCs w:val="24"/>
+        </w:rPr>
+      </w:pPr>
+      <w:r>
+        <w:rPr>
+          <w:color w:val="000000" w:themeColor="text1"/>
+          <w:sz w:val="24"/>
+          <w:szCs w:val="24"/>
+        </w:rPr>
+        <w:t xml:space="preserve">110- </w:t>
+      </w:r>
       <w:bookmarkStart w:id="0" w:name="_GoBack"/>
       <w:bookmarkEnd w:id="0"/>
-    </w:p>
-    <w:p>
-      <w:pPr>
-        <w:rPr>
-          <w:color w:val="000000" w:themeColor="text1"/>
-          <w:sz w:val="24"/>
-          <w:szCs w:val="24"/>
-        </w:rPr>
-      </w:pPr>
     </w:p>
     <w:p>
       <w:pPr>
@@ -19015,9 +20334,9 @@
     </w:lvl>
   </w:abstractNum>
   <w:abstractNum w:abstractNumId="5" w15:restartNumberingAfterBreak="0">
-    <w:nsid w:val="327609CD"/>
+    <w:nsid w:val="21992168"/>
     <w:multiLevelType w:val="hybridMultilevel"/>
-    <w:tmpl w:val="92809BF0"/>
+    <w:tmpl w:val="4E127D7E"/>
     <w:lvl w:ilvl="0" w:tplc="04160001">
       <w:start w:val="1"/>
       <w:numFmt w:val="bullet"/>
@@ -19128,6 +20447,232 @@
     </w:lvl>
   </w:abstractNum>
   <w:abstractNum w:abstractNumId="6" w15:restartNumberingAfterBreak="0">
+    <w:nsid w:val="25EB61DD"/>
+    <w:multiLevelType w:val="hybridMultilevel"/>
+    <w:tmpl w:val="2E5CD22E"/>
+    <w:lvl w:ilvl="0" w:tplc="04160001">
+      <w:start w:val="1"/>
+      <w:numFmt w:val="bullet"/>
+      <w:lvlText w:val=""/>
+      <w:lvlJc w:val="left"/>
+      <w:pPr>
+        <w:ind w:left="720" w:hanging="360"/>
+      </w:pPr>
+      <w:rPr>
+        <w:rFonts w:ascii="Symbol" w:hAnsi="Symbol" w:hint="default"/>
+      </w:rPr>
+    </w:lvl>
+    <w:lvl w:ilvl="1" w:tplc="04160003" w:tentative="1">
+      <w:start w:val="1"/>
+      <w:numFmt w:val="bullet"/>
+      <w:lvlText w:val="o"/>
+      <w:lvlJc w:val="left"/>
+      <w:pPr>
+        <w:ind w:left="1440" w:hanging="360"/>
+      </w:pPr>
+      <w:rPr>
+        <w:rFonts w:ascii="Courier New" w:hAnsi="Courier New" w:cs="Courier New" w:hint="default"/>
+      </w:rPr>
+    </w:lvl>
+    <w:lvl w:ilvl="2" w:tplc="04160005" w:tentative="1">
+      <w:start w:val="1"/>
+      <w:numFmt w:val="bullet"/>
+      <w:lvlText w:val=""/>
+      <w:lvlJc w:val="left"/>
+      <w:pPr>
+        <w:ind w:left="2160" w:hanging="360"/>
+      </w:pPr>
+      <w:rPr>
+        <w:rFonts w:ascii="Wingdings" w:hAnsi="Wingdings" w:hint="default"/>
+      </w:rPr>
+    </w:lvl>
+    <w:lvl w:ilvl="3" w:tplc="04160001" w:tentative="1">
+      <w:start w:val="1"/>
+      <w:numFmt w:val="bullet"/>
+      <w:lvlText w:val=""/>
+      <w:lvlJc w:val="left"/>
+      <w:pPr>
+        <w:ind w:left="2880" w:hanging="360"/>
+      </w:pPr>
+      <w:rPr>
+        <w:rFonts w:ascii="Symbol" w:hAnsi="Symbol" w:hint="default"/>
+      </w:rPr>
+    </w:lvl>
+    <w:lvl w:ilvl="4" w:tplc="04160003" w:tentative="1">
+      <w:start w:val="1"/>
+      <w:numFmt w:val="bullet"/>
+      <w:lvlText w:val="o"/>
+      <w:lvlJc w:val="left"/>
+      <w:pPr>
+        <w:ind w:left="3600" w:hanging="360"/>
+      </w:pPr>
+      <w:rPr>
+        <w:rFonts w:ascii="Courier New" w:hAnsi="Courier New" w:cs="Courier New" w:hint="default"/>
+      </w:rPr>
+    </w:lvl>
+    <w:lvl w:ilvl="5" w:tplc="04160005" w:tentative="1">
+      <w:start w:val="1"/>
+      <w:numFmt w:val="bullet"/>
+      <w:lvlText w:val=""/>
+      <w:lvlJc w:val="left"/>
+      <w:pPr>
+        <w:ind w:left="4320" w:hanging="360"/>
+      </w:pPr>
+      <w:rPr>
+        <w:rFonts w:ascii="Wingdings" w:hAnsi="Wingdings" w:hint="default"/>
+      </w:rPr>
+    </w:lvl>
+    <w:lvl w:ilvl="6" w:tplc="04160001" w:tentative="1">
+      <w:start w:val="1"/>
+      <w:numFmt w:val="bullet"/>
+      <w:lvlText w:val=""/>
+      <w:lvlJc w:val="left"/>
+      <w:pPr>
+        <w:ind w:left="5040" w:hanging="360"/>
+      </w:pPr>
+      <w:rPr>
+        <w:rFonts w:ascii="Symbol" w:hAnsi="Symbol" w:hint="default"/>
+      </w:rPr>
+    </w:lvl>
+    <w:lvl w:ilvl="7" w:tplc="04160003" w:tentative="1">
+      <w:start w:val="1"/>
+      <w:numFmt w:val="bullet"/>
+      <w:lvlText w:val="o"/>
+      <w:lvlJc w:val="left"/>
+      <w:pPr>
+        <w:ind w:left="5760" w:hanging="360"/>
+      </w:pPr>
+      <w:rPr>
+        <w:rFonts w:ascii="Courier New" w:hAnsi="Courier New" w:cs="Courier New" w:hint="default"/>
+      </w:rPr>
+    </w:lvl>
+    <w:lvl w:ilvl="8" w:tplc="04160005" w:tentative="1">
+      <w:start w:val="1"/>
+      <w:numFmt w:val="bullet"/>
+      <w:lvlText w:val=""/>
+      <w:lvlJc w:val="left"/>
+      <w:pPr>
+        <w:ind w:left="6480" w:hanging="360"/>
+      </w:pPr>
+      <w:rPr>
+        <w:rFonts w:ascii="Wingdings" w:hAnsi="Wingdings" w:hint="default"/>
+      </w:rPr>
+    </w:lvl>
+  </w:abstractNum>
+  <w:abstractNum w:abstractNumId="7" w15:restartNumberingAfterBreak="0">
+    <w:nsid w:val="327609CD"/>
+    <w:multiLevelType w:val="hybridMultilevel"/>
+    <w:tmpl w:val="92809BF0"/>
+    <w:lvl w:ilvl="0" w:tplc="04160001">
+      <w:start w:val="1"/>
+      <w:numFmt w:val="bullet"/>
+      <w:lvlText w:val=""/>
+      <w:lvlJc w:val="left"/>
+      <w:pPr>
+        <w:ind w:left="720" w:hanging="360"/>
+      </w:pPr>
+      <w:rPr>
+        <w:rFonts w:ascii="Symbol" w:hAnsi="Symbol" w:hint="default"/>
+      </w:rPr>
+    </w:lvl>
+    <w:lvl w:ilvl="1" w:tplc="04160003" w:tentative="1">
+      <w:start w:val="1"/>
+      <w:numFmt w:val="bullet"/>
+      <w:lvlText w:val="o"/>
+      <w:lvlJc w:val="left"/>
+      <w:pPr>
+        <w:ind w:left="1440" w:hanging="360"/>
+      </w:pPr>
+      <w:rPr>
+        <w:rFonts w:ascii="Courier New" w:hAnsi="Courier New" w:cs="Courier New" w:hint="default"/>
+      </w:rPr>
+    </w:lvl>
+    <w:lvl w:ilvl="2" w:tplc="04160005" w:tentative="1">
+      <w:start w:val="1"/>
+      <w:numFmt w:val="bullet"/>
+      <w:lvlText w:val=""/>
+      <w:lvlJc w:val="left"/>
+      <w:pPr>
+        <w:ind w:left="2160" w:hanging="360"/>
+      </w:pPr>
+      <w:rPr>
+        <w:rFonts w:ascii="Wingdings" w:hAnsi="Wingdings" w:hint="default"/>
+      </w:rPr>
+    </w:lvl>
+    <w:lvl w:ilvl="3" w:tplc="04160001" w:tentative="1">
+      <w:start w:val="1"/>
+      <w:numFmt w:val="bullet"/>
+      <w:lvlText w:val=""/>
+      <w:lvlJc w:val="left"/>
+      <w:pPr>
+        <w:ind w:left="2880" w:hanging="360"/>
+      </w:pPr>
+      <w:rPr>
+        <w:rFonts w:ascii="Symbol" w:hAnsi="Symbol" w:hint="default"/>
+      </w:rPr>
+    </w:lvl>
+    <w:lvl w:ilvl="4" w:tplc="04160003" w:tentative="1">
+      <w:start w:val="1"/>
+      <w:numFmt w:val="bullet"/>
+      <w:lvlText w:val="o"/>
+      <w:lvlJc w:val="left"/>
+      <w:pPr>
+        <w:ind w:left="3600" w:hanging="360"/>
+      </w:pPr>
+      <w:rPr>
+        <w:rFonts w:ascii="Courier New" w:hAnsi="Courier New" w:cs="Courier New" w:hint="default"/>
+      </w:rPr>
+    </w:lvl>
+    <w:lvl w:ilvl="5" w:tplc="04160005" w:tentative="1">
+      <w:start w:val="1"/>
+      <w:numFmt w:val="bullet"/>
+      <w:lvlText w:val=""/>
+      <w:lvlJc w:val="left"/>
+      <w:pPr>
+        <w:ind w:left="4320" w:hanging="360"/>
+      </w:pPr>
+      <w:rPr>
+        <w:rFonts w:ascii="Wingdings" w:hAnsi="Wingdings" w:hint="default"/>
+      </w:rPr>
+    </w:lvl>
+    <w:lvl w:ilvl="6" w:tplc="04160001" w:tentative="1">
+      <w:start w:val="1"/>
+      <w:numFmt w:val="bullet"/>
+      <w:lvlText w:val=""/>
+      <w:lvlJc w:val="left"/>
+      <w:pPr>
+        <w:ind w:left="5040" w:hanging="360"/>
+      </w:pPr>
+      <w:rPr>
+        <w:rFonts w:ascii="Symbol" w:hAnsi="Symbol" w:hint="default"/>
+      </w:rPr>
+    </w:lvl>
+    <w:lvl w:ilvl="7" w:tplc="04160003" w:tentative="1">
+      <w:start w:val="1"/>
+      <w:numFmt w:val="bullet"/>
+      <w:lvlText w:val="o"/>
+      <w:lvlJc w:val="left"/>
+      <w:pPr>
+        <w:ind w:left="5760" w:hanging="360"/>
+      </w:pPr>
+      <w:rPr>
+        <w:rFonts w:ascii="Courier New" w:hAnsi="Courier New" w:cs="Courier New" w:hint="default"/>
+      </w:rPr>
+    </w:lvl>
+    <w:lvl w:ilvl="8" w:tplc="04160005" w:tentative="1">
+      <w:start w:val="1"/>
+      <w:numFmt w:val="bullet"/>
+      <w:lvlText w:val=""/>
+      <w:lvlJc w:val="left"/>
+      <w:pPr>
+        <w:ind w:left="6480" w:hanging="360"/>
+      </w:pPr>
+      <w:rPr>
+        <w:rFonts w:ascii="Wingdings" w:hAnsi="Wingdings" w:hint="default"/>
+      </w:rPr>
+    </w:lvl>
+  </w:abstractNum>
+  <w:abstractNum w:abstractNumId="8" w15:restartNumberingAfterBreak="0">
     <w:nsid w:val="348873D8"/>
     <w:multiLevelType w:val="hybridMultilevel"/>
     <w:tmpl w:val="CB2CCE98"/>
@@ -19216,17 +20761,17 @@
       </w:pPr>
     </w:lvl>
   </w:abstractNum>
-  <w:abstractNum w:abstractNumId="7" w15:restartNumberingAfterBreak="0">
-    <w:nsid w:val="4137159B"/>
+  <w:abstractNum w:abstractNumId="9" w15:restartNumberingAfterBreak="0">
+    <w:nsid w:val="3C28173E"/>
     <w:multiLevelType w:val="hybridMultilevel"/>
-    <w:tmpl w:val="432C6DCC"/>
+    <w:tmpl w:val="9E14CBF8"/>
     <w:lvl w:ilvl="0" w:tplc="04160001">
       <w:start w:val="1"/>
       <w:numFmt w:val="bullet"/>
       <w:lvlText w:val=""/>
       <w:lvlJc w:val="left"/>
       <w:pPr>
-        <w:ind w:left="1080" w:hanging="360"/>
+        <w:ind w:left="720" w:hanging="360"/>
       </w:pPr>
       <w:rPr>
         <w:rFonts w:ascii="Symbol" w:hAnsi="Symbol" w:hint="default"/>
@@ -19238,7 +20783,7 @@
       <w:lvlText w:val="o"/>
       <w:lvlJc w:val="left"/>
       <w:pPr>
-        <w:ind w:left="1800" w:hanging="360"/>
+        <w:ind w:left="1440" w:hanging="360"/>
       </w:pPr>
       <w:rPr>
         <w:rFonts w:ascii="Courier New" w:hAnsi="Courier New" w:cs="Courier New" w:hint="default"/>
@@ -19250,7 +20795,7 @@
       <w:lvlText w:val=""/>
       <w:lvlJc w:val="left"/>
       <w:pPr>
-        <w:ind w:left="2520" w:hanging="360"/>
+        <w:ind w:left="2160" w:hanging="360"/>
       </w:pPr>
       <w:rPr>
         <w:rFonts w:ascii="Wingdings" w:hAnsi="Wingdings" w:hint="default"/>
@@ -19262,7 +20807,7 @@
       <w:lvlText w:val=""/>
       <w:lvlJc w:val="left"/>
       <w:pPr>
-        <w:ind w:left="3240" w:hanging="360"/>
+        <w:ind w:left="2880" w:hanging="360"/>
       </w:pPr>
       <w:rPr>
         <w:rFonts w:ascii="Symbol" w:hAnsi="Symbol" w:hint="default"/>
@@ -19274,7 +20819,7 @@
       <w:lvlText w:val="o"/>
       <w:lvlJc w:val="left"/>
       <w:pPr>
-        <w:ind w:left="3960" w:hanging="360"/>
+        <w:ind w:left="3600" w:hanging="360"/>
       </w:pPr>
       <w:rPr>
         <w:rFonts w:ascii="Courier New" w:hAnsi="Courier New" w:cs="Courier New" w:hint="default"/>
@@ -19286,7 +20831,7 @@
       <w:lvlText w:val=""/>
       <w:lvlJc w:val="left"/>
       <w:pPr>
-        <w:ind w:left="4680" w:hanging="360"/>
+        <w:ind w:left="4320" w:hanging="360"/>
       </w:pPr>
       <w:rPr>
         <w:rFonts w:ascii="Wingdings" w:hAnsi="Wingdings" w:hint="default"/>
@@ -19298,7 +20843,7 @@
       <w:lvlText w:val=""/>
       <w:lvlJc w:val="left"/>
       <w:pPr>
-        <w:ind w:left="5400" w:hanging="360"/>
+        <w:ind w:left="5040" w:hanging="360"/>
       </w:pPr>
       <w:rPr>
         <w:rFonts w:ascii="Symbol" w:hAnsi="Symbol" w:hint="default"/>
@@ -19310,7 +20855,7 @@
       <w:lvlText w:val="o"/>
       <w:lvlJc w:val="left"/>
       <w:pPr>
-        <w:ind w:left="6120" w:hanging="360"/>
+        <w:ind w:left="5760" w:hanging="360"/>
       </w:pPr>
       <w:rPr>
         <w:rFonts w:ascii="Courier New" w:hAnsi="Courier New" w:cs="Courier New" w:hint="default"/>
@@ -19322,24 +20867,24 @@
       <w:lvlText w:val=""/>
       <w:lvlJc w:val="left"/>
       <w:pPr>
-        <w:ind w:left="6840" w:hanging="360"/>
+        <w:ind w:left="6480" w:hanging="360"/>
       </w:pPr>
       <w:rPr>
         <w:rFonts w:ascii="Wingdings" w:hAnsi="Wingdings" w:hint="default"/>
       </w:rPr>
     </w:lvl>
   </w:abstractNum>
-  <w:abstractNum w:abstractNumId="8" w15:restartNumberingAfterBreak="0">
-    <w:nsid w:val="4350088B"/>
+  <w:abstractNum w:abstractNumId="10" w15:restartNumberingAfterBreak="0">
+    <w:nsid w:val="4137159B"/>
     <w:multiLevelType w:val="hybridMultilevel"/>
-    <w:tmpl w:val="BB0A0D6C"/>
+    <w:tmpl w:val="432C6DCC"/>
     <w:lvl w:ilvl="0" w:tplc="04160001">
       <w:start w:val="1"/>
       <w:numFmt w:val="bullet"/>
       <w:lvlText w:val=""/>
       <w:lvlJc w:val="left"/>
       <w:pPr>
-        <w:ind w:left="720" w:hanging="360"/>
+        <w:ind w:left="1080" w:hanging="360"/>
       </w:pPr>
       <w:rPr>
         <w:rFonts w:ascii="Symbol" w:hAnsi="Symbol" w:hint="default"/>
@@ -19351,7 +20896,7 @@
       <w:lvlText w:val="o"/>
       <w:lvlJc w:val="left"/>
       <w:pPr>
-        <w:ind w:left="1440" w:hanging="360"/>
+        <w:ind w:left="1800" w:hanging="360"/>
       </w:pPr>
       <w:rPr>
         <w:rFonts w:ascii="Courier New" w:hAnsi="Courier New" w:cs="Courier New" w:hint="default"/>
@@ -19363,7 +20908,7 @@
       <w:lvlText w:val=""/>
       <w:lvlJc w:val="left"/>
       <w:pPr>
-        <w:ind w:left="2160" w:hanging="360"/>
+        <w:ind w:left="2520" w:hanging="360"/>
       </w:pPr>
       <w:rPr>
         <w:rFonts w:ascii="Wingdings" w:hAnsi="Wingdings" w:hint="default"/>
@@ -19375,7 +20920,7 @@
       <w:lvlText w:val=""/>
       <w:lvlJc w:val="left"/>
       <w:pPr>
-        <w:ind w:left="2880" w:hanging="360"/>
+        <w:ind w:left="3240" w:hanging="360"/>
       </w:pPr>
       <w:rPr>
         <w:rFonts w:ascii="Symbol" w:hAnsi="Symbol" w:hint="default"/>
@@ -19387,7 +20932,7 @@
       <w:lvlText w:val="o"/>
       <w:lvlJc w:val="left"/>
       <w:pPr>
-        <w:ind w:left="3600" w:hanging="360"/>
+        <w:ind w:left="3960" w:hanging="360"/>
       </w:pPr>
       <w:rPr>
         <w:rFonts w:ascii="Courier New" w:hAnsi="Courier New" w:cs="Courier New" w:hint="default"/>
@@ -19399,7 +20944,7 @@
       <w:lvlText w:val=""/>
       <w:lvlJc w:val="left"/>
       <w:pPr>
-        <w:ind w:left="4320" w:hanging="360"/>
+        <w:ind w:left="4680" w:hanging="360"/>
       </w:pPr>
       <w:rPr>
         <w:rFonts w:ascii="Wingdings" w:hAnsi="Wingdings" w:hint="default"/>
@@ -19411,7 +20956,7 @@
       <w:lvlText w:val=""/>
       <w:lvlJc w:val="left"/>
       <w:pPr>
-        <w:ind w:left="5040" w:hanging="360"/>
+        <w:ind w:left="5400" w:hanging="360"/>
       </w:pPr>
       <w:rPr>
         <w:rFonts w:ascii="Symbol" w:hAnsi="Symbol" w:hint="default"/>
@@ -19423,7 +20968,7 @@
       <w:lvlText w:val="o"/>
       <w:lvlJc w:val="left"/>
       <w:pPr>
-        <w:ind w:left="5760" w:hanging="360"/>
+        <w:ind w:left="6120" w:hanging="360"/>
       </w:pPr>
       <w:rPr>
         <w:rFonts w:ascii="Courier New" w:hAnsi="Courier New" w:cs="Courier New" w:hint="default"/>
@@ -19435,17 +20980,17 @@
       <w:lvlText w:val=""/>
       <w:lvlJc w:val="left"/>
       <w:pPr>
-        <w:ind w:left="6480" w:hanging="360"/>
+        <w:ind w:left="6840" w:hanging="360"/>
       </w:pPr>
       <w:rPr>
         <w:rFonts w:ascii="Wingdings" w:hAnsi="Wingdings" w:hint="default"/>
       </w:rPr>
     </w:lvl>
   </w:abstractNum>
-  <w:abstractNum w:abstractNumId="9" w15:restartNumberingAfterBreak="0">
-    <w:nsid w:val="441A6262"/>
+  <w:abstractNum w:abstractNumId="11" w15:restartNumberingAfterBreak="0">
+    <w:nsid w:val="4350088B"/>
     <w:multiLevelType w:val="hybridMultilevel"/>
-    <w:tmpl w:val="2578F122"/>
+    <w:tmpl w:val="BB0A0D6C"/>
     <w:lvl w:ilvl="0" w:tplc="04160001">
       <w:start w:val="1"/>
       <w:numFmt w:val="bullet"/>
@@ -19555,10 +21100,10 @@
       </w:rPr>
     </w:lvl>
   </w:abstractNum>
-  <w:abstractNum w:abstractNumId="10" w15:restartNumberingAfterBreak="0">
-    <w:nsid w:val="470B21D8"/>
+  <w:abstractNum w:abstractNumId="12" w15:restartNumberingAfterBreak="0">
+    <w:nsid w:val="441A6262"/>
     <w:multiLevelType w:val="hybridMultilevel"/>
-    <w:tmpl w:val="2B862F14"/>
+    <w:tmpl w:val="2578F122"/>
     <w:lvl w:ilvl="0" w:tplc="04160001">
       <w:start w:val="1"/>
       <w:numFmt w:val="bullet"/>
@@ -19668,7 +21213,120 @@
       </w:rPr>
     </w:lvl>
   </w:abstractNum>
-  <w:abstractNum w:abstractNumId="11" w15:restartNumberingAfterBreak="0">
+  <w:abstractNum w:abstractNumId="13" w15:restartNumberingAfterBreak="0">
+    <w:nsid w:val="470B21D8"/>
+    <w:multiLevelType w:val="hybridMultilevel"/>
+    <w:tmpl w:val="2B862F14"/>
+    <w:lvl w:ilvl="0" w:tplc="04160001">
+      <w:start w:val="1"/>
+      <w:numFmt w:val="bullet"/>
+      <w:lvlText w:val=""/>
+      <w:lvlJc w:val="left"/>
+      <w:pPr>
+        <w:ind w:left="720" w:hanging="360"/>
+      </w:pPr>
+      <w:rPr>
+        <w:rFonts w:ascii="Symbol" w:hAnsi="Symbol" w:hint="default"/>
+      </w:rPr>
+    </w:lvl>
+    <w:lvl w:ilvl="1" w:tplc="04160003" w:tentative="1">
+      <w:start w:val="1"/>
+      <w:numFmt w:val="bullet"/>
+      <w:lvlText w:val="o"/>
+      <w:lvlJc w:val="left"/>
+      <w:pPr>
+        <w:ind w:left="1440" w:hanging="360"/>
+      </w:pPr>
+      <w:rPr>
+        <w:rFonts w:ascii="Courier New" w:hAnsi="Courier New" w:cs="Courier New" w:hint="default"/>
+      </w:rPr>
+    </w:lvl>
+    <w:lvl w:ilvl="2" w:tplc="04160005" w:tentative="1">
+      <w:start w:val="1"/>
+      <w:numFmt w:val="bullet"/>
+      <w:lvlText w:val=""/>
+      <w:lvlJc w:val="left"/>
+      <w:pPr>
+        <w:ind w:left="2160" w:hanging="360"/>
+      </w:pPr>
+      <w:rPr>
+        <w:rFonts w:ascii="Wingdings" w:hAnsi="Wingdings" w:hint="default"/>
+      </w:rPr>
+    </w:lvl>
+    <w:lvl w:ilvl="3" w:tplc="04160001" w:tentative="1">
+      <w:start w:val="1"/>
+      <w:numFmt w:val="bullet"/>
+      <w:lvlText w:val=""/>
+      <w:lvlJc w:val="left"/>
+      <w:pPr>
+        <w:ind w:left="2880" w:hanging="360"/>
+      </w:pPr>
+      <w:rPr>
+        <w:rFonts w:ascii="Symbol" w:hAnsi="Symbol" w:hint="default"/>
+      </w:rPr>
+    </w:lvl>
+    <w:lvl w:ilvl="4" w:tplc="04160003" w:tentative="1">
+      <w:start w:val="1"/>
+      <w:numFmt w:val="bullet"/>
+      <w:lvlText w:val="o"/>
+      <w:lvlJc w:val="left"/>
+      <w:pPr>
+        <w:ind w:left="3600" w:hanging="360"/>
+      </w:pPr>
+      <w:rPr>
+        <w:rFonts w:ascii="Courier New" w:hAnsi="Courier New" w:cs="Courier New" w:hint="default"/>
+      </w:rPr>
+    </w:lvl>
+    <w:lvl w:ilvl="5" w:tplc="04160005" w:tentative="1">
+      <w:start w:val="1"/>
+      <w:numFmt w:val="bullet"/>
+      <w:lvlText w:val=""/>
+      <w:lvlJc w:val="left"/>
+      <w:pPr>
+        <w:ind w:left="4320" w:hanging="360"/>
+      </w:pPr>
+      <w:rPr>
+        <w:rFonts w:ascii="Wingdings" w:hAnsi="Wingdings" w:hint="default"/>
+      </w:rPr>
+    </w:lvl>
+    <w:lvl w:ilvl="6" w:tplc="04160001" w:tentative="1">
+      <w:start w:val="1"/>
+      <w:numFmt w:val="bullet"/>
+      <w:lvlText w:val=""/>
+      <w:lvlJc w:val="left"/>
+      <w:pPr>
+        <w:ind w:left="5040" w:hanging="360"/>
+      </w:pPr>
+      <w:rPr>
+        <w:rFonts w:ascii="Symbol" w:hAnsi="Symbol" w:hint="default"/>
+      </w:rPr>
+    </w:lvl>
+    <w:lvl w:ilvl="7" w:tplc="04160003" w:tentative="1">
+      <w:start w:val="1"/>
+      <w:numFmt w:val="bullet"/>
+      <w:lvlText w:val="o"/>
+      <w:lvlJc w:val="left"/>
+      <w:pPr>
+        <w:ind w:left="5760" w:hanging="360"/>
+      </w:pPr>
+      <w:rPr>
+        <w:rFonts w:ascii="Courier New" w:hAnsi="Courier New" w:cs="Courier New" w:hint="default"/>
+      </w:rPr>
+    </w:lvl>
+    <w:lvl w:ilvl="8" w:tplc="04160005" w:tentative="1">
+      <w:start w:val="1"/>
+      <w:numFmt w:val="bullet"/>
+      <w:lvlText w:val=""/>
+      <w:lvlJc w:val="left"/>
+      <w:pPr>
+        <w:ind w:left="6480" w:hanging="360"/>
+      </w:pPr>
+      <w:rPr>
+        <w:rFonts w:ascii="Wingdings" w:hAnsi="Wingdings" w:hint="default"/>
+      </w:rPr>
+    </w:lvl>
+  </w:abstractNum>
+  <w:abstractNum w:abstractNumId="14" w15:restartNumberingAfterBreak="0">
     <w:nsid w:val="4A567898"/>
     <w:multiLevelType w:val="hybridMultilevel"/>
     <w:tmpl w:val="FEEE9A96"/>
@@ -19757,7 +21415,7 @@
       </w:pPr>
     </w:lvl>
   </w:abstractNum>
-  <w:abstractNum w:abstractNumId="12" w15:restartNumberingAfterBreak="0">
+  <w:abstractNum w:abstractNumId="15" w15:restartNumberingAfterBreak="0">
     <w:nsid w:val="4BD97793"/>
     <w:multiLevelType w:val="hybridMultilevel"/>
     <w:tmpl w:val="F52C3F50"/>
@@ -19870,7 +21528,7 @@
       </w:rPr>
     </w:lvl>
   </w:abstractNum>
-  <w:abstractNum w:abstractNumId="13" w15:restartNumberingAfterBreak="0">
+  <w:abstractNum w:abstractNumId="16" w15:restartNumberingAfterBreak="0">
     <w:nsid w:val="4CAD583E"/>
     <w:multiLevelType w:val="hybridMultilevel"/>
     <w:tmpl w:val="01709D9A"/>
@@ -19959,7 +21617,7 @@
       </w:pPr>
     </w:lvl>
   </w:abstractNum>
-  <w:abstractNum w:abstractNumId="14" w15:restartNumberingAfterBreak="0">
+  <w:abstractNum w:abstractNumId="17" w15:restartNumberingAfterBreak="0">
     <w:nsid w:val="67EB77F4"/>
     <w:multiLevelType w:val="hybridMultilevel"/>
     <w:tmpl w:val="1FAA0BA4"/>
@@ -20072,7 +21730,7 @@
       </w:rPr>
     </w:lvl>
   </w:abstractNum>
-  <w:abstractNum w:abstractNumId="15" w15:restartNumberingAfterBreak="0">
+  <w:abstractNum w:abstractNumId="18" w15:restartNumberingAfterBreak="0">
     <w:nsid w:val="75866949"/>
     <w:multiLevelType w:val="hybridMultilevel"/>
     <w:tmpl w:val="706668EA"/>
@@ -20160,6 +21818,232 @@
       </w:pPr>
     </w:lvl>
   </w:abstractNum>
+  <w:abstractNum w:abstractNumId="19" w15:restartNumberingAfterBreak="0">
+    <w:nsid w:val="7CB157EB"/>
+    <w:multiLevelType w:val="hybridMultilevel"/>
+    <w:tmpl w:val="50AAE96A"/>
+    <w:lvl w:ilvl="0" w:tplc="04160001">
+      <w:start w:val="1"/>
+      <w:numFmt w:val="bullet"/>
+      <w:lvlText w:val=""/>
+      <w:lvlJc w:val="left"/>
+      <w:pPr>
+        <w:ind w:left="720" w:hanging="360"/>
+      </w:pPr>
+      <w:rPr>
+        <w:rFonts w:ascii="Symbol" w:hAnsi="Symbol" w:hint="default"/>
+      </w:rPr>
+    </w:lvl>
+    <w:lvl w:ilvl="1" w:tplc="04160003" w:tentative="1">
+      <w:start w:val="1"/>
+      <w:numFmt w:val="bullet"/>
+      <w:lvlText w:val="o"/>
+      <w:lvlJc w:val="left"/>
+      <w:pPr>
+        <w:ind w:left="1440" w:hanging="360"/>
+      </w:pPr>
+      <w:rPr>
+        <w:rFonts w:ascii="Courier New" w:hAnsi="Courier New" w:cs="Courier New" w:hint="default"/>
+      </w:rPr>
+    </w:lvl>
+    <w:lvl w:ilvl="2" w:tplc="04160005" w:tentative="1">
+      <w:start w:val="1"/>
+      <w:numFmt w:val="bullet"/>
+      <w:lvlText w:val=""/>
+      <w:lvlJc w:val="left"/>
+      <w:pPr>
+        <w:ind w:left="2160" w:hanging="360"/>
+      </w:pPr>
+      <w:rPr>
+        <w:rFonts w:ascii="Wingdings" w:hAnsi="Wingdings" w:hint="default"/>
+      </w:rPr>
+    </w:lvl>
+    <w:lvl w:ilvl="3" w:tplc="04160001" w:tentative="1">
+      <w:start w:val="1"/>
+      <w:numFmt w:val="bullet"/>
+      <w:lvlText w:val=""/>
+      <w:lvlJc w:val="left"/>
+      <w:pPr>
+        <w:ind w:left="2880" w:hanging="360"/>
+      </w:pPr>
+      <w:rPr>
+        <w:rFonts w:ascii="Symbol" w:hAnsi="Symbol" w:hint="default"/>
+      </w:rPr>
+    </w:lvl>
+    <w:lvl w:ilvl="4" w:tplc="04160003" w:tentative="1">
+      <w:start w:val="1"/>
+      <w:numFmt w:val="bullet"/>
+      <w:lvlText w:val="o"/>
+      <w:lvlJc w:val="left"/>
+      <w:pPr>
+        <w:ind w:left="3600" w:hanging="360"/>
+      </w:pPr>
+      <w:rPr>
+        <w:rFonts w:ascii="Courier New" w:hAnsi="Courier New" w:cs="Courier New" w:hint="default"/>
+      </w:rPr>
+    </w:lvl>
+    <w:lvl w:ilvl="5" w:tplc="04160005" w:tentative="1">
+      <w:start w:val="1"/>
+      <w:numFmt w:val="bullet"/>
+      <w:lvlText w:val=""/>
+      <w:lvlJc w:val="left"/>
+      <w:pPr>
+        <w:ind w:left="4320" w:hanging="360"/>
+      </w:pPr>
+      <w:rPr>
+        <w:rFonts w:ascii="Wingdings" w:hAnsi="Wingdings" w:hint="default"/>
+      </w:rPr>
+    </w:lvl>
+    <w:lvl w:ilvl="6" w:tplc="04160001" w:tentative="1">
+      <w:start w:val="1"/>
+      <w:numFmt w:val="bullet"/>
+      <w:lvlText w:val=""/>
+      <w:lvlJc w:val="left"/>
+      <w:pPr>
+        <w:ind w:left="5040" w:hanging="360"/>
+      </w:pPr>
+      <w:rPr>
+        <w:rFonts w:ascii="Symbol" w:hAnsi="Symbol" w:hint="default"/>
+      </w:rPr>
+    </w:lvl>
+    <w:lvl w:ilvl="7" w:tplc="04160003" w:tentative="1">
+      <w:start w:val="1"/>
+      <w:numFmt w:val="bullet"/>
+      <w:lvlText w:val="o"/>
+      <w:lvlJc w:val="left"/>
+      <w:pPr>
+        <w:ind w:left="5760" w:hanging="360"/>
+      </w:pPr>
+      <w:rPr>
+        <w:rFonts w:ascii="Courier New" w:hAnsi="Courier New" w:cs="Courier New" w:hint="default"/>
+      </w:rPr>
+    </w:lvl>
+    <w:lvl w:ilvl="8" w:tplc="04160005" w:tentative="1">
+      <w:start w:val="1"/>
+      <w:numFmt w:val="bullet"/>
+      <w:lvlText w:val=""/>
+      <w:lvlJc w:val="left"/>
+      <w:pPr>
+        <w:ind w:left="6480" w:hanging="360"/>
+      </w:pPr>
+      <w:rPr>
+        <w:rFonts w:ascii="Wingdings" w:hAnsi="Wingdings" w:hint="default"/>
+      </w:rPr>
+    </w:lvl>
+  </w:abstractNum>
+  <w:abstractNum w:abstractNumId="20" w15:restartNumberingAfterBreak="0">
+    <w:nsid w:val="7FBE6C5E"/>
+    <w:multiLevelType w:val="hybridMultilevel"/>
+    <w:tmpl w:val="2D9ABED0"/>
+    <w:lvl w:ilvl="0" w:tplc="04160001">
+      <w:start w:val="1"/>
+      <w:numFmt w:val="bullet"/>
+      <w:lvlText w:val=""/>
+      <w:lvlJc w:val="left"/>
+      <w:pPr>
+        <w:ind w:left="720" w:hanging="360"/>
+      </w:pPr>
+      <w:rPr>
+        <w:rFonts w:ascii="Symbol" w:hAnsi="Symbol" w:hint="default"/>
+      </w:rPr>
+    </w:lvl>
+    <w:lvl w:ilvl="1" w:tplc="04160003" w:tentative="1">
+      <w:start w:val="1"/>
+      <w:numFmt w:val="bullet"/>
+      <w:lvlText w:val="o"/>
+      <w:lvlJc w:val="left"/>
+      <w:pPr>
+        <w:ind w:left="1440" w:hanging="360"/>
+      </w:pPr>
+      <w:rPr>
+        <w:rFonts w:ascii="Courier New" w:hAnsi="Courier New" w:cs="Courier New" w:hint="default"/>
+      </w:rPr>
+    </w:lvl>
+    <w:lvl w:ilvl="2" w:tplc="04160005" w:tentative="1">
+      <w:start w:val="1"/>
+      <w:numFmt w:val="bullet"/>
+      <w:lvlText w:val=""/>
+      <w:lvlJc w:val="left"/>
+      <w:pPr>
+        <w:ind w:left="2160" w:hanging="360"/>
+      </w:pPr>
+      <w:rPr>
+        <w:rFonts w:ascii="Wingdings" w:hAnsi="Wingdings" w:hint="default"/>
+      </w:rPr>
+    </w:lvl>
+    <w:lvl w:ilvl="3" w:tplc="04160001" w:tentative="1">
+      <w:start w:val="1"/>
+      <w:numFmt w:val="bullet"/>
+      <w:lvlText w:val=""/>
+      <w:lvlJc w:val="left"/>
+      <w:pPr>
+        <w:ind w:left="2880" w:hanging="360"/>
+      </w:pPr>
+      <w:rPr>
+        <w:rFonts w:ascii="Symbol" w:hAnsi="Symbol" w:hint="default"/>
+      </w:rPr>
+    </w:lvl>
+    <w:lvl w:ilvl="4" w:tplc="04160003" w:tentative="1">
+      <w:start w:val="1"/>
+      <w:numFmt w:val="bullet"/>
+      <w:lvlText w:val="o"/>
+      <w:lvlJc w:val="left"/>
+      <w:pPr>
+        <w:ind w:left="3600" w:hanging="360"/>
+      </w:pPr>
+      <w:rPr>
+        <w:rFonts w:ascii="Courier New" w:hAnsi="Courier New" w:cs="Courier New" w:hint="default"/>
+      </w:rPr>
+    </w:lvl>
+    <w:lvl w:ilvl="5" w:tplc="04160005" w:tentative="1">
+      <w:start w:val="1"/>
+      <w:numFmt w:val="bullet"/>
+      <w:lvlText w:val=""/>
+      <w:lvlJc w:val="left"/>
+      <w:pPr>
+        <w:ind w:left="4320" w:hanging="360"/>
+      </w:pPr>
+      <w:rPr>
+        <w:rFonts w:ascii="Wingdings" w:hAnsi="Wingdings" w:hint="default"/>
+      </w:rPr>
+    </w:lvl>
+    <w:lvl w:ilvl="6" w:tplc="04160001" w:tentative="1">
+      <w:start w:val="1"/>
+      <w:numFmt w:val="bullet"/>
+      <w:lvlText w:val=""/>
+      <w:lvlJc w:val="left"/>
+      <w:pPr>
+        <w:ind w:left="5040" w:hanging="360"/>
+      </w:pPr>
+      <w:rPr>
+        <w:rFonts w:ascii="Symbol" w:hAnsi="Symbol" w:hint="default"/>
+      </w:rPr>
+    </w:lvl>
+    <w:lvl w:ilvl="7" w:tplc="04160003" w:tentative="1">
+      <w:start w:val="1"/>
+      <w:numFmt w:val="bullet"/>
+      <w:lvlText w:val="o"/>
+      <w:lvlJc w:val="left"/>
+      <w:pPr>
+        <w:ind w:left="5760" w:hanging="360"/>
+      </w:pPr>
+      <w:rPr>
+        <w:rFonts w:ascii="Courier New" w:hAnsi="Courier New" w:cs="Courier New" w:hint="default"/>
+      </w:rPr>
+    </w:lvl>
+    <w:lvl w:ilvl="8" w:tplc="04160005" w:tentative="1">
+      <w:start w:val="1"/>
+      <w:numFmt w:val="bullet"/>
+      <w:lvlText w:val=""/>
+      <w:lvlJc w:val="left"/>
+      <w:pPr>
+        <w:ind w:left="6480" w:hanging="360"/>
+      </w:pPr>
+      <w:rPr>
+        <w:rFonts w:ascii="Wingdings" w:hAnsi="Wingdings" w:hint="default"/>
+      </w:rPr>
+    </w:lvl>
+  </w:abstractNum>
   <w:num w:numId="1">
     <w:abstractNumId w:val="2"/>
   </w:num>
@@ -20167,10 +22051,10 @@
     <w:abstractNumId w:val="0"/>
   </w:num>
   <w:num w:numId="3">
-    <w:abstractNumId w:val="14"/>
+    <w:abstractNumId w:val="17"/>
   </w:num>
   <w:num w:numId="4">
-    <w:abstractNumId w:val="7"/>
+    <w:abstractNumId w:val="10"/>
   </w:num>
   <w:num w:numId="5">
     <w:abstractNumId w:val="3"/>
@@ -20179,34 +22063,49 @@
     <w:abstractNumId w:val="4"/>
   </w:num>
   <w:num w:numId="7">
-    <w:abstractNumId w:val="5"/>
+    <w:abstractNumId w:val="7"/>
   </w:num>
   <w:num w:numId="8">
-    <w:abstractNumId w:val="8"/>
+    <w:abstractNumId w:val="11"/>
   </w:num>
   <w:num w:numId="9">
-    <w:abstractNumId w:val="9"/>
+    <w:abstractNumId w:val="12"/>
   </w:num>
   <w:num w:numId="10">
-    <w:abstractNumId w:val="12"/>
+    <w:abstractNumId w:val="15"/>
   </w:num>
   <w:num w:numId="11">
-    <w:abstractNumId w:val="10"/>
+    <w:abstractNumId w:val="13"/>
   </w:num>
   <w:num w:numId="12">
     <w:abstractNumId w:val="1"/>
   </w:num>
   <w:num w:numId="13">
-    <w:abstractNumId w:val="11"/>
+    <w:abstractNumId w:val="14"/>
   </w:num>
   <w:num w:numId="14">
-    <w:abstractNumId w:val="15"/>
+    <w:abstractNumId w:val="18"/>
   </w:num>
   <w:num w:numId="15">
+    <w:abstractNumId w:val="8"/>
+  </w:num>
+  <w:num w:numId="16">
+    <w:abstractNumId w:val="16"/>
+  </w:num>
+  <w:num w:numId="17">
+    <w:abstractNumId w:val="20"/>
+  </w:num>
+  <w:num w:numId="18">
     <w:abstractNumId w:val="6"/>
   </w:num>
-  <w:num w:numId="16">
-    <w:abstractNumId w:val="13"/>
+  <w:num w:numId="19">
+    <w:abstractNumId w:val="9"/>
+  </w:num>
+  <w:num w:numId="20">
+    <w:abstractNumId w:val="5"/>
+  </w:num>
+  <w:num w:numId="21">
+    <w:abstractNumId w:val="19"/>
   </w:num>
 </w:numbering>
 </file>
@@ -20973,7 +22872,7 @@
 </file>
 
 <file path=customXml/itemProps1.xml><?xml version="1.0" encoding="utf-8"?>
-<ds:datastoreItem xmlns:ds="http://schemas.openxmlformats.org/officeDocument/2006/customXml" ds:itemID="{1A278231-F932-4F83-BD06-2B6A0B85A2E2}">
+<ds:datastoreItem xmlns:ds="http://schemas.openxmlformats.org/officeDocument/2006/customXml" ds:itemID="{0B60CE91-8C17-4F16-B404-427445B4E576}">
   <ds:schemaRefs>
     <ds:schemaRef ds:uri="http://schemas.openxmlformats.org/officeDocument/2006/bibliography"/>
   </ds:schemaRefs>

</xml_diff>